<commit_message>
Added fixed figures and authors to manuscript
</commit_message>
<xml_diff>
--- a/Annual Report Manuscript Outline.docx
+++ b/Annual Report Manuscript Outline.docx
@@ -2,6 +2,27 @@
 <file path=word/document.xml><?xml version="1.0" encoding="utf-8"?>
 <w:document xmlns:wpc="http://schemas.microsoft.com/office/word/2010/wordprocessingCanvas" xmlns:cx="http://schemas.microsoft.com/office/drawing/2014/chartex" xmlns:cx1="http://schemas.microsoft.com/office/drawing/2015/9/8/chartex" xmlns:cx2="http://schemas.microsoft.com/office/drawing/2015/10/21/chartex" xmlns:cx3="http://schemas.microsoft.com/office/drawing/2016/5/9/chartex" xmlns:cx4="http://schemas.microsoft.com/office/drawing/2016/5/10/chartex" xmlns:cx5="http://schemas.microsoft.com/office/drawing/2016/5/11/chartex" xmlns:cx6="http://schemas.microsoft.com/office/drawing/2016/5/12/chartex" xmlns:cx7="http://schemas.microsoft.com/office/drawing/2016/5/13/chartex" xmlns:cx8="http://schemas.microsoft.com/office/drawing/2016/5/14/chartex" xmlns:mc="http://schemas.openxmlformats.org/markup-compatibility/2006" xmlns:aink="http://schemas.microsoft.com/office/drawing/2016/ink" xmlns:am3d="http://schemas.microsoft.com/office/drawing/2017/model3d" xmlns:o="urn:schemas-microsoft-com:office:office" xmlns:oel="http://schemas.microsoft.com/office/2019/extlst" xmlns:r="http://schemas.openxmlformats.org/officeDocument/2006/relationships" xmlns:m="http://schemas.openxmlformats.org/officeDocument/2006/math" xmlns:v="urn:schemas-microsoft-com:vml" xmlns:wp14="http://schemas.microsoft.com/office/word/2010/wordprocessingDrawing" xmlns:wp="http://schemas.openxmlformats.org/drawingml/2006/wordprocessingDrawing" xmlns:w10="urn:schemas-microsoft-com:office:word" xmlns:w="http://schemas.openxmlformats.org/wordprocessingml/2006/main" xmlns:w14="http://schemas.microsoft.com/office/word/2010/wordml" xmlns:w15="http://schemas.microsoft.com/office/word/2012/wordml" xmlns:w16cex="http://schemas.microsoft.com/office/word/2018/wordml/cex" xmlns:w16cid="http://schemas.microsoft.com/office/word/2016/wordml/cid" xmlns:w16="http://schemas.microsoft.com/office/word/2018/wordml" xmlns:w16du="http://schemas.microsoft.com/office/word/2023/wordml/word16du" xmlns:w16sdtdh="http://schemas.microsoft.com/office/word/2020/wordml/sdtdatahash" xmlns:w16sdtfl="http://schemas.microsoft.com/office/word/2024/wordml/sdtformatlock" xmlns:w16se="http://schemas.microsoft.com/office/word/2015/wordml/symex" xmlns:wpg="http://schemas.microsoft.com/office/word/2010/wordprocessingGroup" xmlns:wpi="http://schemas.microsoft.com/office/word/2010/wordprocessingInk" xmlns:wne="http://schemas.microsoft.com/office/word/2006/wordml" xmlns:wps="http://schemas.microsoft.com/office/word/2010/wordprocessingShape" mc:Ignorable="w14 w15 w16se w16cid w16 w16cex w16sdtdh w16sdtfl w16du wp14">
   <w:body>
+    <w:p>
+      <w:r>
+        <w:t xml:space="preserve">Title: </w:t>
+      </w:r>
+      <w:r>
+        <w:t>Hydrologically connected</w:t>
+      </w:r>
+      <w:r>
+        <w:t xml:space="preserve"> </w:t>
+      </w:r>
+      <w:r>
+        <w:t>constructed</w:t>
+      </w:r>
+      <w:r>
+        <w:t xml:space="preserve"> wetlands meaningfully contribute to nutrient retention </w:t>
+      </w:r>
+      <w:r>
+        <w:t>in Great Lakes watersheds</w:t>
+      </w:r>
+    </w:p>
+    <w:p/>
     <w:p>
       <w:r>
         <w:t xml:space="preserve">Target Journal: </w:t>
@@ -78,7 +99,321 @@
     <w:p/>
     <w:p>
       <w:r>
-        <w:t xml:space="preserve">Tables: </w:t>
+        <w:t xml:space="preserve">Authors: </w:t>
+      </w:r>
+    </w:p>
+    <w:p>
+      <w:r>
+        <w:t>Kenneth J. Anderson</w:t>
+      </w:r>
+      <w:r>
+        <w:rPr>
+          <w:vertAlign w:val="superscript"/>
+        </w:rPr>
+        <w:t>1</w:t>
+      </w:r>
+      <w:r>
+        <w:t>, Lauren Brown</w:t>
+      </w:r>
+      <w:r>
+        <w:rPr>
+          <w:vertAlign w:val="superscript"/>
+        </w:rPr>
+        <w:t>2</w:t>
+      </w:r>
+      <w:r>
+        <w:t>, Mary Ellen Klukow</w:t>
+      </w:r>
+      <w:r>
+        <w:rPr>
+          <w:vertAlign w:val="superscript"/>
+        </w:rPr>
+        <w:t>1</w:t>
+      </w:r>
+      <w:r>
+        <w:t>, Raíssa Mendonça</w:t>
+      </w:r>
+      <w:r>
+        <w:rPr>
+          <w:vertAlign w:val="superscript"/>
+        </w:rPr>
+        <w:t>1</w:t>
+      </w:r>
+      <w:r>
+        <w:t>, Olivia Schloegel</w:t>
+      </w:r>
+      <w:r>
+        <w:rPr>
+          <w:vertAlign w:val="superscript"/>
+        </w:rPr>
+        <w:t>1</w:t>
+      </w:r>
+      <w:r>
+        <w:t xml:space="preserve">, </w:t>
+      </w:r>
+      <w:r>
+        <w:t>Jakob Boehler</w:t>
+      </w:r>
+      <w:r>
+        <w:rPr>
+          <w:vertAlign w:val="superscript"/>
+        </w:rPr>
+        <w:t>3</w:t>
+      </w:r>
+      <w:r>
+        <w:t>, David Dean</w:t>
+      </w:r>
+      <w:r>
+        <w:rPr>
+          <w:vertAlign w:val="superscript"/>
+        </w:rPr>
+        <w:t>4</w:t>
+      </w:r>
+      <w:r>
+        <w:t>, Connor Gluck</w:t>
+      </w:r>
+      <w:r>
+        <w:rPr>
+          <w:vertAlign w:val="superscript"/>
+        </w:rPr>
+        <w:t>1</w:t>
+      </w:r>
+      <w:r>
+        <w:t>, Hana Esber</w:t>
+      </w:r>
+      <w:r>
+        <w:rPr>
+          <w:vertAlign w:val="superscript"/>
+        </w:rPr>
+        <w:t>1</w:t>
+      </w:r>
+      <w:r>
+        <w:t>, Ethan Glassman</w:t>
+      </w:r>
+      <w:r>
+        <w:rPr>
+          <w:vertAlign w:val="superscript"/>
+        </w:rPr>
+        <w:t>2</w:t>
+      </w:r>
+      <w:r>
+        <w:t>, Haley Hoehn</w:t>
+      </w:r>
+      <w:r>
+        <w:rPr>
+          <w:vertAlign w:val="superscript"/>
+        </w:rPr>
+        <w:t>5</w:t>
+      </w:r>
+      <w:r>
+        <w:t>, Lindsay Horan</w:t>
+      </w:r>
+      <w:r>
+        <w:rPr>
+          <w:vertAlign w:val="superscript"/>
+        </w:rPr>
+        <w:t>6</w:t>
+      </w:r>
+      <w:r>
+        <w:t>, Genna Hunt</w:t>
+      </w:r>
+      <w:r>
+        <w:rPr>
+          <w:vertAlign w:val="superscript"/>
+        </w:rPr>
+        <w:t>2</w:t>
+      </w:r>
+      <w:r>
+        <w:t>, Ewan Isherwood</w:t>
+      </w:r>
+      <w:r>
+        <w:rPr>
+          <w:vertAlign w:val="superscript"/>
+        </w:rPr>
+        <w:t>2</w:t>
+      </w:r>
+      <w:r>
+        <w:t>, Morgan Jutte</w:t>
+      </w:r>
+      <w:r>
+        <w:rPr>
+          <w:vertAlign w:val="superscript"/>
+        </w:rPr>
+        <w:t>5</w:t>
+      </w:r>
+      <w:r>
+        <w:t>, Corbin Kohart</w:t>
+      </w:r>
+      <w:r>
+        <w:rPr>
+          <w:vertAlign w:val="superscript"/>
+        </w:rPr>
+        <w:t>2</w:t>
+      </w:r>
+      <w:r>
+        <w:t>, Austin Nainiger</w:t>
+      </w:r>
+      <w:r>
+        <w:rPr>
+          <w:vertAlign w:val="superscript"/>
+        </w:rPr>
+        <w:t>4</w:t>
+      </w:r>
+      <w:r>
+        <w:t>, Alex Ochs</w:t>
+      </w:r>
+      <w:r>
+        <w:rPr>
+          <w:vertAlign w:val="superscript"/>
+        </w:rPr>
+        <w:t>1</w:t>
+      </w:r>
+      <w:r>
+        <w:t>, Ishfaq Rahman</w:t>
+      </w:r>
+      <w:r>
+        <w:rPr>
+          <w:vertAlign w:val="superscript"/>
+        </w:rPr>
+        <w:t>4</w:t>
+      </w:r>
+      <w:r>
+        <w:t>, Madison Rice</w:t>
+      </w:r>
+      <w:r>
+        <w:rPr>
+          <w:vertAlign w:val="superscript"/>
+        </w:rPr>
+        <w:t>3</w:t>
+      </w:r>
+      <w:r>
+        <w:t>, Leticia Sandoval</w:t>
+      </w:r>
+      <w:r>
+        <w:rPr>
+          <w:vertAlign w:val="superscript"/>
+        </w:rPr>
+        <w:t>4</w:t>
+      </w:r>
+      <w:r>
+        <w:t>, Joseph S. Smith</w:t>
+      </w:r>
+      <w:r>
+        <w:rPr>
+          <w:vertAlign w:val="superscript"/>
+        </w:rPr>
+        <w:t>6</w:t>
+      </w:r>
+      <w:r>
+        <w:t>, Zach Swan</w:t>
+      </w:r>
+      <w:r>
+        <w:rPr>
+          <w:vertAlign w:val="superscript"/>
+        </w:rPr>
+        <w:t>4</w:t>
+      </w:r>
+      <w:r>
+        <w:t xml:space="preserve">, </w:t>
+      </w:r>
+      <w:r>
+        <w:t>Richard Becker</w:t>
+      </w:r>
+      <w:r>
+        <w:rPr>
+          <w:vertAlign w:val="superscript"/>
+        </w:rPr>
+        <w:t>4</w:t>
+      </w:r>
+      <w:r>
+        <w:t>, Thomas Bridgeman</w:t>
+      </w:r>
+      <w:r>
+        <w:rPr>
+          <w:vertAlign w:val="superscript"/>
+        </w:rPr>
+        <w:t>4</w:t>
+      </w:r>
+      <w:r>
+        <w:t>, Stephen J. Jacquemin</w:t>
+      </w:r>
+      <w:r>
+        <w:rPr>
+          <w:vertAlign w:val="superscript"/>
+        </w:rPr>
+        <w:t>5</w:t>
+      </w:r>
+      <w:r>
+        <w:t>, Ganming Liu</w:t>
+      </w:r>
+      <w:r>
+        <w:rPr>
+          <w:vertAlign w:val="superscript"/>
+        </w:rPr>
+        <w:t>2</w:t>
+      </w:r>
+      <w:r>
+        <w:t>, Nathan Manning</w:t>
+      </w:r>
+      <w:r>
+        <w:rPr>
+          <w:vertAlign w:val="superscript"/>
+        </w:rPr>
+        <w:t>2</w:t>
+      </w:r>
+      <w:r>
+        <w:t>, Kevin McCluney</w:t>
+      </w:r>
+      <w:r>
+        <w:rPr>
+          <w:vertAlign w:val="superscript"/>
+        </w:rPr>
+        <w:t>2</w:t>
+      </w:r>
+      <w:r>
+        <w:t>, Helen Michaels</w:t>
+      </w:r>
+      <w:r>
+        <w:rPr>
+          <w:vertAlign w:val="superscript"/>
+        </w:rPr>
+        <w:t>2</w:t>
+      </w:r>
+      <w:r>
+        <w:t>, W. Robert Midden</w:t>
+      </w:r>
+      <w:r>
+        <w:rPr>
+          <w:vertAlign w:val="superscript"/>
+        </w:rPr>
+        <w:t>2</w:t>
+      </w:r>
+      <w:r>
+        <w:t>, Ryan Winston</w:t>
+      </w:r>
+      <w:r>
+        <w:rPr>
+          <w:vertAlign w:val="superscript"/>
+        </w:rPr>
+        <w:t>6</w:t>
+      </w:r>
+      <w:r>
+        <w:t xml:space="preserve">, </w:t>
+      </w:r>
+      <w:r>
+        <w:t>Lauren Kinsman-Costello</w:t>
+      </w:r>
+      <w:r>
+        <w:rPr>
+          <w:vertAlign w:val="superscript"/>
+        </w:rPr>
+        <w:t>1</w:t>
+      </w:r>
+    </w:p>
+    <w:p/>
+    <w:p>
+      <w:r>
+        <w:t xml:space="preserve">Affiliations: </w:t>
       </w:r>
     </w:p>
     <w:p>
@@ -86,11 +421,12 @@
         <w:pStyle w:val="ListParagraph"/>
         <w:numPr>
           <w:ilvl w:val="0"/>
-          <w:numId w:val="5"/>
+          <w:numId w:val="15"/>
         </w:numPr>
+        <w:spacing w:after="0" w:line="240" w:lineRule="auto"/>
       </w:pPr>
       <w:r>
-        <w:t>Table 1. Project summary table</w:t>
+        <w:t>Kent State University</w:t>
       </w:r>
     </w:p>
     <w:p>
@@ -98,17 +434,12 @@
         <w:pStyle w:val="ListParagraph"/>
         <w:numPr>
           <w:ilvl w:val="0"/>
-          <w:numId w:val="5"/>
+          <w:numId w:val="15"/>
         </w:numPr>
+        <w:spacing w:after="0" w:line="240" w:lineRule="auto"/>
       </w:pPr>
       <w:r>
-        <w:t xml:space="preserve">Table </w:t>
-      </w:r>
-      <w:r>
-        <w:t>2</w:t>
-      </w:r>
-      <w:r>
-        <w:t>. Nutrient retention summary table</w:t>
+        <w:t>Bowling Green State University</w:t>
       </w:r>
     </w:p>
     <w:p>
@@ -116,23 +447,15 @@
         <w:pStyle w:val="ListParagraph"/>
         <w:numPr>
           <w:ilvl w:val="0"/>
-          <w:numId w:val="5"/>
+          <w:numId w:val="15"/>
         </w:numPr>
+        <w:spacing w:after="0" w:line="240" w:lineRule="auto"/>
       </w:pPr>
       <w:r>
-        <w:t xml:space="preserve">Table </w:t>
-      </w:r>
-      <w:r>
-        <w:t>3</w:t>
-      </w:r>
-      <w:r>
-        <w:t xml:space="preserve">. </w:t>
-      </w:r>
-      <w:r>
-        <w:t>Budget filtration table</w:t>
-      </w:r>
-      <w:r>
-        <w:t xml:space="preserve"> (MAYBE IN SI)</w:t>
+        <w:t>Heidelberg University</w:t>
+      </w:r>
+      <w:r>
+        <w:t xml:space="preserve"> </w:t>
       </w:r>
     </w:p>
     <w:p>
@@ -140,26 +463,12 @@
         <w:pStyle w:val="ListParagraph"/>
         <w:numPr>
           <w:ilvl w:val="0"/>
-          <w:numId w:val="5"/>
+          <w:numId w:val="15"/>
         </w:numPr>
+        <w:spacing w:after="0" w:line="240" w:lineRule="auto"/>
       </w:pPr>
       <w:r>
-        <w:t xml:space="preserve">Table </w:t>
-      </w:r>
-      <w:r>
-        <w:t>4</w:t>
-      </w:r>
-      <w:r>
-        <w:t>. Scenario comparison scaling up nutrient retention numbers to address Maumee River Watershed goals</w:t>
-      </w:r>
-      <w:r>
-        <w:t xml:space="preserve"> (or alt make this Box 1.)</w:t>
-      </w:r>
-    </w:p>
-    <w:p/>
-    <w:p>
-      <w:r>
-        <w:t xml:space="preserve">Supplemental Material: </w:t>
+        <w:t>University of Toledo</w:t>
       </w:r>
     </w:p>
     <w:p>
@@ -167,11 +476,12 @@
         <w:pStyle w:val="ListParagraph"/>
         <w:numPr>
           <w:ilvl w:val="0"/>
-          <w:numId w:val="5"/>
+          <w:numId w:val="15"/>
         </w:numPr>
+        <w:spacing w:after="0" w:line="240" w:lineRule="auto"/>
       </w:pPr>
       <w:r>
-        <w:t>Table of individual project characteristics</w:t>
+        <w:t>Wright State University</w:t>
       </w:r>
     </w:p>
     <w:p>
@@ -179,30 +489,13 @@
         <w:pStyle w:val="ListParagraph"/>
         <w:numPr>
           <w:ilvl w:val="0"/>
-          <w:numId w:val="5"/>
+          <w:numId w:val="15"/>
         </w:numPr>
+        <w:spacing w:after="0" w:line="240" w:lineRule="auto"/>
       </w:pPr>
       <w:r>
-        <w:t>Nutrient budget methods across all projects</w:t>
-      </w:r>
-    </w:p>
-    <w:p>
-      <w:pPr>
-        <w:pStyle w:val="ListParagraph"/>
-        <w:numPr>
-          <w:ilvl w:val="0"/>
-          <w:numId w:val="5"/>
-        </w:numPr>
-      </w:pPr>
-      <w:r>
-        <w:t>LOO figure</w:t>
-      </w:r>
-    </w:p>
-    <w:p/>
-    <w:p/>
-    <w:p/>
-    <w:p/>
-    <w:p>
+        <w:t xml:space="preserve">Ohio State University </w:t>
+      </w:r>
       <w:r>
         <w:br w:type="page"/>
       </w:r>
@@ -1972,7 +2265,7 @@
         <w:rPr>
           <w:rFonts w:ascii="Aptos" w:hAnsi="Aptos"/>
         </w:rPr>
-        <w:t>(Ohio Environmental Protection Agency (EPA) 2023)</w:t>
+        <w:t>(Ohio Environmentla Protection Agency (EPA) 2023)</w:t>
       </w:r>
       <w:r>
         <w:fldChar w:fldCharType="end"/>
@@ -3779,10 +4072,7 @@
         <w:fldChar w:fldCharType="begin"/>
       </w:r>
       <w:r>
-        <w:instrText xml:space="preserve"> REF _Ref238473448 \h </w:instrText>
-      </w:r>
-      <w:r>
-        <w:instrText xml:space="preserve"> \* MERGEFORMAT </w:instrText>
+        <w:instrText xml:space="preserve"> REF _Ref238473448 \h  \* MERGEFORMAT </w:instrText>
       </w:r>
       <w:r>
         <w:fldChar w:fldCharType="separate"/>
@@ -4005,7 +4295,7 @@
         <w:t xml:space="preserve">Scaling up: </w:t>
       </w:r>
       <w:r>
-        <w:t>TMDL calculation blurb</w:t>
+        <w:t xml:space="preserve">TMDL calculation </w:t>
       </w:r>
     </w:p>
     <w:p>
@@ -4017,10 +4307,31 @@
         </w:numPr>
       </w:pPr>
       <w:r>
-        <w:t xml:space="preserve">Take blurb from annual report. Give some summary of </w:t>
-      </w:r>
-      <w:r>
-        <w:t>TMDL/math</w:t>
+        <w:t xml:space="preserve">Talk about current number of wetlands built compared to how many connected wetlands would be needed. Highlight that </w:t>
+      </w:r>
+      <w:r>
+        <w:t xml:space="preserve">meeting TMDL goals is </w:t>
+      </w:r>
+      <w:r>
+        <w:t>in the realm of the possible</w:t>
+      </w:r>
+      <w:r>
+        <w:t xml:space="preserve"> (if we use connected wetlands… or just build a TON of the basic wetlands)</w:t>
+      </w:r>
+      <w:r>
+        <w:t>!</w:t>
+      </w:r>
+    </w:p>
+    <w:p>
+      <w:pPr>
+        <w:pStyle w:val="ListParagraph"/>
+        <w:numPr>
+          <w:ilvl w:val="0"/>
+          <w:numId w:val="14"/>
+        </w:numPr>
+      </w:pPr>
+      <w:r>
+        <w:t>Conclude that connected wetlands can be effective tools for nutrient retention</w:t>
       </w:r>
     </w:p>
     <w:p>
@@ -4032,29 +4343,17 @@
         </w:numPr>
       </w:pPr>
       <w:r>
-        <w:t>Cite some landscape scale nutrient retention papers</w:t>
+        <w:t>Cite TNC report to talk about co-benefits</w:t>
+      </w:r>
+    </w:p>
+    <w:p/>
+    <w:p>
+      <w:r>
+        <w:br w:type="page"/>
       </w:r>
     </w:p>
     <w:p>
       <w:pPr>
-        <w:pStyle w:val="ListParagraph"/>
-        <w:numPr>
-          <w:ilvl w:val="0"/>
-          <w:numId w:val="14"/>
-        </w:numPr>
-      </w:pPr>
-      <w:r>
-        <w:t>Conclude that connected wetlands can be effective tools for nutrient retention</w:t>
-      </w:r>
-    </w:p>
-    <w:p/>
-    <w:p>
-      <w:r>
-        <w:br w:type="page"/>
-      </w:r>
-    </w:p>
-    <w:p>
-      <w:pPr>
         <w:rPr>
           <w:b/>
           <w:bCs/>
@@ -4067,16 +4366,16 @@
         </w:rPr>
         <w:lastRenderedPageBreak/>
         <w:drawing>
-          <wp:anchor distT="0" distB="0" distL="114300" distR="114300" simplePos="0" relativeHeight="251659264" behindDoc="1" locked="0" layoutInCell="1" allowOverlap="1" wp14:anchorId="3F08B5C6" wp14:editId="0FABA071">
+          <wp:anchor distT="0" distB="0" distL="114300" distR="114300" simplePos="0" relativeHeight="251659264" behindDoc="1" locked="0" layoutInCell="1" allowOverlap="1" wp14:anchorId="3F08B5C6" wp14:editId="76881821">
             <wp:simplePos x="0" y="0"/>
             <wp:positionH relativeFrom="margin">
-              <wp:posOffset>-76200</wp:posOffset>
+              <wp:posOffset>-74930</wp:posOffset>
             </wp:positionH>
             <wp:positionV relativeFrom="paragraph">
-              <wp:posOffset>304800</wp:posOffset>
+              <wp:posOffset>307975</wp:posOffset>
             </wp:positionV>
-            <wp:extent cx="3105150" cy="2691765"/>
-            <wp:effectExtent l="0" t="0" r="0" b="0"/>
+            <wp:extent cx="3476625" cy="3013710"/>
+            <wp:effectExtent l="0" t="0" r="9525" b="0"/>
             <wp:wrapTopAndBottom/>
             <wp:docPr id="952668208" name="Picture 8"/>
             <wp:cNvGraphicFramePr>
@@ -4107,7 +4406,7 @@
                   <pic:spPr bwMode="auto">
                     <a:xfrm>
                       <a:off x="0" y="0"/>
-                      <a:ext cx="3105150" cy="2691765"/>
+                      <a:ext cx="3476625" cy="3013710"/>
                     </a:xfrm>
                     <a:prstGeom prst="rect">
                       <a:avLst/>
@@ -4125,6 +4424,12 @@
                 </pic:pic>
               </a:graphicData>
             </a:graphic>
+            <wp14:sizeRelH relativeFrom="margin">
+              <wp14:pctWidth>0</wp14:pctWidth>
+            </wp14:sizeRelH>
+            <wp14:sizeRelV relativeFrom="margin">
+              <wp14:pctHeight>0</wp14:pctHeight>
+            </wp14:sizeRelV>
           </wp:anchor>
         </w:drawing>
       </w:r>
@@ -4527,33 +4832,16 @@
           <w:u w:val="single"/>
         </w:rPr>
       </w:pPr>
-    </w:p>
-    <w:p>
-      <w:pPr>
-        <w:rPr>
-          <w:b/>
-          <w:bCs/>
-          <w:u w:val="single"/>
-        </w:rPr>
-      </w:pPr>
       <w:r>
         <w:rPr>
           <w:noProof/>
         </w:rPr>
         <w:lastRenderedPageBreak/>
         <w:drawing>
-          <wp:anchor distT="0" distB="0" distL="114300" distR="114300" simplePos="0" relativeHeight="251660288" behindDoc="0" locked="0" layoutInCell="1" allowOverlap="1" wp14:anchorId="20EBD444" wp14:editId="060B1F79">
-            <wp:simplePos x="0" y="0"/>
-            <wp:positionH relativeFrom="column">
-              <wp:posOffset>-152400</wp:posOffset>
-            </wp:positionH>
-            <wp:positionV relativeFrom="paragraph">
-              <wp:posOffset>228600</wp:posOffset>
-            </wp:positionV>
-            <wp:extent cx="5229225" cy="3940175"/>
-            <wp:effectExtent l="0" t="0" r="9525" b="3175"/>
-            <wp:wrapTopAndBottom/>
-            <wp:docPr id="1854671782" name="Picture 4"/>
+          <wp:inline distT="0" distB="0" distL="0" distR="0" wp14:anchorId="117E5DBF" wp14:editId="0FA3A6F0">
+            <wp:extent cx="5337544" cy="4277448"/>
+            <wp:effectExtent l="0" t="0" r="0" b="8890"/>
+            <wp:docPr id="2036090812" name="Picture 2"/>
             <wp:cNvGraphicFramePr>
               <a:graphicFrameLocks xmlns:a="http://schemas.openxmlformats.org/drawingml/2006/main" noChangeAspect="1"/>
             </wp:cNvGraphicFramePr>
@@ -4561,13 +4849,13 @@
               <a:graphicData uri="http://schemas.openxmlformats.org/drawingml/2006/picture">
                 <pic:pic xmlns:pic="http://schemas.openxmlformats.org/drawingml/2006/picture">
                   <pic:nvPicPr>
-                    <pic:cNvPr id="0" name="Picture 3"/>
+                    <pic:cNvPr id="0" name="Picture 2"/>
                     <pic:cNvPicPr>
                       <a:picLocks noChangeAspect="1" noChangeArrowheads="1"/>
                     </pic:cNvPicPr>
                   </pic:nvPicPr>
                   <pic:blipFill>
-                    <a:blip r:embed="rId11">
+                    <a:blip r:embed="rId11" cstate="print">
                       <a:extLst>
                         <a:ext uri="{28A0092B-C50C-407E-A947-70E740481C1C}">
                           <a14:useLocalDpi xmlns:a14="http://schemas.microsoft.com/office/drawing/2010/main" val="0"/>
@@ -4582,23 +4870,20 @@
                   <pic:spPr bwMode="auto">
                     <a:xfrm>
                       <a:off x="0" y="0"/>
-                      <a:ext cx="5229225" cy="3940175"/>
+                      <a:ext cx="5345860" cy="4284112"/>
                     </a:xfrm>
                     <a:prstGeom prst="rect">
                       <a:avLst/>
                     </a:prstGeom>
                     <a:noFill/>
+                    <a:ln>
+                      <a:noFill/>
+                    </a:ln>
                   </pic:spPr>
                 </pic:pic>
               </a:graphicData>
             </a:graphic>
-            <wp14:sizeRelH relativeFrom="margin">
-              <wp14:pctWidth>0</wp14:pctWidth>
-            </wp14:sizeRelH>
-            <wp14:sizeRelV relativeFrom="margin">
-              <wp14:pctHeight>0</wp14:pctHeight>
-            </wp14:sizeRelV>
-          </wp:anchor>
+          </wp:inline>
         </w:drawing>
       </w:r>
     </w:p>
@@ -4625,13 +4910,13 @@
           <w:u w:val="single"/>
         </w:rPr>
         <w:drawing>
-          <wp:anchor distT="0" distB="0" distL="114300" distR="114300" simplePos="0" relativeHeight="251661312" behindDoc="1" locked="0" layoutInCell="1" allowOverlap="1" wp14:anchorId="6A5526D6" wp14:editId="177CD447">
+          <wp:anchor distT="0" distB="0" distL="114300" distR="114300" simplePos="0" relativeHeight="251661312" behindDoc="1" locked="0" layoutInCell="1" allowOverlap="1" wp14:anchorId="6A5526D6" wp14:editId="1977DAE1">
             <wp:simplePos x="0" y="0"/>
             <wp:positionH relativeFrom="margin">
-              <wp:align>left</wp:align>
+              <wp:posOffset>-127591</wp:posOffset>
             </wp:positionH>
             <wp:positionV relativeFrom="paragraph">
-              <wp:posOffset>4819650</wp:posOffset>
+              <wp:posOffset>931737</wp:posOffset>
             </wp:positionV>
             <wp:extent cx="6284598" cy="1866900"/>
             <wp:effectExtent l="0" t="0" r="1905" b="0"/>
@@ -7147,7 +7432,21 @@
                 <w:b/>
                 <w:bCs/>
               </w:rPr>
-              <w:t>1.95</w:t>
+              <w:t>1.</w:t>
+            </w:r>
+            <w:r>
+              <w:rPr>
+                <w:b/>
+                <w:bCs/>
+              </w:rPr>
+              <w:t>6</w:t>
+            </w:r>
+            <w:r>
+              <w:rPr>
+                <w:b/>
+                <w:bCs/>
+              </w:rPr>
+              <w:t>5</w:t>
             </w:r>
           </w:p>
         </w:tc>
@@ -7175,7 +7474,21 @@
                 <w:b/>
                 <w:bCs/>
               </w:rPr>
-              <w:t>102,000</w:t>
+              <w:t>1</w:t>
+            </w:r>
+            <w:r>
+              <w:rPr>
+                <w:b/>
+                <w:bCs/>
+              </w:rPr>
+              <w:t>20</w:t>
+            </w:r>
+            <w:r>
+              <w:rPr>
+                <w:b/>
+                <w:bCs/>
+              </w:rPr>
+              <w:t>,000</w:t>
             </w:r>
           </w:p>
         </w:tc>
@@ -7237,13 +7550,17 @@
           <w:p>
             <w:pPr>
               <w:spacing w:line="240" w:lineRule="auto"/>
-            </w:pPr>
-            <w:r>
               <w:rPr>
                 <w:b/>
                 <w:bCs/>
               </w:rPr>
-              <w:t>5.2</w:t>
+            </w:pPr>
+            <w:r>
+              <w:rPr>
+                <w:b/>
+                <w:bCs/>
+              </w:rPr>
+              <w:t>4.78</w:t>
             </w:r>
           </w:p>
         </w:tc>
@@ -7268,7 +7585,21 @@
                 <w:b/>
                 <w:bCs/>
               </w:rPr>
-              <w:t>38,000</w:t>
+              <w:t>4</w:t>
+            </w:r>
+            <w:r>
+              <w:rPr>
+                <w:b/>
+                <w:bCs/>
+              </w:rPr>
+              <w:t>0</w:t>
+            </w:r>
+            <w:r>
+              <w:rPr>
+                <w:b/>
+                <w:bCs/>
+              </w:rPr>
+              <w:t>,000</w:t>
             </w:r>
           </w:p>
         </w:tc>
@@ -7371,7 +7702,14 @@
                 <w:b/>
                 <w:bCs/>
               </w:rPr>
-              <w:t>1,800</w:t>
+              <w:t>2,0</w:t>
+            </w:r>
+            <w:r>
+              <w:rPr>
+                <w:b/>
+                <w:bCs/>
+              </w:rPr>
+              <w:t>00</w:t>
             </w:r>
           </w:p>
         </w:tc>
@@ -7443,10 +7781,10 @@
           <w:noProof/>
         </w:rPr>
         <w:drawing>
-          <wp:inline distT="0" distB="0" distL="0" distR="0" wp14:anchorId="05F99594" wp14:editId="52EBFC65">
-            <wp:extent cx="3543300" cy="2186722"/>
-            <wp:effectExtent l="0" t="0" r="0" b="4445"/>
-            <wp:docPr id="427285277" name="Picture 12"/>
+          <wp:inline distT="0" distB="0" distL="0" distR="0" wp14:anchorId="5095ABEC" wp14:editId="421A2C68">
+            <wp:extent cx="5816009" cy="5816009"/>
+            <wp:effectExtent l="0" t="0" r="0" b="0"/>
+            <wp:docPr id="2065416054" name="Picture 1"/>
             <wp:cNvGraphicFramePr>
               <a:graphicFrameLocks xmlns:a="http://schemas.openxmlformats.org/drawingml/2006/main" noChangeAspect="1"/>
             </wp:cNvGraphicFramePr>
@@ -7454,7 +7792,7 @@
               <a:graphicData uri="http://schemas.openxmlformats.org/drawingml/2006/picture">
                 <pic:pic xmlns:pic="http://schemas.openxmlformats.org/drawingml/2006/picture">
                   <pic:nvPicPr>
-                    <pic:cNvPr id="0" name="Picture 7"/>
+                    <pic:cNvPr id="0" name="Picture 1"/>
                     <pic:cNvPicPr>
                       <a:picLocks noChangeAspect="1" noChangeArrowheads="1"/>
                     </pic:cNvPicPr>
@@ -7475,12 +7813,15 @@
                   <pic:spPr bwMode="auto">
                     <a:xfrm>
                       <a:off x="0" y="0"/>
-                      <a:ext cx="3546561" cy="2188734"/>
+                      <a:ext cx="5819388" cy="5819388"/>
                     </a:xfrm>
                     <a:prstGeom prst="rect">
                       <a:avLst/>
                     </a:prstGeom>
                     <a:noFill/>
+                    <a:ln>
+                      <a:noFill/>
+                    </a:ln>
                   </pic:spPr>
                 </pic:pic>
               </a:graphicData>
@@ -7572,12 +7913,59 @@
           <w:sz w:val="22"/>
           <w:szCs w:val="22"/>
         </w:rPr>
-        <w:t>. LOO analysis figure</w:t>
+        <w:t xml:space="preserve">. </w:t>
       </w:r>
       <w:bookmarkEnd w:id="14"/>
+      <w:r>
+        <w:rPr>
+          <w:i w:val="0"/>
+          <w:iCs w:val="0"/>
+          <w:color w:val="auto"/>
+          <w:sz w:val="22"/>
+          <w:szCs w:val="22"/>
+        </w:rPr>
+        <w:t>Root mean square error (RMSE) of linear models of monthly TP retention ~ inflow volume</w:t>
+      </w:r>
+      <w:r>
+        <w:rPr>
+          <w:i w:val="0"/>
+          <w:iCs w:val="0"/>
+          <w:color w:val="auto"/>
+          <w:sz w:val="22"/>
+          <w:szCs w:val="22"/>
+        </w:rPr>
+        <w:t>. Each bar represents the RMSE for a) the model with the listed wetland removed</w:t>
+      </w:r>
+      <w:r>
+        <w:rPr>
+          <w:i w:val="0"/>
+          <w:iCs w:val="0"/>
+          <w:color w:val="auto"/>
+          <w:sz w:val="22"/>
+          <w:szCs w:val="22"/>
+        </w:rPr>
+        <w:t xml:space="preserve"> or b) the performance of the model predicting TP retention of the removed wetland. </w:t>
+      </w:r>
     </w:p>
     <w:p>
-      <w:r>
+      <w:pPr>
+        <w:pStyle w:val="Caption"/>
+        <w:rPr>
+          <w:i w:val="0"/>
+          <w:iCs w:val="0"/>
+          <w:color w:val="auto"/>
+          <w:sz w:val="22"/>
+          <w:szCs w:val="22"/>
+        </w:rPr>
+      </w:pPr>
+      <w:bookmarkStart w:id="15" w:name="_Ref238453741"/>
+    </w:p>
+    <w:p>
+      <w:r>
+        <w:rPr>
+          <w:i/>
+          <w:iCs/>
+        </w:rPr>
         <w:br w:type="page"/>
       </w:r>
     </w:p>
@@ -7593,7 +7981,6 @@
           <w:szCs w:val="22"/>
         </w:rPr>
       </w:pPr>
-      <w:bookmarkStart w:id="15" w:name="_Ref238453741"/>
       <w:r>
         <w:rPr>
           <w:i w:val="0"/>
@@ -20909,6 +21296,319 @@
       </w:tr>
     </w:tbl>
     <w:p/>
+    <w:p>
+      <w:r>
+        <w:br w:type="page"/>
+      </w:r>
+    </w:p>
+    <w:p>
+      <w:pPr>
+        <w:pStyle w:val="Bibliography"/>
+        <w:rPr>
+          <w:rFonts w:ascii="Aptos" w:hAnsi="Aptos" w:cs="Times New Roman"/>
+          <w:b/>
+          <w:bCs/>
+          <w:kern w:val="0"/>
+          <w:u w:val="single"/>
+        </w:rPr>
+      </w:pPr>
+      <w:r>
+        <w:rPr>
+          <w:rFonts w:ascii="Aptos" w:hAnsi="Aptos" w:cs="Times New Roman"/>
+          <w:b/>
+          <w:bCs/>
+          <w:kern w:val="0"/>
+          <w:u w:val="single"/>
+        </w:rPr>
+        <w:lastRenderedPageBreak/>
+        <w:t>References:</w:t>
+      </w:r>
+    </w:p>
+    <w:p>
+      <w:pPr>
+        <w:pStyle w:val="Bibliography"/>
+      </w:pPr>
+      <w:r>
+        <w:fldChar w:fldCharType="begin"/>
+      </w:r>
+      <w:r>
+        <w:instrText xml:space="preserve"> ADDIN ZOTERO_BIBL {"uncited":[],"omitted":[],"custom":[]} CSL_BIBLIOGRAPHY </w:instrText>
+      </w:r>
+      <w:r>
+        <w:fldChar w:fldCharType="separate"/>
+      </w:r>
+      <w:r>
+        <w:t>Allen, R. G., L. S. Pereira, D. Raes, and M. Smith. 1998. Crop evapotranspiration-Guidelines for computing crop water requirements-FAO Irrigation and drainage paper 56. Fao, rome 300:D05109.</w:t>
+      </w:r>
+    </w:p>
+    <w:p>
+      <w:pPr>
+        <w:pStyle w:val="Bibliography"/>
+      </w:pPr>
+      <w:r>
+        <w:t>Anderson, D. M., P. M. Glibert, and J. M. Burkholder. 2002. Harmful algal blooms and eutrophication: Nutrient sources, composition, and consequences. Estuaries 25:704–726.</w:t>
+      </w:r>
+    </w:p>
+    <w:p>
+      <w:pPr>
+        <w:pStyle w:val="Bibliography"/>
+      </w:pPr>
+      <w:r>
+        <w:t>Anderson, K. J., B. Adhikari, O. F. Schloegel, R. Marques Mendonca, M. P. Back, N. Brocato, J. A. Cianci-Gaskill, S. E. McMurray, C. Bahlai, D. M. Costello, and L. Kinsman-Costello. 2024. We know less about phosphorus retention in constructed wetlands than we think we do: A quantitative literature synthesis. Ecological Indicators 169:112969.</w:t>
+      </w:r>
+    </w:p>
+    <w:p>
+      <w:pPr>
+        <w:pStyle w:val="Bibliography"/>
+      </w:pPr>
+      <w:r>
+        <w:t>Atkinson, C. L., and C. C. Vaughn. 2015. Biogeochemical hotspots: temporal and spatial scaling of the impact of freshwater mussels on ecosystem function. Freshwater Biology 60:563–574.</w:t>
+      </w:r>
+    </w:p>
+    <w:p>
+      <w:pPr>
+        <w:pStyle w:val="Bibliography"/>
+      </w:pPr>
+      <w:r>
+        <w:t>Aziz, T., and P. Van Cappellen. 2021. Economic valuation of suspended sediment and phosphorus filtration services by four different wetland types: A preliminary assessment for southern Ontario, Canada. Hydrological Processes 35:e14442.</w:t>
+      </w:r>
+    </w:p>
+    <w:p>
+      <w:pPr>
+        <w:pStyle w:val="Bibliography"/>
+      </w:pPr>
+      <w:r>
+        <w:t>Bingham, M., S. K. Sinha, and F. Lupi. 2015. Economic benefits of reducing harmful algal blooms in Lake Erie. Environmental Consulting &amp; Technology, Inc., Report 66.</w:t>
+      </w:r>
+    </w:p>
+    <w:p>
+      <w:pPr>
+        <w:pStyle w:val="Bibliography"/>
+      </w:pPr>
+      <w:r>
+        <w:t>Carpenter, S. R., N. F. Caraco, D. L. Correll, R. W. Howarth, A. N. Sharpley, and V. H. Smith. 1998. Nonpoint Pollution of Surface Waters with Phosphorus and Nitrogen. Ecological Applications 8:559–568.</w:t>
+      </w:r>
+    </w:p>
+    <w:p>
+      <w:pPr>
+        <w:pStyle w:val="Bibliography"/>
+      </w:pPr>
+      <w:r>
+        <w:t>Cheng, F. Y., and N. B. Basu. 2017. Biogeochemical hotspots: Role of small water bodies in landscape nutrient processing. Water Resources Research 53:5038–5056.</w:t>
+      </w:r>
+    </w:p>
+    <w:p>
+      <w:pPr>
+        <w:pStyle w:val="Bibliography"/>
+      </w:pPr>
+      <w:r>
+        <w:lastRenderedPageBreak/>
+        <w:t>Cheng, F. Y., J. Park, M. Kumar, and N. B. Basu. 2023. Disconnectivity matters: the outsized role of small ephemeral wetlands in landscape-scale nutrient retention. Environmental Research Letters 18:024018.</w:t>
+      </w:r>
+    </w:p>
+    <w:p>
+      <w:pPr>
+        <w:pStyle w:val="Bibliography"/>
+      </w:pPr>
+      <w:r>
+        <w:t>Collins, S. D., S. Shukla, and N. K. Shrestha. 2016. Drainage ditches have sufficient adsorption capacity but inadequate residence time for phosphorus retention in the Everglades. Ecological Engineering 92:218–228.</w:t>
+      </w:r>
+    </w:p>
+    <w:p>
+      <w:pPr>
+        <w:pStyle w:val="Bibliography"/>
+      </w:pPr>
+      <w:r>
+        <w:t>Fennessy, M. S., A. D. Jacobs, and M. E. Kentula. 2007. An evaluation of rapid methods for assessing the ecological condition of wetlands. Wetlands 27:543–560.</w:t>
+      </w:r>
+    </w:p>
+    <w:p>
+      <w:pPr>
+        <w:pStyle w:val="Bibliography"/>
+      </w:pPr>
+      <w:r>
+        <w:t>Hamner, B., M. Frasco, and E. LeDell. 2018. Package ‘metrics.’ R Foundation for Statistical Computing.</w:t>
+      </w:r>
+    </w:p>
+    <w:p>
+      <w:pPr>
+        <w:pStyle w:val="Bibliography"/>
+      </w:pPr>
+      <w:r>
+        <w:t>Hanrahan, B. R., K. W. King, M. R. Williams, E. W. Duncan, L. A. Pease, and G. A. LaBarge. 2019. Nutrient balances influence hydrologic losses of nitrogen and phosphorus across agricultural fields in northwestern Ohio. Nutrient Cycling in Agroecosystems 113:231–245.</w:t>
+      </w:r>
+    </w:p>
+    <w:p>
+      <w:pPr>
+        <w:pStyle w:val="Bibliography"/>
+      </w:pPr>
+      <w:r>
+        <w:t>Heisler, J., P. M. Glibert, J. M. Burkholder, D. M. Anderson, W. Cochlan, W. C. Dennison, Q. Dortch, C. J. Gobler, C. A. Heil, E. Humphries, A. Lewitus, R. Magnien, H. G. Marshall, K. Sellner, D. A. Stockwell, D. K. Stoecker, and M. Suddleson. 2008. Eutrophication and harmful algal blooms: A scientific consensus. Harmful Algae 8:3–13.</w:t>
+      </w:r>
+    </w:p>
+    <w:p>
+      <w:pPr>
+        <w:pStyle w:val="Bibliography"/>
+      </w:pPr>
+      <w:r>
+        <w:t>International Joint Commission. 2014. A Balanced Diet for Lake Erie. International Joint Commission.</w:t>
+      </w:r>
+    </w:p>
+    <w:p>
+      <w:pPr>
+        <w:pStyle w:val="Bibliography"/>
+      </w:pPr>
+      <w:r>
+        <w:t>Jacquemin, S. J., L. T. Johnson, T. A. Dirksen, and G. McGlinch. 2018. Changes in Water Quality of Grand Lake St. Marys Watershed Following Implementation of a Distressed Watershed Rules Package. Journal of Environmental Quality 47:113–120.</w:t>
+      </w:r>
+    </w:p>
+    <w:p>
+      <w:pPr>
+        <w:pStyle w:val="Bibliography"/>
+      </w:pPr>
+      <w:r>
+        <w:t xml:space="preserve">Kinsman-Costello, L. E., K. Fussel, C. Winslow, J. Kerns, O. Schloegel, R. Mendonça, R. Becker, T. B. Bridgeman, K. Doro, S. J. Jacquemin, L. Johnson, G. Liu, K. McCluney, H. Michaels, W. R. </w:t>
+      </w:r>
+      <w:r>
+        <w:lastRenderedPageBreak/>
+        <w:t>Midden, S. E. Newell, M. Back, L. Brown, I. Rahman, and Z. Swan. 2024. H2Ohio Wetland Monitoring Program:Monitoring Framework. Columbus, OH, USA.</w:t>
+      </w:r>
+    </w:p>
+    <w:p>
+      <w:pPr>
+        <w:pStyle w:val="Bibliography"/>
+      </w:pPr>
+      <w:r>
+        <w:t>Land, M., W. Granéli, A. Grimvall, C. C. Hoffmann, W. J. Mitsch, K. S. Tonderski, and J. T. A. Verhoeven. 2016. How effective are created or restored freshwater wetlands for nitrogen and phosphorus removal? A systematic review. Environmental Evidence 5:9.</w:t>
+      </w:r>
+    </w:p>
+    <w:p>
+      <w:pPr>
+        <w:pStyle w:val="Bibliography"/>
+      </w:pPr>
+      <w:r>
+        <w:t>Lucas, W. C., and M. Greenway. 2008. Nutrient Retention in Vegetated and Nonvegetated Bioretention Mesocosms. Journal of Irrigation and Drainage Engineering 134:613–623.</w:t>
+      </w:r>
+    </w:p>
+    <w:p>
+      <w:pPr>
+        <w:pStyle w:val="Bibliography"/>
+      </w:pPr>
+      <w:r>
+        <w:t>Marton, J. M., I. F. Creed, D. B. Lewis, C. R. Lane, N. B. Basu, M. J. Cohen, and C. B. Craft. 2015. Geographically isolated wetlands are important biogeochemical reactors on the landscape. Bioscience 65:408–418.</w:t>
+      </w:r>
+    </w:p>
+    <w:p>
+      <w:pPr>
+        <w:pStyle w:val="Bibliography"/>
+      </w:pPr>
+      <w:r>
+        <w:t>Michalak, A. M., E. J. Anderson, D. Beletsky, S. Boland, N. S. Bosch, T. B. Bridgeman, J. D. Chaffin, K. Cho, R. Confesor, I. Daloğlu, J. V. DePinto, M. A. Evans, G. L. Fahnenstiel, L. He, J. C. Ho, L. Jenkins, T. H. Johengen, K. C. Kuo, E. LaPorte, X. Liu, M. R. McWilliams, M. R. Moore, D. J. Posselt, R. P. Richards, D. Scavia, A. L. Steiner, E. Verhamme, D. M. Wright, and M. A. Zagorski. 2013. Record-setting algal bloom in Lake Erie caused by agricultural and meteorological trends consistent with expected future conditions. Proceedings of the National Academy of Sciences 110:6448–6452.</w:t>
+      </w:r>
+    </w:p>
+    <w:p>
+      <w:pPr>
+        <w:pStyle w:val="Bibliography"/>
+      </w:pPr>
+      <w:r>
+        <w:t>Mitsch, W. J. 2017. Solving Lake Erie’s harmful algal blooms by restoring the Great Black Swamp in Ohio. Ecological Engineering 108:406–413.</w:t>
+      </w:r>
+    </w:p>
+    <w:p>
+      <w:pPr>
+        <w:pStyle w:val="Bibliography"/>
+      </w:pPr>
+      <w:r>
+        <w:t>Mitsch, W. J., S. M. Nedrich, S. K. Harter, C. Anderson, A. M. Nahlik, and B. Bernal. 2014. Sedimentation in created freshwater riverine wetlands: 15 years of succession and contrast of methods. Ecological Engineering 72:25–34.</w:t>
+      </w:r>
+    </w:p>
+    <w:p>
+      <w:pPr>
+        <w:pStyle w:val="Bibliography"/>
+      </w:pPr>
+      <w:r>
+        <w:lastRenderedPageBreak/>
+        <w:t>Ohio Environmentla Protection Agency (EPA). 2023. Maumee Watershed Nutrient Total Maximum Daily Load. Division of Surface Water, Assessment and Modeling Section, Columbus, OH, USA.</w:t>
+      </w:r>
+    </w:p>
+    <w:p>
+      <w:pPr>
+        <w:pStyle w:val="Bibliography"/>
+      </w:pPr>
+      <w:r>
+        <w:t>R Core Team. 2024. R: A language and environment for statistical computing. R Foundation for Statistical Computing, Vienna Austria.</w:t>
+      </w:r>
+    </w:p>
+    <w:p>
+      <w:pPr>
+        <w:pStyle w:val="Bibliography"/>
+      </w:pPr>
+      <w:r>
+        <w:t>Silvan, N., H. Vasander, and J. Laine. 2004. Vegetation is the main factor in nutrient retention in a constructed wetland buffer. Plant and Soil 258:179–187.</w:t>
+      </w:r>
+    </w:p>
+    <w:p>
+      <w:pPr>
+        <w:pStyle w:val="Bibliography"/>
+      </w:pPr>
+      <w:r>
+        <w:t>Smith, V. H., and D. W. Schindler. 2009. Eutrophication science: where do we go from here? Trends in ecology &amp; evolution 24:201–207.</w:t>
+      </w:r>
+    </w:p>
+    <w:p>
+      <w:pPr>
+        <w:pStyle w:val="Bibliography"/>
+      </w:pPr>
+      <w:r>
+        <w:t>Sparks, A. 2018. nasapower: A NASA POWER Global Meteorology, Surface Solar Energy and Climatology Data Client for R. Journal of Open Source Software 3:1035.</w:t>
+      </w:r>
+    </w:p>
+    <w:p>
+      <w:pPr>
+        <w:pStyle w:val="Bibliography"/>
+      </w:pPr>
+      <w:r>
+        <w:t>Ury, E. A., P. Arrumugam, E. R. Herbert, P. Badiou, B. Page, and N. B. Basu. 2023. Source or sink? Meta-analysis reveals diverging controls of phosphorus retention and release in restored and constructed wetlands. Environmental Research Letters 18:083002.</w:t>
+      </w:r>
+    </w:p>
+    <w:p>
+      <w:pPr>
+        <w:pStyle w:val="Bibliography"/>
+      </w:pPr>
+      <w:r>
+        <w:t>USDA-NRCS. 2004. Estimation of Direct Runoff from Storm Rainfall. Page National Engineering Handbook, Title 210 Engineering. United States Department of Agriculture Natural Resources Conservation Service.</w:t>
+      </w:r>
+    </w:p>
+    <w:p>
+      <w:pPr>
+        <w:pStyle w:val="Bibliography"/>
+      </w:pPr>
+      <w:r>
+        <w:t>Vymazal, J. 2007. Removal of nutrients in various types of constructed wetlands. Science of The Total Environment 380:48–65.</w:t>
+      </w:r>
+    </w:p>
+    <w:p>
+      <w:pPr>
+        <w:pStyle w:val="Bibliography"/>
+      </w:pPr>
+      <w:r>
+        <w:t>Weisner, S. E. B., K. Johannesson, G. Thiere, H. Svengren, P. M. Ehde, and K. S. Tonderski. 2016. National Large-Scale Wetland Creation in Agricultural Areas—Potential versus Realized Effects on Nutrient Transports. Water 8:544.</w:t>
+      </w:r>
+    </w:p>
+    <w:p>
+      <w:pPr>
+        <w:pStyle w:val="Bibliography"/>
+      </w:pPr>
+      <w:r>
+        <w:t>Wurtsbaugh, W. A., H. W. Paerl, and W. K. Dodds. 2019. Nutrients, eutrophication and harmful algal blooms along the freshwater to marine continuum. WIREs Water 6:e1373.</w:t>
+      </w:r>
+    </w:p>
+    <w:p>
+      <w:r>
+        <w:lastRenderedPageBreak/>
+        <w:fldChar w:fldCharType="end"/>
+      </w:r>
+    </w:p>
     <w:sectPr>
       <w:pgSz w:w="12240" w:h="15840"/>
       <w:pgMar w:top="1440" w:right="1440" w:bottom="1440" w:left="1440" w:header="720" w:footer="720" w:gutter="0"/>
@@ -21484,6 +22184,92 @@
     </w:lvl>
   </w:abstractNum>
   <w:abstractNum w:abstractNumId="4" w15:restartNumberingAfterBreak="0">
+    <w:nsid w:val="2E3B371D"/>
+    <w:multiLevelType w:val="hybridMultilevel"/>
+    <w:tmpl w:val="158AD15C"/>
+    <w:lvl w:ilvl="0" w:tplc="0409000F">
+      <w:start w:val="1"/>
+      <w:numFmt w:val="decimal"/>
+      <w:lvlText w:val="%1."/>
+      <w:lvlJc w:val="left"/>
+      <w:pPr>
+        <w:ind w:left="720" w:hanging="360"/>
+      </w:pPr>
+    </w:lvl>
+    <w:lvl w:ilvl="1" w:tplc="04090019" w:tentative="1">
+      <w:start w:val="1"/>
+      <w:numFmt w:val="lowerLetter"/>
+      <w:lvlText w:val="%2."/>
+      <w:lvlJc w:val="left"/>
+      <w:pPr>
+        <w:ind w:left="1440" w:hanging="360"/>
+      </w:pPr>
+    </w:lvl>
+    <w:lvl w:ilvl="2" w:tplc="0409001B" w:tentative="1">
+      <w:start w:val="1"/>
+      <w:numFmt w:val="lowerRoman"/>
+      <w:lvlText w:val="%3."/>
+      <w:lvlJc w:val="right"/>
+      <w:pPr>
+        <w:ind w:left="2160" w:hanging="180"/>
+      </w:pPr>
+    </w:lvl>
+    <w:lvl w:ilvl="3" w:tplc="0409000F" w:tentative="1">
+      <w:start w:val="1"/>
+      <w:numFmt w:val="decimal"/>
+      <w:lvlText w:val="%4."/>
+      <w:lvlJc w:val="left"/>
+      <w:pPr>
+        <w:ind w:left="2880" w:hanging="360"/>
+      </w:pPr>
+    </w:lvl>
+    <w:lvl w:ilvl="4" w:tplc="04090019" w:tentative="1">
+      <w:start w:val="1"/>
+      <w:numFmt w:val="lowerLetter"/>
+      <w:lvlText w:val="%5."/>
+      <w:lvlJc w:val="left"/>
+      <w:pPr>
+        <w:ind w:left="3600" w:hanging="360"/>
+      </w:pPr>
+    </w:lvl>
+    <w:lvl w:ilvl="5" w:tplc="0409001B" w:tentative="1">
+      <w:start w:val="1"/>
+      <w:numFmt w:val="lowerRoman"/>
+      <w:lvlText w:val="%6."/>
+      <w:lvlJc w:val="right"/>
+      <w:pPr>
+        <w:ind w:left="4320" w:hanging="180"/>
+      </w:pPr>
+    </w:lvl>
+    <w:lvl w:ilvl="6" w:tplc="0409000F" w:tentative="1">
+      <w:start w:val="1"/>
+      <w:numFmt w:val="decimal"/>
+      <w:lvlText w:val="%7."/>
+      <w:lvlJc w:val="left"/>
+      <w:pPr>
+        <w:ind w:left="5040" w:hanging="360"/>
+      </w:pPr>
+    </w:lvl>
+    <w:lvl w:ilvl="7" w:tplc="04090019" w:tentative="1">
+      <w:start w:val="1"/>
+      <w:numFmt w:val="lowerLetter"/>
+      <w:lvlText w:val="%8."/>
+      <w:lvlJc w:val="left"/>
+      <w:pPr>
+        <w:ind w:left="5760" w:hanging="360"/>
+      </w:pPr>
+    </w:lvl>
+    <w:lvl w:ilvl="8" w:tplc="0409001B" w:tentative="1">
+      <w:start w:val="1"/>
+      <w:numFmt w:val="lowerRoman"/>
+      <w:lvlText w:val="%9."/>
+      <w:lvlJc w:val="right"/>
+      <w:pPr>
+        <w:ind w:left="6480" w:hanging="180"/>
+      </w:pPr>
+    </w:lvl>
+  </w:abstractNum>
+  <w:abstractNum w:abstractNumId="5" w15:restartNumberingAfterBreak="0">
     <w:nsid w:val="35472B69"/>
     <w:multiLevelType w:val="hybridMultilevel"/>
     <w:tmpl w:val="43E621FA"/>
@@ -21572,7 +22358,7 @@
       </w:pPr>
     </w:lvl>
   </w:abstractNum>
-  <w:abstractNum w:abstractNumId="5" w15:restartNumberingAfterBreak="0">
+  <w:abstractNum w:abstractNumId="6" w15:restartNumberingAfterBreak="0">
     <w:nsid w:val="3D3A182D"/>
     <w:multiLevelType w:val="hybridMultilevel"/>
     <w:tmpl w:val="48B481EC"/>
@@ -21685,7 +22471,7 @@
       </w:rPr>
     </w:lvl>
   </w:abstractNum>
-  <w:abstractNum w:abstractNumId="6" w15:restartNumberingAfterBreak="0">
+  <w:abstractNum w:abstractNumId="7" w15:restartNumberingAfterBreak="0">
     <w:nsid w:val="402A5E45"/>
     <w:multiLevelType w:val="hybridMultilevel"/>
     <w:tmpl w:val="6B786A8E"/>
@@ -21798,7 +22584,7 @@
       </w:rPr>
     </w:lvl>
   </w:abstractNum>
-  <w:abstractNum w:abstractNumId="7" w15:restartNumberingAfterBreak="0">
+  <w:abstractNum w:abstractNumId="8" w15:restartNumberingAfterBreak="0">
     <w:nsid w:val="4393142C"/>
     <w:multiLevelType w:val="hybridMultilevel"/>
     <w:tmpl w:val="012EC486"/>
@@ -21911,7 +22697,7 @@
       </w:rPr>
     </w:lvl>
   </w:abstractNum>
-  <w:abstractNum w:abstractNumId="8" w15:restartNumberingAfterBreak="0">
+  <w:abstractNum w:abstractNumId="9" w15:restartNumberingAfterBreak="0">
     <w:nsid w:val="568F7064"/>
     <w:multiLevelType w:val="hybridMultilevel"/>
     <w:tmpl w:val="E570ADB6"/>
@@ -22024,7 +22810,7 @@
       </w:rPr>
     </w:lvl>
   </w:abstractNum>
-  <w:abstractNum w:abstractNumId="9" w15:restartNumberingAfterBreak="0">
+  <w:abstractNum w:abstractNumId="10" w15:restartNumberingAfterBreak="0">
     <w:nsid w:val="5E175955"/>
     <w:multiLevelType w:val="hybridMultilevel"/>
     <w:tmpl w:val="A2D6609C"/>
@@ -22137,7 +22923,7 @@
       </w:rPr>
     </w:lvl>
   </w:abstractNum>
-  <w:abstractNum w:abstractNumId="10" w15:restartNumberingAfterBreak="0">
+  <w:abstractNum w:abstractNumId="11" w15:restartNumberingAfterBreak="0">
     <w:nsid w:val="624A0488"/>
     <w:multiLevelType w:val="hybridMultilevel"/>
     <w:tmpl w:val="EF6A659E"/>
@@ -22250,7 +23036,7 @@
       </w:rPr>
     </w:lvl>
   </w:abstractNum>
-  <w:abstractNum w:abstractNumId="11" w15:restartNumberingAfterBreak="0">
+  <w:abstractNum w:abstractNumId="12" w15:restartNumberingAfterBreak="0">
     <w:nsid w:val="65CB6974"/>
     <w:multiLevelType w:val="hybridMultilevel"/>
     <w:tmpl w:val="C00C0D86"/>
@@ -22363,7 +23149,7 @@
       </w:rPr>
     </w:lvl>
   </w:abstractNum>
-  <w:abstractNum w:abstractNumId="12" w15:restartNumberingAfterBreak="0">
+  <w:abstractNum w:abstractNumId="13" w15:restartNumberingAfterBreak="0">
     <w:nsid w:val="6B846B85"/>
     <w:multiLevelType w:val="hybridMultilevel"/>
     <w:tmpl w:val="5518E9EC"/>
@@ -22476,7 +23262,7 @@
       </w:rPr>
     </w:lvl>
   </w:abstractNum>
-  <w:abstractNum w:abstractNumId="13" w15:restartNumberingAfterBreak="0">
+  <w:abstractNum w:abstractNumId="14" w15:restartNumberingAfterBreak="0">
     <w:nsid w:val="7D561E69"/>
     <w:multiLevelType w:val="hybridMultilevel"/>
     <w:tmpl w:val="909C38D0"/>
@@ -22590,7 +23376,7 @@
     </w:lvl>
   </w:abstractNum>
   <w:num w:numId="1" w16cid:durableId="1297226138">
-    <w:abstractNumId w:val="12"/>
+    <w:abstractNumId w:val="13"/>
   </w:num>
   <w:num w:numId="2" w16cid:durableId="965892648">
     <w:abstractNumId w:val="1"/>
@@ -22602,34 +23388,37 @@
     <w:abstractNumId w:val="0"/>
   </w:num>
   <w:num w:numId="5" w16cid:durableId="1836919319">
+    <w:abstractNumId w:val="10"/>
+  </w:num>
+  <w:num w:numId="6" w16cid:durableId="1838303938">
+    <w:abstractNumId w:val="8"/>
+  </w:num>
+  <w:num w:numId="7" w16cid:durableId="1714689514">
     <w:abstractNumId w:val="9"/>
   </w:num>
-  <w:num w:numId="6" w16cid:durableId="1838303938">
-    <w:abstractNumId w:val="7"/>
+  <w:num w:numId="8" w16cid:durableId="688142674">
+    <w:abstractNumId w:val="6"/>
   </w:num>
-  <w:num w:numId="7" w16cid:durableId="1714689514">
-    <w:abstractNumId w:val="8"/>
+  <w:num w:numId="9" w16cid:durableId="544871964">
+    <w:abstractNumId w:val="11"/>
   </w:num>
-  <w:num w:numId="8" w16cid:durableId="688142674">
+  <w:num w:numId="10" w16cid:durableId="210460688">
     <w:abstractNumId w:val="5"/>
   </w:num>
-  <w:num w:numId="9" w16cid:durableId="544871964">
-    <w:abstractNumId w:val="10"/>
-  </w:num>
-  <w:num w:numId="10" w16cid:durableId="210460688">
-    <w:abstractNumId w:val="4"/>
-  </w:num>
   <w:num w:numId="11" w16cid:durableId="1575356027">
-    <w:abstractNumId w:val="6"/>
+    <w:abstractNumId w:val="7"/>
   </w:num>
   <w:num w:numId="12" w16cid:durableId="1864246044">
     <w:abstractNumId w:val="3"/>
   </w:num>
   <w:num w:numId="13" w16cid:durableId="483745644">
-    <w:abstractNumId w:val="13"/>
+    <w:abstractNumId w:val="14"/>
   </w:num>
   <w:num w:numId="14" w16cid:durableId="1026827068">
-    <w:abstractNumId w:val="11"/>
+    <w:abstractNumId w:val="12"/>
+  </w:num>
+  <w:num w:numId="15" w16cid:durableId="1286814838">
+    <w:abstractNumId w:val="4"/>
   </w:num>
 </w:numbering>
 </file>
@@ -23813,6 +24602,18 @@
       <w:szCs w:val="18"/>
     </w:rPr>
   </w:style>
+  <w:style w:type="paragraph" w:styleId="Bibliography">
+    <w:name w:val="Bibliography"/>
+    <w:basedOn w:val="Normal"/>
+    <w:next w:val="Normal"/>
+    <w:uiPriority w:val="37"/>
+    <w:unhideWhenUsed/>
+    <w:rsid w:val="00B454CA"/>
+    <w:pPr>
+      <w:spacing w:after="0" w:line="480" w:lineRule="auto"/>
+      <w:ind w:left="720" w:hanging="720"/>
+    </w:pPr>
+  </w:style>
 </w:styles>
 </file>
 

</xml_diff>

<commit_message>
Additions to mansucript by co-authors
</commit_message>
<xml_diff>
--- a/Annual Report Manuscript Outline.docx
+++ b/Annual Report Manuscript Outline.docx
@@ -540,7 +540,10 @@
     <w:p>
       <w:r>
         <w:tab/>
-        <w:t xml:space="preserve">Non-point source nutrients (nutrients that do not originate from individual points on a landscape, but from large areas) are one of the leading factors driving water quality issues in aquatic ecosystems around the world </w:t>
+        <w:t xml:space="preserve">Non-point source nutrients (nutrients that do not originate from individual points on a landscape, but from large areas) are one of the </w:t>
+      </w:r>
+      <w:r>
+        <w:t xml:space="preserve">leading factors driving water quality issues in aquatic ecosystems around the world </w:t>
       </w:r>
       <w:r>
         <w:fldChar w:fldCharType="begin"/>
@@ -561,7 +564,13 @@
         <w:fldChar w:fldCharType="end"/>
       </w:r>
       <w:r>
-        <w:t xml:space="preserve">. Eutrophication of aquatic habitats has lead to a variety of water quality issues including harmful algal blooms </w:t>
+        <w:t xml:space="preserve">. Eutrophication of aquatic habitats has </w:t>
+      </w:r>
+      <w:r>
+        <w:t>led</w:t>
+      </w:r>
+      <w:r>
+        <w:t xml:space="preserve"> to a variety of water quality issues including harmful algal blooms </w:t>
       </w:r>
       <w:r>
         <w:fldChar w:fldCharType="begin"/>
@@ -582,7 +591,19 @@
         <w:fldChar w:fldCharType="end"/>
       </w:r>
       <w:r>
-        <w:t xml:space="preserve">. The creation or restoration of wetlands has become a common tool in attempts to mitigate non-point source pollution because they receive runoff from broad areas across the landscape creating a hotspot where non-point source pollution can be concentrated </w:t>
+        <w:t>. The creation or restoration of wetlands has become a common tool in attempts to mitigate non-point source pollution because they receive runoff from broad areas across the landscape</w:t>
+      </w:r>
+      <w:r>
+        <w:t>,</w:t>
+      </w:r>
+      <w:r>
+        <w:t xml:space="preserve"> creating a hotspot where non-point source pollution can be concentrated</w:t>
+      </w:r>
+      <w:r>
+        <w:t xml:space="preserve"> and processed</w:t>
+      </w:r>
+      <w:r>
+        <w:t xml:space="preserve"> </w:t>
       </w:r>
       <w:r>
         <w:fldChar w:fldCharType="begin"/>
@@ -609,7 +630,7 @@
     <w:p>
       <w:r>
         <w:tab/>
-        <w:t xml:space="preserve">Wetlands are nutrient cycling hotspots on the landscape that  can both capture and process nutrients </w:t>
+        <w:t xml:space="preserve">Wetlands are nutrient cycling hotspots on the landscape that can both capture and process nutrients </w:t>
       </w:r>
       <w:r>
         <w:fldChar w:fldCharType="begin"/>
@@ -630,7 +651,32 @@
         <w:fldChar w:fldCharType="end"/>
       </w:r>
       <w:r>
-        <w:t xml:space="preserve">.  Even small and seemingly disconnected wetlands have been shown to play major roles on landscape scale nutrient cycling </w:t>
+        <w:t xml:space="preserve">.  </w:t>
+      </w:r>
+      <w:commentRangeStart w:id="0"/>
+      <w:r>
+        <w:t xml:space="preserve">Even small and seemingly disconnected wetlands </w:t>
+      </w:r>
+      <w:r>
+        <w:t>can</w:t>
+      </w:r>
+      <w:r>
+        <w:t xml:space="preserve"> play major roles on landscape scale nutrient cycling</w:t>
+      </w:r>
+      <w:commentRangeEnd w:id="0"/>
+      <w:r>
+        <w:rPr>
+          <w:rStyle w:val="CommentReference"/>
+          <w:sz w:val="22"/>
+          <w:szCs w:val="22"/>
+        </w:rPr>
+        <w:commentReference w:id="0"/>
+      </w:r>
+      <w:r>
+        <w:t xml:space="preserve"> when they’re prevalent across the landscape</w:t>
+      </w:r>
+      <w:r>
+        <w:t xml:space="preserve"> </w:t>
       </w:r>
       <w:r>
         <w:fldChar w:fldCharType="begin"/>
@@ -651,22 +697,172 @@
         <w:fldChar w:fldCharType="end"/>
       </w:r>
       <w:r>
-        <w:t xml:space="preserve">. Constructed wetlands have successfully treated watershed nutrient loading, but successful restoration projects rely on an understanding of what’s happening within an individual wetland to retain nutrients </w:t>
+        <w:t xml:space="preserve">. </w:t>
+      </w:r>
+      <w:r>
+        <w:t>I</w:t>
+      </w:r>
+      <w:r>
+        <w:t xml:space="preserve">n the Grand Lake St. Marys Watershed </w:t>
+      </w:r>
+      <w:r>
+        <w:t>(northwest Ohio)</w:t>
+      </w:r>
+      <w:r>
+        <w:t>,</w:t>
+      </w:r>
+      <w:r>
+        <w:t xml:space="preserve"> a </w:t>
+      </w:r>
+      <w:r>
+        <w:t>landscape</w:t>
+      </w:r>
+      <w:r>
+        <w:t xml:space="preserve"> that has become emblematic of the effects of elevated non-point source runoff</w:t>
+      </w:r>
+      <w:r>
+        <w:t xml:space="preserve"> </w:t>
+      </w:r>
+      <w:r>
+        <w:t xml:space="preserve">and conservation practices </w:t>
+      </w:r>
+      <w:r>
+        <w:t>(Jacquemin et al. 2018)</w:t>
+      </w:r>
+      <w:r>
+        <w:t xml:space="preserve">, </w:t>
+      </w:r>
+      <w:r>
+        <w:t>over 1,000 acres of wetlands have been constructed over the past decade</w:t>
+      </w:r>
+      <w:r>
+        <w:t xml:space="preserve">. These wetlands have been shown to treat volumes and corresponding </w:t>
+      </w:r>
+      <w:r>
+        <w:t xml:space="preserve">phosphorus and nitrogen </w:t>
+      </w:r>
+      <w:r>
+        <w:t xml:space="preserve">nutrient loads far in excess of what their </w:t>
+      </w:r>
+      <w:r>
+        <w:t xml:space="preserve">spatial </w:t>
+      </w:r>
+      <w:r>
+        <w:t xml:space="preserve">footprints </w:t>
+      </w:r>
+      <w:r>
+        <w:t xml:space="preserve">might </w:t>
+      </w:r>
+      <w:r>
+        <w:t>suggest.</w:t>
+      </w:r>
+      <w:r>
+        <w:t xml:space="preserve"> For example, Coldwater Creek Restored Wetland has been in operation for about 10 years</w:t>
+      </w:r>
+      <w:r>
+        <w:t>,</w:t>
+      </w:r>
+      <w:r>
+        <w:t xml:space="preserve"> </w:t>
+      </w:r>
+      <w:r>
+        <w:t>and</w:t>
+      </w:r>
+      <w:r>
+        <w:t xml:space="preserve"> </w:t>
+      </w:r>
+      <w:r>
+        <w:t xml:space="preserve">while </w:t>
+      </w:r>
+      <w:r>
+        <w:t>situated</w:t>
+      </w:r>
+      <w:r>
+        <w:t xml:space="preserve"> on less </w:t>
+      </w:r>
+      <w:r>
+        <w:t>than</w:t>
+      </w:r>
+      <w:r>
+        <w:t xml:space="preserve"> 0</w:t>
+      </w:r>
+      <w:r>
+        <w:t>.</w:t>
+      </w:r>
+      <w:r>
+        <w:t>21% of the sub</w:t>
+      </w:r>
+      <w:r>
+        <w:t>-</w:t>
+      </w:r>
+      <w:r>
+        <w:t>watershed</w:t>
+      </w:r>
+      <w:r>
+        <w:t>,</w:t>
+      </w:r>
+      <w:r>
+        <w:t xml:space="preserve"> </w:t>
+      </w:r>
+      <w:r>
+        <w:t>it has been shown to</w:t>
+      </w:r>
+      <w:r>
+        <w:t xml:space="preserve"> process nearly 5% of the total annual nutrient load</w:t>
+      </w:r>
+      <w:r>
+        <w:t xml:space="preserve"> </w:t>
       </w:r>
       <w:r>
         <w:fldChar w:fldCharType="begin"/>
       </w:r>
       <w:r>
-        <w:instrText xml:space="preserve"> ADDIN ZOTERO_ITEM CSL_CITATION {"citationID":"YzxZAQRk","properties":{"formattedCitation":"(Jacquemin et al. 2018)","plainCitation":"(Jacquemin et al. 2018)","noteIndex":0},"citationItems":[{"id":5211,"uris":["http://zotero.org/users/5222684/items/RJW87AEC"],"itemData":{"id":5211,"type":"article-journal","abstract":"Grand Lake St. Marys watershed has drawn attention over the past decade as water quality issues resulting from nutrient loading have come to the forefront of public opinion, political concern, and scientific study. The objective of this study was to assess long-term changes in water quality (nutrient and sediment concentrations) following the distressed watershed rules package instituted in 2011. Since that time, a variety of rules (e.g., winter manure ban) and best management practices (cover crops, manure storage or transfers, buffers, etc.) have been implemented. We used a general linear model to assess variation in total suspended solids, particulate phosphorus, soluble reactive phosphorus (SRP), nitrate N, and total Kjeldahl nitrogen concentrations from daily Chickasaw Creek (drains </w:instrText>
-      </w:r>
-      <w:r>
-        <w:rPr>
-          <w:rFonts w:ascii="Cambria Math" w:hAnsi="Cambria Math" w:cs="Cambria Math"/>
-        </w:rPr>
-        <w:instrText>∼</w:instrText>
-      </w:r>
-      <w:r>
-        <w:instrText xml:space="preserve">25% of watershed) samples spanning 2008 to 2016. Parameters were related to flow (higher values during high flows), timing (lower values during winter months), and the implementation of the distressed watershed rules package (lower values following implementation). Overall, reductions following the distressed designation for all parameters ranged from 5 to 35% during medium and high flow periods (with exception of SRP). Reductions were even more pronounced during winter months covered by the manure ban, where all parameters (including SRP) exhibited decreases at medium and high flows between 20 and 60%. While the reductions seen in this study are significant, concentrations are still highly elevated and continue to be a problem. We are optimistic that this study will serve to inform future management in the region and elsewhere. Core Ideas Grand Lake St. Marys receives high nutrient runoff from crop and livestock agriculture. The watershed was declared distressed in 2011, and management priorities were implemented. Management priorities included a winter manure application ban and encouraged other BMPs. Reductions in TSS, PP, SRP, NO3−, and TKN were noted at all flows following the designation. This represents an important step toward improved water quality in the watershed.","container-title":"Journal of Environmental Quality","DOI":"10.2134/jeq2017.08.0338","ISSN":"1537-2537","issue":"1","language":"en","license":"© 2018 The Authors.","note":"_eprint: https://onlinelibrary.wiley.com/doi/pdf/10.2134/jeq2017.08.0338","page":"113-120","source":"Wiley Online Library","title":"Changes in Water Quality of Grand Lake St. Marys Watershed Following Implementation of a Distressed Watershed Rules Package","volume":"47","author":[{"family":"Jacquemin","given":"Stephen J."},{"family":"Johnson","given":"Laura T."},{"family":"Dirksen","given":"Theresa A."},{"family":"McGlinch","given":"Greg"}],"issued":{"date-parts":[["2018"]]}}}],"schema":"https://github.com/citation-style-language/schema/raw/master/csl-citation.json"} </w:instrText>
+        <w:instrText xml:space="preserve"> ADDIN ZOTERO_ITEM CSL_CITATION {"citationID":"MJcSKKi7","properties":{"unsorted":false,"formattedCitation":"(Jacquemin et al. 2025)","plainCitation":"(Jacquemin et al. 2025)","noteIndex":0},"citationItems":[{"id":6250,"uris":["http://zotero.org/users/5222684/items/B67RST4G"],"itemData":{"id":6250,"type":"article-journal","abstract":"Abstract\n            \n              Wetlands are becoming increasingly utilized to mitigate runoff as water quality issues from excess nitrogen, phosphorus, and sediment continue to exacerbate eutrophication. This study focuses on long term nutrient and hydrologic data from the Grand Lake St. Marys (Ohio) Watershed where harmful algal blooms have proliferated for decades as a result of a combination of natural habitat loss and nonpoint source agricultural runoff. The objective of this study was to monitor long-term nutrient reductions associated with the restored and managed Coldwater Creek Wetland in order to guide future restoration efforts in the watershed and inform restoration efforts elsewhere. From 2017 to 2023, water samples were collected year-round from the wetland inflow and outflow and analyzed for nutrients (SRP, TP, and NO\n              3\n              -N) and total suspended solids (TSS) in addition to flow measurements to develop a complete hydrologic budget for the wetland source (Coldwater Creek), inflow, and outflow. Over the monitoring period, Coldwater Creek Wetland was able to intercept approximately 10.5 million m\n              3\n              of water equating to ~</w:instrText>
+      </w:r>
+      <w:r>
+        <w:rPr>
+          <w:rFonts w:ascii="Arial" w:hAnsi="Arial" w:cs="Arial"/>
+        </w:rPr>
+        <w:instrText> </w:instrText>
+      </w:r>
+      <w:r>
+        <w:instrText>10% of the total flow entering Grand Lake St. Marys from this subwatershed while showing average load reductions of at least 63% for SRP (1.85</w:instrText>
+      </w:r>
+      <w:r>
+        <w:rPr>
+          <w:rFonts w:ascii="Aptos" w:hAnsi="Aptos" w:cs="Aptos"/>
+        </w:rPr>
+        <w:instrText> </w:instrText>
+      </w:r>
+      <w:r>
+        <w:instrText>g/m\n              2\n              /yr), TP (5.2</w:instrText>
+      </w:r>
+      <w:r>
+        <w:rPr>
+          <w:rFonts w:ascii="Aptos" w:hAnsi="Aptos" w:cs="Aptos"/>
+        </w:rPr>
+        <w:instrText> </w:instrText>
+      </w:r>
+      <w:r>
+        <w:instrText>g/m\n              2\n              /yr), NO\n              3\n              -N (48</w:instrText>
+      </w:r>
+      <w:r>
+        <w:rPr>
+          <w:rFonts w:ascii="Aptos" w:hAnsi="Aptos" w:cs="Aptos"/>
+        </w:rPr>
+        <w:instrText> </w:instrText>
+      </w:r>
+      <w:r>
+        <w:instrText>g/m\n              2\n              /yr), and TSS (657</w:instrText>
+      </w:r>
+      <w:r>
+        <w:rPr>
+          <w:rFonts w:ascii="Aptos" w:hAnsi="Aptos" w:cs="Aptos"/>
+        </w:rPr>
+        <w:instrText> </w:instrText>
+      </w:r>
+      <w:r>
+        <w:instrText xml:space="preserve">g/m\n              2\n              /yr). The need for long-term monitoring of wetlands is essential as documentation of ecosystem function over longer periods of time (as opposed to one or two years of monitoring) is paramount in improving our understanding of these restored ecosystems may help improve water quality.","container-title":"Wetlands","DOI":"10.1007/s13157-025-01917-9","ISSN":"0277-5212, 1943-6246","issue":"4","journalAbbreviation":"Wetlands","language":"en","page":"37","source":"DOI.org (Crossref)","title":"Wetland Conservation in the Grand Lake St. Marys Watershed: Long Term Monitoring Data from Coldwater Creek Restored Wetland","title-short":"Wetland Conservation in the Grand Lake St. Marys Watershed","volume":"45","author":[{"family":"Jacquemin","given":"Stephen J."},{"family":"Grunden","given":"Morgan C."},{"family":"Dirksen","given":"Theresa A."}],"issued":{"date-parts":[["2025",4]]}}}],"schema":"https://github.com/citation-style-language/schema/raw/master/csl-citation.json"} </w:instrText>
       </w:r>
       <w:r>
         <w:fldChar w:fldCharType="separate"/>
@@ -675,70 +871,7 @@
         <w:rPr>
           <w:rFonts w:ascii="Aptos" w:hAnsi="Aptos"/>
         </w:rPr>
-        <w:t>(Jacquemin et al. 2018)</w:t>
-      </w:r>
-      <w:r>
-        <w:fldChar w:fldCharType="end"/>
-      </w:r>
-      <w:r>
-        <w:t xml:space="preserve">. Wetlands initially capture nutrients by retaining water and slowing down flow, which leads to sedimentation of material that contains nutrients </w:t>
-      </w:r>
-      <w:r>
-        <w:fldChar w:fldCharType="begin"/>
-      </w:r>
-      <w:r>
-        <w:instrText xml:space="preserve"> ADDIN ZOTERO_ITEM CSL_CITATION {"citationID":"oBPLjKbm","properties":{"formattedCitation":"(Mitsch et al. 2014, Aziz and Van Cappellen 2021)","plainCitation":"(Mitsch et al. 2014, Aziz and Van Cappellen 2021)","noteIndex":0},"citationItems":[{"id":5173,"uris":["http://zotero.org/users/5222684/items/USB6UQF6"],"itemData":{"id":5173,"type":"article-journal","abstract":"This study summarizes five separate sedimentation studies spanning 15 years (years 3–17 following wetland creation in 1994) of two 1ha experimental flow-through wetlands. Included are methods and analyses of the most recent (2009–2010) comparative study that attempted to quantify both erosion and bioturbation processes. Depending on techniques used, two distinct types of sedimentation rates were estimated—gross and net sedimentation. Gross sedimentation in 2004–2005 (years 11 and 12) using sediment trap bottles was 45kgm−2 for 4 months during and after spring flood pulsing conditions in 2004 and 39kgm−2 for the same 4 months during and after steady flow conditions in 2005. Annual sediment accretion using feldspar and other horizon markers was 31.7±4.4kgm−2yr−1 (4.2±0.6cmyr−1) in 1996 (year 3 after wetland creation) and 34.4±4.5kgm−2yr−1 (5.5±0.8cmyr−1) in 2009 (year 16 after wetland creation). Net sedimentation using soil cores to estimate accumulation of sediments over antecedent soil horizon layers was 4.7±0.3kgm−2yr−1 (0.9±0.07cmyr−1) in 2004 (year 11) and 6.0±0.4kgm−2yr−1 (0.9±0.06cmyr−1) in 2009 (year 16). Net sedimentation, using estimates of sedimentation and erosion with the sediment erosion table (SET) method in 2009–2010 (years 16–17) was 3.9±6.1–9.0kgm−2yr−1 (1.3±0.8–1.4cmyr−1). Bioturbation by macrofauna significantly decreased sedimentation rates during the 2009 (year 16) study. Spatial patterns, consistent among horizon marker and net sedimentation studies, showed that deep, open-water areas had higher rates of sedimentation than shallow areas with emergent vegetation, and that sedimentation rates were higher when closer to the inflow than at the outflow of these flow-through wetlands. Net sedimentation of these created riverine wetlands ranged from 1.2cm/yr to 1.4cm/yr, suggesting that these wetlands will accumulate about 30cm of sediments in a little more than two decades.","collection-title":"The Olentangy River Wetland Research Park: Two Decades of Research on Ecosystem Services","container-title":"Ecological Engineering","DOI":"10.1016/j.ecoleng.2014.09.116","ISSN":"0925-8574","journalAbbreviation":"Ecological Engineering","page":"25-34","source":"ScienceDirect","title":"Sedimentation in created freshwater riverine wetlands: 15 years of succession and contrast of methods","title-short":"Sedimentation in created freshwater riverine wetlands","volume":"72","author":[{"family":"Mitsch","given":"William J."},{"family":"Nedrich","given":"Sara M."},{"family":"Harter","given":"Sarah K."},{"family":"Anderson","given":"Christopher"},{"family":"Nahlik","given":"Amanda M."},{"family":"Bernal","given":"Blanca"}],"issued":{"date-parts":[["2014",11,1]]}}},{"id":4760,"uris":["http://zotero.org/users/5222684/items/VCYEKIMB"],"itemData":{"id":4760,"type":"article-journal","abstract":"Wetlands are known for their water filtration (or purification) function. Although different wetland types differ in their filtration capacity, they are usually aggregated together in economic valuation studies. Here, we explicitly separate the valuation of the suspended sediment and phosphorus (P) filtration services of the four major wetland types—bogs, fens, marshes and swamps—found in southern Ontario, Canada. The areal extents of the four wetland types are derived from the Canadian Wetland Inventory (CWI) progress map, while the sediment accretion rate is used as the key variable regulating the suspended sediment and P filtration functions. Based on available literature data, we assess the relationship of the sediment accretion rate to wetland size. Because only weak positive correlations are found, we assign a mean (average) sediment accretion rate to each wetland type. The sediment accretion rates are combined with mean soil P concentrations to estimate Pretention rates by the wetlands. The replacement cost method is then applied to valuate the sediment and P filtration services. The unit values for both sediment and P retention decrease in the order: marshes &gt; bogs ≈ swamps &gt; fens. The total value of sediment plus phosphorus removal by all wetlands in southern Ontario amounts to $4.2 ± 2.9 billion per year, of which about 80% is accounted for by swamps. We further assess the costs of different options to offset the additional P loading generated in a hypothetical scenario whereby all wetlands are converted to agriculture. The results demonstrate that replacing the P filtration function of existing wetlands with conventional land management and water treatment solutions is not cost-effective, hence reinforcing the importance of protecting existing wetlands.","container-title":"Hydrological Processes","DOI":"10.1002/hyp.14442","ISSN":"1099-1085","issue":"12","language":"en","license":"© 2021 The Authors. Hydrological Processes published by John Wiley &amp; Sons Ltd.","note":"_eprint: https://onlinelibrary.wiley.com/doi/pdf/10.1002/hyp.14442","page":"e14442","source":"Wiley Online Library","title":"Economic valuation of suspended sediment and phosphorus filtration services by four different wetland types: A preliminary assessment for southern Ontario, Canada","title-short":"Economic valuation of suspended sediment and phosphorus filtration services by four different wetland types","volume":"35","author":[{"family":"Aziz","given":"Tariq"},{"family":"Van Cappellen","given":"Philippe"}],"issued":{"date-parts":[["2021"]]}}}],"schema":"https://github.com/citation-style-language/schema/raw/master/csl-citation.json"} </w:instrText>
-      </w:r>
-      <w:r>
-        <w:fldChar w:fldCharType="separate"/>
-      </w:r>
-      <w:r>
-        <w:rPr>
-          <w:rFonts w:ascii="Aptos" w:hAnsi="Aptos"/>
-        </w:rPr>
-        <w:t>(Mitsch et al. 2014, Aziz and Van Cappellen 2021)</w:t>
-      </w:r>
-      <w:r>
-        <w:fldChar w:fldCharType="end"/>
-      </w:r>
-      <w:r>
-        <w:t xml:space="preserve">. Slowing down flow is important for both allowing sediment to settle, and allowing time for sorption of phosphorus to sediment binding sites </w:t>
-      </w:r>
-      <w:r>
-        <w:fldChar w:fldCharType="begin"/>
-      </w:r>
-      <w:r>
-        <w:instrText xml:space="preserve"> ADDIN ZOTERO_ITEM CSL_CITATION {"citationID":"ziKvZYnY","properties":{"formattedCitation":"(Collins et al. 2016)","plainCitation":"(Collins et al. 2016)","noteIndex":0},"citationItems":[{"id":5235,"uris":["http://zotero.org/users/5222684/items/29GSIQYS"],"itemData":{"id":5235,"type":"article-journal","abstract":"Although considered a sink of nutrients, limited information exists to verify phosphorus (P) and nitrogen (N) retention in drainage networks such as ditches and canals. Nutrient retention within two ditches on a cattle ranch in the greater Everglades region was measured using in-situ mesocosms. Phosphorus and N concentrations of water inside the mesocosms were increased or decreased to evaluate the effect of P and N concentration on P and N flux across the sediment-water interface. Ditch sediments possess high P retention capacity which was related to aluminum and iron contents. Soluble reactive P (SRP) retention over seven days varied between 13 and 55% of the starting water column concentration, though retention was significant after one day (p=0.035). Significant P release, although observed only at one site, does indicate the potential for the ditch to be a source of P to downstream locations. The P uptake and release were greater and more rapid in a ditch with organic sediment and emergent macrophytes compared to a ditch with a mineral substrate. P retention over time was rate-limited by diffusion and sediment pore-water exchange. Nitrogen transformation processes were unsubstantial, possibly because in warm sub-tropical Florida most nitrate is denitrified in the presence of an energy source. Several empirical P models predicted (r2&gt;0.90) P retention based on the known water column SRP concentrations and hydraulic residence time. The residence time of the site (0.46 and 0.11 days for the two ditches) is not long enough to significantly reduce P loads passing through the ditches under the current drainage regime. Delaying the drainage by increased water retention as a voluntary Best Management Practice (BMP) or Payment for Environmental Services (PES) program can help increase the residence time to reduce P leaving the ranch. Although these results are derived from a cattle ranch, similar benefits can be expected for drainage ditches in other agricultural systems such as agronomic (e.g. sugarcane) or horticultural (e.g. citrus, vegetable) crops, and the models presented in this paper may be useful for basin-scale water quality management.","container-title":"Ecological Engineering","DOI":"10.1016/j.ecoleng.2016.04.003","ISSN":"0925-8574","journalAbbreviation":"Ecological Engineering","page":"218-228","source":"ScienceDirect","title":"Drainage ditches have sufficient adsorption capacity but inadequate residence time for phosphorus retention in the Everglades","volume":"92","author":[{"family":"Collins","given":"Steven D."},{"family":"Shukla","given":"Sanjay"},{"family":"Shrestha","given":"Niroj K."}],"issued":{"date-parts":[["2016",7,1]]}}}],"schema":"https://github.com/citation-style-language/schema/raw/master/csl-citation.json"} </w:instrText>
-      </w:r>
-      <w:r>
-        <w:fldChar w:fldCharType="separate"/>
-      </w:r>
-      <w:r>
-        <w:rPr>
-          <w:rFonts w:ascii="Aptos" w:hAnsi="Aptos"/>
-        </w:rPr>
-        <w:t>(Collins et al. 2016)</w:t>
-      </w:r>
-      <w:r>
-        <w:fldChar w:fldCharType="end"/>
-      </w:r>
-      <w:r>
-        <w:t xml:space="preserve">. Longer term storage can occur through sediment uptake by vegetation, which binds inorganic phosphorus to organic material making it more difficult to access by microbes and algae  </w:t>
-      </w:r>
-      <w:r>
-        <w:fldChar w:fldCharType="begin"/>
-      </w:r>
-      <w:r>
-        <w:instrText xml:space="preserve"> ADDIN ZOTERO_ITEM CSL_CITATION {"citationID":"ERMTeBqo","properties":{"formattedCitation":"(Silvan et al. 2004, Lucas and Greenway 2008)","plainCitation":"(Silvan et al. 2004, Lucas and Greenway 2008)","noteIndex":0},"citationItems":[{"id":5251,"uris":["http://zotero.org/users/5222684/items/87QNR89P"],"itemData":{"id":5251,"type":"article-journal","abstract":"Wetland buffers may play an important role in the retention of nitrogen (N) and phosphorus (P) that can be released in large quantities from forestry operations. In this study, we investigated the retention capacity of N and P of wetland vegetation comparing the control area with two experimental areas within one site before and after N and P pulse (45 kg N and 15 kg P) lasting one growing season (ca. 150 d). N and P pulse caused a significant increase in the plant biomass and N and P content in the upper experimental area, which received most of the added nutrients. Added N and P was mainly retained in the above and below ground parts of E. vaginatum, especially in storage organs and roots which form a long-term sink for nutrients. Total N retention in the plant biomass during the first year after N and P treatment ranged from 25.3 kg (equals to 126.7 kg N ha−1) in the upper experimental area to 6.1 kg (20.4 kg N ha−1) in the lower experimental area and 4.7 kg (15.7 kg N ha−1) in the control area. P retention ranged from 2.6 kg (13.1 kg P ha−1) in the upper experimental area to 1.0 kg (3.4 kg P ha−1) in the lower experimental area and 0.5 kg (1.8 kg P ha−1) in the control area. The retained proportions of N and P in the plant biomass in the two experimental areas were approximately 70% of the added N (45 kg N y−1) and approximately 25% of the added P (15 kg P y−1) during the first year after N and P addition in 1999. Our study shows that vigorously colonising and growing vegetation is the main factor in the retention of N, a significant factor in the retention of P in a constructed wetland buffer, and thus an important contributor to the prevention of detrimental effects of N and P leaching on watercourses.","container-title":"Plant and Soil","DOI":"10.1023/B:PLSO.0000016549.70555.9d","ISSN":"1573-5036","issue":"1","journalAbbreviation":"Plant and Soil","language":"en","page":"179-187","source":"Springer Link","title":"Vegetation is the main factor in nutrient retention in a constructed wetland buffer","volume":"258","author":[{"family":"Silvan","given":"Niko"},{"family":"Vasander","given":"Harri"},{"family":"Laine","given":"Jukka"}],"issued":{"date-parts":[["2004",1,1]]}}},{"id":5252,"uris":["http://zotero.org/users/5222684/items/F4HLYBNL"],"itemData":{"id":5252,"type":"article-journal","abstract":"Thirty well-established 240L bioretention mesocosms were used to investigate retention\nof dissolved nutrients by bioretention systems. Ten mesocosms were comprised of   80 cm   sandy loam, ten of   80 cm   loamy sand, and ten of pea gravel with   20 cm   of loamy sand. Half were ...","container-title":"Journal of Irrigation and Drainage Engineering","DOI":"10.1061/(ASCE)0733-9437(2008)134:5(613)","ISSN":"0733-9437","issue":"5","language":"EN","page":"613-623","publisher":"American Society of Civil Engineers","source":"ASCE","title":"Nutrient Retention in Vegetated and Nonvegetated Bioretention Mesocosms","volume":"134","author":[{"family":"Lucas","given":"William C."},{"family":"Greenway","given":"Margaret"}],"issued":{"date-parts":[["2008",10,1]]}}}],"schema":"https://github.com/citation-style-language/schema/raw/master/csl-citation.json"} </w:instrText>
-      </w:r>
-      <w:r>
-        <w:fldChar w:fldCharType="separate"/>
-      </w:r>
-      <w:r>
-        <w:rPr>
-          <w:rFonts w:ascii="Aptos" w:hAnsi="Aptos"/>
-        </w:rPr>
-        <w:t>(Silvan et al. 2004, Lucas and Greenway 2008)</w:t>
+        <w:t>(Jacquemin et al. 2025)</w:t>
       </w:r>
       <w:r>
         <w:fldChar w:fldCharType="end"/>
@@ -752,13 +885,54 @@
         <w:ind w:firstLine="360"/>
       </w:pPr>
       <w:r>
-        <w:t xml:space="preserve">A variety of methods are used to evaluate wetland restoration success, including data on vegetation, soil phosphorus sorption capacity (SPSC), and hydrology, but many of the available methods may not accurately assess wetlands ability to retain nutrients </w:t>
-      </w:r>
+        <w:t>These examples show that c</w:t>
+      </w:r>
+      <w:r>
+        <w:t xml:space="preserve">onstructed wetlands have </w:t>
+      </w:r>
+      <w:r>
+        <w:t>the potential to successfully</w:t>
+      </w:r>
+      <w:r>
+        <w:t xml:space="preserve"> treat</w:t>
+      </w:r>
+      <w:r>
+        <w:t xml:space="preserve"> </w:t>
+      </w:r>
+      <w:r>
+        <w:t xml:space="preserve">watershed nutrient </w:t>
+      </w:r>
+      <w:commentRangeStart w:id="1"/>
+      <w:r>
+        <w:t>loading</w:t>
+      </w:r>
+      <w:commentRangeEnd w:id="1"/>
+      <w:r>
+        <w:rPr>
+          <w:rStyle w:val="CommentReference"/>
+          <w:sz w:val="22"/>
+          <w:szCs w:val="22"/>
+        </w:rPr>
+        <w:commentReference w:id="1"/>
+      </w:r>
+      <w:r>
+        <w:t xml:space="preserve">, but the designs of the most successful restoration projects are rooted in a deep understanding of the underlying nutrient retention mechanisms of wetlands </w:t>
+      </w:r>
+      <w:commentRangeStart w:id="2"/>
       <w:r>
         <w:fldChar w:fldCharType="begin"/>
       </w:r>
       <w:r>
-        <w:instrText xml:space="preserve"> ADDIN ZOTERO_ITEM CSL_CITATION {"citationID":"sDCjNdaP","properties":{"formattedCitation":"(Fennessy et al. 2007)","plainCitation":"(Fennessy et al. 2007)","noteIndex":0},"citationItems":[{"id":5254,"uris":["http://zotero.org/users/5222684/items/KV3EJM68"],"itemData":{"id":5254,"type":"article-journal","abstract":"We analyzed 40 existing wetland rapid assessment methods that were developed for a variety of purposes, including informing regulatory decisions and local land use planning, and reviewed them for their potential to assess ecological integrity or condition. Four evaluation criteria were used. We determined if the method 1) can be used to measure condition, 2) is truly rapid, 3) includes a site visit, and 4) can be verified. This resulted in six methods being selected for evaluation relative to a conceptual model describing the core elements of a wetland assessment method, including universal indicators of soil, hydrology, and biotic communities, as well as regional indicators. An additional nine methods were kept for ideas on indicators, scoring, or regionalization. From this review, we identified five general areas that need to be addressed when adapting existing methods or developing new methods to assess condition: 1) definition of the assessment area, 2) treatment of wetland type, 3) approaches to scoring, 4) consideration of highly valued wetland types or features, and 5) procedures for validation with comprehensive ecological data. With scoring in particular, we present the advantages of a method that produces a single integrative score. Development of a rapid assessment method can assist those interested in incorporating condition assessment into their programs because they require less time in the field and less taxonomic expertise than more quantitative methods, which can lead to significant cost savings and increased sample sizes.","container-title":"Wetlands","DOI":"10.1672/0277-5212(2007)27[543:AEORMF]2.0.CO;2","ISSN":"1943-6246","issue":"3","journalAbbreviation":"Wetlands","language":"en","license":"2007 Society of Wetland Scientists","note":"Company: Springer\nDistributor: Springer\nInstitution: Springer\nLabel: Springer\nnumber: 3","page":"543-560","publisher":"Springer Netherlands","source":"link.springer.com","title":"An evaluation of rapid methods for assessing the ecological condition of wetlands","volume":"27","author":[{"family":"Fennessy","given":"M. Siobhan"},{"family":"Jacobs","given":"Amy D."},{"family":"Kentula","given":"Mary E."}],"issued":{"date-parts":[["2007",9,1]]}}}],"schema":"https://github.com/citation-style-language/schema/raw/master/csl-citation.json"} </w:instrText>
+        <w:instrText xml:space="preserve"> ADDIN ZOTERO_ITEM CSL_CITATION {"citationID":"XKEUVrvV","properties":{"unsorted":false,"formattedCitation":"(Kadlec 2016, Jacquemin et al. 2018, Ury et al. 2023)","plainCitation":"(Kadlec 2016, Jacquemin et al. 2018, Ury et al. 2023)","dontUpdate":true,"noteIndex":0},"citationItems":[{"id":6248,"uris":["http://zotero.org/users/5222684/items/D22E4CL6"],"itemData":{"id":6248,"type":"article-journal","abstract":"This paper reviews aspects of the performance of large (&gt;40 ha) constructed treatment wetlands intended for phosphorus control. Thirty-seven such wetlands have been built and have good data records, with a median size of 754 ha. All are successfully removing phosphorus from a variety of waters. Period of record median concentration reductions were 71%, load reductions 0.77 gP·m−2·year−1, and rate coefficients 12.5 m·year−1. Large wetlands have a narrower performance spectrum than the larger group of all sizes. Some systems display startup trends, ranging to several years, likely resulting from antecedent soil and vegetation conditions. There are internal longitudinal gradients in concentration, which vary with lateral position and flow conditions. Accretion in inlet zones may require attention. Concentrations are reduced to plateau values, in the range of about 10–50 mgP·m−3. Vegetation type has an effect upon performance measures, and its presence facilitates performance. Trends in the performance measures over the history of individual systems display only small changes, with both increases and decreases occurring. Such trends remove little of the variance in behavior. Seasonality is typically weak for steady flow systems, and most variability appears to be stochastic. Stormwater systems display differences between wet and dry season behavior, which appear to be flow-driven. Several models of system performance have been developed, both steady and dynamic.","container-title":"Water","DOI":"10.3390/w8060243","ISSN":"2073-4441","issue":"6","language":"en","license":"http://creativecommons.org/licenses/by/3.0/","page":"243","publisher":"Multidisciplinary Digital Publishing Institute","source":"www.mdpi.com","title":"Large Constructed Wetlands for Phosphorus Control: A Review","title-short":"Large Constructed Wetlands for Phosphorus Control","volume":"8","author":[{"family":"Kadlec","given":"Robert H."}],"issued":{"date-parts":[["2016",6]]}}},{"id":5211,"uris":["http://zotero.org/users/5222684/items/RJW87AEC"],"itemData":{"id":5211,"type":"article-journal","abstract":"Grand Lake St. Marys watershed has drawn attention over the past decade as water quality issues resulting from nutrient loading have come to the forefront of public opinion, political concern, and scientific study. The objective of this study was to assess long-term changes in water quality (nutrient and sediment concentrations) following the distressed watershed rules package instituted in 2011. Since that time, a variety of rules (e.g., winter manure ban) and best management practices (cover crops, manure storage or transfers, buffers, etc.) have been implemented. We used a general linear model to assess variation in total suspended solids, particulate phosphorus, soluble reactive phosphorus (SRP), nitrate N, and total Kjeldahl nitrogen concentrations from daily Chickasaw Creek (drains </w:instrText>
+      </w:r>
+      <w:r>
+        <w:rPr>
+          <w:rFonts w:ascii="Cambria Math" w:hAnsi="Cambria Math" w:cs="Cambria Math"/>
+        </w:rPr>
+        <w:instrText>∼</w:instrText>
+      </w:r>
+      <w:r>
+        <w:instrText xml:space="preserve">25% of watershed) samples spanning 2008 to 2016. Parameters were related to flow (higher values during high flows), timing (lower values during winter months), and the implementation of the distressed watershed rules package (lower values following implementation). Overall, reductions following the distressed designation for all parameters ranged from 5 to 35% during medium and high flow periods (with exception of SRP). Reductions were even more pronounced during winter months covered by the manure ban, where all parameters (including SRP) exhibited decreases at medium and high flows between 20 and 60%. While the reductions seen in this study are significant, concentrations are still highly elevated and continue to be a problem. We are optimistic that this study will serve to inform future management in the region and elsewhere. Core Ideas Grand Lake St. Marys receives high nutrient runoff from crop and livestock agriculture. The watershed was declared distressed in 2011, and management priorities were implemented. Management priorities included a winter manure application ban and encouraged other BMPs. Reductions in TSS, PP, SRP, NO3−, and TKN were noted at all flows following the designation. This represents an important step toward improved water quality in the watershed.","container-title":"Journal of Environmental Quality","DOI":"10.2134/jeq2017.08.0338","ISSN":"1537-2537","issue":"1","language":"en","license":"© 2018 The Authors.","note":"_eprint: https://onlinelibrary.wiley.com/doi/pdf/10.2134/jeq2017.08.0338","page":"113-120","source":"Wiley Online Library","title":"Changes in Water Quality of Grand Lake St. Marys Watershed Following Implementation of a Distressed Watershed Rules Package","volume":"47","author":[{"family":"Jacquemin","given":"Stephen J."},{"family":"Johnson","given":"Laura T."},{"family":"Dirksen","given":"Theresa A."},{"family":"McGlinch","given":"Greg"}],"issued":{"date-parts":[["2018"]]}}},{"id":1654,"uris":["http://zotero.org/users/5222684/items/L4YNJ95X"],"itemData":{"id":1654,"type":"article-journal","container-title":"Environmental Research Letters","issue":"8","page":"083002","publisher":"IOP Publishing","source":"Google Scholar","title":"Source or sink? Meta-analysis reveals diverging controls of phosphorus retention and release in restored and constructed wetlands","title-short":"Source or sink?","volume":"18","author":[{"family":"Ury","given":"Emily A."},{"family":"Arrumugam","given":"Puvaanah"},{"family":"Herbert","given":"Ellen R."},{"family":"Badiou","given":"Pascal"},{"family":"Page","given":"Bryan"},{"family":"Basu","given":"Nandita B."}],"issued":{"date-parts":[["2023"]]}}}],"schema":"https://github.com/citation-style-language/schema/raw/master/csl-citation.json"} </w:instrText>
       </w:r>
       <w:r>
         <w:fldChar w:fldCharType="separate"/>
@@ -767,19 +941,34 @@
         <w:rPr>
           <w:rFonts w:ascii="Aptos" w:hAnsi="Aptos"/>
         </w:rPr>
-        <w:t>(Fennessy et al. 2007)</w:t>
+        <w:t>(Kadlec 2016, Ury et al. 2023)</w:t>
       </w:r>
       <w:r>
         <w:fldChar w:fldCharType="end"/>
       </w:r>
-      <w:r>
-        <w:t xml:space="preserve">. The drivers of nutrient retention in wetlands are not clearly understood, with high variability in rates of nutrient retention across a variety of studied wetlands: but wetlands with high nutrient loading consistently retain more phosphorus </w:t>
+      <w:commentRangeEnd w:id="2"/>
+      <w:r>
+        <w:rPr>
+          <w:rStyle w:val="CommentReference"/>
+          <w:sz w:val="22"/>
+          <w:szCs w:val="22"/>
+        </w:rPr>
+        <w:commentReference w:id="2"/>
+      </w:r>
+      <w:r>
+        <w:t>.</w:t>
+      </w:r>
+      <w:r>
+        <w:t xml:space="preserve"> </w:t>
+      </w:r>
+      <w:r>
+        <w:t xml:space="preserve">Wetlands initially capture nutrients by retaining water and slowing down flow, which leads to sedimentation of material that contains nutrients </w:t>
       </w:r>
       <w:r>
         <w:fldChar w:fldCharType="begin"/>
       </w:r>
       <w:r>
-        <w:instrText xml:space="preserve"> ADDIN ZOTERO_ITEM CSL_CITATION {"citationID":"DbSIlVM1","properties":{"formattedCitation":"(Land et al. 2016, Ury et al. 2023)","plainCitation":"(Land et al. 2016, Ury et al. 2023)","noteIndex":0},"citationItems":[{"id":1647,"uris":["http://zotero.org/users/5222684/items/ZFE5E3L8"],"itemData":{"id":1647,"type":"article-journal","abstract":"Eutrophication of aquatic environments is a major environmental problem in large parts of the world. In Europe, EU legislation (the Water Framework Directive and the Marine Strategy Framework Directive), international conventions (OSPAR, HELCOM) and national environmental objectives emphasize the need to reduce the input of nutrients to freshwater and marine environments. A widely used method to achieve this is to allow water to pass through a created or restored wetland. However, the large variation in measured nutrient removal rates in such wetlands calls for a systematic review.","container-title":"Environmental Evidence","DOI":"10.1186/s13750-016-0060-0","ISSN":"2047-2382","issue":"1","journalAbbreviation":"Environmental Evidence","page":"9","source":"BioMed Central","title":"How effective are created or restored freshwater wetlands for nitrogen and phosphorus removal? A systematic review","title-short":"How effective are created or restored freshwater wetlands for nitrogen and phosphorus removal?","volume":"5","author":[{"family":"Land","given":"Magnus"},{"family":"Granéli","given":"Wilhelm"},{"family":"Grimvall","given":"Anders"},{"family":"Hoffmann","given":"Carl Christian"},{"family":"Mitsch","given":"William J."},{"family":"Tonderski","given":"Karin S."},{"family":"Verhoeven","given":"Jos T. A."}],"issued":{"date-parts":[["2016",5,9]]}}},{"id":1654,"uris":["http://zotero.org/users/5222684/items/L4YNJ95X"],"itemData":{"id":1654,"type":"article-journal","container-title":"Environmental Research Letters","issue":"8","page":"083002","publisher":"IOP Publishing","source":"Google Scholar","title":"Source or sink? Meta-analysis reveals diverging controls of phosphorus retention and release in restored and constructed wetlands","title-short":"Source or sink?","volume":"18","author":[{"family":"Ury","given":"Emily A."},{"family":"Arrumugam","given":"Puvaanah"},{"family":"Herbert","given":"Ellen R."},{"family":"Badiou","given":"Pascal"},{"family":"Page","given":"Bryan"},{"family":"Basu","given":"Nandita B."}],"issued":{"date-parts":[["2023"]]}}}],"schema":"https://github.com/citation-style-language/schema/raw/master/csl-citation.json"} </w:instrText>
+        <w:instrText xml:space="preserve"> ADDIN ZOTERO_ITEM CSL_CITATION {"citationID":"oBPLjKbm","properties":{"formattedCitation":"(Mitsch et al. 2014, Aziz and Van Cappellen 2021)","plainCitation":"(Mitsch et al. 2014, Aziz and Van Cappellen 2021)","noteIndex":0},"citationItems":[{"id":5173,"uris":["http://zotero.org/users/5222684/items/USB6UQF6"],"itemData":{"id":5173,"type":"article-journal","abstract":"This study summarizes five separate sedimentation studies spanning 15 years (years 3–17 following wetland creation in 1994) of two 1ha experimental flow-through wetlands. Included are methods and analyses of the most recent (2009–2010) comparative study that attempted to quantify both erosion and bioturbation processes. Depending on techniques used, two distinct types of sedimentation rates were estimated—gross and net sedimentation. Gross sedimentation in 2004–2005 (years 11 and 12) using sediment trap bottles was 45kgm−2 for 4 months during and after spring flood pulsing conditions in 2004 and 39kgm−2 for the same 4 months during and after steady flow conditions in 2005. Annual sediment accretion using feldspar and other horizon markers was 31.7±4.4kgm−2yr−1 (4.2±0.6cmyr−1) in 1996 (year 3 after wetland creation) and 34.4±4.5kgm−2yr−1 (5.5±0.8cmyr−1) in 2009 (year 16 after wetland creation). Net sedimentation using soil cores to estimate accumulation of sediments over antecedent soil horizon layers was 4.7±0.3kgm−2yr−1 (0.9±0.07cmyr−1) in 2004 (year 11) and 6.0±0.4kgm−2yr−1 (0.9±0.06cmyr−1) in 2009 (year 16). Net sedimentation, using estimates of sedimentation and erosion with the sediment erosion table (SET) method in 2009–2010 (years 16–17) was 3.9±6.1–9.0kgm−2yr−1 (1.3±0.8–1.4cmyr−1). Bioturbation by macrofauna significantly decreased sedimentation rates during the 2009 (year 16) study. Spatial patterns, consistent among horizon marker and net sedimentation studies, showed that deep, open-water areas had higher rates of sedimentation than shallow areas with emergent vegetation, and that sedimentation rates were higher when closer to the inflow than at the outflow of these flow-through wetlands. Net sedimentation of these created riverine wetlands ranged from 1.2cm/yr to 1.4cm/yr, suggesting that these wetlands will accumulate about 30cm of sediments in a little more than two decades.","collection-title":"The Olentangy River Wetland Research Park: Two Decades of Research on Ecosystem Services","container-title":"Ecological Engineering","DOI":"10.1016/j.ecoleng.2014.09.116","ISSN":"0925-8574","journalAbbreviation":"Ecological Engineering","page":"25-34","source":"ScienceDirect","title":"Sedimentation in created freshwater riverine wetlands: 15 years of succession and contrast of methods","title-short":"Sedimentation in created freshwater riverine wetlands","volume":"72","author":[{"family":"Mitsch","given":"William J."},{"family":"Nedrich","given":"Sara M."},{"family":"Harter","given":"Sarah K."},{"family":"Anderson","given":"Christopher"},{"family":"Nahlik","given":"Amanda M."},{"family":"Bernal","given":"Blanca"}],"issued":{"date-parts":[["2014",11,1]]}}},{"id":4760,"uris":["http://zotero.org/users/5222684/items/VCYEKIMB"],"itemData":{"id":4760,"type":"article-journal","abstract":"Wetlands are known for their water filtration (or purification) function. Although different wetland types differ in their filtration capacity, they are usually aggregated together in economic valuation studies. Here, we explicitly separate the valuation of the suspended sediment and phosphorus (P) filtration services of the four major wetland types—bogs, fens, marshes and swamps—found in southern Ontario, Canada. The areal extents of the four wetland types are derived from the Canadian Wetland Inventory (CWI) progress map, while the sediment accretion rate is used as the key variable regulating the suspended sediment and P filtration functions. Based on available literature data, we assess the relationship of the sediment accretion rate to wetland size. Because only weak positive correlations are found, we assign a mean (average) sediment accretion rate to each wetland type. The sediment accretion rates are combined with mean soil P concentrations to estimate Pretention rates by the wetlands. The replacement cost method is then applied to valuate the sediment and P filtration services. The unit values for both sediment and P retention decrease in the order: marshes &gt; bogs ≈ swamps &gt; fens. The total value of sediment plus phosphorus removal by all wetlands in southern Ontario amounts to $4.2 ± 2.9 billion per year, of which about 80% is accounted for by swamps. We further assess the costs of different options to offset the additional P loading generated in a hypothetical scenario whereby all wetlands are converted to agriculture. The results demonstrate that replacing the P filtration function of existing wetlands with conventional land management and water treatment solutions is not cost-effective, hence reinforcing the importance of protecting existing wetlands.","container-title":"Hydrological Processes","DOI":"10.1002/hyp.14442","ISSN":"1099-1085","issue":"12","language":"en","license":"© 2021 The Authors. Hydrological Processes published by John Wiley &amp; Sons Ltd.","note":"_eprint: https://onlinelibrary.wiley.com/doi/pdf/10.1002/hyp.14442","page":"e14442","source":"Wiley Online Library","title":"Economic valuation of suspended sediment and phosphorus filtration services by four different wetland types: A preliminary assessment for southern Ontario, Canada","title-short":"Economic valuation of suspended sediment and phosphorus filtration services by four different wetland types","volume":"35","author":[{"family":"Aziz","given":"Tariq"},{"family":"Van Cappellen","given":"Philippe"}],"issued":{"date-parts":[["2021"]]}}}],"schema":"https://github.com/citation-style-language/schema/raw/master/csl-citation.json"} </w:instrText>
       </w:r>
       <w:r>
         <w:fldChar w:fldCharType="separate"/>
@@ -788,19 +977,53 @@
         <w:rPr>
           <w:rFonts w:ascii="Aptos" w:hAnsi="Aptos"/>
         </w:rPr>
-        <w:t>(Land et al. 2016, Ury et al. 2023)</w:t>
+        <w:t>(Mitsch et al. 2014, Aziz and Van Cappellen 2021)</w:t>
       </w:r>
       <w:r>
         <w:fldChar w:fldCharType="end"/>
       </w:r>
       <w:r>
-        <w:t xml:space="preserve">. A high proportion of nutrient retention estimates may be biased due to missing storm events that deliver a majority of nutrients to wetlands, and due to monitoring after the first three years after construction being rare </w:t>
+        <w:t xml:space="preserve">. Slowing down flow is important for both allowing sediment to </w:t>
+      </w:r>
+      <w:r>
+        <w:t>settle and</w:t>
+      </w:r>
+      <w:r>
+        <w:t xml:space="preserve"> </w:t>
+      </w:r>
+      <w:commentRangeStart w:id="3"/>
+      <w:r>
+        <w:t xml:space="preserve">allowing time for </w:t>
+      </w:r>
+      <w:r>
+        <w:t xml:space="preserve">the </w:t>
+      </w:r>
+      <w:r>
+        <w:t>sorption of phosphorus to sediment binding sites</w:t>
+      </w:r>
+      <w:commentRangeEnd w:id="3"/>
+      <w:r>
+        <w:rPr>
+          <w:rStyle w:val="CommentReference"/>
+          <w:sz w:val="22"/>
+          <w:szCs w:val="22"/>
+        </w:rPr>
+        <w:commentReference w:id="3"/>
+      </w:r>
+      <w:r>
+        <w:t xml:space="preserve"> and </w:t>
+      </w:r>
+      <w:r>
+        <w:t>denitrification</w:t>
+      </w:r>
+      <w:r>
+        <w:t xml:space="preserve"> </w:t>
       </w:r>
       <w:r>
         <w:fldChar w:fldCharType="begin"/>
       </w:r>
       <w:r>
-        <w:instrText xml:space="preserve"> ADDIN ZOTERO_ITEM CSL_CITATION {"citationID":"wkwnhsib","properties":{"formattedCitation":"(Anderson et al. 2024)","plainCitation":"(Anderson et al. 2024)","noteIndex":0},"citationItems":[{"id":5200,"uris":["http://zotero.org/users/5222684/items/5XVZM6SG"],"itemData":{"id":5200,"type":"article-journal","abstract":"Wetlands are increasingly being constructed to retain phosphorus, but indicators of performance are often unique to individual wetlands. In this quantitative literature synthesis, we highlight two major knowledge gaps and a source of bias in our current understanding of phosphorus retention by constructed and restored wetlands. We performed a literature review to assess differences in wetland characteristics, phosphorus retention, and sampling frequency and duration to better understand how constructed and restored wetlands retain phosphorus. We then examined a series of different sampling frequencies to determine how sampling approaches affect observed trends using a case study at the Old Woman Creek National Estuarine Research Reserve where high-resolution data on phosphorus concentrations was available. We found that, while differences among broad wetland structural groupings exist, measured rates of phosphorus retention are highly variable. Additionally, we observed that the wetlands sampled in the literature are most often newly constructed; 70% of the wetlands were monitored for three or fewer years. Among twelve wetlands that were monitored for over ten years, resampling techniques demonstrated that three-year time scales are unable to predict long-term trends for nutrient retention. Similarly, we found that 70% of wetlands in the literature were sampled weekly or less frequently and did not account for major flow events when estimating nutrient retention. Our case study analysis indicated that excluding storm events lead to a significant underestimate of phosphorus retention. We further demonstrate that when sampling is infrequent and misses storm events, the retention of water and phosphorus by wetlands causes higher underestimates at the inflow than the outflow where phosphorus leaves wetlands more slowly than the inflow. The greater underestimation of loads at outflows compared to inflows can lead to a wetland being mislabeled as a source when it is a sink for phosphorus if storm events are not accounted for. Together this synthesis highlights that our understanding of how constructed wetlands store phosphorus is limited by three major factors: a lack of long-term monitoring, the drivers of high variability in phosphorus retention between different wetland types, and potential bias from the difficulties of capturing storm events. Our analysis indicates that most published works have been conducted at shorter time frames, or lower sampling frequencies than are required for accurate estimates of phosphorus retention. This finding is of significance because substantial investments are made in restoring and constructing wetlands based on inadequately supported assumptions that wetlands are highly effective at phosphorus retention. Ultimately, these results can inform improvements to post-restoration assessment of wetland nutrient function, including decisions on where and when to monitor water quality.","container-title":"Ecological Indicators","DOI":"10.1016/j.ecolind.2024.112969","ISSN":"1470-160X","journalAbbreviation":"Ecological Indicators","page":"112969","source":"ScienceDirect","title":"We know less about phosphorus retention in constructed wetlands than we think we do: A quantitative literature synthesis","title-short":"We know less about phosphorus retention in constructed wetlands than we think we do","volume":"169","author":[{"family":"Anderson","given":"Kenneth J."},{"family":"Adhikari","given":"Bishwodeep"},{"family":"Schloegel","given":"Olivia F."},{"family":"Marques Mendonca","given":"Raissa"},{"family":"Back","given":"Michael P."},{"family":"Brocato","given":"Nicholas"},{"family":"Cianci-Gaskill","given":"Jacob A."},{"family":"McMurray","given":"Steven E."},{"family":"Bahlai","given":"Christie"},{"family":"Costello","given":"David M."},{"family":"Kinsman-Costello","given":"Lauren"}],"issued":{"date-parts":[["2024",12,1]]}}}],"schema":"https://github.com/citation-style-language/schema/raw/master/csl-citation.json"} </w:instrText>
+        <w:instrText xml:space="preserve"> ADDIN ZOTERO_ITEM CSL_CITATION {"citationID":"ziKvZYnY","properties":{"formattedCitation":"(Collins et al. 2016)","plainCitation":"(Collins et al. 2016)","noteIndex":0},"citationItems":[{"id":5235,"uris":["http://zotero.org/users/5222684/items/29GSIQYS"],"itemData":{"id":5235,"type":"article-journal","abstract":"Although considered a sink of nutrients, limited information exists to verify phosphorus (P) and nitrogen (N) retention in drainage networks such as ditches and canals. Nutrient retention within two ditches on a cattle ranch in the greater Everglades region was measured using in-situ mesocosms. Phosphorus and N concentrations of water inside the mesocosms were increased or decreased to evaluate the effect of P and N concentration on P and N flux across the sediment-water interface. Ditch sediments possess high P retention capacity which was related to aluminum and iron contents. Soluble reactive P (SRP) retention over seven days varied between 13 and 55% of the starting water column concentration, though retention was significant after one day (p=0.035). Significant P release, although observed only at one site, does indicate the potential for the ditch to be a source of P to downstream locations. The P uptake and release were greater and more rapid in a ditch with organic sediment and emergent macrophytes compared to a ditch with a mineral substrate. P retention over time was rate-limited by diffusion and sediment pore-water exchange. Nitrogen transformation processes were unsubstantial, possibly because in warm sub-tropical Florida most nitrate is denitrified in the presence of an energy source. Several empirical P models predicted (r2&gt;0.90) P retention based on the known water column SRP concentrations and hydraulic residence time. The residence time of the site (0.46 and 0.11 days for the two ditches) is not long enough to significantly reduce P loads passing through the ditches under the current drainage regime. Delaying the drainage by increased water retention as a voluntary Best Management Practice (BMP) or Payment for Environmental Services (PES) program can help increase the residence time to reduce P leaving the ranch. Although these results are derived from a cattle ranch, similar benefits can be expected for drainage ditches in other agricultural systems such as agronomic (e.g. sugarcane) or horticultural (e.g. citrus, vegetable) crops, and the models presented in this paper may be useful for basin-scale water quality management.","container-title":"Ecological Engineering","DOI":"10.1016/j.ecoleng.2016.04.003","ISSN":"0925-8574","journalAbbreviation":"Ecological Engineering","page":"218-228","source":"ScienceDirect","title":"Drainage ditches have sufficient adsorption capacity but inadequate residence time for phosphorus retention in the Everglades","volume":"92","author":[{"family":"Collins","given":"Steven D."},{"family":"Shukla","given":"Sanjay"},{"family":"Shrestha","given":"Niroj K."}],"issued":{"date-parts":[["2016",7,1]]}}}],"schema":"https://github.com/citation-style-language/schema/raw/master/csl-citation.json"} </w:instrText>
       </w:r>
       <w:r>
         <w:fldChar w:fldCharType="separate"/>
@@ -809,22 +1032,241 @@
         <w:rPr>
           <w:rFonts w:ascii="Aptos" w:hAnsi="Aptos"/>
         </w:rPr>
-        <w:t>(Anderson et al. 2024)</w:t>
+        <w:t>(Collins et al. 2016)</w:t>
       </w:r>
       <w:r>
         <w:fldChar w:fldCharType="end"/>
       </w:r>
       <w:r>
-        <w:t>. Understanding the drivers of nutrient retention for constructed wetlands will enable practitioners to create wetlands that maximize their nutrient retention capabilities and accurately assess tradeoffs in nutrient retention when creating wetlands with other</w:t>
-      </w:r>
-      <w:r>
-        <w:t xml:space="preserve"> primary</w:t>
-      </w:r>
-      <w:r>
-        <w:t xml:space="preserve"> goals such as waterfowl habitat, or diversity. </w:t>
+        <w:t xml:space="preserve">. Longer term storage can occur through sediment uptake by vegetation, which binds inorganic phosphorus to organic material making it more difficult to access by microbes and algae </w:t>
+      </w:r>
+      <w:r>
+        <w:fldChar w:fldCharType="begin"/>
+      </w:r>
+      <w:r>
+        <w:instrText xml:space="preserve"> ADDIN ZOTERO_ITEM CSL_CITATION {"citationID":"ERMTeBqo","properties":{"formattedCitation":"(Silvan et al. 2004, Lucas and Greenway 2008)","plainCitation":"(Silvan et al. 2004, Lucas and Greenway 2008)","noteIndex":0},"citationItems":[{"id":5251,"uris":["http://zotero.org/users/5222684/items/87QNR89P"],"itemData":{"id":5251,"type":"article-journal","abstract":"Wetland buffers may play an important role in the retention of nitrogen (N) and phosphorus (P) that can be released in large quantities from forestry operations. In this study, we investigated the retention capacity of N and P of wetland vegetation comparing the control area with two experimental areas within one site before and after N and P pulse (45 kg N and 15 kg P) lasting one growing season (ca. 150 d). N and P pulse caused a significant increase in the plant biomass and N and P content in the upper experimental area, which received most of the added nutrients. Added N and P was mainly retained in the above and below ground parts of E. vaginatum, especially in storage organs and roots which form a long-term sink for nutrients. Total N retention in the plant biomass during the first year after N and P treatment ranged from 25.3 kg (equals to 126.7 kg N ha−1) in the upper experimental area to 6.1 kg (20.4 kg N ha−1) in the lower experimental area and 4.7 kg (15.7 kg N ha−1) in the control area. P retention ranged from 2.6 kg (13.1 kg P ha−1) in the upper experimental area to 1.0 kg (3.4 kg P ha−1) in the lower experimental area and 0.5 kg (1.8 kg P ha−1) in the control area. The retained proportions of N and P in the plant biomass in the two experimental areas were approximately 70% of the added N (45 kg N y−1) and approximately 25% of the added P (15 kg P y−1) during the first year after N and P addition in 1999. Our study shows that vigorously colonising and growing vegetation is the main factor in the retention of N, a significant factor in the retention of P in a constructed wetland buffer, and thus an important contributor to the prevention of detrimental effects of N and P leaching on watercourses.","container-title":"Plant and Soil","DOI":"10.1023/B:PLSO.0000016549.70555.9d","ISSN":"1573-5036","issue":"1","journalAbbreviation":"Plant and Soil","language":"en","page":"179-187","source":"Springer Link","title":"Vegetation is the main factor in nutrient retention in a constructed wetland buffer","volume":"258","author":[{"family":"Silvan","given":"Niko"},{"family":"Vasander","given":"Harri"},{"family":"Laine","given":"Jukka"}],"issued":{"date-parts":[["2004",1,1]]}}},{"id":5252,"uris":["http://zotero.org/users/5222684/items/F4HLYBNL"],"itemData":{"id":5252,"type":"article-journal","abstract":"Thirty well-established 240L bioretention mesocosms were used to investigate retention\nof dissolved nutrients by bioretention systems. Ten mesocosms were comprised of   80 cm   sandy loam, ten of   80 cm   loamy sand, and ten of pea gravel with   20 cm   of loamy sand. Half were ...","container-title":"Journal of Irrigation and Drainage Engineering","DOI":"10.1061/(ASCE)0733-9437(2008)134:5(613)","ISSN":"0733-9437","issue":"5","language":"EN","page":"613-623","publisher":"American Society of Civil Engineers","source":"ASCE","title":"Nutrient Retention in Vegetated and Nonvegetated Bioretention Mesocosms","volume":"134","author":[{"family":"Lucas","given":"William C."},{"family":"Greenway","given":"Margaret"}],"issued":{"date-parts":[["2008",10,1]]}}}],"schema":"https://github.com/citation-style-language/schema/raw/master/csl-citation.json"} </w:instrText>
+      </w:r>
+      <w:r>
+        <w:fldChar w:fldCharType="separate"/>
+      </w:r>
+      <w:r>
+        <w:rPr>
+          <w:rFonts w:ascii="Aptos" w:hAnsi="Aptos"/>
+        </w:rPr>
+        <w:t>(Silvan et al. 2004, Lucas and Greenway 2008)</w:t>
+      </w:r>
+      <w:r>
+        <w:fldChar w:fldCharType="end"/>
+      </w:r>
+      <w:r>
+        <w:t xml:space="preserve">. </w:t>
       </w:r>
     </w:p>
     <w:p>
+      <w:pPr>
+        <w:ind w:firstLine="360"/>
+      </w:pPr>
+      <w:r>
+        <w:t xml:space="preserve">A variety of </w:t>
+      </w:r>
+      <w:r>
+        <w:t>metrics/indices</w:t>
+      </w:r>
+      <w:commentRangeStart w:id="4"/>
+      <w:r>
+        <w:t xml:space="preserve"> </w:t>
+      </w:r>
+      <w:commentRangeEnd w:id="4"/>
+      <w:r>
+        <w:rPr>
+          <w:rStyle w:val="CommentReference"/>
+          <w:sz w:val="22"/>
+          <w:szCs w:val="22"/>
+        </w:rPr>
+        <w:commentReference w:id="4"/>
+      </w:r>
+      <w:r>
+        <w:t xml:space="preserve">are </w:t>
+      </w:r>
+      <w:r>
+        <w:t xml:space="preserve">often </w:t>
+      </w:r>
+      <w:commentRangeStart w:id="5"/>
+      <w:r>
+        <w:t>used</w:t>
+      </w:r>
+      <w:r>
+        <w:t xml:space="preserve"> as a proxy</w:t>
+      </w:r>
+      <w:r>
+        <w:t xml:space="preserve"> </w:t>
+      </w:r>
+      <w:commentRangeEnd w:id="5"/>
+      <w:r>
+        <w:rPr>
+          <w:rStyle w:val="CommentReference"/>
+          <w:sz w:val="22"/>
+          <w:szCs w:val="22"/>
+        </w:rPr>
+        <w:commentReference w:id="5"/>
+      </w:r>
+      <w:r>
+        <w:t xml:space="preserve">to evaluate wetland restoration success, including </w:t>
+      </w:r>
+      <w:commentRangeStart w:id="6"/>
+      <w:r>
+        <w:t>vegetation</w:t>
+      </w:r>
+      <w:commentRangeEnd w:id="6"/>
+      <w:r>
+        <w:rPr>
+          <w:rStyle w:val="CommentReference"/>
+          <w:sz w:val="22"/>
+          <w:szCs w:val="22"/>
+        </w:rPr>
+        <w:commentReference w:id="6"/>
+      </w:r>
+      <w:r>
+        <w:t xml:space="preserve"> </w:t>
+      </w:r>
+      <w:r>
+        <w:t>diversity and biomass</w:t>
+      </w:r>
+      <w:r>
+        <w:t xml:space="preserve">, soil phosphorus sorption capacity (SPSC), and </w:t>
+      </w:r>
+      <w:r>
+        <w:t>hydrologic regime</w:t>
+      </w:r>
+      <w:r>
+        <w:t xml:space="preserve">, but many of the available methods may not accurately assess </w:t>
+      </w:r>
+      <w:r>
+        <w:t>a</w:t>
+      </w:r>
+      <w:r>
+        <w:t xml:space="preserve"> wetland</w:t>
+      </w:r>
+      <w:r>
+        <w:t>’</w:t>
+      </w:r>
+      <w:r>
+        <w:t xml:space="preserve">s ability to retain nutrients </w:t>
+      </w:r>
+      <w:r>
+        <w:fldChar w:fldCharType="begin"/>
+      </w:r>
+      <w:r>
+        <w:instrText xml:space="preserve"> ADDIN ZOTERO_ITEM CSL_CITATION {"citationID":"sDCjNdaP","properties":{"formattedCitation":"(Fennessy et al. 2007)","plainCitation":"(Fennessy et al. 2007)","noteIndex":0},"citationItems":[{"id":5254,"uris":["http://zotero.org/users/5222684/items/KV3EJM68"],"itemData":{"id":5254,"type":"article-journal","abstract":"We analyzed 40 existing wetland rapid assessment methods that were developed for a variety of purposes, including informing regulatory decisions and local land use planning, and reviewed them for their potential to assess ecological integrity or condition. Four evaluation criteria were used. We determined if the method 1) can be used to measure condition, 2) is truly rapid, 3) includes a site visit, and 4) can be verified. This resulted in six methods being selected for evaluation relative to a conceptual model describing the core elements of a wetland assessment method, including universal indicators of soil, hydrology, and biotic communities, as well as regional indicators. An additional nine methods were kept for ideas on indicators, scoring, or regionalization. From this review, we identified five general areas that need to be addressed when adapting existing methods or developing new methods to assess condition: 1) definition of the assessment area, 2) treatment of wetland type, 3) approaches to scoring, 4) consideration of highly valued wetland types or features, and 5) procedures for validation with comprehensive ecological data. With scoring in particular, we present the advantages of a method that produces a single integrative score. Development of a rapid assessment method can assist those interested in incorporating condition assessment into their programs because they require less time in the field and less taxonomic expertise than more quantitative methods, which can lead to significant cost savings and increased sample sizes.","container-title":"Wetlands","DOI":"10.1672/0277-5212(2007)27[543:AEORMF]2.0.CO;2","ISSN":"1943-6246","issue":"3","journalAbbreviation":"Wetlands","language":"en","license":"2007 Society of Wetland Scientists","note":"Company: Springer\nDistributor: Springer\nInstitution: Springer\nLabel: Springer\nnumber: 3","page":"543-560","publisher":"Springer Netherlands","source":"link.springer.com","title":"An evaluation of rapid methods for assessing the ecological condition of wetlands","volume":"27","author":[{"family":"Fennessy","given":"M. Siobhan"},{"family":"Jacobs","given":"Amy D."},{"family":"Kentula","given":"Mary E."}],"issued":{"date-parts":[["2007",9,1]]}}}],"schema":"https://github.com/citation-style-language/schema/raw/master/csl-citation.json"} </w:instrText>
+      </w:r>
+      <w:r>
+        <w:fldChar w:fldCharType="separate"/>
+      </w:r>
+      <w:r>
+        <w:rPr>
+          <w:rFonts w:ascii="Aptos" w:hAnsi="Aptos"/>
+        </w:rPr>
+        <w:t>(Fennessy et al. 2007)</w:t>
+      </w:r>
+      <w:r>
+        <w:fldChar w:fldCharType="end"/>
+      </w:r>
+      <w:r>
+        <w:t>. The drivers of nutrient retention in wetlands are not clearly understood, with high variability in rates of nutrient retention across a variety of studied wetlands</w:t>
+      </w:r>
+      <w:r>
+        <w:t>,</w:t>
+      </w:r>
+      <w:r>
+        <w:t xml:space="preserve"> but wetlands </w:t>
+      </w:r>
+      <w:r>
+        <w:t xml:space="preserve">experiencing high hydrologic loading rates </w:t>
+      </w:r>
+      <w:r>
+        <w:t xml:space="preserve">consistently retain more phosphorus </w:t>
+      </w:r>
+      <w:r>
+        <w:fldChar w:fldCharType="begin"/>
+      </w:r>
+      <w:r>
+        <w:instrText xml:space="preserve"> ADDIN ZOTERO_ITEM CSL_CITATION {"citationID":"DbSIlVM1","properties":{"formattedCitation":"(Land et al. 2016, Ury et al. 2023)","plainCitation":"(Land et al. 2016, Ury et al. 2023)","noteIndex":0},"citationItems":[{"id":1647,"uris":["http://zotero.org/users/5222684/items/ZFE5E3L8"],"itemData":{"id":1647,"type":"article-journal","abstract":"Eutrophication of aquatic environments is a major environmental problem in large parts of the world. In Europe, EU legislation (the Water Framework Directive and the Marine Strategy Framework Directive), international conventions (OSPAR, HELCOM) and national environmental objectives emphasize the need to reduce the input of nutrients to freshwater and marine environments. A widely used method to achieve this is to allow water to pass through a created or restored wetland. However, the large variation in measured nutrient removal rates in such wetlands calls for a systematic review.","container-title":"Environmental Evidence","DOI":"10.1186/s13750-016-0060-0","ISSN":"2047-2382","issue":"1","journalAbbreviation":"Environmental Evidence","page":"9","source":"BioMed Central","title":"How effective are created or restored freshwater wetlands for nitrogen and phosphorus removal? A systematic review","title-short":"How effective are created or restored freshwater wetlands for nitrogen and phosphorus removal?","volume":"5","author":[{"family":"Land","given":"Magnus"},{"family":"Granéli","given":"Wilhelm"},{"family":"Grimvall","given":"Anders"},{"family":"Hoffmann","given":"Carl Christian"},{"family":"Mitsch","given":"William J."},{"family":"Tonderski","given":"Karin S."},{"family":"Verhoeven","given":"Jos T. A."}],"issued":{"date-parts":[["2016",5,9]]}}},{"id":1654,"uris":["http://zotero.org/users/5222684/items/L4YNJ95X"],"itemData":{"id":1654,"type":"article-journal","container-title":"Environmental Research Letters","issue":"8","page":"083002","publisher":"IOP Publishing","source":"Google Scholar","title":"Source or sink? Meta-analysis reveals diverging controls of phosphorus retention and release in restored and constructed wetlands","title-short":"Source or sink?","volume":"18","author":[{"family":"Ury","given":"Emily A."},{"family":"Arrumugam","given":"Puvaanah"},{"family":"Herbert","given":"Ellen R."},{"family":"Badiou","given":"Pascal"},{"family":"Page","given":"Bryan"},{"family":"Basu","given":"Nandita B."}],"issued":{"date-parts":[["2023"]]}}}],"schema":"https://github.com/citation-style-language/schema/raw/master/csl-citation.json"} </w:instrText>
+      </w:r>
+      <w:r>
+        <w:fldChar w:fldCharType="separate"/>
+      </w:r>
+      <w:r>
+        <w:rPr>
+          <w:rFonts w:ascii="Aptos" w:hAnsi="Aptos"/>
+        </w:rPr>
+        <w:t>(Land et al. 2016, Ury et al. 2023)</w:t>
+      </w:r>
+      <w:r>
+        <w:fldChar w:fldCharType="end"/>
+      </w:r>
+      <w:r>
+        <w:t xml:space="preserve">. A high proportion of nutrient retention estimates may be biased due to missing storm events that deliver a majority of </w:t>
+      </w:r>
+      <w:r>
+        <w:t>a wetland’s annual nutrient load</w:t>
+      </w:r>
+      <w:r>
+        <w:t xml:space="preserve"> and due to monitoring after the first three years after construction being rare </w:t>
+      </w:r>
+      <w:r>
+        <w:fldChar w:fldCharType="begin"/>
+      </w:r>
+      <w:r>
+        <w:instrText xml:space="preserve"> ADDIN ZOTERO_ITEM CSL_CITATION {"citationID":"wkwnhsib","properties":{"formattedCitation":"(Anderson et al. 2024)","plainCitation":"(Anderson et al. 2024)","noteIndex":0},"citationItems":[{"id":5200,"uris":["http://zotero.org/users/5222684/items/5XVZM6SG"],"itemData":{"id":5200,"type":"article-journal","abstract":"Wetlands are increasingly being constructed to retain phosphorus, but indicators of performance are often unique to individual wetlands. In this quantitative literature synthesis, we highlight two major knowledge gaps and a source of bias in our current understanding of phosphorus retention by constructed and restored wetlands. We performed a literature review to assess differences in wetland characteristics, phosphorus retention, and sampling frequency and duration to better understand how constructed and restored wetlands retain phosphorus. We then examined a series of different sampling frequencies to determine how sampling approaches affect observed trends using a case study at the Old Woman Creek National Estuarine Research Reserve where high-resolution data on phosphorus concentrations was available. We found that, while differences among broad wetland structural groupings exist, measured rates of phosphorus retention are highly variable. Additionally, we observed that the wetlands sampled in the literature are most often newly constructed; 70% of the wetlands were monitored for three or fewer years. Among twelve wetlands that were monitored for over ten years, resampling techniques demonstrated that three-year time scales are unable to predict long-term trends for nutrient retention. Similarly, we found that 70% of wetlands in the literature were sampled weekly or less frequently and did not account for major flow events when estimating nutrient retention. Our case study analysis indicated that excluding storm events lead to a significant underestimate of phosphorus retention. We further demonstrate that when sampling is infrequent and misses storm events, the retention of water and phosphorus by wetlands causes higher underestimates at the inflow than the outflow where phosphorus leaves wetlands more slowly than the inflow. The greater underestimation of loads at outflows compared to inflows can lead to a wetland being mislabeled as a source when it is a sink for phosphorus if storm events are not accounted for. Together this synthesis highlights that our understanding of how constructed wetlands store phosphorus is limited by three major factors: a lack of long-term monitoring, the drivers of high variability in phosphorus retention between different wetland types, and potential bias from the difficulties of capturing storm events. Our analysis indicates that most published works have been conducted at shorter time frames, or lower sampling frequencies than are required for accurate estimates of phosphorus retention. This finding is of significance because substantial investments are made in restoring and constructing wetlands based on inadequately supported assumptions that wetlands are highly effective at phosphorus retention. Ultimately, these results can inform improvements to post-restoration assessment of wetland nutrient function, including decisions on where and when to monitor water quality.","container-title":"Ecological Indicators","DOI":"10.1016/j.ecolind.2024.112969","ISSN":"1470-160X","journalAbbreviation":"Ecological Indicators","page":"112969","source":"ScienceDirect","title":"We know less about phosphorus retention in constructed wetlands than we think we do: A quantitative literature synthesis","title-short":"We know less about phosphorus retention in constructed wetlands than we think we do","volume":"169","author":[{"family":"Anderson","given":"Kenneth J."},{"family":"Adhikari","given":"Bishwodeep"},{"family":"Schloegel","given":"Olivia F."},{"family":"Marques Mendonca","given":"Raissa"},{"family":"Back","given":"Michael P."},{"family":"Brocato","given":"Nicholas"},{"family":"Cianci-Gaskill","given":"Jacob A."},{"family":"McMurray","given":"Steven E."},{"family":"Bahlai","given":"Christie"},{"family":"Costello","given":"David M."},{"family":"Kinsman-Costello","given":"Lauren"}],"issued":{"date-parts":[["2024",12,1]]}}}],"schema":"https://github.com/citation-style-language/schema/raw/master/csl-citation.json"} </w:instrText>
+      </w:r>
+      <w:r>
+        <w:fldChar w:fldCharType="separate"/>
+      </w:r>
+      <w:r>
+        <w:rPr>
+          <w:rFonts w:ascii="Aptos" w:hAnsi="Aptos"/>
+        </w:rPr>
+        <w:t>(Anderson et al. 2024)</w:t>
+      </w:r>
+      <w:r>
+        <w:fldChar w:fldCharType="end"/>
+      </w:r>
+      <w:r>
+        <w:t xml:space="preserve">. Understanding the drivers of nutrient retention for constructed wetlands will enable practitioners to create wetlands that maximize their nutrient retention </w:t>
+      </w:r>
+      <w:r>
+        <w:t xml:space="preserve">capabilities and accurately </w:t>
+      </w:r>
+      <w:r>
+        <w:lastRenderedPageBreak/>
+        <w:t xml:space="preserve">assess </w:t>
+      </w:r>
+      <w:r>
+        <w:t>tradeoffs in nutrient retention when creating wetlands with other</w:t>
+      </w:r>
+      <w:r>
+        <w:t xml:space="preserve"> primary</w:t>
+      </w:r>
+      <w:r>
+        <w:t xml:space="preserve"> goals such as waterfowl habitat</w:t>
+      </w:r>
+      <w:r>
+        <w:t>, flood abatement,</w:t>
+      </w:r>
+      <w:r>
+        <w:t xml:space="preserve"> or </w:t>
+      </w:r>
+      <w:r>
+        <w:t>bio</w:t>
+      </w:r>
+      <w:r>
+        <w:t>diversity</w:t>
+      </w:r>
+      <w:r>
+        <w:t xml:space="preserve">. </w:t>
+      </w:r>
+    </w:p>
+    <w:p>
       <w:r>
         <w:tab/>
         <w:t xml:space="preserve">To investigate the drivers of nutrient retention in wetlands we </w:t>
@@ -839,7 +1281,13 @@
         <w:t>nutrient budgets for 24 constructed wetlands across Ohio</w:t>
       </w:r>
       <w:r>
-        <w:t xml:space="preserve">. We constructed nutrient budgets using a mass balance approach, collecting nutrient concentration and water volumes across all projects at the inflow and outflow and calculating retention as the portion of inflow that did not exit each wetland. </w:t>
+        <w:t xml:space="preserve">. We </w:t>
+      </w:r>
+      <w:r>
+        <w:t>calculated</w:t>
+      </w:r>
+      <w:r>
+        <w:t xml:space="preserve"> nutrient budgets using a mass balance approach, collecting nutrient concentration and water volumes across all projects at the inflow and outflow and calculating retention as the portion of inflow that did not exit each wetland. </w:t>
       </w:r>
       <w:r>
         <w:t xml:space="preserve">We aimed to address </w:t>
@@ -875,11 +1323,7 @@
         <w:t xml:space="preserve"> </w:t>
       </w:r>
       <w:r>
-        <w:t xml:space="preserve">inflow volume and nutrient </w:t>
-      </w:r>
-      <w:r>
-        <w:lastRenderedPageBreak/>
-        <w:t xml:space="preserve">concentrations as predictors of nutrient retention across all 24 wetlands. To investigate the potential for nutrient release we </w:t>
+        <w:t xml:space="preserve">inflow volume and nutrient concentrations as predictors of nutrient retention across all 24 wetlands. To investigate the potential for nutrient release we </w:t>
       </w:r>
       <w:r>
         <w:t xml:space="preserve">built logistic regressions to track the effects of timing, inflow volume, and nutrient concentration as potential drivers of release. To evaluate whether wetlands can feasibly contribute to landscape goals we </w:t>
@@ -888,7 +1332,11 @@
         <w:t xml:space="preserve">built out three hypothetical scenarios based on the data from </w:t>
       </w:r>
       <w:r>
-        <w:t xml:space="preserve">monitored wetlands to extrapolate the total area that would need to be converted to wetlands to meet Lake Erie nutrient loading </w:t>
+        <w:t xml:space="preserve">monitored wetlands to extrapolate the total area that would need to be converted to wetlands to meet </w:t>
+      </w:r>
+      <w:commentRangeStart w:id="7"/>
+      <w:r>
+        <w:t xml:space="preserve">Lake Erie nutrient loading </w:t>
       </w:r>
       <w:r>
         <w:t>goals</w:t>
@@ -901,6 +1349,15 @@
       </w:r>
       <w:r>
         <w:t>national Joint Council targets.</w:t>
+      </w:r>
+      <w:commentRangeEnd w:id="7"/>
+      <w:r>
+        <w:rPr>
+          <w:rStyle w:val="CommentReference"/>
+          <w:sz w:val="22"/>
+          <w:szCs w:val="22"/>
+        </w:rPr>
+        <w:commentReference w:id="7"/>
       </w:r>
       <w:r>
         <w:t xml:space="preserve"> </w:t>
@@ -978,7 +1435,20 @@
         <w:t>Initiativ</w:t>
       </w:r>
       <w:r>
-        <w:t xml:space="preserve">e: a water quality program administered by the Ohio Department of Natural Resources </w:t>
+        <w:t>e</w:t>
+      </w:r>
+      <w:ins w:id="8" w:author="Klukow, Mary Ellen" w:date="2026-08-26T13:06:00Z">
+        <w:r>
+          <w:t>,</w:t>
+        </w:r>
+      </w:ins>
+      <w:del w:id="9" w:author="Klukow, Mary Ellen" w:date="2026-08-26T13:06:00Z">
+        <w:r>
+          <w:delText>:</w:delText>
+        </w:r>
+      </w:del>
+      <w:r>
+        <w:t xml:space="preserve"> a water quality program administered by the Ohio Department of Natural Resources </w:t>
       </w:r>
       <w:r>
         <w:t>that has to date created 498 wetland projects throughout the state of Ohio</w:t>
@@ -1048,6 +1518,8 @@
       <w:r>
         <w:t xml:space="preserve"> </w:t>
       </w:r>
+      <w:commentRangeStart w:id="10"/>
+      <w:commentRangeStart w:id="11"/>
       <w:r>
         <w:t>The goal of the H2Ohio program is to mitigate harmful algal blooms in Lake Erie</w:t>
       </w:r>
@@ -1085,7 +1557,11 @@
         <w:t>approximately 80% agricultural land</w:t>
       </w:r>
       <w:r>
-        <w:t xml:space="preserve"> [</w:t>
+        <w:t xml:space="preserve"> </w:t>
+      </w:r>
+      <w:commentRangeStart w:id="12"/>
+      <w:r>
+        <w:t>[</w:t>
       </w:r>
       <w:r>
         <w:rPr>
@@ -1093,6 +1569,15 @@
         </w:rPr>
         <w:t>CITE SOMETHING HERE</w:t>
       </w:r>
+      <w:commentRangeEnd w:id="12"/>
+      <w:r>
+        <w:rPr>
+          <w:rStyle w:val="CommentReference"/>
+          <w:sz w:val="22"/>
+          <w:szCs w:val="22"/>
+        </w:rPr>
+        <w:commentReference w:id="12"/>
+      </w:r>
       <w:r>
         <w:t>]</w:t>
       </w:r>
@@ -1103,13 +1588,47 @@
         <w:t xml:space="preserve"> </w:t>
       </w:r>
       <w:r>
-        <w:t xml:space="preserve">Wetland restoration in Northeastern Ohio is especially relevant because </w:t>
+        <w:t>Wetland restoration in North</w:t>
+      </w:r>
+      <w:ins w:id="13" w:author="Klukow, Mary Ellen" w:date="2026-08-26T13:07:00Z">
+        <w:r>
+          <w:t>we</w:t>
+        </w:r>
+      </w:ins>
+      <w:del w:id="14" w:author="Klukow, Mary Ellen" w:date="2026-08-26T13:07:00Z">
+        <w:r>
+          <w:delText>ea</w:delText>
+        </w:r>
+      </w:del>
+      <w:r>
+        <w:t xml:space="preserve">stern Ohio is especially relevant because </w:t>
       </w:r>
       <w:r>
         <w:t xml:space="preserve">the landscape was radically altered starting in the early 1900s when the Great Black Swamp, a wetland that covered </w:t>
       </w:r>
       <w:r>
-        <w:t>1 million acres of Northeastern Ohio was drained to make room for agriculture</w:t>
+        <w:t>1 million acres of North</w:t>
+      </w:r>
+      <w:ins w:id="15" w:author="Klukow, Mary Ellen" w:date="2026-08-26T13:07:00Z">
+        <w:r>
+          <w:t>we</w:t>
+        </w:r>
+      </w:ins>
+      <w:del w:id="16" w:author="Klukow, Mary Ellen" w:date="2026-08-26T13:07:00Z">
+        <w:r>
+          <w:delText>ea</w:delText>
+        </w:r>
+      </w:del>
+      <w:r>
+        <w:t>stern Ohio</w:t>
+      </w:r>
+      <w:ins w:id="17" w:author="Klukow, Mary Ellen" w:date="2026-08-26T13:07:00Z">
+        <w:r>
+          <w:t>,</w:t>
+        </w:r>
+      </w:ins>
+      <w:r>
+        <w:t xml:space="preserve"> was drained to make room for agriculture</w:t>
       </w:r>
       <w:r>
         <w:t xml:space="preserve"> </w:t>
@@ -1148,7 +1667,23 @@
         <w:t>until</w:t>
       </w:r>
       <w:r>
-        <w:t xml:space="preserve"> the early 2000s </w:t>
+        <w:t xml:space="preserve"> </w:t>
+      </w:r>
+      <w:commentRangeStart w:id="18"/>
+      <w:r>
+        <w:t>the early 2000s</w:t>
+      </w:r>
+      <w:commentRangeEnd w:id="18"/>
+      <w:r>
+        <w:rPr>
+          <w:rStyle w:val="CommentReference"/>
+          <w:sz w:val="22"/>
+          <w:szCs w:val="22"/>
+        </w:rPr>
+        <w:commentReference w:id="18"/>
+      </w:r>
+      <w:r>
+        <w:t xml:space="preserve"> </w:t>
       </w:r>
       <w:r>
         <w:t>when</w:t>
@@ -1176,6 +1711,24 @@
       </w:r>
       <w:r>
         <w:t xml:space="preserve">, however the H2Ohio Initiative represents a major investment in wetland restoration across the state. </w:t>
+      </w:r>
+      <w:commentRangeEnd w:id="10"/>
+      <w:r>
+        <w:rPr>
+          <w:rStyle w:val="CommentReference"/>
+          <w:sz w:val="22"/>
+          <w:szCs w:val="22"/>
+        </w:rPr>
+        <w:commentReference w:id="10"/>
+      </w:r>
+      <w:commentRangeEnd w:id="11"/>
+      <w:r>
+        <w:rPr>
+          <w:rStyle w:val="CommentReference"/>
+          <w:sz w:val="22"/>
+          <w:szCs w:val="22"/>
+        </w:rPr>
+        <w:commentReference w:id="11"/>
       </w:r>
     </w:p>
     <w:p>
@@ -1188,8 +1741,21 @@
       <w:r>
         <w:t xml:space="preserve">collects data across </w:t>
       </w:r>
-      <w:r>
-        <w:t xml:space="preserve">51 </w:t>
+      <w:commentRangeStart w:id="19"/>
+      <w:r>
+        <w:t>51</w:t>
+      </w:r>
+      <w:commentRangeEnd w:id="19"/>
+      <w:r>
+        <w:rPr>
+          <w:rStyle w:val="CommentReference"/>
+          <w:sz w:val="22"/>
+          <w:szCs w:val="22"/>
+        </w:rPr>
+        <w:commentReference w:id="19"/>
+      </w:r>
+      <w:r>
+        <w:t xml:space="preserve"> </w:t>
       </w:r>
       <w:r>
         <w:t xml:space="preserve">total </w:t>
@@ -1267,7 +1833,11 @@
         <w:t xml:space="preserve">, while one was from a drainage area evenly split between </w:t>
       </w:r>
       <w:r>
-        <w:t>forest and agriculture.</w:t>
+        <w:t xml:space="preserve">forest </w:t>
+      </w:r>
+      <w:r>
+        <w:lastRenderedPageBreak/>
+        <w:t>and agriculture.</w:t>
       </w:r>
       <w:r>
         <w:t xml:space="preserve"> </w:t>
@@ -1340,7 +1910,11 @@
         <w:t xml:space="preserve">Wetland nutrient retention was calculated </w:t>
       </w:r>
       <w:r>
-        <w:t>using a mass loading approach, where inflowing</w:t>
+        <w:t xml:space="preserve">using a </w:t>
+      </w:r>
+      <w:commentRangeStart w:id="20"/>
+      <w:r>
+        <w:t>mass loading approach, where inflowing</w:t>
       </w:r>
       <w:r>
         <w:t xml:space="preserve"> and outflowing</w:t>
@@ -1367,7 +1941,19 @@
         <w:t>concentration</w:t>
       </w:r>
       <w:r>
-        <w:t xml:space="preserve">s for each wetland. </w:t>
+        <w:t>s for each wetland.</w:t>
+      </w:r>
+      <w:commentRangeEnd w:id="20"/>
+      <w:r>
+        <w:rPr>
+          <w:rStyle w:val="CommentReference"/>
+          <w:sz w:val="22"/>
+          <w:szCs w:val="22"/>
+        </w:rPr>
+        <w:commentReference w:id="20"/>
+      </w:r>
+      <w:r>
+        <w:t xml:space="preserve"> </w:t>
       </w:r>
       <w:r>
         <w:t xml:space="preserve">We calculated the nutrient retention </w:t>
@@ -1427,11 +2013,7 @@
         <w:t xml:space="preserve">direct measurement </w:t>
       </w:r>
       <w:r>
-        <w:t xml:space="preserve">of inflows, stage </w:t>
-      </w:r>
-      <w:r>
-        <w:lastRenderedPageBreak/>
-        <w:t>storage models, or</w:t>
+        <w:t>of inflows, stage storage models, or</w:t>
       </w:r>
       <w:r>
         <w:t xml:space="preserve"> estimation</w:t>
@@ -1914,7 +2496,7 @@
       <w:r>
         <w:t>Daily solar radiation (MJ/m²/day) was sourced from the National Aeronautics and Space Administration (NASA) Langley Research Center's Prediction Of Worldwide Energy Resources (</w:t>
       </w:r>
-      <w:hyperlink r:id="rId8">
+      <w:hyperlink r:id="rId12">
         <w:r>
           <w:rPr>
             <w:rStyle w:val="Hyperlink"/>
@@ -2009,7 +2591,11 @@
         <w:t>a</w:t>
       </w:r>
       <w:r>
-        <w:t>) to estimate the evaporative demand of the atmosphere over a hypothetical reference crop (Allen et al., 1998). Key intermediate variables (e.g., slope of the saturation vapor pressure curve, the psychrometric constant, mean saturation and actual vapor pressure) were calculated from the daily meteorological inputs and project-specific parameters (latitude, elevation). Soil heat flux density (</w:t>
+        <w:t xml:space="preserve">) to estimate the evaporative demand of the atmosphere over a hypothetical reference crop (Allen et al., 1998). Key intermediate variables (e.g., slope of the saturation vapor pressure curve, the psychrometric constant, mean saturation and actual vapor pressure) were calculated from the daily meteorological inputs and project-specific </w:t>
+      </w:r>
+      <w:r>
+        <w:lastRenderedPageBreak/>
+        <w:t>parameters (latitude, elevation). Soil heat flux density (</w:t>
       </w:r>
       <m:oMath>
         <m:r>
@@ -2173,7 +2759,6 @@
     </w:p>
     <w:p>
       <w:r>
-        <w:lastRenderedPageBreak/>
         <w:tab/>
         <w:t xml:space="preserve">The processing of new nutrients is not the only way that wetlands can contribute to nutrient reductions across the watershed. </w:t>
       </w:r>
@@ -2382,6 +2967,7 @@
     </w:p>
     <w:p>
       <w:r>
+        <w:lastRenderedPageBreak/>
         <w:t xml:space="preserve">To investigate relationships between nutrient retention, water volume, and nutrient concentration we </w:t>
       </w:r>
       <w:r>
@@ -2537,6 +3123,11 @@
       <w:r>
         <w:t xml:space="preserve"> in most wetlands</w:t>
       </w:r>
+      <w:ins w:id="21" w:author="Esber, Hana" w:date="2026-08-28T11:00:00Z">
+        <w:r>
+          <w:t>,</w:t>
+        </w:r>
+      </w:ins>
       <w:r>
         <w:t xml:space="preserve"> </w:t>
       </w:r>
@@ -2546,6 +3137,11 @@
       <w:r>
         <w:t>wetlands</w:t>
       </w:r>
+      <w:ins w:id="22" w:author="Esber, Hana" w:date="2026-08-28T11:00:00Z">
+        <w:r>
+          <w:t>,</w:t>
+        </w:r>
+      </w:ins>
       <w:r>
         <w:t xml:space="preserve"> and net annual TN release in three </w:t>
       </w:r>
@@ -2583,11 +3179,7 @@
         <w:t xml:space="preserve"> TP retention ranged </w:t>
       </w:r>
       <w:r>
-        <w:t xml:space="preserve">from –11 lbs./year to 1732 lbs./year, with a mean (± standard deviation) of 113 </w:t>
-      </w:r>
-      <w:r>
-        <w:lastRenderedPageBreak/>
-        <w:t>lbs./year (±280), and a median of 25</w:t>
+        <w:t>from –11 lbs./year to 1732 lbs./year, with a mean (± standard deviation) of 113 lbs./year (±280), and a median of 25</w:t>
       </w:r>
       <w:r>
         <w:t xml:space="preserve"> </w:t>
@@ -2793,7 +3385,23 @@
         <w:t>Dissolved nutrients were similarly retained primarily during spring with</w:t>
       </w:r>
       <w:r>
-        <w:t xml:space="preserve"> 34% of DRP is processed in the spring and 39% in the summer, 44% of nitrite+nitrate is processed in the spring and 38% in the summer, and 18% of total ammonium nitrogen (NH4) is processed in the spring and 58% in the summer.</w:t>
+        <w:t xml:space="preserve"> 34% of DRP is processed in the spring and 39% in the summer, 44% of nitrite+nitrate is processed in the spring and 38% in the summer, and 18% of total ammonium nitrogen (NH4) is processed in the spring and 58% in the </w:t>
+      </w:r>
+      <w:commentRangeStart w:id="23"/>
+      <w:r>
+        <w:t>summer</w:t>
+      </w:r>
+      <w:commentRangeEnd w:id="23"/>
+      <w:r>
+        <w:rPr>
+          <w:rStyle w:val="CommentReference"/>
+          <w:sz w:val="22"/>
+          <w:szCs w:val="22"/>
+        </w:rPr>
+        <w:commentReference w:id="23"/>
+      </w:r>
+      <w:r>
+        <w:t>.</w:t>
       </w:r>
     </w:p>
     <w:p>
@@ -2839,7 +3447,13 @@
         <w:t xml:space="preserve"> across wetlands was significantly </w:t>
       </w:r>
       <w:r>
-        <w:t xml:space="preserve">related to inflow volume. Across months and Projects, the </w:t>
+        <w:t xml:space="preserve">related to inflow volume. Across months and </w:t>
+      </w:r>
+      <w:r>
+        <w:t>wetlands</w:t>
+      </w:r>
+      <w:r>
+        <w:t xml:space="preserve">, the </w:t>
       </w:r>
       <w:r>
         <w:t xml:space="preserve">log-scale </w:t>
@@ -3164,6 +3778,8 @@
       </w:r>
     </w:p>
     <w:p>
+      <w:commentRangeStart w:id="24"/>
+      <w:commentRangeStart w:id="25"/>
       <w:r>
         <w:tab/>
       </w:r>
@@ -3186,13 +3802,46 @@
         <w:t xml:space="preserve">however the function of the wetland </w:t>
       </w:r>
       <w:r>
-        <w:t>on nutrient retention is represented by the change from in</w:t>
-      </w:r>
-      <w:r>
-        <w:t xml:space="preserve">let to outlet which is not </w:t>
-      </w:r>
-      <w:r>
-        <w:t xml:space="preserve">included in the model. </w:t>
+        <w:t xml:space="preserve">on nutrient </w:t>
+      </w:r>
+      <w:r>
+        <w:lastRenderedPageBreak/>
+        <w:t>retention is represented by the change from in</w:t>
+      </w:r>
+      <w:r>
+        <w:t>let to outlet</w:t>
+      </w:r>
+      <w:ins w:id="26" w:author="Klukow, Mary Ellen" w:date="2026-08-26T13:17:00Z">
+        <w:r>
+          <w:t>,</w:t>
+        </w:r>
+      </w:ins>
+      <w:r>
+        <w:t xml:space="preserve"> which is not </w:t>
+      </w:r>
+      <w:r>
+        <w:t>included in the model.</w:t>
+      </w:r>
+      <w:commentRangeEnd w:id="24"/>
+      <w:r>
+        <w:rPr>
+          <w:rStyle w:val="CommentReference"/>
+          <w:sz w:val="22"/>
+          <w:szCs w:val="22"/>
+        </w:rPr>
+        <w:commentReference w:id="24"/>
+      </w:r>
+      <w:commentRangeEnd w:id="25"/>
+      <w:r>
+        <w:rPr>
+          <w:rStyle w:val="CommentReference"/>
+          <w:sz w:val="22"/>
+          <w:szCs w:val="22"/>
+        </w:rPr>
+        <w:commentReference w:id="25"/>
+      </w:r>
+      <w:r>
+        <w:t xml:space="preserve"> </w:t>
       </w:r>
       <w:r>
         <w:t>T</w:t>
@@ -3261,7 +3910,52 @@
         <w:t>TP</w:t>
       </w:r>
       <w:r>
-        <w:t xml:space="preserve">, 3.5lbs for TN, 4.2lbs for DRP, 7.5lbs for NOX, and 4.7lbs for NH3. </w:t>
+        <w:t xml:space="preserve">, 3.5lbs for TN, 4.2lbs for DRP, 7.5lbs for </w:t>
+      </w:r>
+      <w:commentRangeStart w:id="27"/>
+      <w:r>
+        <w:t>NO</w:t>
+      </w:r>
+      <w:ins w:id="28" w:author="Esber, Hana" w:date="2026-08-28T11:09:00Z">
+        <w:r>
+          <w:rPr>
+            <w:vertAlign w:val="subscript"/>
+          </w:rPr>
+          <w:t>x</w:t>
+        </w:r>
+      </w:ins>
+      <w:del w:id="29" w:author="Esber, Hana" w:date="2026-08-28T11:09:00Z">
+        <w:r>
+          <w:delText>X</w:delText>
+        </w:r>
+      </w:del>
+      <w:r>
+        <w:t>, and 4.7lbs for NH</w:t>
+      </w:r>
+      <w:ins w:id="30" w:author="Esber, Hana" w:date="2026-08-28T11:09:00Z">
+        <w:r>
+          <w:rPr>
+            <w:vertAlign w:val="subscript"/>
+          </w:rPr>
+          <w:t>4</w:t>
+        </w:r>
+      </w:ins>
+      <w:del w:id="31" w:author="Esber, Hana" w:date="2026-08-28T11:09:00Z">
+        <w:r>
+          <w:delText>3</w:delText>
+        </w:r>
+      </w:del>
+      <w:commentRangeEnd w:id="27"/>
+      <w:r>
+        <w:rPr>
+          <w:rStyle w:val="CommentReference"/>
+          <w:sz w:val="22"/>
+          <w:szCs w:val="22"/>
+        </w:rPr>
+        <w:commentReference w:id="27"/>
+      </w:r>
+      <w:r>
+        <w:t xml:space="preserve">. </w:t>
       </w:r>
       <w:r>
         <w:t xml:space="preserve">We then applied each new model to predict nutrient retention at the removed wetland and found </w:t>
@@ -3375,11 +4069,7 @@
         <w:t>was</w:t>
       </w:r>
       <w:r>
-        <w:t xml:space="preserve"> a </w:t>
-      </w:r>
-      <w:r>
-        <w:lastRenderedPageBreak/>
-        <w:t>similar or occasionally</w:t>
+        <w:t xml:space="preserve"> a similar or occasionally</w:t>
       </w:r>
       <w:r>
         <w:t xml:space="preserve"> a</w:t>
@@ -3491,21 +4181,57 @@
       <w:r>
         <w:t xml:space="preserve"> </w:t>
       </w:r>
-      <w:r>
-        <w:t>Based on model t-values TP</w:t>
+      <w:commentRangeStart w:id="32"/>
+      <w:commentRangeStart w:id="33"/>
+      <w:r>
+        <w:t>Based on model t-values</w:t>
+      </w:r>
+      <w:ins w:id="34" w:author="Esber, Hana" w:date="2026-08-28T11:11:00Z">
+        <w:r>
+          <w:t>,</w:t>
+        </w:r>
+      </w:ins>
+      <w:r>
+        <w:t xml:space="preserve"> TP</w:t>
       </w:r>
       <w:r>
         <w:t xml:space="preserve"> concentration </w:t>
       </w:r>
       <w:r>
-        <w:t xml:space="preserve">was a more significant predictor than inflowing volume at two wetlands, and </w:t>
-      </w:r>
-      <w:r>
-        <w:t>within the same magnitude</w:t>
-      </w:r>
+        <w:t>was a more significant predictor than inflowing volume at two wetlands</w:t>
+      </w:r>
+      <w:ins w:id="35" w:author="Esber, Hana" w:date="2026-08-28T11:12:00Z">
+        <w:r>
+          <w:t>.</w:t>
+        </w:r>
+      </w:ins>
+      <w:del w:id="36" w:author="Esber, Hana" w:date="2026-08-28T11:12:00Z">
+        <w:r>
+          <w:delText>,</w:delText>
+        </w:r>
+      </w:del>
       <w:r>
         <w:t xml:space="preserve"> </w:t>
       </w:r>
+      <w:del w:id="37" w:author="Esber, Hana" w:date="2026-08-28T11:12:00Z">
+        <w:r>
+          <w:delText xml:space="preserve">and </w:delText>
+        </w:r>
+        <w:r>
+          <w:delText>w</w:delText>
+        </w:r>
+      </w:del>
+      <w:ins w:id="38" w:author="Esber, Hana" w:date="2026-08-28T11:12:00Z">
+        <w:r>
+          <w:t>W</w:t>
+        </w:r>
+      </w:ins>
+      <w:r>
+        <w:t>ithin the same magnitude</w:t>
+      </w:r>
+      <w:r>
+        <w:t xml:space="preserve"> </w:t>
+      </w:r>
       <w:r>
         <w:t>at 8 more wetlands</w:t>
       </w:r>
@@ -3561,7 +4287,28 @@
         <w:t>more wetlands</w:t>
       </w:r>
       <w:r>
-        <w:t xml:space="preserve"> (</w:t>
+        <w:t xml:space="preserve"> </w:t>
+      </w:r>
+      <w:commentRangeEnd w:id="32"/>
+      <w:r>
+        <w:rPr>
+          <w:rStyle w:val="CommentReference"/>
+          <w:sz w:val="22"/>
+          <w:szCs w:val="22"/>
+        </w:rPr>
+        <w:commentReference w:id="32"/>
+      </w:r>
+      <w:commentRangeEnd w:id="33"/>
+      <w:r>
+        <w:rPr>
+          <w:rStyle w:val="CommentReference"/>
+          <w:sz w:val="22"/>
+          <w:szCs w:val="22"/>
+        </w:rPr>
+        <w:commentReference w:id="33"/>
+      </w:r>
+      <w:r>
+        <w:t>(</w:t>
       </w:r>
       <w:r>
         <w:fldChar w:fldCharType="begin"/>
@@ -3914,6 +4661,7 @@
         <w:ind w:firstLine="720"/>
       </w:pPr>
       <w:r>
+        <w:lastRenderedPageBreak/>
         <w:t xml:space="preserve">We </w:t>
       </w:r>
       <w:r>
@@ -4036,7 +4784,20 @@
         <w:t>using wetland systems</w:t>
       </w:r>
       <w:r>
-        <w:t>: Typical wetlands (</w:t>
+        <w:t xml:space="preserve">: </w:t>
+      </w:r>
+      <w:ins w:id="39" w:author="Klukow, Mary Ellen" w:date="2026-08-26T13:25:00Z">
+        <w:r>
+          <w:t>t</w:t>
+        </w:r>
+      </w:ins>
+      <w:del w:id="40" w:author="Klukow, Mary Ellen" w:date="2026-08-26T13:25:00Z">
+        <w:r>
+          <w:delText>T</w:delText>
+        </w:r>
+      </w:del>
+      <w:r>
+        <w:t>ypical wetlands (</w:t>
       </w:r>
       <w:r>
         <w:t>i.e., representative of commonly occurring projects across the portfolio, generally with sporadic connectivity to source water; 50th percentile nutrient retention</w:t>
@@ -4096,11 +4857,7 @@
         <w:t xml:space="preserve">. This </w:t>
       </w:r>
       <w:r>
-        <w:t xml:space="preserve">means that 102,000 acres of typical wetlands, </w:t>
-      </w:r>
-      <w:r>
-        <w:lastRenderedPageBreak/>
-        <w:t xml:space="preserve">38,000 acres of connected wetlands, or </w:t>
+        <w:t xml:space="preserve">means that 102,000 acres of typical wetlands, 38,000 acres of connected wetlands, or </w:t>
       </w:r>
       <w:r>
         <w:t xml:space="preserve">1,800 acres of the best possible wetlands would be needed to meet Maumee River TMDL goals. </w:t>
@@ -4169,10 +4926,29 @@
         </w:numPr>
       </w:pPr>
       <w:r>
-        <w:t xml:space="preserve">Volume </w:t>
-      </w:r>
-      <w:r>
-        <w:t xml:space="preserve">determines load in. </w:t>
+        <w:t xml:space="preserve">Across wetlands </w:t>
+      </w:r>
+      <w:commentRangeStart w:id="41"/>
+      <w:r>
+        <w:t xml:space="preserve">hydrology </w:t>
+      </w:r>
+      <w:commentRangeEnd w:id="41"/>
+      <w:r>
+        <w:rPr>
+          <w:rStyle w:val="CommentReference"/>
+          <w:sz w:val="22"/>
+          <w:szCs w:val="22"/>
+        </w:rPr>
+        <w:commentReference w:id="41"/>
+      </w:r>
+      <w:r>
+        <w:t>controls nutrient retention</w:t>
+      </w:r>
+      <w:r>
+        <w:t>/release</w:t>
+      </w:r>
+      <w:r>
+        <w:t xml:space="preserve">. </w:t>
       </w:r>
     </w:p>
     <w:p>
@@ -4184,10 +4960,104 @@
         </w:numPr>
       </w:pPr>
       <w:r>
+        <w:t xml:space="preserve">Discussion of % retention vs. net retention. Efficiency doesn’t matter when you’re thinking about wetland broadly, but does matter within individual wetlands. Set the stage. Cite </w:t>
+      </w:r>
+      <w:r>
+        <w:fldChar w:fldCharType="begin"/>
+      </w:r>
+      <w:r>
+        <w:instrText xml:space="preserve"> ADDIN ZOTERO_ITEM CSL_CITATION {"citationID":"4PCy1Atz","properties":{"unsorted":false,"formattedCitation":"(Ury et al. 2023)","plainCitation":"(Ury et al. 2023)","noteIndex":0},"citationItems":[{"id":1654,"uris":["http://zotero.org/users/5222684/items/L4YNJ95X"],"itemData":{"id":1654,"type":"article-journal","container-title":"Environmental Research Letters","issue":"8","page":"083002","publisher":"IOP Publishing","source":"Google Scholar","title":"Source or sink? Meta-analysis reveals diverging controls of phosphorus retention and release in restored and constructed wetlands","title-short":"Source or sink?","volume":"18","author":[{"family":"Ury","given":"Emily A."},{"family":"Arrumugam","given":"Puvaanah"},{"family":"Herbert","given":"Ellen R."},{"family":"Badiou","given":"Pascal"},{"family":"Page","given":"Bryan"},{"family":"Basu","given":"Nandita B."}],"issued":{"date-parts":[["2023"]]}}}],"schema":"https://github.com/citation-style-language/schema/raw/master/csl-citation.json"} </w:instrText>
+      </w:r>
+      <w:r>
+        <w:fldChar w:fldCharType="separate"/>
+      </w:r>
+      <w:r>
+        <w:rPr>
+          <w:rFonts w:ascii="Aptos" w:hAnsi="Aptos"/>
+        </w:rPr>
+        <w:t>(Ury et al. 2023)</w:t>
+      </w:r>
+      <w:r>
+        <w:fldChar w:fldCharType="end"/>
+      </w:r>
+      <w:r>
+        <w:t xml:space="preserve"> to talk about </w:t>
+      </w:r>
+      <w:r>
+        <w:t xml:space="preserve">how they found that % retention decreased with hydraulic </w:t>
+      </w:r>
+      <w:r>
+        <w:t>loading rate</w:t>
+      </w:r>
+      <w:r>
+        <w:t>, which led them to conclude that higher hydraulic loading rate may lead to release. We show opposite but similar</w:t>
+      </w:r>
+      <w:r>
+        <w:t>: volume in sets the scale for BOTH release and retention.</w:t>
+      </w:r>
+    </w:p>
+    <w:p>
+      <w:pPr>
+        <w:pStyle w:val="ListParagraph"/>
+        <w:numPr>
+          <w:ilvl w:val="1"/>
+          <w:numId w:val="14"/>
+        </w:numPr>
+      </w:pPr>
+      <w:r>
+        <w:t xml:space="preserve">Volume </w:t>
+      </w:r>
+      <w:r>
+        <w:t xml:space="preserve">determines load in. </w:t>
+      </w:r>
+      <w:r>
+        <w:t>Similar results found in meta-analyses</w:t>
+      </w:r>
+      <w:r>
+        <w:t xml:space="preserve"> </w:t>
+      </w:r>
+      <w:r>
+        <w:t xml:space="preserve">but this is the </w:t>
+      </w:r>
+      <w:r>
+        <w:t>largest</w:t>
+      </w:r>
+      <w:r>
+        <w:t xml:space="preserve"> cohesive dataset showing this </w:t>
+      </w:r>
+      <w:r>
+        <w:t>pattern</w:t>
+      </w:r>
+      <w:r>
+        <w:t xml:space="preserve"> </w:t>
+      </w:r>
+    </w:p>
+    <w:p>
+      <w:pPr>
+        <w:pStyle w:val="ListParagraph"/>
+        <w:numPr>
+          <w:ilvl w:val="1"/>
+          <w:numId w:val="14"/>
+        </w:numPr>
+      </w:pPr>
+      <w:r>
         <w:t>Slowing down water and residence time important</w:t>
       </w:r>
       <w:r>
-        <w:t xml:space="preserve"> to efficiency</w:t>
+        <w:t xml:space="preserve"> to </w:t>
+      </w:r>
+      <w:commentRangeStart w:id="42"/>
+      <w:r>
+        <w:t>efficiency</w:t>
+      </w:r>
+      <w:commentRangeEnd w:id="42"/>
+      <w:r>
+        <w:rPr>
+          <w:rStyle w:val="CommentReference"/>
+          <w:sz w:val="22"/>
+          <w:szCs w:val="22"/>
+        </w:rPr>
+        <w:commentReference w:id="42"/>
       </w:r>
       <w:r>
         <w:t xml:space="preserve">, but high efficiency can only do so much when </w:t>
@@ -4217,7 +5087,39 @@
         </w:numPr>
       </w:pPr>
       <w:r>
-        <w:t xml:space="preserve">Talk about capturing sources of high nutrient water. </w:t>
+        <w:t xml:space="preserve">Talk about capturing sources of high nutrient </w:t>
+      </w:r>
+      <w:commentRangeStart w:id="43"/>
+      <w:commentRangeStart w:id="44"/>
+      <w:r>
+        <w:t>water</w:t>
+      </w:r>
+      <w:commentRangeEnd w:id="43"/>
+      <w:r>
+        <w:rPr>
+          <w:rStyle w:val="CommentReference"/>
+          <w:sz w:val="22"/>
+          <w:szCs w:val="22"/>
+        </w:rPr>
+        <w:commentReference w:id="43"/>
+      </w:r>
+      <w:commentRangeEnd w:id="44"/>
+      <w:r>
+        <w:rPr>
+          <w:rStyle w:val="CommentReference"/>
+          <w:sz w:val="22"/>
+          <w:szCs w:val="22"/>
+        </w:rPr>
+        <w:commentReference w:id="44"/>
+      </w:r>
+      <w:r>
+        <w:t xml:space="preserve">. </w:t>
+      </w:r>
+      <w:r>
+        <w:t>Talk about capturing storm water</w:t>
+      </w:r>
+      <w:r>
+        <w:t xml:space="preserve"> and how storm water is sometimes higher concentration. Cite that one paper </w:t>
       </w:r>
     </w:p>
     <w:p>
@@ -4253,7 +5155,33 @@
         </w:numPr>
       </w:pPr>
       <w:r>
-        <w:t xml:space="preserve">Diffusion at low concentration. </w:t>
+        <w:t>Diffusion at low concentratio</w:t>
+      </w:r>
+      <w:r>
+        <w:t xml:space="preserve">n? </w:t>
+      </w:r>
+      <w:commentRangeStart w:id="45"/>
+      <w:commentRangeStart w:id="46"/>
+      <w:r>
+        <w:t xml:space="preserve">Find some literature on this to think more about. </w:t>
+      </w:r>
+      <w:commentRangeEnd w:id="45"/>
+      <w:r>
+        <w:rPr>
+          <w:rStyle w:val="CommentReference"/>
+          <w:sz w:val="22"/>
+          <w:szCs w:val="22"/>
+        </w:rPr>
+        <w:commentReference w:id="45"/>
+      </w:r>
+      <w:commentRangeEnd w:id="46"/>
+      <w:r>
+        <w:rPr>
+          <w:rStyle w:val="CommentReference"/>
+          <w:sz w:val="22"/>
+          <w:szCs w:val="22"/>
+        </w:rPr>
+        <w:commentReference w:id="46"/>
       </w:r>
     </w:p>
     <w:p>
@@ -4275,12 +5203,30 @@
       <w:pPr>
         <w:pStyle w:val="ListParagraph"/>
         <w:numPr>
-          <w:ilvl w:val="0"/>
+          <w:ilvl w:val="1"/>
           <w:numId w:val="14"/>
         </w:numPr>
       </w:pPr>
       <w:r>
-        <w:t xml:space="preserve">Long-term data needed to understand nutrient retention. Can’t predict trends with only 3 years of data </w:t>
+        <w:t xml:space="preserve">Drying and rewetting can make release more likely </w:t>
+      </w:r>
+      <w:r>
+        <w:fldChar w:fldCharType="begin"/>
+      </w:r>
+      <w:r>
+        <w:instrText xml:space="preserve"> ADDIN ZOTERO_ITEM CSL_CITATION {"citationID":"nZshPczU","properties":{"unsorted":false,"formattedCitation":"(Aldous et al. 2005, Kinsman-Costello et al. 2014)","plainCitation":"(Aldous et al. 2005, Kinsman-Costello et al. 2014)","noteIndex":0},"citationItems":[{"id":6242,"uris":["http://zotero.org/users/5222684/items/HAVI2P4S"],"itemData":{"id":6242,"type":"article-journal","abstract":"Many wetland restoration projects occur on former agricultural soils that have a history of disturbance and fertilization, making them prone to phosphorus (P) release upon flooding. To study the relationship between P release and hydrologic regime, we collected soil cores from three restoration wetlands and three undisturbed wetlands around Upper Klamath Lake in southern Oregon, U.S.A. Soil cores were subjected to one of three hydrologic regimes—flooded, moist, and dry—for 7.5 weeks, and P fluxes were measured upon reflooding. Soils from restoration wetlands released P upon reflooding regardless of the hydrologic regime, with the greatest releases coming from soils that had been flooded or dried. Undisturbed wetland soils released P only after drying. Patterns in P release can be explained by a combination of physical and biological processes, including the release of iron-bound P due to anoxia in the flooded treatment and the mineralization of organic P under aerobic conditions in the dry treatment. Higher rates of soil P release from restoration wetland soils, particularly under flooded conditions, were associated with higher total P concentrations compared with undisturbed wetland soils. We conclude that maintaining moist soil is the means to minimize P release from recently flooded wetland soils. Alternatively, prolonged flooding provides a means of liberating excess labile P from former agricultural soils while minimizing continued organic P mineralization and soil subsidence.","container-title":"Restoration Ecology","DOI":"10.1111/j.1526-100X.2005.00043.x","ISSN":"1526-100X","issue":"2","language":"en","page":"341-347","source":"Wiley Online Library","title":"Hydrologic Regime Controls Soil Phosphorus Fluxes in Restoration and Undisturbed Wetlands","volume":"13","author":[{"family":"Aldous","given":"Allison"},{"family":"McCormick","given":"Paul"},{"family":"Ferguson","given":"Chad"},{"family":"Graham","given":"Sean"},{"family":"Craft","given":"Chris"}],"issued":{"date-parts":[["2005"]]}}},{"id":1726,"uris":["http://zotero.org/users/5222684/items/2ACSDNEP"],"itemData":{"id":1726,"type":"article-journal","abstract":"Wetland restoration provides many benefits, but re-flooding historically drained land can have unintended negative consequences, including phosphorus (P) release from sediments. To investigate the effects of re-flooding on P cycling, this study monitored a restoration in Michigan that back-flooded old drainage ditches and re-flooded former wetland soils. Immediately after re-flooding, previously exposed sediments released substantial amounts of P to the water column. Soluble reactive phosphorus (SRP) concentrations in re-flooded areas were as high as 750 μg P l−1. At peak P concentrations, there were about 20 times more SRP and 14 times more total P in the surface water than in the much smaller flooded area that existed before re-flooding. Prolific growth of filamentous algae and duckweed was observed in subsequent summers. Sedimental analyses suggest that most of the P released originated from iron-bound fractions. The highest SRP concentrations occurred during the first year when surface water dissolved oxygen was low (&lt;5.5 mg l−1). Similarly low oxygen in the second year after flooding was not associated with such high P concentrations. After 1 year postflooding, SRP concentrations remained below 50 μg P l−1 (but still high enough to produce eutrophic conditions) until the end of sampling about 15 months after re-flooding. When re-flooding historically drained soils, managers should consider the potential for sediment P release to jeopardize restoration goals and therefore should incorporate longer term monitoring of water quality into restoration plans. Knowledge of sediment P amounts and forms can indicate the potential for P release to overlying water.","container-title":"Ecosystems","DOI":"10.1007/s10021-014-9748-6","ISSN":"1435-0629","issue":"4","journalAbbreviation":"Ecosystems","language":"en","page":"641-656","source":"Springer Link","title":"Re-flooding a Historically Drained Wetland Leads to Rapid Sediment Phosphorus Release","volume":"17","author":[{"family":"Kinsman-Costello","given":"Lauren E."},{"family":"O’Brien","given":"Jonathan"},{"family":"Hamilton","given":"Stephen K."}],"issued":{"date-parts":[["2014",6,1]]}}}],"schema":"https://github.com/citation-style-language/schema/raw/master/csl-citation.json"} </w:instrText>
+      </w:r>
+      <w:r>
+        <w:fldChar w:fldCharType="separate"/>
+      </w:r>
+      <w:r>
+        <w:rPr>
+          <w:rFonts w:ascii="Aptos" w:hAnsi="Aptos"/>
+        </w:rPr>
+        <w:t>(Aldous et al. 2005, Kinsman-Costello et al. 2014)</w:t>
+      </w:r>
+      <w:r>
+        <w:fldChar w:fldCharType="end"/>
       </w:r>
     </w:p>
     <w:p>
@@ -4292,10 +5238,8 @@
         </w:numPr>
       </w:pPr>
       <w:r>
-        <w:t xml:space="preserve">Scaling up: </w:t>
-      </w:r>
-      <w:r>
-        <w:t xml:space="preserve">TMDL calculation </w:t>
+        <w:lastRenderedPageBreak/>
+        <w:t>Timing of retention</w:t>
       </w:r>
     </w:p>
     <w:p>
@@ -4307,19 +5251,50 @@
         </w:numPr>
       </w:pPr>
       <w:r>
-        <w:t xml:space="preserve">Talk about current number of wetlands built compared to how many connected wetlands would be needed. Highlight that </w:t>
-      </w:r>
-      <w:r>
-        <w:t xml:space="preserve">meeting TMDL goals is </w:t>
-      </w:r>
-      <w:r>
-        <w:t>in the realm of the possible</w:t>
-      </w:r>
-      <w:r>
-        <w:t xml:space="preserve"> (if we use connected wetlands… or just build a TON of the basic wetlands)</w:t>
-      </w:r>
-      <w:r>
-        <w:t>!</w:t>
+        <w:t>Talk about storms and how nutrient runoff to Lake Erie mostly happens during just a couple storms so wetlands capturing nutrients during those storms is important</w:t>
+      </w:r>
+    </w:p>
+    <w:p>
+      <w:pPr>
+        <w:pStyle w:val="ListParagraph"/>
+        <w:numPr>
+          <w:ilvl w:val="2"/>
+          <w:numId w:val="14"/>
+        </w:numPr>
+      </w:pPr>
+      <w:r>
+        <w:t xml:space="preserve">Talk about how this study found that continuous flow through wetlands WERE more </w:t>
+      </w:r>
+      <w:r>
+        <w:t>efficient</w:t>
+      </w:r>
+      <w:r>
+        <w:t xml:space="preserve"> at nutrient removal though</w:t>
+      </w:r>
+      <w:r>
+        <w:t xml:space="preserve"> (BUT BRING BACK POINT ABOUT NET RETENTION) </w:t>
+      </w:r>
+      <w:r>
+        <w:fldChar w:fldCharType="begin"/>
+      </w:r>
+      <w:r>
+        <w:instrText xml:space="preserve"> ADDIN ZOTERO_ITEM CSL_CITATION {"citationID":"ySKbtkQh","properties":{"unsorted":false,"formattedCitation":"(D\\uc0\\u237{}az et al. 2012)","plainCitation":"(Díaz et al. 2012)","noteIndex":0},"citationItems":[{"id":6245,"uris":["http://zotero.org/users/5222684/items/7A57J9QK"],"itemData":{"id":6245,"type":"article-journal","abstract":"Several agricultural non-point source pollutants impair water quality in the Sacramento–San Joaquin River system of California's Central Valley. Constructed wetlands are a water management option available to growers in this region to economically reduce pollutants in agricultural runoff. This study assessed the efficacy of using constructed wetlands to improve water quality of irrigation return flows prior to discharge into surface waters. Seven constructed surface flow-through wetlands having contrasting design and water management were evaluated for their effects on the fate of chemical (salts, nutrients, and dissolved organic carbon), physical (suspended solids), and biological contaminants (algal pigments and bacteria indicator). Based on wetland input–output measurements, load removal efficiencies (LRE) were used to determine wetland performance. All wetlands efficiently removed nitrate and total suspended solids showing LRE ranging from 22 to 99% and from 31 to 96%, respectively. However, for the rest of studied parameters, removal dynamics were mixed, varying from source (negative LRE) to sink (positive LRE). In general continuous flow-through wetlands were more effective in removing most pollutants in comparison to flood-pulse wetlands. Among continuous flow-through wetlands those with lower vegetation cover (&lt;5%) acted as algae incubators contributing to biological oxygen demand, while those with long hydrologic residence time (&gt;10 days) promoted increased concentrations of dissolved organic carbon. Water evapotranspiration and seepage processes, vegetation characteristics and hydrologic residence time were key factors affecting concentration and load reductions. This study demonstrates the potential benefits and limitations of constructed wetlands for treating water from agricultural non-point sources, providing useful information for optimizing constructed wetland design and management.","container-title":"Agricultural Water Management","DOI":"10.1016/j.agwat.2011.12.012","ISSN":"0378-3774","journalAbbreviation":"Agricultural Water Management","page":"171-183","source":"ScienceDirect","title":"Agricultural pollutant removal by constructed wetlands: Implications for water management and design","title-short":"Agricultural pollutant removal by constructed wetlands","volume":"104","author":[{"family":"Díaz","given":"Francisco J."},{"family":"O′Geen","given":"Anthony T."},{"family":"Dahlgren","given":"Randy A."}],"issued":{"date-parts":[["2012",2,1]]}}}],"schema":"https://github.com/citation-style-language/schema/raw/master/csl-citation.json"} </w:instrText>
+      </w:r>
+      <w:r>
+        <w:fldChar w:fldCharType="separate"/>
+      </w:r>
+      <w:r>
+        <w:rPr>
+          <w:rFonts w:ascii="Aptos" w:hAnsi="Aptos" w:cs="Times New Roman"/>
+          <w:kern w:val="0"/>
+        </w:rPr>
+        <w:t>(Díaz et al. 2012)</w:t>
+      </w:r>
+      <w:r>
+        <w:fldChar w:fldCharType="end"/>
+      </w:r>
+      <w:r>
+        <w:t xml:space="preserve">. </w:t>
       </w:r>
     </w:p>
     <w:p>
@@ -4331,7 +5306,7 @@
         </w:numPr>
       </w:pPr>
       <w:r>
-        <w:t>Conclude that connected wetlands can be effective tools for nutrient retention</w:t>
+        <w:t xml:space="preserve">Long-term data needed to understand nutrient retention. Can’t predict trends with only 3 years of data </w:t>
       </w:r>
     </w:p>
     <w:p>
@@ -4343,6 +5318,202 @@
         </w:numPr>
       </w:pPr>
       <w:r>
+        <w:t xml:space="preserve">Cite </w:t>
+      </w:r>
+      <w:r>
+        <w:fldChar w:fldCharType="begin"/>
+      </w:r>
+      <w:r>
+        <w:instrText xml:space="preserve"> ADDIN ZOTERO_ITEM CSL_CITATION {"citationID":"iD11kggd","properties":{"unsorted":false,"formattedCitation":"(Anderson et al. 2024)","plainCitation":"(Anderson et al. 2024)","noteIndex":0},"citationItems":[{"id":5200,"uris":["http://zotero.org/users/5222684/items/5XVZM6SG"],"itemData":{"id":5200,"type":"article-journal","abstract":"Wetlands are increasingly being constructed to retain phosphorus, but indicators of performance are often unique to individual wetlands. In this quantitative literature synthesis, we highlight two major knowledge gaps and a source of bias in our current understanding of phosphorus retention by constructed and restored wetlands. We performed a literature review to assess differences in wetland characteristics, phosphorus retention, and sampling frequency and duration to better understand how constructed and restored wetlands retain phosphorus. We then examined a series of different sampling frequencies to determine how sampling approaches affect observed trends using a case study at the Old Woman Creek National Estuarine Research Reserve where high-resolution data on phosphorus concentrations was available. We found that, while differences among broad wetland structural groupings exist, measured rates of phosphorus retention are highly variable. Additionally, we observed that the wetlands sampled in the literature are most often newly constructed; 70% of the wetlands were monitored for three or fewer years. Among twelve wetlands that were monitored for over ten years, resampling techniques demonstrated that three-year time scales are unable to predict long-term trends for nutrient retention. Similarly, we found that 70% of wetlands in the literature were sampled weekly or less frequently and did not account for major flow events when estimating nutrient retention. Our case study analysis indicated that excluding storm events lead to a significant underestimate of phosphorus retention. We further demonstrate that when sampling is infrequent and misses storm events, the retention of water and phosphorus by wetlands causes higher underestimates at the inflow than the outflow where phosphorus leaves wetlands more slowly than the inflow. The greater underestimation of loads at outflows compared to inflows can lead to a wetland being mislabeled as a source when it is a sink for phosphorus if storm events are not accounted for. Together this synthesis highlights that our understanding of how constructed wetlands store phosphorus is limited by three major factors: a lack of long-term monitoring, the drivers of high variability in phosphorus retention between different wetland types, and potential bias from the difficulties of capturing storm events. Our analysis indicates that most published works have been conducted at shorter time frames, or lower sampling frequencies than are required for accurate estimates of phosphorus retention. This finding is of significance because substantial investments are made in restoring and constructing wetlands based on inadequately supported assumptions that wetlands are highly effective at phosphorus retention. Ultimately, these results can inform improvements to post-restoration assessment of wetland nutrient function, including decisions on where and when to monitor water quality.","container-title":"Ecological Indicators","DOI":"10.1016/j.ecolind.2024.112969","ISSN":"1470-160X","journalAbbreviation":"Ecological Indicators","page":"112969","source":"ScienceDirect","title":"We know less about phosphorus retention in constructed wetlands than we think we do: A quantitative literature synthesis","title-short":"We know less about phosphorus retention in constructed wetlands than we think we do","volume":"169","author":[{"family":"Anderson","given":"Kenneth J."},{"family":"Adhikari","given":"Bishwodeep"},{"family":"Schloegel","given":"Olivia F."},{"family":"Marques Mendonca","given":"Raissa"},{"family":"Back","given":"Michael P."},{"family":"Brocato","given":"Nicholas"},{"family":"Cianci-Gaskill","given":"Jacob A."},{"family":"McMurray","given":"Steven E."},{"family":"Bahlai","given":"Christie"},{"family":"Costello","given":"David M."},{"family":"Kinsman-Costello","given":"Lauren"}],"issued":{"date-parts":[["2024",12,1]]}}}],"schema":"https://github.com/citation-style-language/schema/raw/master/csl-citation.json"} </w:instrText>
+      </w:r>
+      <w:r>
+        <w:fldChar w:fldCharType="separate"/>
+      </w:r>
+      <w:r>
+        <w:rPr>
+          <w:rFonts w:ascii="Aptos" w:hAnsi="Aptos"/>
+        </w:rPr>
+        <w:t>(Anderson et al. 2024)</w:t>
+      </w:r>
+      <w:r>
+        <w:fldChar w:fldCharType="end"/>
+      </w:r>
+      <w:r>
+        <w:t xml:space="preserve"> to talk about long-term data needs. </w:t>
+      </w:r>
+    </w:p>
+    <w:p>
+      <w:pPr>
+        <w:pStyle w:val="ListParagraph"/>
+        <w:numPr>
+          <w:ilvl w:val="1"/>
+          <w:numId w:val="14"/>
+        </w:numPr>
+        <w:rPr>
+          <w:ins w:id="47" w:author="Esber, Hana" w:date="2026-08-28T11:20:00Z"/>
+        </w:rPr>
+      </w:pPr>
+      <w:r>
+        <w:t>Mention that these were mostly data taken in drought years</w:t>
+      </w:r>
+    </w:p>
+    <w:p>
+      <w:pPr>
+        <w:pStyle w:val="ListParagraph"/>
+        <w:numPr>
+          <w:ilvl w:val="1"/>
+          <w:numId w:val="14"/>
+        </w:numPr>
+      </w:pPr>
+      <w:ins w:id="48" w:author="Esber, Hana" w:date="2026-08-28T11:20:00Z">
+        <w:r>
+          <w:t>Add in how baby wetlands</w:t>
+        </w:r>
+        <w:r>
+          <w:t xml:space="preserve"> are not </w:t>
+        </w:r>
+        <w:r>
+          <w:t>usually primed for retention/nutrient transformation right off the bat</w:t>
+        </w:r>
+      </w:ins>
+      <w:ins w:id="49" w:author="Esber, Hana" w:date="2026-08-28T11:22:00Z">
+        <w:r>
+          <w:t xml:space="preserve"> which makes long term monitoring even more import</w:t>
+        </w:r>
+      </w:ins>
+      <w:ins w:id="50" w:author="Esber, Hana" w:date="2026-08-28T11:23:00Z">
+        <w:r>
+          <w:t xml:space="preserve">ant. They are dynamic! </w:t>
+        </w:r>
+      </w:ins>
+      <w:ins w:id="51" w:author="Esber, Hana" w:date="2026-08-28T11:20:00Z">
+        <w:r>
+          <w:t>(</w:t>
+        </w:r>
+      </w:ins>
+      <w:ins w:id="52" w:author="Esber, Hana" w:date="2026-08-28T11:22:00Z">
+        <w:r>
+          <w:t>https://doi.org/10.1007/BF01879236</w:t>
+        </w:r>
+        <w:r>
+          <w:t>)</w:t>
+        </w:r>
+      </w:ins>
+    </w:p>
+    <w:p>
+      <w:pPr>
+        <w:pStyle w:val="ListParagraph"/>
+        <w:numPr>
+          <w:ilvl w:val="0"/>
+          <w:numId w:val="14"/>
+        </w:numPr>
+      </w:pPr>
+      <w:r>
+        <w:t xml:space="preserve">Scaling up: </w:t>
+      </w:r>
+      <w:r>
+        <w:t xml:space="preserve">TMDL calculation </w:t>
+      </w:r>
+    </w:p>
+    <w:p>
+      <w:pPr>
+        <w:pStyle w:val="ListParagraph"/>
+        <w:numPr>
+          <w:ilvl w:val="1"/>
+          <w:numId w:val="14"/>
+        </w:numPr>
+      </w:pPr>
+      <w:r>
+        <w:t xml:space="preserve">Talk about current </w:t>
+      </w:r>
+      <w:r>
+        <w:t>acreage</w:t>
+      </w:r>
+      <w:r>
+        <w:t xml:space="preserve"> of wetlands built compared to how many connected wetlands would be needed. Highlight that </w:t>
+      </w:r>
+      <w:r>
+        <w:t xml:space="preserve">meeting TMDL goals is </w:t>
+      </w:r>
+      <w:r>
+        <w:t>in the realm of the possible</w:t>
+      </w:r>
+      <w:r>
+        <w:t xml:space="preserve"> (if we use connected wetlands… or just build a TON of the basic wetlands)</w:t>
+      </w:r>
+      <w:r>
+        <w:t>!</w:t>
+      </w:r>
+    </w:p>
+    <w:p>
+      <w:pPr>
+        <w:pStyle w:val="ListParagraph"/>
+        <w:numPr>
+          <w:ilvl w:val="1"/>
+          <w:numId w:val="14"/>
+        </w:numPr>
+      </w:pPr>
+      <w:r>
+        <w:t xml:space="preserve">Cite GLSM stuff here? </w:t>
+      </w:r>
+      <w:r>
+        <w:t xml:space="preserve">Highlight that we have seen wetlands as effective tools for reducing nutrient runoff. </w:t>
+      </w:r>
+    </w:p>
+    <w:p>
+      <w:pPr>
+        <w:pStyle w:val="ListParagraph"/>
+        <w:numPr>
+          <w:ilvl w:val="1"/>
+          <w:numId w:val="14"/>
+        </w:numPr>
+      </w:pPr>
+      <w:r>
+        <w:t xml:space="preserve">Cite </w:t>
+      </w:r>
+      <w:r>
+        <w:fldChar w:fldCharType="begin"/>
+      </w:r>
+      <w:r>
+        <w:instrText xml:space="preserve"> ADDIN ZOTERO_ITEM CSL_CITATION {"citationID":"vsBuq24u","properties":{"unsorted":false,"formattedCitation":"(Cheng and Basu 2017)","plainCitation":"(Cheng and Basu 2017)","noteIndex":0},"citationItems":[{"id":64,"uris":["http://zotero.org/users/5222684/items/4N5GLFJS"],"itemData":{"id":64,"type":"article-journal","abstract":"Increased loading of nitrogen (N) and phosphorus (P) from agricultural and urban intensification has led to severe degradation of inland and coastal waters. Lakes, reservoirs, and wetlands (lentic systems) retain these nutrients, thus regulating their delivery to downstream waters. While the processes controlling N and P retention are relatively well-known, there is a lack of quantitative understanding of how these processes manifest across spatial scales. We synthesized data from 600 lentic systems around the world to gain insight into the relationship between hydrologic and biogeochemical controls on nutrient retention. Our results indicate that the first-order reaction rate constant, k [T−1], is inversely proportional to the hydraulic residence time, τ [T], across 6 orders of magnitude in residence time for total N, total P, nitrate, and phosphate. We hypothesized that the consistency of the relationship points to a strong hydrologic control on biogeochemical processing, and validated our hypothesis using a sediment-water model that links major nutrient removal processes with system size. Finally, the k-τ relationships were upscaled to the landscape scale using a wetland size-frequency distribution. Results suggest that small wetlands play a disproportionately large role in landscape-scale nutrient processing—50% of nitrogen removal occurs in wetlands smaller than 102.5 m2 in our example. Thus, given the same loss in wetland area, the nutrient retention potential lost is greater when smaller wetlands are preferentially lost from the landscape. Our study highlights the need for a stronger focus on small lentic systems as major nutrient sinks in the landscape.","container-title":"Water Resources Research","DOI":"10.1002/2016WR020102","ISSN":"1944-7973","issue":"6","language":"en","note":"_eprint: https://onlinelibrary.wiley.com/doi/pdf/10.1002/2016WR020102","page":"5038-5056","source":"Wiley Online Library","title":"Biogeochemical hotspots: Role of small water bodies in landscape nutrient processing","title-short":"Biogeochemical hotspots","volume":"53","author":[{"family":"Cheng","given":"Frederick Y."},{"family":"Basu","given":"Nandita B."}],"issued":{"date-parts":[["2017"]]}}}],"schema":"https://github.com/citation-style-language/schema/raw/master/csl-citation.json"} </w:instrText>
+      </w:r>
+      <w:r>
+        <w:fldChar w:fldCharType="separate"/>
+      </w:r>
+      <w:r>
+        <w:rPr>
+          <w:rFonts w:ascii="Aptos" w:hAnsi="Aptos"/>
+        </w:rPr>
+        <w:t>(Cheng and Basu 2017)</w:t>
+      </w:r>
+      <w:r>
+        <w:fldChar w:fldCharType="end"/>
+      </w:r>
+      <w:r>
+        <w:t xml:space="preserve"> to talk about how small wetlands have potential based on modelling approaches, but here we’re able to show the effect more concretely (though more work is still to be done). </w:t>
+      </w:r>
+    </w:p>
+    <w:p>
+      <w:pPr>
+        <w:pStyle w:val="ListParagraph"/>
+        <w:numPr>
+          <w:ilvl w:val="0"/>
+          <w:numId w:val="14"/>
+        </w:numPr>
+      </w:pPr>
+      <w:r>
+        <w:t>Conclude that connected wetlands can be effective tools for nutrient retention</w:t>
+      </w:r>
+    </w:p>
+    <w:p>
+      <w:pPr>
+        <w:pStyle w:val="ListParagraph"/>
+        <w:numPr>
+          <w:ilvl w:val="1"/>
+          <w:numId w:val="14"/>
+        </w:numPr>
+      </w:pPr>
+      <w:r>
         <w:t>Cite TNC report to talk about co-benefits</w:t>
       </w:r>
     </w:p>
@@ -4366,7 +5537,7 @@
         </w:rPr>
         <w:lastRenderedPageBreak/>
         <w:drawing>
-          <wp:anchor distT="0" distB="0" distL="114300" distR="114300" simplePos="0" relativeHeight="251659264" behindDoc="1" locked="0" layoutInCell="1" allowOverlap="1" wp14:anchorId="3F08B5C6" wp14:editId="76881821">
+          <wp:anchor distT="0" distB="0" distL="114300" distR="114300" simplePos="0" relativeHeight="251658240" behindDoc="1" locked="0" layoutInCell="1" allowOverlap="1" wp14:anchorId="3F08B5C6" wp14:editId="76881821">
             <wp:simplePos x="0" y="0"/>
             <wp:positionH relativeFrom="margin">
               <wp:posOffset>-74930</wp:posOffset>
@@ -4391,7 +5562,7 @@
                     </pic:cNvPicPr>
                   </pic:nvPicPr>
                   <pic:blipFill rotWithShape="1">
-                    <a:blip r:embed="rId9">
+                    <a:blip r:embed="rId13">
                       <a:extLst>
                         <a:ext uri="{28A0092B-C50C-407E-A947-70E740481C1C}">
                           <a14:useLocalDpi xmlns:a14="http://schemas.microsoft.com/office/drawing/2010/main" val="0"/>
@@ -4441,7 +5612,7 @@
         </w:rPr>
         <w:t xml:space="preserve">Figures: </w:t>
       </w:r>
-      <w:bookmarkStart w:id="0" w:name="_Ref237347007"/>
+      <w:bookmarkStart w:id="53" w:name="_Ref237347007"/>
     </w:p>
     <w:p>
       <w:pPr>
@@ -4454,7 +5625,7 @@
           <w:szCs w:val="22"/>
         </w:rPr>
       </w:pPr>
-      <w:bookmarkStart w:id="1" w:name="_Ref237351546"/>
+      <w:bookmarkStart w:id="54" w:name="_Ref237351546"/>
       <w:r>
         <w:rPr>
           <w:i w:val="0"/>
@@ -4516,7 +5687,7 @@
         </w:rPr>
         <w:fldChar w:fldCharType="end"/>
       </w:r>
-      <w:bookmarkEnd w:id="1"/>
+      <w:bookmarkEnd w:id="54"/>
       <w:r>
         <w:rPr>
           <w:i w:val="0"/>
@@ -4587,7 +5758,7 @@
         </w:rPr>
         <w:t>were monitored to build nutrient budgets</w:t>
       </w:r>
-      <w:bookmarkEnd w:id="0"/>
+      <w:bookmarkEnd w:id="53"/>
     </w:p>
     <w:p>
       <w:pPr>
@@ -4615,7 +5786,7 @@
                     </pic:cNvPicPr>
                   </pic:nvPicPr>
                   <pic:blipFill>
-                    <a:blip r:embed="rId10">
+                    <a:blip r:embed="rId14">
                       <a:extLst>
                         <a:ext uri="{28A0092B-C50C-407E-A947-70E740481C1C}">
                           <a14:useLocalDpi xmlns:a14="http://schemas.microsoft.com/office/drawing/2010/main" val="0"/>
@@ -4658,8 +5829,8 @@
           <w:u w:val="single"/>
         </w:rPr>
       </w:pPr>
-      <w:bookmarkStart w:id="2" w:name="_Toc237348176"/>
-      <w:bookmarkStart w:id="3" w:name="_Ref237351592"/>
+      <w:bookmarkStart w:id="55" w:name="_Toc237348176"/>
+      <w:bookmarkStart w:id="56" w:name="_Ref237351592"/>
       <w:r>
         <w:rPr>
           <w:i w:val="0"/>
@@ -4721,8 +5892,8 @@
         </w:rPr>
         <w:fldChar w:fldCharType="end"/>
       </w:r>
-      <w:bookmarkEnd w:id="2"/>
-      <w:bookmarkEnd w:id="3"/>
+      <w:bookmarkEnd w:id="55"/>
+      <w:bookmarkEnd w:id="56"/>
       <w:r>
         <w:rPr>
           <w:i w:val="0"/>
@@ -4855,7 +6026,7 @@
                     </pic:cNvPicPr>
                   </pic:nvPicPr>
                   <pic:blipFill>
-                    <a:blip r:embed="rId11" cstate="print">
+                    <a:blip r:embed="rId15" cstate="print">
                       <a:extLst>
                         <a:ext uri="{28A0092B-C50C-407E-A947-70E740481C1C}">
                           <a14:useLocalDpi xmlns:a14="http://schemas.microsoft.com/office/drawing/2010/main" val="0"/>
@@ -4901,7 +6072,7 @@
           <w:u w:val="single"/>
         </w:rPr>
       </w:pPr>
-      <w:bookmarkStart w:id="4" w:name="_Ref237351576"/>
+      <w:bookmarkStart w:id="57" w:name="_Ref237351576"/>
       <w:r>
         <w:rPr>
           <w:b/>
@@ -4910,7 +6081,7 @@
           <w:u w:val="single"/>
         </w:rPr>
         <w:drawing>
-          <wp:anchor distT="0" distB="0" distL="114300" distR="114300" simplePos="0" relativeHeight="251661312" behindDoc="1" locked="0" layoutInCell="1" allowOverlap="1" wp14:anchorId="6A5526D6" wp14:editId="1977DAE1">
+          <wp:anchor distT="0" distB="0" distL="114300" distR="114300" simplePos="0" relativeHeight="251658241" behindDoc="1" locked="0" layoutInCell="1" allowOverlap="1" wp14:anchorId="6A5526D6" wp14:editId="1977DAE1">
             <wp:simplePos x="0" y="0"/>
             <wp:positionH relativeFrom="margin">
               <wp:posOffset>-127591</wp:posOffset>
@@ -4935,7 +6106,7 @@
                     </pic:cNvPicPr>
                   </pic:nvPicPr>
                   <pic:blipFill rotWithShape="1">
-                    <a:blip r:embed="rId12">
+                    <a:blip r:embed="rId16">
                       <a:extLst>
                         <a:ext uri="{28A0092B-C50C-407E-A947-70E740481C1C}">
                           <a14:useLocalDpi xmlns:a14="http://schemas.microsoft.com/office/drawing/2010/main" val="0"/>
@@ -5032,7 +6203,7 @@
         </w:rPr>
         <w:fldChar w:fldCharType="end"/>
       </w:r>
-      <w:bookmarkEnd w:id="4"/>
+      <w:bookmarkEnd w:id="57"/>
       <w:r>
         <w:rPr>
           <w:i w:val="0"/>
@@ -5207,7 +6378,7 @@
           <w:szCs w:val="22"/>
         </w:rPr>
       </w:pPr>
-      <w:bookmarkStart w:id="5" w:name="_Ref237355469"/>
+      <w:bookmarkStart w:id="58" w:name="_Ref237355469"/>
       <w:r>
         <w:rPr>
           <w:i w:val="0"/>
@@ -5269,7 +6440,7 @@
         </w:rPr>
         <w:fldChar w:fldCharType="end"/>
       </w:r>
-      <w:bookmarkEnd w:id="5"/>
+      <w:bookmarkEnd w:id="58"/>
       <w:r>
         <w:rPr>
           <w:i w:val="0"/>
@@ -5391,7 +6562,7 @@
                     </pic:cNvPicPr>
                   </pic:nvPicPr>
                   <pic:blipFill>
-                    <a:blip r:embed="rId13">
+                    <a:blip r:embed="rId17">
                       <a:extLst>
                         <a:ext uri="{28A0092B-C50C-407E-A947-70E740481C1C}">
                           <a14:useLocalDpi xmlns:a14="http://schemas.microsoft.com/office/drawing/2010/main" val="0"/>
@@ -5434,7 +6605,7 @@
           <w:u w:val="single"/>
         </w:rPr>
       </w:pPr>
-      <w:bookmarkStart w:id="6" w:name="_Ref237355488"/>
+      <w:bookmarkStart w:id="59" w:name="_Ref237355488"/>
       <w:r>
         <w:rPr>
           <w:i w:val="0"/>
@@ -5496,7 +6667,7 @@
         </w:rPr>
         <w:fldChar w:fldCharType="end"/>
       </w:r>
-      <w:bookmarkEnd w:id="6"/>
+      <w:bookmarkEnd w:id="59"/>
       <w:r>
         <w:rPr>
           <w:i w:val="0"/>
@@ -5563,7 +6734,7 @@
                     </pic:cNvPicPr>
                   </pic:nvPicPr>
                   <pic:blipFill>
-                    <a:blip r:embed="rId14">
+                    <a:blip r:embed="rId18">
                       <a:extLst>
                         <a:ext uri="{28A0092B-C50C-407E-A947-70E740481C1C}">
                           <a14:useLocalDpi xmlns:a14="http://schemas.microsoft.com/office/drawing/2010/main" val="0"/>
@@ -5601,7 +6772,7 @@
           <w:u w:val="single"/>
         </w:rPr>
       </w:pPr>
-      <w:bookmarkStart w:id="7" w:name="_Ref237355502"/>
+      <w:bookmarkStart w:id="60" w:name="_Ref237355502"/>
       <w:r>
         <w:rPr>
           <w:i w:val="0"/>
@@ -5663,7 +6834,7 @@
         </w:rPr>
         <w:fldChar w:fldCharType="end"/>
       </w:r>
-      <w:bookmarkEnd w:id="7"/>
+      <w:bookmarkEnd w:id="60"/>
       <w:r>
         <w:rPr>
           <w:i w:val="0"/>
@@ -5725,8 +6896,8 @@
           <w:u w:val="single"/>
         </w:rPr>
       </w:pPr>
-      <w:bookmarkStart w:id="8" w:name="_Ref238469583"/>
-      <w:bookmarkStart w:id="9" w:name="_Ref238469568"/>
+      <w:bookmarkStart w:id="61" w:name="_Ref238469583"/>
+      <w:bookmarkStart w:id="62" w:name="_Ref238469568"/>
       <w:r>
         <w:rPr>
           <w:i w:val="0"/>
@@ -5798,7 +6969,7 @@
         </w:rPr>
         <w:fldChar w:fldCharType="end"/>
       </w:r>
-      <w:bookmarkEnd w:id="8"/>
+      <w:bookmarkEnd w:id="61"/>
       <w:r>
         <w:rPr>
           <w:i w:val="0"/>
@@ -5809,7 +6980,7 @@
         </w:rPr>
         <w:t>.</w:t>
       </w:r>
-      <w:bookmarkEnd w:id="9"/>
+      <w:bookmarkEnd w:id="62"/>
       <w:r>
         <w:rPr>
           <w:i w:val="0"/>
@@ -7081,7 +8252,7 @@
           <w:szCs w:val="22"/>
         </w:rPr>
       </w:pPr>
-      <w:bookmarkStart w:id="10" w:name="_Ref238473448"/>
+      <w:bookmarkStart w:id="63" w:name="_Ref238473448"/>
       <w:r>
         <w:rPr>
           <w:i w:val="0"/>
@@ -7143,7 +8314,7 @@
         </w:rPr>
         <w:fldChar w:fldCharType="end"/>
       </w:r>
-      <w:bookmarkEnd w:id="10"/>
+      <w:bookmarkEnd w:id="63"/>
       <w:r>
         <w:rPr>
           <w:i w:val="0"/>
@@ -7381,18 +8552,18 @@
               </w:rPr>
               <w:t xml:space="preserve">1. </w:t>
             </w:r>
-            <w:commentRangeStart w:id="11"/>
+            <w:commentRangeStart w:id="64"/>
             <w:r>
               <w:t>Typical</w:t>
             </w:r>
-            <w:commentRangeEnd w:id="11"/>
+            <w:commentRangeEnd w:id="64"/>
             <w:r>
               <w:rPr>
                 <w:rStyle w:val="CommentReference"/>
                 <w:sz w:val="22"/>
                 <w:szCs w:val="22"/>
               </w:rPr>
-              <w:commentReference w:id="11"/>
+              <w:commentReference w:id="64"/>
             </w:r>
             <w:r>
               <w:t xml:space="preserve"> Wetlands (50</w:t>
@@ -7659,7 +8830,7 @@
             <w:pPr>
               <w:spacing w:line="240" w:lineRule="auto"/>
             </w:pPr>
-            <w:commentRangeStart w:id="12"/>
+            <w:commentRangeStart w:id="65"/>
             <w:r>
               <w:rPr>
                 <w:b/>
@@ -7667,14 +8838,14 @@
               </w:rPr>
               <w:t>113.75</w:t>
             </w:r>
-            <w:commentRangeEnd w:id="12"/>
+            <w:commentRangeEnd w:id="65"/>
             <w:r>
               <w:rPr>
                 <w:rStyle w:val="CommentReference"/>
                 <w:sz w:val="22"/>
                 <w:szCs w:val="22"/>
               </w:rPr>
-              <w:commentReference w:id="12"/>
+              <w:commentReference w:id="65"/>
             </w:r>
           </w:p>
         </w:tc>
@@ -7841,8 +9012,8 @@
           <w:szCs w:val="22"/>
         </w:rPr>
       </w:pPr>
-      <w:bookmarkStart w:id="13" w:name="_Ref237352403"/>
-      <w:bookmarkStart w:id="14" w:name="_Ref237352386"/>
+      <w:bookmarkStart w:id="66" w:name="_Ref237352403"/>
+      <w:bookmarkStart w:id="67" w:name="_Ref237352386"/>
       <w:r>
         <w:rPr>
           <w:i w:val="0"/>
@@ -7904,7 +9075,7 @@
         </w:rPr>
         <w:fldChar w:fldCharType="end"/>
       </w:r>
-      <w:bookmarkEnd w:id="13"/>
+      <w:bookmarkEnd w:id="66"/>
       <w:r>
         <w:rPr>
           <w:i w:val="0"/>
@@ -7915,7 +9086,7 @@
         </w:rPr>
         <w:t xml:space="preserve">. </w:t>
       </w:r>
-      <w:bookmarkEnd w:id="14"/>
+      <w:bookmarkEnd w:id="67"/>
       <w:r>
         <w:rPr>
           <w:i w:val="0"/>
@@ -7958,7 +9129,7 @@
           <w:szCs w:val="22"/>
         </w:rPr>
       </w:pPr>
-      <w:bookmarkStart w:id="15" w:name="_Ref238453741"/>
+      <w:bookmarkStart w:id="68" w:name="_Ref238453741"/>
     </w:p>
     <w:p>
       <w:r>
@@ -8044,7 +9215,7 @@
         </w:rPr>
         <w:fldChar w:fldCharType="end"/>
       </w:r>
-      <w:bookmarkEnd w:id="15"/>
+      <w:bookmarkEnd w:id="68"/>
       <w:r>
         <w:rPr>
           <w:i w:val="0"/>
@@ -21338,7 +22509,7 @@
         <w:fldChar w:fldCharType="separate"/>
       </w:r>
       <w:r>
-        <w:t>Allen, R. G., L. S. Pereira, D. Raes, and M. Smith. 1998. Crop evapotranspiration-Guidelines for computing crop water requirements-FAO Irrigation and drainage paper 56. Fao, rome 300:D05109.</w:t>
+        <w:t>Aldous, A., P. McCormick, C. Ferguson, S. Graham, and C. Craft. 2005. Hydrologic Regime Controls Soil Phosphorus Fluxes in Restoration and Undisturbed Wetlands. Restoration Ecology 13:341–347.</w:t>
       </w:r>
     </w:p>
     <w:p>
@@ -21346,7 +22517,7 @@
         <w:pStyle w:val="Bibliography"/>
       </w:pPr>
       <w:r>
-        <w:t>Anderson, D. M., P. M. Glibert, and J. M. Burkholder. 2002. Harmful algal blooms and eutrophication: Nutrient sources, composition, and consequences. Estuaries 25:704–726.</w:t>
+        <w:t>Allen, R. G., L. S. Pereira, D. Raes, and M. Smith. 1998. Crop evapotranspiration-Guidelines for computing crop water requirements-FAO Irrigation and drainage paper 56. Fao, rome 300:D05109.</w:t>
       </w:r>
     </w:p>
     <w:p>
@@ -21354,7 +22525,7 @@
         <w:pStyle w:val="Bibliography"/>
       </w:pPr>
       <w:r>
-        <w:t>Anderson, K. J., B. Adhikari, O. F. Schloegel, R. Marques Mendonca, M. P. Back, N. Brocato, J. A. Cianci-Gaskill, S. E. McMurray, C. Bahlai, D. M. Costello, and L. Kinsman-Costello. 2024. We know less about phosphorus retention in constructed wetlands than we think we do: A quantitative literature synthesis. Ecological Indicators 169:112969.</w:t>
+        <w:t>Anderson, D. M., P. M. Glibert, and J. M. Burkholder. 2002. Harmful algal blooms and eutrophication: Nutrient sources, composition, and consequences. Estuaries 25:704–726.</w:t>
       </w:r>
     </w:p>
     <w:p>
@@ -21362,7 +22533,7 @@
         <w:pStyle w:val="Bibliography"/>
       </w:pPr>
       <w:r>
-        <w:t>Atkinson, C. L., and C. C. Vaughn. 2015. Biogeochemical hotspots: temporal and spatial scaling of the impact of freshwater mussels on ecosystem function. Freshwater Biology 60:563–574.</w:t>
+        <w:t>Anderson, K. J., B. Adhikari, O. F. Schloegel, R. Marques Mendonca, M. P. Back, N. Brocato, J. A. Cianci-Gaskill, S. E. McMurray, C. Bahlai, D. M. Costello, and L. Kinsman-Costello. 2024. We know less about phosphorus retention in constructed wetlands than we think we do: A quantitative literature synthesis. Ecological Indicators 169:112969.</w:t>
       </w:r>
     </w:p>
     <w:p>
@@ -21370,7 +22541,7 @@
         <w:pStyle w:val="Bibliography"/>
       </w:pPr>
       <w:r>
-        <w:t>Aziz, T., and P. Van Cappellen. 2021. Economic valuation of suspended sediment and phosphorus filtration services by four different wetland types: A preliminary assessment for southern Ontario, Canada. Hydrological Processes 35:e14442.</w:t>
+        <w:t>Atkinson, C. L., and C. C. Vaughn. 2015. Biogeochemical hotspots: temporal and spatial scaling of the impact of freshwater mussels on ecosystem function. Freshwater Biology 60:563–574.</w:t>
       </w:r>
     </w:p>
     <w:p>
@@ -21378,7 +22549,7 @@
         <w:pStyle w:val="Bibliography"/>
       </w:pPr>
       <w:r>
-        <w:t>Bingham, M., S. K. Sinha, and F. Lupi. 2015. Economic benefits of reducing harmful algal blooms in Lake Erie. Environmental Consulting &amp; Technology, Inc., Report 66.</w:t>
+        <w:t>Aziz, T., and P. Van Cappellen. 2021. Economic valuation of suspended sediment and phosphorus filtration services by four different wetland types: A preliminary assessment for southern Ontario, Canada. Hydrological Processes 35:e14442.</w:t>
       </w:r>
     </w:p>
     <w:p>
@@ -21386,7 +22557,7 @@
         <w:pStyle w:val="Bibliography"/>
       </w:pPr>
       <w:r>
-        <w:t>Carpenter, S. R., N. F. Caraco, D. L. Correll, R. W. Howarth, A. N. Sharpley, and V. H. Smith. 1998. Nonpoint Pollution of Surface Waters with Phosphorus and Nitrogen. Ecological Applications 8:559–568.</w:t>
+        <w:t>Bingham, M., S. K. Sinha, and F. Lupi. 2015. Economic benefits of reducing harmful algal blooms in Lake Erie. Environmental Consulting &amp; Technology, Inc., Report 66.</w:t>
       </w:r>
     </w:p>
     <w:p>
@@ -21394,7 +22565,7 @@
         <w:pStyle w:val="Bibliography"/>
       </w:pPr>
       <w:r>
-        <w:t>Cheng, F. Y., and N. B. Basu. 2017. Biogeochemical hotspots: Role of small water bodies in landscape nutrient processing. Water Resources Research 53:5038–5056.</w:t>
+        <w:t>Carpenter, S. R., N. F. Caraco, D. L. Correll, R. W. Howarth, A. N. Sharpley, and V. H. Smith. 1998. Nonpoint Pollution of Surface Waters with Phosphorus and Nitrogen. Ecological Applications 8:559–568.</w:t>
       </w:r>
     </w:p>
     <w:p>
@@ -21403,7 +22574,7 @@
       </w:pPr>
       <w:r>
         <w:lastRenderedPageBreak/>
-        <w:t>Cheng, F. Y., J. Park, M. Kumar, and N. B. Basu. 2023. Disconnectivity matters: the outsized role of small ephemeral wetlands in landscape-scale nutrient retention. Environmental Research Letters 18:024018.</w:t>
+        <w:t>Cheng, F. Y., and N. B. Basu. 2017. Biogeochemical hotspots: Role of small water bodies in landscape nutrient processing. Water Resources Research 53:5038–5056.</w:t>
       </w:r>
     </w:p>
     <w:p>
@@ -21411,7 +22582,7 @@
         <w:pStyle w:val="Bibliography"/>
       </w:pPr>
       <w:r>
-        <w:t>Collins, S. D., S. Shukla, and N. K. Shrestha. 2016. Drainage ditches have sufficient adsorption capacity but inadequate residence time for phosphorus retention in the Everglades. Ecological Engineering 92:218–228.</w:t>
+        <w:t>Cheng, F. Y., J. Park, M. Kumar, and N. B. Basu. 2023. Disconnectivity matters: the outsized role of small ephemeral wetlands in landscape-scale nutrient retention. Environmental Research Letters 18:024018.</w:t>
       </w:r>
     </w:p>
     <w:p>
@@ -21419,7 +22590,7 @@
         <w:pStyle w:val="Bibliography"/>
       </w:pPr>
       <w:r>
-        <w:t>Fennessy, M. S., A. D. Jacobs, and M. E. Kentula. 2007. An evaluation of rapid methods for assessing the ecological condition of wetlands. Wetlands 27:543–560.</w:t>
+        <w:t>Collins, S. D., S. Shukla, and N. K. Shrestha. 2016. Drainage ditches have sufficient adsorption capacity but inadequate residence time for phosphorus retention in the Everglades. Ecological Engineering 92:218–228.</w:t>
       </w:r>
     </w:p>
     <w:p>
@@ -21427,7 +22598,7 @@
         <w:pStyle w:val="Bibliography"/>
       </w:pPr>
       <w:r>
-        <w:t>Hamner, B., M. Frasco, and E. LeDell. 2018. Package ‘metrics.’ R Foundation for Statistical Computing.</w:t>
+        <w:t>Díaz, F. J., A. T. O′Geen, and R. A. Dahlgren. 2012. Agricultural pollutant removal by constructed wetlands: Implications for water management and design. Agricultural Water Management 104:171–183.</w:t>
       </w:r>
     </w:p>
     <w:p>
@@ -21435,7 +22606,7 @@
         <w:pStyle w:val="Bibliography"/>
       </w:pPr>
       <w:r>
-        <w:t>Hanrahan, B. R., K. W. King, M. R. Williams, E. W. Duncan, L. A. Pease, and G. A. LaBarge. 2019. Nutrient balances influence hydrologic losses of nitrogen and phosphorus across agricultural fields in northwestern Ohio. Nutrient Cycling in Agroecosystems 113:231–245.</w:t>
+        <w:t>Fennessy, M. S., A. D. Jacobs, and M. E. Kentula. 2007. An evaluation of rapid methods for assessing the ecological condition of wetlands. Wetlands 27:543–560.</w:t>
       </w:r>
     </w:p>
     <w:p>
@@ -21443,7 +22614,7 @@
         <w:pStyle w:val="Bibliography"/>
       </w:pPr>
       <w:r>
-        <w:t>Heisler, J., P. M. Glibert, J. M. Burkholder, D. M. Anderson, W. Cochlan, W. C. Dennison, Q. Dortch, C. J. Gobler, C. A. Heil, E. Humphries, A. Lewitus, R. Magnien, H. G. Marshall, K. Sellner, D. A. Stockwell, D. K. Stoecker, and M. Suddleson. 2008. Eutrophication and harmful algal blooms: A scientific consensus. Harmful Algae 8:3–13.</w:t>
+        <w:t>Hamner, B., M. Frasco, and E. LeDell. 2018. Package ‘metrics.’ R Foundation for Statistical Computing.</w:t>
       </w:r>
     </w:p>
     <w:p>
@@ -21451,7 +22622,7 @@
         <w:pStyle w:val="Bibliography"/>
       </w:pPr>
       <w:r>
-        <w:t>International Joint Commission. 2014. A Balanced Diet for Lake Erie. International Joint Commission.</w:t>
+        <w:t>Hanrahan, B. R., K. W. King, M. R. Williams, E. W. Duncan, L. A. Pease, and G. A. LaBarge. 2019. Nutrient balances influence hydrologic losses of nitrogen and phosphorus across agricultural fields in northwestern Ohio. Nutrient Cycling in Agroecosystems 113:231–245.</w:t>
       </w:r>
     </w:p>
     <w:p>
@@ -21459,7 +22630,7 @@
         <w:pStyle w:val="Bibliography"/>
       </w:pPr>
       <w:r>
-        <w:t>Jacquemin, S. J., L. T. Johnson, T. A. Dirksen, and G. McGlinch. 2018. Changes in Water Quality of Grand Lake St. Marys Watershed Following Implementation of a Distressed Watershed Rules Package. Journal of Environmental Quality 47:113–120.</w:t>
+        <w:t>Heisler, J., P. M. Glibert, J. M. Burkholder, D. M. Anderson, W. Cochlan, W. C. Dennison, Q. Dortch, C. J. Gobler, C. A. Heil, E. Humphries, A. Lewitus, R. Magnien, H. G. Marshall, K. Sellner, D. A. Stockwell, D. K. Stoecker, and M. Suddleson. 2008. Eutrophication and harmful algal blooms: A scientific consensus. Harmful Algae 8:3–13.</w:t>
       </w:r>
     </w:p>
     <w:p>
@@ -21467,11 +22638,7 @@
         <w:pStyle w:val="Bibliography"/>
       </w:pPr>
       <w:r>
-        <w:t xml:space="preserve">Kinsman-Costello, L. E., K. Fussel, C. Winslow, J. Kerns, O. Schloegel, R. Mendonça, R. Becker, T. B. Bridgeman, K. Doro, S. J. Jacquemin, L. Johnson, G. Liu, K. McCluney, H. Michaels, W. R. </w:t>
-      </w:r>
-      <w:r>
-        <w:lastRenderedPageBreak/>
-        <w:t>Midden, S. E. Newell, M. Back, L. Brown, I. Rahman, and Z. Swan. 2024. H2Ohio Wetland Monitoring Program:Monitoring Framework. Columbus, OH, USA.</w:t>
+        <w:t>International Joint Commission. 2014. A Balanced Diet for Lake Erie. International Joint Commission.</w:t>
       </w:r>
     </w:p>
     <w:p>
@@ -21479,7 +22646,8 @@
         <w:pStyle w:val="Bibliography"/>
       </w:pPr>
       <w:r>
-        <w:t>Land, M., W. Granéli, A. Grimvall, C. C. Hoffmann, W. J. Mitsch, K. S. Tonderski, and J. T. A. Verhoeven. 2016. How effective are created or restored freshwater wetlands for nitrogen and phosphorus removal? A systematic review. Environmental Evidence 5:9.</w:t>
+        <w:lastRenderedPageBreak/>
+        <w:t>Jacquemin, S. J., M. C. Grunden, and T. A. Dirksen. 2025. Wetland Conservation in the Grand Lake St. Marys Watershed: Long Term Monitoring Data from Coldwater Creek Restored Wetland. Wetlands 45:37.</w:t>
       </w:r>
     </w:p>
     <w:p>
@@ -21487,7 +22655,7 @@
         <w:pStyle w:val="Bibliography"/>
       </w:pPr>
       <w:r>
-        <w:t>Lucas, W. C., and M. Greenway. 2008. Nutrient Retention in Vegetated and Nonvegetated Bioretention Mesocosms. Journal of Irrigation and Drainage Engineering 134:613–623.</w:t>
+        <w:t>Jacquemin, S. J., L. T. Johnson, T. A. Dirksen, and G. McGlinch. 2018. Changes in Water Quality of Grand Lake St. Marys Watershed Following Implementation of a Distressed Watershed Rules Package. Journal of Environmental Quality 47:113–120.</w:t>
       </w:r>
     </w:p>
     <w:p>
@@ -21495,7 +22663,7 @@
         <w:pStyle w:val="Bibliography"/>
       </w:pPr>
       <w:r>
-        <w:t>Marton, J. M., I. F. Creed, D. B. Lewis, C. R. Lane, N. B. Basu, M. J. Cohen, and C. B. Craft. 2015. Geographically isolated wetlands are important biogeochemical reactors on the landscape. Bioscience 65:408–418.</w:t>
+        <w:t>Kadlec, R. H. 2016. Large Constructed Wetlands for Phosphorus Control: A Review. Water 8:243.</w:t>
       </w:r>
     </w:p>
     <w:p>
@@ -21503,7 +22671,7 @@
         <w:pStyle w:val="Bibliography"/>
       </w:pPr>
       <w:r>
-        <w:t>Michalak, A. M., E. J. Anderson, D. Beletsky, S. Boland, N. S. Bosch, T. B. Bridgeman, J. D. Chaffin, K. Cho, R. Confesor, I. Daloğlu, J. V. DePinto, M. A. Evans, G. L. Fahnenstiel, L. He, J. C. Ho, L. Jenkins, T. H. Johengen, K. C. Kuo, E. LaPorte, X. Liu, M. R. McWilliams, M. R. Moore, D. J. Posselt, R. P. Richards, D. Scavia, A. L. Steiner, E. Verhamme, D. M. Wright, and M. A. Zagorski. 2013. Record-setting algal bloom in Lake Erie caused by agricultural and meteorological trends consistent with expected future conditions. Proceedings of the National Academy of Sciences 110:6448–6452.</w:t>
+        <w:t>Kinsman-Costello, L. E., K. Fussel, C. Winslow, J. Kerns, O. Schloegel, R. Mendonça, R. Becker, T. B. Bridgeman, K. Doro, S. J. Jacquemin, L. Johnson, G. Liu, K. McCluney, H. Michaels, W. R. Midden, S. E. Newell, M. Back, L. Brown, I. Rahman, and Z. Swan. 2024. H2Ohio Wetland Monitoring Program:Monitoring Framework. Columbus, OH, USA.</w:t>
       </w:r>
     </w:p>
     <w:p>
@@ -21511,7 +22679,7 @@
         <w:pStyle w:val="Bibliography"/>
       </w:pPr>
       <w:r>
-        <w:t>Mitsch, W. J. 2017. Solving Lake Erie’s harmful algal blooms by restoring the Great Black Swamp in Ohio. Ecological Engineering 108:406–413.</w:t>
+        <w:t>Kinsman-Costello, L. E., J. O’Brien, and S. K. Hamilton. 2014. Re-flooding a Historically Drained Wetland Leads to Rapid Sediment Phosphorus Release. Ecosystems 17:641–656.</w:t>
       </w:r>
     </w:p>
     <w:p>
@@ -21519,7 +22687,7 @@
         <w:pStyle w:val="Bibliography"/>
       </w:pPr>
       <w:r>
-        <w:t>Mitsch, W. J., S. M. Nedrich, S. K. Harter, C. Anderson, A. M. Nahlik, and B. Bernal. 2014. Sedimentation in created freshwater riverine wetlands: 15 years of succession and contrast of methods. Ecological Engineering 72:25–34.</w:t>
+        <w:t>Land, M., W. Granéli, A. Grimvall, C. C. Hoffmann, W. J. Mitsch, K. S. Tonderski, and J. T. A. Verhoeven. 2016. How effective are created or restored freshwater wetlands for nitrogen and phosphorus removal? A systematic review. Environmental Evidence 5:9.</w:t>
       </w:r>
     </w:p>
     <w:p>
@@ -21527,8 +22695,7 @@
         <w:pStyle w:val="Bibliography"/>
       </w:pPr>
       <w:r>
-        <w:lastRenderedPageBreak/>
-        <w:t>Ohio Environmentla Protection Agency (EPA). 2023. Maumee Watershed Nutrient Total Maximum Daily Load. Division of Surface Water, Assessment and Modeling Section, Columbus, OH, USA.</w:t>
+        <w:t>Lucas, W. C., and M. Greenway. 2008. Nutrient Retention in Vegetated and Nonvegetated Bioretention Mesocosms. Journal of Irrigation and Drainage Engineering 134:613–623.</w:t>
       </w:r>
     </w:p>
     <w:p>
@@ -21536,7 +22703,7 @@
         <w:pStyle w:val="Bibliography"/>
       </w:pPr>
       <w:r>
-        <w:t>R Core Team. 2024. R: A language and environment for statistical computing. R Foundation for Statistical Computing, Vienna Austria.</w:t>
+        <w:t>Marton, J. M., I. F. Creed, D. B. Lewis, C. R. Lane, N. B. Basu, M. J. Cohen, and C. B. Craft. 2015. Geographically isolated wetlands are important biogeochemical reactors on the landscape. Bioscience 65:408–418.</w:t>
       </w:r>
     </w:p>
     <w:p>
@@ -21544,7 +22711,11 @@
         <w:pStyle w:val="Bibliography"/>
       </w:pPr>
       <w:r>
-        <w:t>Silvan, N., H. Vasander, and J. Laine. 2004. Vegetation is the main factor in nutrient retention in a constructed wetland buffer. Plant and Soil 258:179–187.</w:t>
+        <w:t xml:space="preserve">Michalak, A. M., E. J. Anderson, D. Beletsky, S. Boland, N. S. Bosch, T. B. Bridgeman, J. D. Chaffin, K. Cho, R. Confesor, I. Daloğlu, J. V. DePinto, M. A. Evans, G. L. Fahnenstiel, L. He, J. C. Ho, L. Jenkins, T. H. Johengen, K. C. Kuo, E. LaPorte, X. Liu, M. R. McWilliams, M. R. Moore, D. J. </w:t>
+      </w:r>
+      <w:r>
+        <w:lastRenderedPageBreak/>
+        <w:t>Posselt, R. P. Richards, D. Scavia, A. L. Steiner, E. Verhamme, D. M. Wright, and M. A. Zagorski. 2013. Record-setting algal bloom in Lake Erie caused by agricultural and meteorological trends consistent with expected future conditions. Proceedings of the National Academy of Sciences 110:6448–6452.</w:t>
       </w:r>
     </w:p>
     <w:p>
@@ -21552,7 +22723,7 @@
         <w:pStyle w:val="Bibliography"/>
       </w:pPr>
       <w:r>
-        <w:t>Smith, V. H., and D. W. Schindler. 2009. Eutrophication science: where do we go from here? Trends in ecology &amp; evolution 24:201–207.</w:t>
+        <w:t>Mitsch, W. J. 2017. Solving Lake Erie’s harmful algal blooms by restoring the Great Black Swamp in Ohio. Ecological Engineering 108:406–413.</w:t>
       </w:r>
     </w:p>
     <w:p>
@@ -21560,7 +22731,7 @@
         <w:pStyle w:val="Bibliography"/>
       </w:pPr>
       <w:r>
-        <w:t>Sparks, A. 2018. nasapower: A NASA POWER Global Meteorology, Surface Solar Energy and Climatology Data Client for R. Journal of Open Source Software 3:1035.</w:t>
+        <w:t>Mitsch, W. J., S. M. Nedrich, S. K. Harter, C. Anderson, A. M. Nahlik, and B. Bernal. 2014. Sedimentation in created freshwater riverine wetlands: 15 years of succession and contrast of methods. Ecological Engineering 72:25–34.</w:t>
       </w:r>
     </w:p>
     <w:p>
@@ -21568,7 +22739,7 @@
         <w:pStyle w:val="Bibliography"/>
       </w:pPr>
       <w:r>
-        <w:t>Ury, E. A., P. Arrumugam, E. R. Herbert, P. Badiou, B. Page, and N. B. Basu. 2023. Source or sink? Meta-analysis reveals diverging controls of phosphorus retention and release in restored and constructed wetlands. Environmental Research Letters 18:083002.</w:t>
+        <w:t>Ohio Environmentla Protection Agency (EPA). 2023. Maumee Watershed Nutrient Total Maximum Daily Load. Division of Surface Water, Assessment and Modeling Section, Columbus, OH, USA.</w:t>
       </w:r>
     </w:p>
     <w:p>
@@ -21576,7 +22747,7 @@
         <w:pStyle w:val="Bibliography"/>
       </w:pPr>
       <w:r>
-        <w:t>USDA-NRCS. 2004. Estimation of Direct Runoff from Storm Rainfall. Page National Engineering Handbook, Title 210 Engineering. United States Department of Agriculture Natural Resources Conservation Service.</w:t>
+        <w:t>R Core Team. 2024. R: A language and environment for statistical computing. R Foundation for Statistical Computing, Vienna Austria.</w:t>
       </w:r>
     </w:p>
     <w:p>
@@ -21584,7 +22755,7 @@
         <w:pStyle w:val="Bibliography"/>
       </w:pPr>
       <w:r>
-        <w:t>Vymazal, J. 2007. Removal of nutrients in various types of constructed wetlands. Science of The Total Environment 380:48–65.</w:t>
+        <w:t>Silvan, N., H. Vasander, and J. Laine. 2004. Vegetation is the main factor in nutrient retention in a constructed wetland buffer. Plant and Soil 258:179–187.</w:t>
       </w:r>
     </w:p>
     <w:p>
@@ -21592,7 +22763,7 @@
         <w:pStyle w:val="Bibliography"/>
       </w:pPr>
       <w:r>
-        <w:t>Weisner, S. E. B., K. Johannesson, G. Thiere, H. Svengren, P. M. Ehde, and K. S. Tonderski. 2016. National Large-Scale Wetland Creation in Agricultural Areas—Potential versus Realized Effects on Nutrient Transports. Water 8:544.</w:t>
+        <w:t>Smith, V. H., and D. W. Schindler. 2009. Eutrophication science: where do we go from here? Trends in ecology &amp; evolution 24:201–207.</w:t>
       </w:r>
     </w:p>
     <w:p>
@@ -21600,12 +22771,52 @@
         <w:pStyle w:val="Bibliography"/>
       </w:pPr>
       <w:r>
-        <w:t>Wurtsbaugh, W. A., H. W. Paerl, and W. K. Dodds. 2019. Nutrients, eutrophication and harmful algal blooms along the freshwater to marine continuum. WIREs Water 6:e1373.</w:t>
+        <w:t>Sparks, A. 2018. nasapower: A NASA POWER Global Meteorology, Surface Solar Energy and Climatology Data Client for R. Journal of Open Source Software 3:1035.</w:t>
       </w:r>
     </w:p>
     <w:p>
+      <w:pPr>
+        <w:pStyle w:val="Bibliography"/>
+      </w:pPr>
+      <w:r>
+        <w:t>Ury, E. A., P. Arrumugam, E. R. Herbert, P. Badiou, B. Page, and N. B. Basu. 2023. Source or sink? Meta-analysis reveals diverging controls of phosphorus retention and release in restored and constructed wetlands. Environmental Research Letters 18:083002.</w:t>
+      </w:r>
+    </w:p>
+    <w:p>
+      <w:pPr>
+        <w:pStyle w:val="Bibliography"/>
+      </w:pPr>
       <w:r>
         <w:lastRenderedPageBreak/>
+        <w:t>USDA-NRCS. 2004. Estimation of Direct Runoff from Storm Rainfall. Page National Engineering Handbook, Title 210 Engineering. United States Department of Agriculture Natural Resources Conservation Service.</w:t>
+      </w:r>
+    </w:p>
+    <w:p>
+      <w:pPr>
+        <w:pStyle w:val="Bibliography"/>
+      </w:pPr>
+      <w:r>
+        <w:t>Vymazal, J. 2007. Removal of nutrients in various types of constructed wetlands. Science of The Total Environment 380:48–65.</w:t>
+      </w:r>
+    </w:p>
+    <w:p>
+      <w:pPr>
+        <w:pStyle w:val="Bibliography"/>
+      </w:pPr>
+      <w:r>
+        <w:t>Weisner, S. E. B., K. Johannesson, G. Thiere, H. Svengren, P. M. Ehde, and K. S. Tonderski. 2016. National Large-Scale Wetland Creation in Agricultural Areas—Potential versus Realized Effects on Nutrient Transports. Water 8:544.</w:t>
+      </w:r>
+    </w:p>
+    <w:p>
+      <w:pPr>
+        <w:pStyle w:val="Bibliography"/>
+      </w:pPr>
+      <w:r>
+        <w:t>Wurtsbaugh, W. A., H. W. Paerl, and W. K. Dodds. 2019. Nutrients, eutrophication and harmful algal blooms along the freshwater to marine continuum. WIREs Water 6:e1373.</w:t>
+      </w:r>
+    </w:p>
+    <w:p>
+      <w:r>
         <w:fldChar w:fldCharType="end"/>
       </w:r>
     </w:p>
@@ -21621,7 +22832,501 @@
 
 <file path=word/comments.xml><?xml version="1.0" encoding="utf-8"?>
 <w:comments xmlns:wpc="http://schemas.microsoft.com/office/word/2010/wordprocessingCanvas" xmlns:cx="http://schemas.microsoft.com/office/drawing/2014/chartex" xmlns:cx1="http://schemas.microsoft.com/office/drawing/2015/9/8/chartex" xmlns:cx2="http://schemas.microsoft.com/office/drawing/2015/10/21/chartex" xmlns:cx3="http://schemas.microsoft.com/office/drawing/2016/5/9/chartex" xmlns:cx4="http://schemas.microsoft.com/office/drawing/2016/5/10/chartex" xmlns:cx5="http://schemas.microsoft.com/office/drawing/2016/5/11/chartex" xmlns:cx6="http://schemas.microsoft.com/office/drawing/2016/5/12/chartex" xmlns:cx7="http://schemas.microsoft.com/office/drawing/2016/5/13/chartex" xmlns:cx8="http://schemas.microsoft.com/office/drawing/2016/5/14/chartex" xmlns:mc="http://schemas.openxmlformats.org/markup-compatibility/2006" xmlns:aink="http://schemas.microsoft.com/office/drawing/2016/ink" xmlns:am3d="http://schemas.microsoft.com/office/drawing/2017/model3d" xmlns:o="urn:schemas-microsoft-com:office:office" xmlns:oel="http://schemas.microsoft.com/office/2019/extlst" xmlns:r="http://schemas.openxmlformats.org/officeDocument/2006/relationships" xmlns:m="http://schemas.openxmlformats.org/officeDocument/2006/math" xmlns:v="urn:schemas-microsoft-com:vml" xmlns:wp14="http://schemas.microsoft.com/office/word/2010/wordprocessingDrawing" xmlns:wp="http://schemas.openxmlformats.org/drawingml/2006/wordprocessingDrawing" xmlns:w10="urn:schemas-microsoft-com:office:word" xmlns:w="http://schemas.openxmlformats.org/wordprocessingml/2006/main" xmlns:w14="http://schemas.microsoft.com/office/word/2010/wordml" xmlns:w15="http://schemas.microsoft.com/office/word/2012/wordml" xmlns:w16cex="http://schemas.microsoft.com/office/word/2018/wordml/cex" xmlns:w16cid="http://schemas.microsoft.com/office/word/2016/wordml/cid" xmlns:w16="http://schemas.microsoft.com/office/word/2018/wordml" xmlns:w16du="http://schemas.microsoft.com/office/word/2023/wordml/word16du" xmlns:w16sdtdh="http://schemas.microsoft.com/office/word/2020/wordml/sdtdatahash" xmlns:w16sdtfl="http://schemas.microsoft.com/office/word/2024/wordml/sdtformatlock" xmlns:w16se="http://schemas.microsoft.com/office/word/2015/wordml/symex" xmlns:wpg="http://schemas.microsoft.com/office/word/2010/wordprocessingGroup" xmlns:wpi="http://schemas.microsoft.com/office/word/2010/wordprocessingInk" xmlns:wne="http://schemas.microsoft.com/office/word/2006/wordml" xmlns:wps="http://schemas.microsoft.com/office/word/2010/wordprocessingShape" mc:Ignorable="w14 w15 w16se w16cid w16 w16cex w16sdtdh w16sdtfl w16du wp14">
-  <w:comment w:id="11" w:author="Kinsman-Costello, Lauren" w:date="2026-07-16T13:58:00Z" w:initials="LK">
+  <w:comment w:id="0" w:author="Klukow, Mary Ellen" w:date="2026-08-26T09:35:00Z" w:initials="KM">
+    <w:p>
+      <w:pPr>
+        <w:pStyle w:val="CommentText"/>
+      </w:pPr>
+      <w:r>
+        <w:rPr>
+          <w:rStyle w:val="CommentReference"/>
+        </w:rPr>
+        <w:annotationRef/>
+      </w:r>
+      <w:r>
+        <w:t>this almost seems counter to what you're arguing in the paper, so maybe some nuance can be added here?</w:t>
+      </w:r>
+    </w:p>
+  </w:comment>
+  <w:comment w:id="1" w:author="Klukow, Mary Ellen" w:date="2026-08-26T08:39:00Z" w:initials="KM">
+    <w:p>
+      <w:pPr>
+        <w:pStyle w:val="CommentText"/>
+      </w:pPr>
+      <w:r>
+        <w:rPr>
+          <w:rStyle w:val="CommentReference"/>
+        </w:rPr>
+        <w:annotationRef/>
+      </w:r>
+      <w:r>
+        <w:t>Kadlec 2016 (doi:10.3390/w8060243); Ury et al. 2023 (https://doi.org/10.1088/1748-9326/ace6bf)</w:t>
+      </w:r>
+    </w:p>
+  </w:comment>
+  <w:comment w:id="2" w:author="Klukow, Mary Ellen" w:date="2026-08-26T08:45:00Z" w:initials="KM">
+    <w:p>
+      <w:pPr>
+        <w:pStyle w:val="CommentText"/>
+      </w:pPr>
+      <w:r>
+        <w:rPr>
+          <w:rStyle w:val="CommentReference"/>
+        </w:rPr>
+        <w:annotationRef/>
+      </w:r>
+      <w:r>
+        <w:t>I think I know what you're saying, but maybe it could be slightly more clear with something like "the designs of the most successful restoration projects are rooted in a deep understanding of the underlying nutrient retention mechanisms of wetlands."?</w:t>
+      </w:r>
+    </w:p>
+  </w:comment>
+  <w:comment w:id="3" w:author="Klukow, Mary Ellen" w:date="2026-08-26T08:46:00Z" w:initials="KM">
+    <w:p>
+      <w:pPr>
+        <w:pStyle w:val="CommentText"/>
+      </w:pPr>
+      <w:r>
+        <w:rPr>
+          <w:rStyle w:val="CommentReference"/>
+        </w:rPr>
+        <w:annotationRef/>
+      </w:r>
+      <w:r>
+        <w:t>anything about N here?</w:t>
+      </w:r>
+    </w:p>
+  </w:comment>
+  <w:comment w:id="4" w:author="Klukow, Mary Ellen" w:date="2026-08-26T08:47:00Z" w:initials="KM">
+    <w:p>
+      <w:pPr>
+        <w:pStyle w:val="CommentText"/>
+      </w:pPr>
+      <w:r>
+        <w:rPr>
+          <w:rStyle w:val="CommentReference"/>
+        </w:rPr>
+        <w:annotationRef/>
+      </w:r>
+      <w:r>
+        <w:t>metrics/indices?</w:t>
+      </w:r>
+    </w:p>
+  </w:comment>
+  <w:comment w:id="5" w:author="Klukow, Mary Ellen" w:date="2026-08-26T08:47:00Z" w:initials="KM">
+    <w:p>
+      <w:pPr>
+        <w:pStyle w:val="CommentText"/>
+      </w:pPr>
+      <w:r>
+        <w:rPr>
+          <w:rStyle w:val="CommentReference"/>
+        </w:rPr>
+        <w:annotationRef/>
+      </w:r>
+      <w:r>
+        <w:t>used as a proxy?</w:t>
+      </w:r>
+    </w:p>
+  </w:comment>
+  <w:comment w:id="6" w:author="Klukow, Mary Ellen" w:date="2026-08-26T08:48:00Z" w:initials="KM">
+    <w:p>
+      <w:pPr>
+        <w:pStyle w:val="CommentText"/>
+      </w:pPr>
+      <w:r>
+        <w:rPr>
+          <w:rStyle w:val="CommentReference"/>
+        </w:rPr>
+        <w:annotationRef/>
+      </w:r>
+      <w:r>
+        <w:t>examples?</w:t>
+      </w:r>
+    </w:p>
+  </w:comment>
+  <w:comment w:id="7" w:author="Esber, Hana" w:date="2026-08-28T10:40:00Z" w:initials="HE">
+    <w:p>
+      <w:pPr>
+        <w:pStyle w:val="CommentText"/>
+      </w:pPr>
+      <w:r>
+        <w:rPr>
+          <w:rStyle w:val="CommentReference"/>
+        </w:rPr>
+        <w:annotationRef/>
+      </w:r>
+      <w:r>
+        <w:t>Is this something that changes in respect to year? I wasn’t sure if those goals were specific to 2024 for example or just until a certain year like 2030</w:t>
+      </w:r>
+    </w:p>
+  </w:comment>
+  <w:comment w:id="12" w:author="Esber, Hana" w:date="2026-08-28T10:52:00Z" w:initials="HE">
+    <w:p>
+      <w:pPr>
+        <w:pStyle w:val="CommentText"/>
+      </w:pPr>
+      <w:r>
+        <w:rPr>
+          <w:rStyle w:val="CommentReference"/>
+        </w:rPr>
+        <w:annotationRef/>
+      </w:r>
+      <w:r>
+        <w:t xml:space="preserve">This cites how many million acres of farmland in Ohio (about 50% of total land) </w:t>
+      </w:r>
+      <w:hyperlink r:id="rId1" w:history="1">
+        <w:r>
+          <w:rPr>
+            <w:rStyle w:val="Hyperlink"/>
+          </w:rPr>
+          <w:t>https://doi.org/10.1016/S2095-6339(15)30017-4</w:t>
+        </w:r>
+      </w:hyperlink>
+      <w:r>
+        <w:t xml:space="preserve"> , and this shows about 80% of Maumee drainage in a figure </w:t>
+      </w:r>
+      <w:hyperlink r:id="rId2" w:history="1">
+        <w:r>
+          <w:rPr>
+            <w:rStyle w:val="Hyperlink"/>
+          </w:rPr>
+          <w:t>https://doi.org/10.1016/j.ejrh.2015.06.017</w:t>
+        </w:r>
+      </w:hyperlink>
+      <w:r>
+        <w:t xml:space="preserve"> </w:t>
+      </w:r>
+    </w:p>
+  </w:comment>
+  <w:comment w:id="18" w:author="Klukow, Mary Ellen" w:date="2026-08-26T09:08:00Z" w:initials="KM">
+    <w:p>
+      <w:pPr>
+        <w:pStyle w:val="CommentText"/>
+      </w:pPr>
+      <w:r>
+        <w:rPr>
+          <w:rStyle w:val="CommentReference"/>
+        </w:rPr>
+        <w:annotationRef/>
+      </w:r>
+      <w:r>
+        <w:t>crisis was in 2014, might be more clear to just say that</w:t>
+      </w:r>
+    </w:p>
+  </w:comment>
+  <w:comment w:id="10" w:author="Klukow, Mary Ellen" w:date="2026-08-26T09:13:00Z" w:initials="KM">
+    <w:p>
+      <w:pPr>
+        <w:pStyle w:val="CommentText"/>
+      </w:pPr>
+      <w:r>
+        <w:rPr>
+          <w:rStyle w:val="CommentReference"/>
+        </w:rPr>
+        <w:annotationRef/>
+      </w:r>
+      <w:r>
+        <w:t>should this be in the intro?</w:t>
+      </w:r>
+    </w:p>
+  </w:comment>
+  <w:comment w:id="11" w:author="Esber, Hana" w:date="2026-08-28T10:42:00Z" w:initials="HE">
+    <w:p>
+      <w:pPr>
+        <w:pStyle w:val="CommentText"/>
+      </w:pPr>
+      <w:r>
+        <w:rPr>
+          <w:rStyle w:val="CommentReference"/>
+        </w:rPr>
+        <w:annotationRef/>
+      </w:r>
+      <w:r>
+        <w:t>I think it could fit in the intro a bit better since you start the second intro paragraph talking about how wetlands are hotspots for nutrient cycling. You can add this in there to connect the idea of adding more wetlands in Ohio being necessary because of high nutrient inputs</w:t>
+      </w:r>
+    </w:p>
+  </w:comment>
+  <w:comment w:id="19" w:author="Klukow, Mary Ellen" w:date="2026-08-26T09:09:00Z" w:initials="KM">
+    <w:p>
+      <w:pPr>
+        <w:pStyle w:val="CommentText"/>
+      </w:pPr>
+      <w:r>
+        <w:rPr>
+          <w:rStyle w:val="CommentReference"/>
+        </w:rPr>
+        <w:annotationRef/>
+      </w:r>
+      <w:r>
+        <w:t>I would just say over 50, because it kinda wavers each year, but we're def over 50</w:t>
+      </w:r>
+    </w:p>
+  </w:comment>
+  <w:comment w:id="20" w:author="Klukow, Mary Ellen" w:date="2026-08-26T09:10:00Z" w:initials="KM">
+    <w:p>
+      <w:pPr>
+        <w:pStyle w:val="CommentText"/>
+      </w:pPr>
+      <w:r>
+        <w:rPr>
+          <w:rStyle w:val="CommentReference"/>
+        </w:rPr>
+        <w:annotationRef/>
+      </w:r>
+      <w:r>
+        <w:t>Would it be overkill to have this as an equation too, just for clarity's sake?</w:t>
+      </w:r>
+    </w:p>
+  </w:comment>
+  <w:comment w:id="23" w:author="Esber, Hana" w:date="2026-08-28T11:03:00Z" w:initials="HE">
+    <w:p>
+      <w:pPr>
+        <w:pStyle w:val="CommentText"/>
+      </w:pPr>
+      <w:r>
+        <w:rPr>
+          <w:rStyle w:val="CommentReference"/>
+        </w:rPr>
+        <w:annotationRef/>
+      </w:r>
+      <w:r>
+        <w:t>Would it be good to describe at some point what you consider spring/summer months since our water year ranges from Oct 1 - Sept 30?</w:t>
+      </w:r>
+    </w:p>
+  </w:comment>
+  <w:comment w:id="24" w:author="Klukow, Mary Ellen" w:date="2026-08-26T09:22:00Z" w:initials="KM">
+    <w:p>
+      <w:pPr>
+        <w:pStyle w:val="CommentText"/>
+      </w:pPr>
+      <w:r>
+        <w:rPr>
+          <w:rStyle w:val="CommentReference"/>
+        </w:rPr>
+        <w:annotationRef/>
+      </w:r>
+      <w:r>
+        <w:t>Flagging this as something that seems unclear to me, but may be obvious to other people. If no one else thinks this is confusing, ignore this comment</w:t>
+      </w:r>
+    </w:p>
+  </w:comment>
+  <w:comment w:id="25" w:author="Esber, Hana" w:date="2026-08-28T11:07:00Z" w:initials="HE">
+    <w:p>
+      <w:pPr>
+        <w:pStyle w:val="CommentText"/>
+      </w:pPr>
+      <w:r>
+        <w:rPr>
+          <w:rStyle w:val="CommentReference"/>
+        </w:rPr>
+        <w:annotationRef/>
+      </w:r>
+      <w:r>
+        <w:t>I also feel that this is a bit confusing. Are you trying to say you used inflow volume when it was available and if you had storm nutrient concentration then you used that too? Is the function of the wetland on nutrient retention just explaining that XX lbs of P went in and XX lbs of P came out?</w:t>
+      </w:r>
+    </w:p>
+  </w:comment>
+  <w:comment w:id="27" w:author="Esber, Hana" w:date="2026-08-28T11:10:00Z" w:initials="HE">
+    <w:p>
+      <w:pPr>
+        <w:pStyle w:val="CommentText"/>
+      </w:pPr>
+      <w:r>
+        <w:rPr>
+          <w:rStyle w:val="CommentReference"/>
+        </w:rPr>
+        <w:annotationRef/>
+      </w:r>
+      <w:r>
+        <w:t>Wasn’t sure if you meant NH</w:t>
+      </w:r>
+      <w:r>
+        <w:rPr>
+          <w:vertAlign w:val="subscript"/>
+        </w:rPr>
+        <w:t xml:space="preserve">4 </w:t>
+      </w:r>
+      <w:r>
+        <w:t>here or if you meant NH3, but I also saw previously you reference NOX with the subscript. Just something to keep an eye on</w:t>
+      </w:r>
+    </w:p>
+  </w:comment>
+  <w:comment w:id="32" w:author="Esber, Hana" w:date="2026-08-28T11:12:00Z" w:initials="HE">
+    <w:p>
+      <w:pPr>
+        <w:pStyle w:val="CommentText"/>
+      </w:pPr>
+      <w:r>
+        <w:rPr>
+          <w:rStyle w:val="CommentReference"/>
+        </w:rPr>
+        <w:annotationRef/>
+      </w:r>
+      <w:r>
+        <w:t>This sentence is pretty hefty. I would suggest breaking it up a bit more. I added in a few spots I thought it would be useful at, but feel free to adjust however you like</w:t>
+      </w:r>
+    </w:p>
+  </w:comment>
+  <w:comment w:id="33" w:author="Esber, Hana" w:date="2026-08-28T11:13:00Z" w:initials="HE">
+    <w:p>
+      <w:pPr>
+        <w:pStyle w:val="CommentText"/>
+      </w:pPr>
+      <w:r>
+        <w:rPr>
+          <w:rStyle w:val="CommentReference"/>
+        </w:rPr>
+        <w:annotationRef/>
+      </w:r>
+      <w:r>
+        <w:t>Also, the further I read through this I get a little lost in the “at the same magnitude” statements. This might just need a little more clarity or the actual number in some cases</w:t>
+      </w:r>
+    </w:p>
+  </w:comment>
+  <w:comment w:id="41" w:author="Esber, Hana" w:date="2026-08-28T11:25:00Z" w:initials="HE">
+    <w:p>
+      <w:pPr>
+        <w:pStyle w:val="CommentText"/>
+      </w:pPr>
+      <w:r>
+        <w:rPr>
+          <w:rStyle w:val="CommentReference"/>
+        </w:rPr>
+        <w:annotationRef/>
+      </w:r>
+      <w:r>
+        <w:t>This might be helpful when talking about why the hydrology is important for nutrient cycling?</w:t>
+      </w:r>
+      <w:r>
+        <w:br/>
+      </w:r>
+      <w:hyperlink r:id="rId3" w:history="1">
+        <w:r>
+          <w:rPr>
+            <w:rStyle w:val="Hyperlink"/>
+          </w:rPr>
+          <w:t>https://onlinelibrary.wiley.com/doi/abs/10.1002/hyp.10637</w:t>
+        </w:r>
+      </w:hyperlink>
+      <w:r>
+        <w:br/>
+      </w:r>
+    </w:p>
+  </w:comment>
+  <w:comment w:id="42" w:author="Esber, Hana" w:date="2026-08-28T11:27:00Z" w:initials="HE">
+    <w:p>
+      <w:pPr>
+        <w:pStyle w:val="CommentText"/>
+      </w:pPr>
+      <w:r>
+        <w:rPr>
+          <w:rStyle w:val="CommentReference"/>
+        </w:rPr>
+        <w:annotationRef/>
+      </w:r>
+      <w:r>
+        <w:t>Shameless microtopography plug for slowing down flow of water and increasing residence time:</w:t>
+      </w:r>
+      <w:r>
+        <w:br/>
+      </w:r>
+      <w:hyperlink r:id="rId4" w:history="1">
+        <w:r>
+          <w:rPr>
+            <w:rStyle w:val="Hyperlink"/>
+          </w:rPr>
+          <w:t>https://onlinelibrary.wiley.com/doi/abs/10.1029/2009JG001241</w:t>
+        </w:r>
+      </w:hyperlink>
+      <w:r>
+        <w:br/>
+      </w:r>
+      <w:hyperlink r:id="rId5" w:history="1">
+        <w:r>
+          <w:rPr>
+            <w:rStyle w:val="Hyperlink"/>
+          </w:rPr>
+          <w:t>https://doi.org/10.13031/2013.6441</w:t>
+        </w:r>
+      </w:hyperlink>
+    </w:p>
+  </w:comment>
+  <w:comment w:id="43" w:author="Esber, Hana" w:date="2026-08-28T11:19:00Z" w:initials="HE">
+    <w:p>
+      <w:pPr>
+        <w:pStyle w:val="CommentText"/>
+      </w:pPr>
+      <w:r>
+        <w:rPr>
+          <w:rStyle w:val="CommentReference"/>
+        </w:rPr>
+        <w:annotationRef/>
+      </w:r>
+      <w:r>
+        <w:t>Could you add in scenarios about storm sampling here or would that be too different from your current narrative? I was thinking that maybe there’s a wetland that often has low retention until it captures a large storm water volume + nutrient concentration</w:t>
+      </w:r>
+    </w:p>
+  </w:comment>
+  <w:comment w:id="44" w:author="Esber, Hana" w:date="2026-08-28T11:19:00Z" w:initials="HE">
+    <w:p>
+      <w:pPr>
+        <w:pStyle w:val="CommentText"/>
+      </w:pPr>
+      <w:r>
+        <w:rPr>
+          <w:rStyle w:val="CommentReference"/>
+        </w:rPr>
+        <w:annotationRef/>
+      </w:r>
+      <w:r>
+        <w:t>Just saw this later in your discussion...</w:t>
+      </w:r>
+    </w:p>
+  </w:comment>
+  <w:comment w:id="45" w:author="Klukow, Mary Ellen" w:date="2026-08-26T09:32:00Z" w:initials="KM">
+    <w:p>
+      <w:pPr>
+        <w:pStyle w:val="CommentText"/>
+      </w:pPr>
+      <w:r>
+        <w:rPr>
+          <w:rStyle w:val="CommentReference"/>
+        </w:rPr>
+        <w:annotationRef/>
+      </w:r>
+      <w:r>
+        <w:t xml:space="preserve">Mike's paper talks more about this: </w:t>
+      </w:r>
+      <w:hyperlink r:id="rId6" w:history="1">
+        <w:r>
+          <w:rPr>
+            <w:rStyle w:val="Hyperlink"/>
+          </w:rPr>
+          <w:t>https://doi.org/10.1016/j.jglr.2025.102658</w:t>
+        </w:r>
+      </w:hyperlink>
+      <w:r>
+        <w:t xml:space="preserve"> </w:t>
+      </w:r>
+    </w:p>
+  </w:comment>
+  <w:comment w:id="46" w:author="Klukow, Mary Ellen" w:date="2026-08-26T09:32:00Z" w:initials="KM">
+    <w:p>
+      <w:pPr>
+        <w:pStyle w:val="CommentText"/>
+      </w:pPr>
+      <w:r>
+        <w:rPr>
+          <w:rStyle w:val="CommentReference"/>
+        </w:rPr>
+        <w:annotationRef/>
+      </w:r>
+      <w:r>
+        <w:t>I think</w:t>
+      </w:r>
+    </w:p>
+  </w:comment>
+  <w:comment w:id="64" w:author="Kinsman-Costello, Lauren" w:date="2026-07-16T13:58:00Z" w:initials="LK">
     <w:p>
       <w:r>
         <w:rPr>
@@ -21638,7 +23343,7 @@
       </w:r>
     </w:p>
   </w:comment>
-  <w:comment w:id="12" w:author="Kinsman-Costello, Lauren" w:date="2026-06-18T14:36:00Z" w:initials="LK">
+  <w:comment w:id="65" w:author="Kinsman-Costello, Lauren" w:date="2026-06-18T14:36:00Z" w:initials="LK">
     <w:p>
       <w:r>
         <w:rPr>
@@ -21660,6 +23365,32 @@
 
 <file path=word/commentsExtended.xml><?xml version="1.0" encoding="utf-8"?>
 <w15:commentsEx xmlns:wpc="http://schemas.microsoft.com/office/word/2010/wordprocessingCanvas" xmlns:cx="http://schemas.microsoft.com/office/drawing/2014/chartex" xmlns:cx1="http://schemas.microsoft.com/office/drawing/2015/9/8/chartex" xmlns:cx2="http://schemas.microsoft.com/office/drawing/2015/10/21/chartex" xmlns:cx3="http://schemas.microsoft.com/office/drawing/2016/5/9/chartex" xmlns:cx4="http://schemas.microsoft.com/office/drawing/2016/5/10/chartex" xmlns:cx5="http://schemas.microsoft.com/office/drawing/2016/5/11/chartex" xmlns:cx6="http://schemas.microsoft.com/office/drawing/2016/5/12/chartex" xmlns:cx7="http://schemas.microsoft.com/office/drawing/2016/5/13/chartex" xmlns:cx8="http://schemas.microsoft.com/office/drawing/2016/5/14/chartex" xmlns:mc="http://schemas.openxmlformats.org/markup-compatibility/2006" xmlns:aink="http://schemas.microsoft.com/office/drawing/2016/ink" xmlns:am3d="http://schemas.microsoft.com/office/drawing/2017/model3d" xmlns:o="urn:schemas-microsoft-com:office:office" xmlns:oel="http://schemas.microsoft.com/office/2019/extlst" xmlns:r="http://schemas.openxmlformats.org/officeDocument/2006/relationships" xmlns:m="http://schemas.openxmlformats.org/officeDocument/2006/math" xmlns:v="urn:schemas-microsoft-com:vml" xmlns:wp14="http://schemas.microsoft.com/office/word/2010/wordprocessingDrawing" xmlns:wp="http://schemas.openxmlformats.org/drawingml/2006/wordprocessingDrawing" xmlns:w10="urn:schemas-microsoft-com:office:word" xmlns:w="http://schemas.openxmlformats.org/wordprocessingml/2006/main" xmlns:w14="http://schemas.microsoft.com/office/word/2010/wordml" xmlns:w15="http://schemas.microsoft.com/office/word/2012/wordml" xmlns:w16cex="http://schemas.microsoft.com/office/word/2018/wordml/cex" xmlns:w16cid="http://schemas.microsoft.com/office/word/2016/wordml/cid" xmlns:w16="http://schemas.microsoft.com/office/word/2018/wordml" xmlns:w16du="http://schemas.microsoft.com/office/word/2023/wordml/word16du" xmlns:w16sdtdh="http://schemas.microsoft.com/office/word/2020/wordml/sdtdatahash" xmlns:w16sdtfl="http://schemas.microsoft.com/office/word/2024/wordml/sdtformatlock" xmlns:w16se="http://schemas.microsoft.com/office/word/2015/wordml/symex" xmlns:wpg="http://schemas.microsoft.com/office/word/2010/wordprocessingGroup" xmlns:wpi="http://schemas.microsoft.com/office/word/2010/wordprocessingInk" xmlns:wne="http://schemas.microsoft.com/office/word/2006/wordml" xmlns:wps="http://schemas.microsoft.com/office/word/2010/wordprocessingShape" mc:Ignorable="w14 w15 w16se w16cid w16 w16cex w16sdtdh w16sdtfl w16du wp14">
+  <w15:commentEx w15:paraId="3D56E6A9" w15:done="1"/>
+  <w15:commentEx w15:paraId="7E33381F" w15:done="1"/>
+  <w15:commentEx w15:paraId="0DFCE6C4" w15:done="1"/>
+  <w15:commentEx w15:paraId="07E738FA" w15:done="1"/>
+  <w15:commentEx w15:paraId="2F473D81" w15:done="1"/>
+  <w15:commentEx w15:paraId="00BFF4E7" w15:done="1"/>
+  <w15:commentEx w15:paraId="1B18C8C1" w15:done="1"/>
+  <w15:commentEx w15:paraId="766BA9E8" w15:done="0"/>
+  <w15:commentEx w15:paraId="14C2184E" w15:done="0"/>
+  <w15:commentEx w15:paraId="302A9852" w15:done="0"/>
+  <w15:commentEx w15:paraId="17930F6C" w15:done="0"/>
+  <w15:commentEx w15:paraId="0B57500C" w15:paraIdParent="17930F6C" w15:done="0"/>
+  <w15:commentEx w15:paraId="5E6544D9" w15:done="0"/>
+  <w15:commentEx w15:paraId="6581AE80" w15:done="0"/>
+  <w15:commentEx w15:paraId="074B9CA3" w15:done="0"/>
+  <w15:commentEx w15:paraId="164BA8EA" w15:done="0"/>
+  <w15:commentEx w15:paraId="3CB8E7CB" w15:paraIdParent="164BA8EA" w15:done="0"/>
+  <w15:commentEx w15:paraId="74869837" w15:done="0"/>
+  <w15:commentEx w15:paraId="58456B6B" w15:done="0"/>
+  <w15:commentEx w15:paraId="3A802E9F" w15:paraIdParent="58456B6B" w15:done="0"/>
+  <w15:commentEx w15:paraId="6DE88855" w15:done="0"/>
+  <w15:commentEx w15:paraId="2EB70DBA" w15:done="0"/>
+  <w15:commentEx w15:paraId="7536B280" w15:done="0"/>
+  <w15:commentEx w15:paraId="79D1BF77" w15:paraIdParent="7536B280" w15:done="0"/>
+  <w15:commentEx w15:paraId="0D403FB5" w15:done="0"/>
+  <w15:commentEx w15:paraId="1831880D" w15:paraIdParent="0D403FB5" w15:done="0"/>
   <w15:commentEx w15:paraId="14AF0CD5" w15:done="1"/>
   <w15:commentEx w15:paraId="1A8BF337" w15:done="1"/>
 </w15:commentsEx>
@@ -21667,6 +23398,32 @@
 
 <file path=word/commentsExtensible.xml><?xml version="1.0" encoding="utf-8"?>
 <w16cex:commentsExtensible xmlns:wpc="http://schemas.microsoft.com/office/word/2010/wordprocessingCanvas" xmlns:cx="http://schemas.microsoft.com/office/drawing/2014/chartex" xmlns:cx1="http://schemas.microsoft.com/office/drawing/2015/9/8/chartex" xmlns:cx2="http://schemas.microsoft.com/office/drawing/2015/10/21/chartex" xmlns:cx3="http://schemas.microsoft.com/office/drawing/2016/5/9/chartex" xmlns:cx4="http://schemas.microsoft.com/office/drawing/2016/5/10/chartex" xmlns:cx5="http://schemas.microsoft.com/office/drawing/2016/5/11/chartex" xmlns:cx6="http://schemas.microsoft.com/office/drawing/2016/5/12/chartex" xmlns:cx7="http://schemas.microsoft.com/office/drawing/2016/5/13/chartex" xmlns:cx8="http://schemas.microsoft.com/office/drawing/2016/5/14/chartex" xmlns:cr="http://schemas.microsoft.com/office/comments/2020/reactions" xmlns:mc="http://schemas.openxmlformats.org/markup-compatibility/2006" xmlns:aink="http://schemas.microsoft.com/office/drawing/2016/ink" xmlns:am3d="http://schemas.microsoft.com/office/drawing/2017/model3d" xmlns:o="urn:schemas-microsoft-com:office:office" xmlns:oel="http://schemas.microsoft.com/office/2019/extlst" xmlns:r="http://schemas.openxmlformats.org/officeDocument/2006/relationships" xmlns:m="http://schemas.openxmlformats.org/officeDocument/2006/math" xmlns:v="urn:schemas-microsoft-com:vml" xmlns:wp14="http://schemas.microsoft.com/office/word/2010/wordprocessingDrawing" xmlns:wp="http://schemas.openxmlformats.org/drawingml/2006/wordprocessingDrawing" xmlns:w10="urn:schemas-microsoft-com:office:word" xmlns:w="http://schemas.openxmlformats.org/wordprocessingml/2006/main" xmlns:w14="http://schemas.microsoft.com/office/word/2010/wordml" xmlns:w15="http://schemas.microsoft.com/office/word/2012/wordml" xmlns:w16cex="http://schemas.microsoft.com/office/word/2018/wordml/cex" xmlns:w16cid="http://schemas.microsoft.com/office/word/2016/wordml/cid" xmlns:w16="http://schemas.microsoft.com/office/word/2018/wordml" xmlns:w16du="http://schemas.microsoft.com/office/word/2023/wordml/word16du" xmlns:w16sdtdh="http://schemas.microsoft.com/office/word/2020/wordml/sdtdatahash" xmlns:w16sdtfl="http://schemas.microsoft.com/office/word/2024/wordml/sdtformatlock" xmlns:w16se="http://schemas.microsoft.com/office/word/2015/wordml/symex" xmlns:wpg="http://schemas.microsoft.com/office/word/2010/wordprocessingGroup" xmlns:wpi="http://schemas.microsoft.com/office/word/2010/wordprocessingInk" xmlns:wne="http://schemas.microsoft.com/office/word/2006/wordml" xmlns:wps="http://schemas.microsoft.com/office/word/2010/wordprocessingShape" mc:Ignorable="w14 w15 w16se w16cid w16 w16cex w16sdtdh w16sdtfl cr w16du wp14">
+  <w16cex:commentExtensible w16cex:durableId="7D9C0FAB" w16cex:dateUtc="2026-08-26T13:35:00Z"/>
+  <w16cex:commentExtensible w16cex:durableId="44A76127" w16cex:dateUtc="2026-08-26T12:39:00Z"/>
+  <w16cex:commentExtensible w16cex:durableId="04051381" w16cex:dateUtc="2026-08-26T12:45:00Z"/>
+  <w16cex:commentExtensible w16cex:durableId="2E67CFFB" w16cex:dateUtc="2026-08-26T12:46:00Z"/>
+  <w16cex:commentExtensible w16cex:durableId="02D681C2" w16cex:dateUtc="2026-08-26T12:47:00Z"/>
+  <w16cex:commentExtensible w16cex:durableId="2B80D3FF" w16cex:dateUtc="2026-08-26T12:47:00Z"/>
+  <w16cex:commentExtensible w16cex:durableId="5D5960BF" w16cex:dateUtc="2026-08-26T12:48:00Z"/>
+  <w16cex:commentExtensible w16cex:durableId="04AA4E8D" w16cex:dateUtc="2026-08-28T14:40:00Z"/>
+  <w16cex:commentExtensible w16cex:durableId="15A3157C" w16cex:dateUtc="2026-08-28T14:52:00Z"/>
+  <w16cex:commentExtensible w16cex:durableId="2B498230" w16cex:dateUtc="2026-08-26T13:08:00Z"/>
+  <w16cex:commentExtensible w16cex:durableId="3017ABC8" w16cex:dateUtc="2026-08-26T13:13:00Z"/>
+  <w16cex:commentExtensible w16cex:durableId="383737AD" w16cex:dateUtc="2026-08-28T14:42:00Z"/>
+  <w16cex:commentExtensible w16cex:durableId="58635FA2" w16cex:dateUtc="2026-08-26T13:09:00Z"/>
+  <w16cex:commentExtensible w16cex:durableId="6E4D9171" w16cex:dateUtc="2026-08-26T13:10:00Z"/>
+  <w16cex:commentExtensible w16cex:durableId="213BFCA7" w16cex:dateUtc="2026-08-28T15:03:00Z"/>
+  <w16cex:commentExtensible w16cex:durableId="12491496" w16cex:dateUtc="2026-08-26T13:22:00Z"/>
+  <w16cex:commentExtensible w16cex:durableId="49C1D1DE" w16cex:dateUtc="2026-08-28T15:07:00Z"/>
+  <w16cex:commentExtensible w16cex:durableId="6B206DC6" w16cex:dateUtc="2026-08-28T15:10:00Z"/>
+  <w16cex:commentExtensible w16cex:durableId="77F4FD38" w16cex:dateUtc="2026-08-28T15:12:00Z"/>
+  <w16cex:commentExtensible w16cex:durableId="5D897656" w16cex:dateUtc="2026-08-28T15:13:00Z"/>
+  <w16cex:commentExtensible w16cex:durableId="7D77406C" w16cex:dateUtc="2026-08-28T15:25:00Z"/>
+  <w16cex:commentExtensible w16cex:durableId="7B78F59E" w16cex:dateUtc="2026-08-28T15:27:00Z"/>
+  <w16cex:commentExtensible w16cex:durableId="150A47BF" w16cex:dateUtc="2026-08-28T15:19:00Z"/>
+  <w16cex:commentExtensible w16cex:durableId="6999CF66" w16cex:dateUtc="2026-08-28T15:19:00Z"/>
+  <w16cex:commentExtensible w16cex:durableId="2E76C45C" w16cex:dateUtc="2026-08-26T13:32:00Z"/>
+  <w16cex:commentExtensible w16cex:durableId="3525E23B" w16cex:dateUtc="2026-08-26T13:32:00Z"/>
   <w16cex:commentExtensible w16cex:durableId="795DF92E" w16cex:dateUtc="2026-07-16T17:58:00Z"/>
   <w16cex:commentExtensible w16cex:durableId="085C6BC8" w16cex:dateUtc="2026-06-18T18:36:00Z"/>
 </w16cex:commentsExtensible>
@@ -21674,6 +23431,32 @@
 
 <file path=word/commentsIds.xml><?xml version="1.0" encoding="utf-8"?>
 <w16cid:commentsIds xmlns:wpc="http://schemas.microsoft.com/office/word/2010/wordprocessingCanvas" xmlns:cx="http://schemas.microsoft.com/office/drawing/2014/chartex" xmlns:cx1="http://schemas.microsoft.com/office/drawing/2015/9/8/chartex" xmlns:cx2="http://schemas.microsoft.com/office/drawing/2015/10/21/chartex" xmlns:cx3="http://schemas.microsoft.com/office/drawing/2016/5/9/chartex" xmlns:cx4="http://schemas.microsoft.com/office/drawing/2016/5/10/chartex" xmlns:cx5="http://schemas.microsoft.com/office/drawing/2016/5/11/chartex" xmlns:cx6="http://schemas.microsoft.com/office/drawing/2016/5/12/chartex" xmlns:cx7="http://schemas.microsoft.com/office/drawing/2016/5/13/chartex" xmlns:cx8="http://schemas.microsoft.com/office/drawing/2016/5/14/chartex" xmlns:mc="http://schemas.openxmlformats.org/markup-compatibility/2006" xmlns:aink="http://schemas.microsoft.com/office/drawing/2016/ink" xmlns:am3d="http://schemas.microsoft.com/office/drawing/2017/model3d" xmlns:o="urn:schemas-microsoft-com:office:office" xmlns:oel="http://schemas.microsoft.com/office/2019/extlst" xmlns:r="http://schemas.openxmlformats.org/officeDocument/2006/relationships" xmlns:m="http://schemas.openxmlformats.org/officeDocument/2006/math" xmlns:v="urn:schemas-microsoft-com:vml" xmlns:wp14="http://schemas.microsoft.com/office/word/2010/wordprocessingDrawing" xmlns:wp="http://schemas.openxmlformats.org/drawingml/2006/wordprocessingDrawing" xmlns:w10="urn:schemas-microsoft-com:office:word" xmlns:w="http://schemas.openxmlformats.org/wordprocessingml/2006/main" xmlns:w14="http://schemas.microsoft.com/office/word/2010/wordml" xmlns:w15="http://schemas.microsoft.com/office/word/2012/wordml" xmlns:w16cex="http://schemas.microsoft.com/office/word/2018/wordml/cex" xmlns:w16cid="http://schemas.microsoft.com/office/word/2016/wordml/cid" xmlns:w16="http://schemas.microsoft.com/office/word/2018/wordml" xmlns:w16du="http://schemas.microsoft.com/office/word/2023/wordml/word16du" xmlns:w16sdtdh="http://schemas.microsoft.com/office/word/2020/wordml/sdtdatahash" xmlns:w16sdtfl="http://schemas.microsoft.com/office/word/2024/wordml/sdtformatlock" xmlns:w16se="http://schemas.microsoft.com/office/word/2015/wordml/symex" xmlns:wpg="http://schemas.microsoft.com/office/word/2010/wordprocessingGroup" xmlns:wpi="http://schemas.microsoft.com/office/word/2010/wordprocessingInk" xmlns:wne="http://schemas.microsoft.com/office/word/2006/wordml" xmlns:wps="http://schemas.microsoft.com/office/word/2010/wordprocessingShape" mc:Ignorable="w14 w15 w16se w16cid w16 w16cex w16sdtdh w16sdtfl w16du wp14">
+  <w16cid:commentId w16cid:paraId="3D56E6A9" w16cid:durableId="7D9C0FAB"/>
+  <w16cid:commentId w16cid:paraId="7E33381F" w16cid:durableId="44A76127"/>
+  <w16cid:commentId w16cid:paraId="0DFCE6C4" w16cid:durableId="04051381"/>
+  <w16cid:commentId w16cid:paraId="07E738FA" w16cid:durableId="2E67CFFB"/>
+  <w16cid:commentId w16cid:paraId="2F473D81" w16cid:durableId="02D681C2"/>
+  <w16cid:commentId w16cid:paraId="00BFF4E7" w16cid:durableId="2B80D3FF"/>
+  <w16cid:commentId w16cid:paraId="1B18C8C1" w16cid:durableId="5D5960BF"/>
+  <w16cid:commentId w16cid:paraId="766BA9E8" w16cid:durableId="04AA4E8D"/>
+  <w16cid:commentId w16cid:paraId="14C2184E" w16cid:durableId="15A3157C"/>
+  <w16cid:commentId w16cid:paraId="302A9852" w16cid:durableId="2B498230"/>
+  <w16cid:commentId w16cid:paraId="17930F6C" w16cid:durableId="3017ABC8"/>
+  <w16cid:commentId w16cid:paraId="0B57500C" w16cid:durableId="383737AD"/>
+  <w16cid:commentId w16cid:paraId="5E6544D9" w16cid:durableId="58635FA2"/>
+  <w16cid:commentId w16cid:paraId="6581AE80" w16cid:durableId="6E4D9171"/>
+  <w16cid:commentId w16cid:paraId="074B9CA3" w16cid:durableId="213BFCA7"/>
+  <w16cid:commentId w16cid:paraId="164BA8EA" w16cid:durableId="12491496"/>
+  <w16cid:commentId w16cid:paraId="3CB8E7CB" w16cid:durableId="49C1D1DE"/>
+  <w16cid:commentId w16cid:paraId="74869837" w16cid:durableId="6B206DC6"/>
+  <w16cid:commentId w16cid:paraId="58456B6B" w16cid:durableId="77F4FD38"/>
+  <w16cid:commentId w16cid:paraId="3A802E9F" w16cid:durableId="5D897656"/>
+  <w16cid:commentId w16cid:paraId="6DE88855" w16cid:durableId="7D77406C"/>
+  <w16cid:commentId w16cid:paraId="2EB70DBA" w16cid:durableId="7B78F59E"/>
+  <w16cid:commentId w16cid:paraId="7536B280" w16cid:durableId="150A47BF"/>
+  <w16cid:commentId w16cid:paraId="79D1BF77" w16cid:durableId="6999CF66"/>
+  <w16cid:commentId w16cid:paraId="0D403FB5" w16cid:durableId="2E76C45C"/>
+  <w16cid:commentId w16cid:paraId="1831880D" w16cid:durableId="3525E23B"/>
   <w16cid:commentId w16cid:paraId="14AF0CD5" w16cid:durableId="795DF92E"/>
   <w16cid:commentId w16cid:paraId="1A8BF337" w16cid:durableId="085C6BC8"/>
 </w16cid:commentsIds>
@@ -23064,7 +24847,7 @@
         <w:rFonts w:ascii="Courier New" w:hAnsi="Courier New" w:cs="Courier New" w:hint="default"/>
       </w:rPr>
     </w:lvl>
-    <w:lvl w:ilvl="2" w:tplc="04090005" w:tentative="1">
+    <w:lvl w:ilvl="2" w:tplc="04090005">
       <w:start w:val="1"/>
       <w:numFmt w:val="bullet"/>
       <w:lvlText w:val=""/>
@@ -23375,49 +25158,49 @@
       </w:rPr>
     </w:lvl>
   </w:abstractNum>
-  <w:num w:numId="1" w16cid:durableId="1297226138">
+  <w:num w:numId="1" w16cid:durableId="339936613">
     <w:abstractNumId w:val="13"/>
   </w:num>
-  <w:num w:numId="2" w16cid:durableId="965892648">
+  <w:num w:numId="2" w16cid:durableId="1450851379">
     <w:abstractNumId w:val="1"/>
   </w:num>
-  <w:num w:numId="3" w16cid:durableId="1668171874">
+  <w:num w:numId="3" w16cid:durableId="1009989436">
     <w:abstractNumId w:val="2"/>
   </w:num>
-  <w:num w:numId="4" w16cid:durableId="1042562642">
+  <w:num w:numId="4" w16cid:durableId="1582981689">
     <w:abstractNumId w:val="0"/>
   </w:num>
-  <w:num w:numId="5" w16cid:durableId="1836919319">
+  <w:num w:numId="5" w16cid:durableId="1072584688">
     <w:abstractNumId w:val="10"/>
   </w:num>
-  <w:num w:numId="6" w16cid:durableId="1838303938">
+  <w:num w:numId="6" w16cid:durableId="1804544390">
     <w:abstractNumId w:val="8"/>
   </w:num>
-  <w:num w:numId="7" w16cid:durableId="1714689514">
+  <w:num w:numId="7" w16cid:durableId="674112736">
     <w:abstractNumId w:val="9"/>
   </w:num>
-  <w:num w:numId="8" w16cid:durableId="688142674">
+  <w:num w:numId="8" w16cid:durableId="1912537986">
     <w:abstractNumId w:val="6"/>
   </w:num>
-  <w:num w:numId="9" w16cid:durableId="544871964">
+  <w:num w:numId="9" w16cid:durableId="1345744388">
     <w:abstractNumId w:val="11"/>
   </w:num>
-  <w:num w:numId="10" w16cid:durableId="210460688">
+  <w:num w:numId="10" w16cid:durableId="1134131552">
     <w:abstractNumId w:val="5"/>
   </w:num>
-  <w:num w:numId="11" w16cid:durableId="1575356027">
+  <w:num w:numId="11" w16cid:durableId="1138957564">
     <w:abstractNumId w:val="7"/>
   </w:num>
-  <w:num w:numId="12" w16cid:durableId="1864246044">
+  <w:num w:numId="12" w16cid:durableId="1904441405">
     <w:abstractNumId w:val="3"/>
   </w:num>
-  <w:num w:numId="13" w16cid:durableId="483745644">
+  <w:num w:numId="13" w16cid:durableId="623123060">
     <w:abstractNumId w:val="14"/>
   </w:num>
-  <w:num w:numId="14" w16cid:durableId="1026827068">
+  <w:num w:numId="14" w16cid:durableId="313921987">
     <w:abstractNumId w:val="12"/>
   </w:num>
-  <w:num w:numId="15" w16cid:durableId="1286814838">
+  <w:num w:numId="15" w16cid:durableId="1156603954">
     <w:abstractNumId w:val="4"/>
   </w:num>
 </w:numbering>
@@ -23425,6 +25208,12 @@
 
 <file path=word/people.xml><?xml version="1.0" encoding="utf-8"?>
 <w15:people xmlns:wpc="http://schemas.microsoft.com/office/word/2010/wordprocessingCanvas" xmlns:cx="http://schemas.microsoft.com/office/drawing/2014/chartex" xmlns:cx1="http://schemas.microsoft.com/office/drawing/2015/9/8/chartex" xmlns:cx2="http://schemas.microsoft.com/office/drawing/2015/10/21/chartex" xmlns:cx3="http://schemas.microsoft.com/office/drawing/2016/5/9/chartex" xmlns:cx4="http://schemas.microsoft.com/office/drawing/2016/5/10/chartex" xmlns:cx5="http://schemas.microsoft.com/office/drawing/2016/5/11/chartex" xmlns:cx6="http://schemas.microsoft.com/office/drawing/2016/5/12/chartex" xmlns:cx7="http://schemas.microsoft.com/office/drawing/2016/5/13/chartex" xmlns:cx8="http://schemas.microsoft.com/office/drawing/2016/5/14/chartex" xmlns:mc="http://schemas.openxmlformats.org/markup-compatibility/2006" xmlns:aink="http://schemas.microsoft.com/office/drawing/2016/ink" xmlns:am3d="http://schemas.microsoft.com/office/drawing/2017/model3d" xmlns:o="urn:schemas-microsoft-com:office:office" xmlns:oel="http://schemas.microsoft.com/office/2019/extlst" xmlns:r="http://schemas.openxmlformats.org/officeDocument/2006/relationships" xmlns:m="http://schemas.openxmlformats.org/officeDocument/2006/math" xmlns:v="urn:schemas-microsoft-com:vml" xmlns:wp14="http://schemas.microsoft.com/office/word/2010/wordprocessingDrawing" xmlns:wp="http://schemas.openxmlformats.org/drawingml/2006/wordprocessingDrawing" xmlns:w10="urn:schemas-microsoft-com:office:word" xmlns:w="http://schemas.openxmlformats.org/wordprocessingml/2006/main" xmlns:w14="http://schemas.microsoft.com/office/word/2010/wordml" xmlns:w15="http://schemas.microsoft.com/office/word/2012/wordml" xmlns:w16cex="http://schemas.microsoft.com/office/word/2018/wordml/cex" xmlns:w16cid="http://schemas.microsoft.com/office/word/2016/wordml/cid" xmlns:w16="http://schemas.microsoft.com/office/word/2018/wordml" xmlns:w16du="http://schemas.microsoft.com/office/word/2023/wordml/word16du" xmlns:w16sdtdh="http://schemas.microsoft.com/office/word/2020/wordml/sdtdatahash" xmlns:w16sdtfl="http://schemas.microsoft.com/office/word/2024/wordml/sdtformatlock" xmlns:w16se="http://schemas.microsoft.com/office/word/2015/wordml/symex" xmlns:wpg="http://schemas.microsoft.com/office/word/2010/wordprocessingGroup" xmlns:wpi="http://schemas.microsoft.com/office/word/2010/wordprocessingInk" xmlns:wne="http://schemas.microsoft.com/office/word/2006/wordml" xmlns:wps="http://schemas.microsoft.com/office/word/2010/wordprocessingShape" mc:Ignorable="w14 w15 w16se w16cid w16 w16cex w16sdtdh w16sdtfl w16du wp14">
+  <w15:person w15:author="Klukow, Mary Ellen">
+    <w15:presenceInfo w15:providerId="AD" w15:userId="S::mklukow@kent.edu::c0826514-8d03-4712-84bd-aefb72c35407"/>
+  </w15:person>
+  <w15:person w15:author="Esber, Hana">
+    <w15:presenceInfo w15:providerId="AD" w15:userId="S::hesber@kent.edu::0c83478a-2a4f-458a-985e-d4c7775130ce"/>
+  </w15:person>
   <w15:person w15:author="Kinsman-Costello, Lauren">
     <w15:presenceInfo w15:providerId="AD" w15:userId="S::lkinsman@kent.edu::beeeb4a2-f8e9-4f4c-bd36-953ec100c7d4"/>
   </w15:person>
@@ -24614,6 +26403,28 @@
       <w:ind w:left="720" w:hanging="720"/>
     </w:pPr>
   </w:style>
+  <w:style w:type="character" w:styleId="UnresolvedMention">
+    <w:name w:val="Unresolved Mention"/>
+    <w:basedOn w:val="DefaultParagraphFont"/>
+    <w:uiPriority w:val="99"/>
+    <w:semiHidden/>
+    <w:unhideWhenUsed/>
+    <w:rsid w:val="001F5045"/>
+    <w:rPr>
+      <w:color w:val="605E5C"/>
+      <w:shd w:val="clear" w:color="auto" w:fill="E1DFDD"/>
+    </w:rPr>
+  </w:style>
+  <w:style w:type="paragraph" w:styleId="Revision">
+    <w:name w:val="Revision"/>
+    <w:hidden/>
+    <w:uiPriority w:val="99"/>
+    <w:semiHidden/>
+    <w:rsid w:val="00CB38FB"/>
+    <w:pPr>
+      <w:spacing w:after="0" w:line="240" w:lineRule="auto"/>
+    </w:pPr>
+  </w:style>
 </w:styles>
 </file>
 

</xml_diff>

<commit_message>
More edits and additions to N scenarios
</commit_message>
<xml_diff>
--- a/Annual Report Manuscript Outline.docx
+++ b/Annual Report Manuscript Outline.docx
@@ -1230,15 +1230,15 @@
           <w:sz w:val="24"/>
           <w:szCs w:val="24"/>
         </w:rPr>
-        <w:t>,</w:t>
-      </w:r>
-      <w:r>
-        <w:rPr>
-          <w:rFonts w:ascii="Times New Roman" w:hAnsi="Times New Roman" w:cs="Times New Roman"/>
-          <w:sz w:val="24"/>
-          <w:szCs w:val="24"/>
-        </w:rPr>
-        <w:t xml:space="preserve"> Mary Ellen </w:t>
+        <w:t xml:space="preserve">, Mary </w:t>
+      </w:r>
+      <w:r>
+        <w:rPr>
+          <w:rFonts w:ascii="Times New Roman" w:hAnsi="Times New Roman" w:cs="Times New Roman"/>
+          <w:sz w:val="24"/>
+          <w:szCs w:val="24"/>
+        </w:rPr>
+        <w:t xml:space="preserve">Ellen </w:t>
       </w:r>
       <w:r>
         <w:rPr>
@@ -2091,15 +2091,7 @@
             <w:sz w:val="24"/>
             <w:szCs w:val="24"/>
           </w:rPr>
-          <w:delText>they</w:delText>
-        </w:r>
-        <w:r>
-          <w:rPr>
-            <w:rFonts w:ascii="Times New Roman" w:hAnsi="Times New Roman" w:cs="Times New Roman"/>
-            <w:sz w:val="24"/>
-            <w:szCs w:val="24"/>
-          </w:rPr>
-          <w:delText xml:space="preserve"> </w:delText>
+          <w:delText xml:space="preserve">they </w:delText>
         </w:r>
       </w:del>
       <w:ins w:id="42" w:author="Marques Mendonca, Raissa" w:date="2026-09-14T11:07:00Z" w16du:dateUtc="2026-09-14T15:07:00Z">
@@ -3143,7 +3135,34 @@
           <w:sz w:val="24"/>
           <w:szCs w:val="24"/>
         </w:rPr>
-        <w:t>, the designs of the most successful restoration projects are rooted in a deep understanding of the underlying nutrient</w:t>
+        <w:t xml:space="preserve">, the designs of the </w:t>
+      </w:r>
+      <w:commentRangeStart w:id="58"/>
+      <w:r>
+        <w:rPr>
+          <w:rFonts w:ascii="Times New Roman" w:hAnsi="Times New Roman" w:cs="Times New Roman"/>
+          <w:sz w:val="24"/>
+          <w:szCs w:val="24"/>
+        </w:rPr>
+        <w:t>most successful</w:t>
+      </w:r>
+      <w:commentRangeEnd w:id="58"/>
+      <w:r>
+        <w:rPr>
+          <w:rStyle w:val="CommentReference"/>
+          <w:rFonts w:ascii="Times New Roman" w:hAnsi="Times New Roman" w:cs="Times New Roman"/>
+          <w:sz w:val="24"/>
+          <w:szCs w:val="24"/>
+        </w:rPr>
+        <w:commentReference w:id="58"/>
+      </w:r>
+      <w:r>
+        <w:rPr>
+          <w:rFonts w:ascii="Times New Roman" w:hAnsi="Times New Roman" w:cs="Times New Roman"/>
+          <w:sz w:val="24"/>
+          <w:szCs w:val="24"/>
+        </w:rPr>
+        <w:t xml:space="preserve"> restoration projects are rooted in a deep understanding of the underlying nutrient</w:t>
       </w:r>
       <w:r>
         <w:rPr>
@@ -3161,7 +3180,7 @@
         </w:rPr>
         <w:t xml:space="preserve">retention mechanisms of wetlands </w:t>
       </w:r>
-      <w:commentRangeStart w:id="58"/>
+      <w:commentRangeStart w:id="59"/>
       <w:r>
         <w:rPr>
           <w:rFonts w:ascii="Times New Roman" w:hAnsi="Times New Roman" w:cs="Times New Roman"/>
@@ -3218,7 +3237,7 @@
         </w:rPr>
         <w:fldChar w:fldCharType="end"/>
       </w:r>
-      <w:commentRangeEnd w:id="58"/>
+      <w:commentRangeEnd w:id="59"/>
       <w:r>
         <w:rPr>
           <w:rStyle w:val="CommentReference"/>
@@ -3226,7 +3245,7 @@
           <w:sz w:val="24"/>
           <w:szCs w:val="24"/>
         </w:rPr>
-        <w:commentReference w:id="58"/>
+        <w:commentReference w:id="59"/>
       </w:r>
       <w:r>
         <w:rPr>
@@ -3260,7 +3279,35 @@
           <w:sz w:val="24"/>
           <w:szCs w:val="24"/>
         </w:rPr>
-        <w:t>Wetlands initially capture nutrients by retaining water and slowing down flow, which leads to sedimentation of material</w:t>
+        <w:t xml:space="preserve">Wetlands initially capture nutrients by retaining water and slowing down flow, which </w:t>
+      </w:r>
+      <w:del w:id="60" w:author="Marques Mendonca, Raissa" w:date="2026-09-14T11:51:00Z" w16du:dateUtc="2026-09-14T15:51:00Z">
+        <w:r>
+          <w:rPr>
+            <w:rFonts w:ascii="Times New Roman" w:hAnsi="Times New Roman" w:cs="Times New Roman"/>
+            <w:sz w:val="24"/>
+            <w:szCs w:val="24"/>
+          </w:rPr>
+          <w:delText>leads to</w:delText>
+        </w:r>
+      </w:del>
+      <w:ins w:id="61" w:author="Marques Mendonca, Raissa" w:date="2026-09-14T11:51:00Z" w16du:dateUtc="2026-09-14T15:51:00Z">
+        <w:r>
+          <w:rPr>
+            <w:rFonts w:ascii="Times New Roman" w:hAnsi="Times New Roman" w:cs="Times New Roman"/>
+            <w:sz w:val="24"/>
+            <w:szCs w:val="24"/>
+          </w:rPr>
+          <w:t>allows time for</w:t>
+        </w:r>
+      </w:ins>
+      <w:r>
+        <w:rPr>
+          <w:rFonts w:ascii="Times New Roman" w:hAnsi="Times New Roman" w:cs="Times New Roman"/>
+          <w:sz w:val="24"/>
+          <w:szCs w:val="24"/>
+        </w:rPr>
+        <w:t xml:space="preserve"> sedimentation of material</w:t>
       </w:r>
       <w:r>
         <w:rPr>
@@ -3278,7 +3325,7 @@
         </w:rPr>
         <w:t xml:space="preserve"> that </w:t>
       </w:r>
-      <w:del w:id="59" w:author="Jacquemin, Stephen James" w:date="2026-09-09T19:39:00Z" w16du:dateUtc="2026-09-09T19:39:26Z">
+      <w:del w:id="62" w:author="Jacquemin, Stephen James" w:date="2026-09-09T19:39:00Z" w16du:dateUtc="2026-09-09T19:39:26Z">
         <w:r>
           <w:rPr>
             <w:rFonts w:ascii="Times New Roman" w:hAnsi="Times New Roman" w:cs="Times New Roman"/>
@@ -3288,7 +3335,7 @@
           <w:delText>contains</w:delText>
         </w:r>
       </w:del>
-      <w:ins w:id="60" w:author="Jacquemin, Stephen James" w:date="2026-09-09T19:39:00Z" w16du:dateUtc="2026-09-09T19:39:38Z">
+      <w:ins w:id="63" w:author="Jacquemin, Stephen James" w:date="2026-09-09T19:39:00Z" w16du:dateUtc="2026-09-09T19:39:38Z">
         <w:r>
           <w:rPr>
             <w:rFonts w:ascii="Times New Roman" w:hAnsi="Times New Roman" w:cs="Times New Roman"/>
@@ -3346,46 +3393,84 @@
         </w:rPr>
         <w:fldChar w:fldCharType="end"/>
       </w:r>
-      <w:r>
-        <w:rPr>
-          <w:rFonts w:ascii="Times New Roman" w:hAnsi="Times New Roman" w:cs="Times New Roman"/>
-          <w:sz w:val="24"/>
-          <w:szCs w:val="24"/>
-        </w:rPr>
-        <w:t xml:space="preserve">. Slowing down flow </w:t>
-      </w:r>
-      <w:r>
-        <w:rPr>
-          <w:rFonts w:ascii="Times New Roman" w:hAnsi="Times New Roman" w:cs="Times New Roman"/>
-          <w:sz w:val="24"/>
-          <w:szCs w:val="24"/>
-        </w:rPr>
-        <w:t>allows</w:t>
-      </w:r>
-      <w:r>
-        <w:rPr>
-          <w:rFonts w:ascii="Times New Roman" w:hAnsi="Times New Roman" w:cs="Times New Roman"/>
-          <w:sz w:val="24"/>
-          <w:szCs w:val="24"/>
-        </w:rPr>
-        <w:t xml:space="preserve"> both</w:t>
-      </w:r>
-      <w:r>
-        <w:rPr>
-          <w:rFonts w:ascii="Times New Roman" w:hAnsi="Times New Roman" w:cs="Times New Roman"/>
-          <w:sz w:val="24"/>
-          <w:szCs w:val="24"/>
-        </w:rPr>
-        <w:t xml:space="preserve"> sediment to </w:t>
-      </w:r>
-      <w:r>
-        <w:rPr>
-          <w:rFonts w:ascii="Times New Roman" w:hAnsi="Times New Roman" w:cs="Times New Roman"/>
-          <w:sz w:val="24"/>
-          <w:szCs w:val="24"/>
-        </w:rPr>
-        <w:t>settle and</w:t>
-      </w:r>
+      <w:ins w:id="64" w:author="Marques Mendonca, Raissa" w:date="2026-09-14T11:51:00Z" w16du:dateUtc="2026-09-14T15:51:00Z">
+        <w:r>
+          <w:rPr>
+            <w:rFonts w:ascii="Times New Roman" w:hAnsi="Times New Roman" w:cs="Times New Roman"/>
+            <w:sz w:val="24"/>
+            <w:szCs w:val="24"/>
+          </w:rPr>
+          <w:t xml:space="preserve"> and</w:t>
+        </w:r>
+      </w:ins>
+      <w:commentRangeStart w:id="65"/>
+      <w:del w:id="66" w:author="Marques Mendonca, Raissa" w:date="2026-09-14T11:51:00Z" w16du:dateUtc="2026-09-14T15:51:00Z">
+        <w:r>
+          <w:rPr>
+            <w:rFonts w:ascii="Times New Roman" w:hAnsi="Times New Roman" w:cs="Times New Roman"/>
+            <w:sz w:val="24"/>
+            <w:szCs w:val="24"/>
+          </w:rPr>
+          <w:delText xml:space="preserve">. Slowing down flow </w:delText>
+        </w:r>
+        <w:r>
+          <w:rPr>
+            <w:rFonts w:ascii="Times New Roman" w:hAnsi="Times New Roman" w:cs="Times New Roman"/>
+            <w:sz w:val="24"/>
+            <w:szCs w:val="24"/>
+          </w:rPr>
+          <w:delText>allows</w:delText>
+        </w:r>
+        <w:r>
+          <w:rPr>
+            <w:rFonts w:ascii="Times New Roman" w:hAnsi="Times New Roman" w:cs="Times New Roman"/>
+            <w:sz w:val="24"/>
+            <w:szCs w:val="24"/>
+          </w:rPr>
+          <w:delText xml:space="preserve"> both</w:delText>
+        </w:r>
+        <w:r>
+          <w:rPr>
+            <w:rFonts w:ascii="Times New Roman" w:hAnsi="Times New Roman" w:cs="Times New Roman"/>
+            <w:sz w:val="24"/>
+            <w:szCs w:val="24"/>
+          </w:rPr>
+          <w:delText xml:space="preserve"> sediment to </w:delText>
+        </w:r>
+        <w:r>
+          <w:rPr>
+            <w:rFonts w:ascii="Times New Roman" w:hAnsi="Times New Roman" w:cs="Times New Roman"/>
+            <w:sz w:val="24"/>
+            <w:szCs w:val="24"/>
+          </w:rPr>
+          <w:delText>settle and</w:delText>
+        </w:r>
+        <w:r>
+          <w:rPr>
+            <w:rFonts w:ascii="Times New Roman" w:hAnsi="Times New Roman" w:cs="Times New Roman"/>
+            <w:sz w:val="24"/>
+            <w:szCs w:val="24"/>
+          </w:rPr>
+          <w:delText xml:space="preserve"> </w:delText>
+        </w:r>
+        <w:commentRangeStart w:id="67"/>
+        <w:r>
+          <w:rPr>
+            <w:rFonts w:ascii="Times New Roman" w:hAnsi="Times New Roman" w:cs="Times New Roman"/>
+            <w:sz w:val="24"/>
+            <w:szCs w:val="24"/>
+          </w:rPr>
+          <w:delText xml:space="preserve">time for </w:delText>
+        </w:r>
+        <w:r>
+          <w:rPr>
+            <w:rFonts w:ascii="Times New Roman" w:hAnsi="Times New Roman" w:cs="Times New Roman"/>
+            <w:sz w:val="24"/>
+            <w:szCs w:val="24"/>
+          </w:rPr>
+          <w:delText>the</w:delText>
+        </w:r>
+      </w:del>
       <w:r>
         <w:rPr>
           <w:rFonts w:ascii="Times New Roman" w:hAnsi="Times New Roman" w:cs="Times New Roman"/>
@@ -3394,22 +3479,15 @@
         </w:rPr>
         <w:t xml:space="preserve"> </w:t>
       </w:r>
-      <w:commentRangeStart w:id="61"/>
-      <w:r>
-        <w:rPr>
-          <w:rFonts w:ascii="Times New Roman" w:hAnsi="Times New Roman" w:cs="Times New Roman"/>
-          <w:sz w:val="24"/>
-          <w:szCs w:val="24"/>
-        </w:rPr>
-        <w:t xml:space="preserve">time for </w:t>
-      </w:r>
-      <w:r>
-        <w:rPr>
-          <w:rFonts w:ascii="Times New Roman" w:hAnsi="Times New Roman" w:cs="Times New Roman"/>
-          <w:sz w:val="24"/>
-          <w:szCs w:val="24"/>
-        </w:rPr>
-        <w:t xml:space="preserve">the </w:t>
+      <w:commentRangeEnd w:id="65"/>
+      <w:r>
+        <w:rPr>
+          <w:rStyle w:val="CommentReference"/>
+          <w:rFonts w:ascii="Times New Roman" w:hAnsi="Times New Roman" w:cs="Times New Roman"/>
+          <w:sz w:val="24"/>
+          <w:szCs w:val="24"/>
+        </w:rPr>
+        <w:commentReference w:id="65"/>
       </w:r>
       <w:r>
         <w:rPr>
@@ -3435,7 +3513,7 @@
         </w:rPr>
         <w:t>binding sites</w:t>
       </w:r>
-      <w:commentRangeEnd w:id="61"/>
+      <w:commentRangeEnd w:id="67"/>
       <w:r>
         <w:rPr>
           <w:rStyle w:val="CommentReference"/>
@@ -3443,7 +3521,7 @@
           <w:sz w:val="24"/>
           <w:szCs w:val="24"/>
         </w:rPr>
-        <w:commentReference w:id="61"/>
+        <w:commentReference w:id="67"/>
       </w:r>
       <w:r>
         <w:rPr>
@@ -3515,7 +3593,35 @@
           <w:sz w:val="24"/>
           <w:szCs w:val="24"/>
         </w:rPr>
-        <w:t>. Longer term storage can occur through sediment uptake by vegetation, which binds inorganic phosphorus to organic material</w:t>
+        <w:t>. Longer</w:t>
+      </w:r>
+      <w:ins w:id="68" w:author="Marques Mendonca, Raissa" w:date="2026-09-14T11:53:00Z" w16du:dateUtc="2026-09-14T15:53:00Z">
+        <w:r>
+          <w:rPr>
+            <w:rFonts w:ascii="Times New Roman" w:hAnsi="Times New Roman" w:cs="Times New Roman"/>
+            <w:sz w:val="24"/>
+            <w:szCs w:val="24"/>
+          </w:rPr>
+          <w:t>-</w:t>
+        </w:r>
+      </w:ins>
+      <w:del w:id="69" w:author="Marques Mendonca, Raissa" w:date="2026-09-14T11:53:00Z" w16du:dateUtc="2026-09-14T15:53:00Z">
+        <w:r>
+          <w:rPr>
+            <w:rFonts w:ascii="Times New Roman" w:hAnsi="Times New Roman" w:cs="Times New Roman"/>
+            <w:sz w:val="24"/>
+            <w:szCs w:val="24"/>
+          </w:rPr>
+          <w:delText xml:space="preserve"> </w:delText>
+        </w:r>
+      </w:del>
+      <w:r>
+        <w:rPr>
+          <w:rFonts w:ascii="Times New Roman" w:hAnsi="Times New Roman" w:cs="Times New Roman"/>
+          <w:sz w:val="24"/>
+          <w:szCs w:val="24"/>
+        </w:rPr>
+        <w:t>term storage can occur through sediment uptake by vegetation, which binds inorganic phosphorus to organic material</w:t>
       </w:r>
       <w:r>
         <w:rPr>
@@ -3659,9 +3765,28 @@
           <w:sz w:val="24"/>
           <w:szCs w:val="24"/>
         </w:rPr>
-        <w:t>for nutrient retention</w:t>
-      </w:r>
-      <w:ins w:id="62" w:author="Jacquemin, Stephen James" w:date="2026-09-11T12:07:00Z" w16du:dateUtc="2026-09-11T12:07:49Z">
+        <w:t xml:space="preserve">for nutrient </w:t>
+      </w:r>
+      <w:commentRangeStart w:id="70"/>
+      <w:r>
+        <w:rPr>
+          <w:rFonts w:ascii="Times New Roman" w:hAnsi="Times New Roman" w:cs="Times New Roman"/>
+          <w:sz w:val="24"/>
+          <w:szCs w:val="24"/>
+        </w:rPr>
+        <w:t>retention</w:t>
+      </w:r>
+      <w:commentRangeEnd w:id="70"/>
+      <w:r>
+        <w:rPr>
+          <w:rStyle w:val="CommentReference"/>
+          <w:rFonts w:ascii="Times New Roman" w:hAnsi="Times New Roman" w:cs="Times New Roman"/>
+          <w:sz w:val="24"/>
+          <w:szCs w:val="24"/>
+        </w:rPr>
+        <w:commentReference w:id="70"/>
+      </w:r>
+      <w:ins w:id="71" w:author="Jacquemin, Stephen James" w:date="2026-09-11T12:07:00Z" w16du:dateUtc="2026-09-11T12:07:49Z">
         <w:r>
           <w:rPr>
             <w:rFonts w:ascii="Times New Roman" w:hAnsi="Times New Roman" w:cs="Times New Roman"/>
@@ -3685,9 +3810,63 @@
           <w:sz w:val="24"/>
           <w:szCs w:val="24"/>
         </w:rPr>
-        <w:t xml:space="preserve">there are examples of wetland restorations that release nutrients </w:t>
-      </w:r>
-      <w:del w:id="63" w:author="Jacquemin, Stephen James" w:date="2026-09-11T12:07:00Z" w16du:dateUtc="2026-09-11T12:07:59Z">
+        <w:t xml:space="preserve">there are examples of </w:t>
+      </w:r>
+      <w:ins w:id="72" w:author="Marques Mendonca, Raissa" w:date="2026-09-14T11:59:00Z" w16du:dateUtc="2026-09-14T15:59:00Z">
+        <w:r>
+          <w:rPr>
+            <w:rFonts w:ascii="Times New Roman" w:hAnsi="Times New Roman" w:cs="Times New Roman"/>
+            <w:sz w:val="24"/>
+            <w:szCs w:val="24"/>
+          </w:rPr>
+          <w:t xml:space="preserve">restored </w:t>
+        </w:r>
+      </w:ins>
+      <w:r>
+        <w:rPr>
+          <w:rFonts w:ascii="Times New Roman" w:hAnsi="Times New Roman" w:cs="Times New Roman"/>
+          <w:sz w:val="24"/>
+          <w:szCs w:val="24"/>
+        </w:rPr>
+        <w:t>wetland</w:t>
+      </w:r>
+      <w:ins w:id="73" w:author="Marques Mendonca, Raissa" w:date="2026-09-14T11:59:00Z" w16du:dateUtc="2026-09-14T15:59:00Z">
+        <w:r>
+          <w:rPr>
+            <w:rFonts w:ascii="Times New Roman" w:hAnsi="Times New Roman" w:cs="Times New Roman"/>
+            <w:sz w:val="24"/>
+            <w:szCs w:val="24"/>
+          </w:rPr>
+          <w:t>s</w:t>
+        </w:r>
+      </w:ins>
+      <w:r>
+        <w:rPr>
+          <w:rFonts w:ascii="Times New Roman" w:hAnsi="Times New Roman" w:cs="Times New Roman"/>
+          <w:sz w:val="24"/>
+          <w:szCs w:val="24"/>
+        </w:rPr>
+        <w:t xml:space="preserve"> </w:t>
+      </w:r>
+      <w:del w:id="74" w:author="Marques Mendonca, Raissa" w:date="2026-09-14T11:59:00Z" w16du:dateUtc="2026-09-14T15:59:00Z">
+        <w:r>
+          <w:rPr>
+            <w:rFonts w:ascii="Times New Roman" w:hAnsi="Times New Roman" w:cs="Times New Roman"/>
+            <w:sz w:val="24"/>
+            <w:szCs w:val="24"/>
+          </w:rPr>
+          <w:delText xml:space="preserve">restorations </w:delText>
+        </w:r>
+      </w:del>
+      <w:r>
+        <w:rPr>
+          <w:rFonts w:ascii="Times New Roman" w:hAnsi="Times New Roman" w:cs="Times New Roman"/>
+          <w:sz w:val="24"/>
+          <w:szCs w:val="24"/>
+        </w:rPr>
+        <w:t xml:space="preserve">that release nutrients </w:t>
+      </w:r>
+      <w:del w:id="75" w:author="Jacquemin, Stephen James" w:date="2026-09-11T12:07:00Z" w16du:dateUtc="2026-09-11T12:07:59Z">
         <w:r>
           <w:rPr>
             <w:rFonts w:ascii="Times New Roman" w:hAnsi="Times New Roman" w:cs="Times New Roman"/>
@@ -3703,19 +3882,137 @@
           <w:sz w:val="24"/>
           <w:szCs w:val="24"/>
         </w:rPr>
-        <w:t>rather than retaining them</w:t>
-      </w:r>
-      <w:ins w:id="64" w:author="Jacquemin, Stephen James" w:date="2026-09-11T12:08:00Z" w16du:dateUtc="2026-09-11T12:08:48Z">
+        <w:t>rather than retain</w:t>
+      </w:r>
+      <w:del w:id="76" w:author="Marques Mendonca, Raissa" w:date="2026-09-14T11:59:00Z" w16du:dateUtc="2026-09-14T15:59:00Z">
         <w:r>
           <w:rPr>
             <w:rFonts w:ascii="Times New Roman" w:hAnsi="Times New Roman" w:cs="Times New Roman"/>
             <w:sz w:val="24"/>
             <w:szCs w:val="24"/>
           </w:rPr>
-          <w:t>, making the study of what determines a ‘source’ vs. ‘sink’ subject to ongoing study</w:t>
+          <w:delText>ing</w:delText>
+        </w:r>
+      </w:del>
+      <w:r>
+        <w:rPr>
+          <w:rFonts w:ascii="Times New Roman" w:hAnsi="Times New Roman" w:cs="Times New Roman"/>
+          <w:sz w:val="24"/>
+          <w:szCs w:val="24"/>
+        </w:rPr>
+        <w:t xml:space="preserve"> them</w:t>
+      </w:r>
+      <w:ins w:id="77" w:author="Jacquemin, Stephen James" w:date="2026-09-11T12:08:00Z" w16du:dateUtc="2026-09-11T12:08:48Z">
+        <w:r>
+          <w:rPr>
+            <w:rFonts w:ascii="Times New Roman" w:hAnsi="Times New Roman" w:cs="Times New Roman"/>
+            <w:sz w:val="24"/>
+            <w:szCs w:val="24"/>
+          </w:rPr>
+          <w:t xml:space="preserve">, </w:t>
         </w:r>
       </w:ins>
-      <w:del w:id="65" w:author="Jacquemin, Stephen James" w:date="2026-09-11T12:08:00Z" w16du:dateUtc="2026-09-11T12:08:37Z">
+      <w:ins w:id="78" w:author="Marques Mendonca, Raissa" w:date="2026-09-14T12:04:00Z" w16du:dateUtc="2026-09-14T16:04:00Z">
+        <w:r>
+          <w:rPr>
+            <w:rFonts w:ascii="Times New Roman" w:hAnsi="Times New Roman" w:cs="Times New Roman"/>
+            <w:sz w:val="24"/>
+            <w:szCs w:val="24"/>
+          </w:rPr>
+          <w:t xml:space="preserve">which </w:t>
+        </w:r>
+      </w:ins>
+      <w:ins w:id="79" w:author="Jacquemin, Stephen James" w:date="2026-09-11T12:08:00Z" w16du:dateUtc="2026-09-11T12:08:48Z">
+        <w:r>
+          <w:rPr>
+            <w:rFonts w:ascii="Times New Roman" w:hAnsi="Times New Roman" w:cs="Times New Roman"/>
+            <w:sz w:val="24"/>
+            <w:szCs w:val="24"/>
+          </w:rPr>
+          <w:t>mak</w:t>
+        </w:r>
+      </w:ins>
+      <w:ins w:id="80" w:author="Marques Mendonca, Raissa" w:date="2026-09-14T12:04:00Z" w16du:dateUtc="2026-09-14T16:04:00Z">
+        <w:r>
+          <w:rPr>
+            <w:rFonts w:ascii="Times New Roman" w:hAnsi="Times New Roman" w:cs="Times New Roman"/>
+            <w:sz w:val="24"/>
+            <w:szCs w:val="24"/>
+          </w:rPr>
+          <w:t>e</w:t>
+        </w:r>
+      </w:ins>
+      <w:ins w:id="81" w:author="Marques Mendonca, Raissa" w:date="2026-09-14T12:05:00Z" w16du:dateUtc="2026-09-14T16:05:00Z">
+        <w:r>
+          <w:rPr>
+            <w:rFonts w:ascii="Times New Roman" w:hAnsi="Times New Roman" w:cs="Times New Roman"/>
+            <w:sz w:val="24"/>
+            <w:szCs w:val="24"/>
+          </w:rPr>
+          <w:t>s</w:t>
+        </w:r>
+      </w:ins>
+      <w:ins w:id="82" w:author="Jacquemin, Stephen James" w:date="2026-09-11T12:08:00Z" w16du:dateUtc="2026-09-11T12:08:48Z">
+        <w:del w:id="83" w:author="Marques Mendonca, Raissa" w:date="2026-09-14T12:04:00Z" w16du:dateUtc="2026-09-14T16:04:00Z">
+          <w:r>
+            <w:rPr>
+              <w:rFonts w:ascii="Times New Roman" w:hAnsi="Times New Roman" w:cs="Times New Roman"/>
+              <w:sz w:val="24"/>
+              <w:szCs w:val="24"/>
+            </w:rPr>
+            <w:delText>ing</w:delText>
+          </w:r>
+        </w:del>
+        <w:r>
+          <w:rPr>
+            <w:rFonts w:ascii="Times New Roman" w:hAnsi="Times New Roman" w:cs="Times New Roman"/>
+            <w:sz w:val="24"/>
+            <w:szCs w:val="24"/>
+          </w:rPr>
+          <w:t xml:space="preserve"> the study of what determines a ‘source’ vs. ‘sink’ </w:t>
+        </w:r>
+        <w:del w:id="84" w:author="Marques Mendonca, Raissa" w:date="2026-09-14T12:04:00Z" w16du:dateUtc="2026-09-14T16:04:00Z">
+          <w:r>
+            <w:rPr>
+              <w:rFonts w:ascii="Times New Roman" w:hAnsi="Times New Roman" w:cs="Times New Roman"/>
+              <w:sz w:val="24"/>
+              <w:szCs w:val="24"/>
+            </w:rPr>
+            <w:delText>subject to ongoing study</w:delText>
+          </w:r>
+        </w:del>
+      </w:ins>
+      <w:ins w:id="85" w:author="Marques Mendonca, Raissa" w:date="2026-09-14T12:04:00Z" w16du:dateUtc="2026-09-14T16:04:00Z">
+        <w:r>
+          <w:rPr>
+            <w:rFonts w:ascii="Times New Roman" w:hAnsi="Times New Roman" w:cs="Times New Roman"/>
+            <w:sz w:val="24"/>
+            <w:szCs w:val="24"/>
+          </w:rPr>
+          <w:t xml:space="preserve">particularly </w:t>
+        </w:r>
+      </w:ins>
+      <w:ins w:id="86" w:author="Marques Mendonca, Raissa" w:date="2026-09-14T12:06:00Z" w16du:dateUtc="2026-09-14T16:06:00Z">
+        <w:r>
+          <w:rPr>
+            <w:rFonts w:ascii="Times New Roman" w:hAnsi="Times New Roman" w:cs="Times New Roman"/>
+            <w:sz w:val="24"/>
+            <w:szCs w:val="24"/>
+          </w:rPr>
+          <w:t>significant</w:t>
+        </w:r>
+      </w:ins>
+      <w:ins w:id="87" w:author="Marques Mendonca, Raissa" w:date="2026-09-14T11:54:00Z" w16du:dateUtc="2026-09-14T15:54:00Z">
+        <w:r>
+          <w:rPr>
+            <w:rFonts w:ascii="Times New Roman" w:hAnsi="Times New Roman" w:cs="Times New Roman"/>
+            <w:sz w:val="24"/>
+            <w:szCs w:val="24"/>
+          </w:rPr>
+          <w:t xml:space="preserve"> </w:t>
+        </w:r>
+      </w:ins>
+      <w:del w:id="88" w:author="Jacquemin, Stephen James" w:date="2026-09-11T12:08:00Z" w16du:dateUtc="2026-09-11T12:08:37Z">
         <w:r>
           <w:rPr>
             <w:rFonts w:ascii="Times New Roman" w:hAnsi="Times New Roman" w:cs="Times New Roman"/>
@@ -3856,7 +4153,7 @@
         </w:rPr>
         <w:t>metrics/indices</w:t>
       </w:r>
-      <w:commentRangeStart w:id="66"/>
+      <w:commentRangeStart w:id="89"/>
       <w:r>
         <w:rPr>
           <w:rFonts w:ascii="Times New Roman" w:hAnsi="Times New Roman" w:cs="Times New Roman"/>
@@ -3865,7 +4162,7 @@
         </w:rPr>
         <w:t xml:space="preserve"> </w:t>
       </w:r>
-      <w:commentRangeEnd w:id="66"/>
+      <w:commentRangeEnd w:id="89"/>
       <w:r>
         <w:rPr>
           <w:rStyle w:val="CommentReference"/>
@@ -3873,7 +4170,7 @@
           <w:sz w:val="24"/>
           <w:szCs w:val="24"/>
         </w:rPr>
-        <w:commentReference w:id="66"/>
+        <w:commentReference w:id="89"/>
       </w:r>
       <w:r>
         <w:rPr>
@@ -3891,7 +4188,7 @@
         </w:rPr>
         <w:t xml:space="preserve">often </w:t>
       </w:r>
-      <w:commentRangeStart w:id="67"/>
+      <w:commentRangeStart w:id="90"/>
       <w:r>
         <w:rPr>
           <w:rFonts w:ascii="Times New Roman" w:hAnsi="Times New Roman" w:cs="Times New Roman"/>
@@ -3924,7 +4221,7 @@
         </w:rPr>
         <w:t xml:space="preserve"> </w:t>
       </w:r>
-      <w:commentRangeEnd w:id="67"/>
+      <w:commentRangeEnd w:id="90"/>
       <w:r>
         <w:rPr>
           <w:rStyle w:val="CommentReference"/>
@@ -3932,7 +4229,7 @@
           <w:sz w:val="24"/>
           <w:szCs w:val="24"/>
         </w:rPr>
-        <w:commentReference w:id="67"/>
+        <w:commentReference w:id="90"/>
       </w:r>
       <w:r>
         <w:rPr>
@@ -3942,7 +4239,7 @@
         </w:rPr>
         <w:t xml:space="preserve">to evaluate wetland restoration success, including </w:t>
       </w:r>
-      <w:commentRangeStart w:id="68"/>
+      <w:commentRangeStart w:id="91"/>
       <w:r>
         <w:rPr>
           <w:rFonts w:ascii="Times New Roman" w:hAnsi="Times New Roman" w:cs="Times New Roman"/>
@@ -3951,7 +4248,7 @@
         </w:rPr>
         <w:t>vegetation</w:t>
       </w:r>
-      <w:commentRangeEnd w:id="68"/>
+      <w:commentRangeEnd w:id="91"/>
       <w:r>
         <w:rPr>
           <w:rStyle w:val="CommentReference"/>
@@ -3959,7 +4256,7 @@
           <w:sz w:val="24"/>
           <w:szCs w:val="24"/>
         </w:rPr>
-        <w:commentReference w:id="68"/>
+        <w:commentReference w:id="91"/>
       </w:r>
       <w:r>
         <w:rPr>
@@ -4095,55 +4392,258 @@
           <w:sz w:val="24"/>
           <w:szCs w:val="24"/>
         </w:rPr>
-        <w:t xml:space="preserve">. The drivers of nutrient retention in wetlands are not clearly understood </w:t>
-      </w:r>
-      <w:r>
-        <w:rPr>
-          <w:rFonts w:ascii="Times New Roman" w:hAnsi="Times New Roman" w:cs="Times New Roman"/>
-          <w:sz w:val="24"/>
-          <w:szCs w:val="24"/>
-        </w:rPr>
-        <w:t>(</w:t>
-      </w:r>
-      <w:r>
-        <w:rPr>
-          <w:rFonts w:ascii="Times New Roman" w:hAnsi="Times New Roman" w:cs="Times New Roman"/>
-          <w:sz w:val="24"/>
-          <w:szCs w:val="24"/>
-        </w:rPr>
-        <w:t>with high variability in rates of nutrient retention across a variety of studied wetlands</w:t>
-      </w:r>
-      <w:r>
-        <w:rPr>
-          <w:rFonts w:ascii="Times New Roman" w:hAnsi="Times New Roman" w:cs="Times New Roman"/>
-          <w:sz w:val="24"/>
-          <w:szCs w:val="24"/>
-        </w:rPr>
-        <w:t>)</w:t>
-      </w:r>
-      <w:r>
-        <w:rPr>
-          <w:rFonts w:ascii="Times New Roman" w:hAnsi="Times New Roman" w:cs="Times New Roman"/>
-          <w:sz w:val="24"/>
-          <w:szCs w:val="24"/>
-        </w:rPr>
-        <w:t>,</w:t>
-      </w:r>
-      <w:r>
-        <w:rPr>
-          <w:rFonts w:ascii="Times New Roman" w:hAnsi="Times New Roman" w:cs="Times New Roman"/>
-          <w:sz w:val="24"/>
-          <w:szCs w:val="24"/>
-        </w:rPr>
-        <w:t xml:space="preserve"> but</w:t>
-      </w:r>
-      <w:r>
-        <w:rPr>
-          <w:rFonts w:ascii="Times New Roman" w:hAnsi="Times New Roman" w:cs="Times New Roman"/>
-          <w:sz w:val="24"/>
-          <w:szCs w:val="24"/>
-        </w:rPr>
-        <w:t xml:space="preserve"> through nutrient budgeting methods</w:t>
+        <w:t xml:space="preserve">. The drivers of nutrient retention in wetlands are not </w:t>
+      </w:r>
+      <w:ins w:id="92" w:author="Marques Mendonca, Raissa" w:date="2026-09-14T12:11:00Z" w16du:dateUtc="2026-09-14T16:11:00Z">
+        <w:r>
+          <w:rPr>
+            <w:rFonts w:ascii="Times New Roman" w:hAnsi="Times New Roman" w:cs="Times New Roman"/>
+            <w:sz w:val="24"/>
+            <w:szCs w:val="24"/>
+          </w:rPr>
+          <w:t xml:space="preserve">yet </w:t>
+        </w:r>
+      </w:ins>
+      <w:r>
+        <w:rPr>
+          <w:rFonts w:ascii="Times New Roman" w:hAnsi="Times New Roman" w:cs="Times New Roman"/>
+          <w:sz w:val="24"/>
+          <w:szCs w:val="24"/>
+        </w:rPr>
+        <w:t>clearly understood</w:t>
+      </w:r>
+      <w:ins w:id="93" w:author="Marques Mendonca, Raissa" w:date="2026-09-14T12:10:00Z" w16du:dateUtc="2026-09-14T16:10:00Z">
+        <w:r>
+          <w:rPr>
+            <w:rFonts w:ascii="Times New Roman" w:hAnsi="Times New Roman" w:cs="Times New Roman"/>
+            <w:sz w:val="24"/>
+            <w:szCs w:val="24"/>
+          </w:rPr>
+          <w:t xml:space="preserve">, </w:t>
+        </w:r>
+      </w:ins>
+      <w:del w:id="94" w:author="Marques Mendonca, Raissa" w:date="2026-09-14T12:10:00Z" w16du:dateUtc="2026-09-14T16:10:00Z">
+        <w:r>
+          <w:rPr>
+            <w:rFonts w:ascii="Times New Roman" w:hAnsi="Times New Roman" w:cs="Times New Roman"/>
+            <w:sz w:val="24"/>
+            <w:szCs w:val="24"/>
+          </w:rPr>
+          <w:delText xml:space="preserve"> </w:delText>
+        </w:r>
+        <w:r>
+          <w:rPr>
+            <w:rFonts w:ascii="Times New Roman" w:hAnsi="Times New Roman" w:cs="Times New Roman"/>
+            <w:sz w:val="24"/>
+            <w:szCs w:val="24"/>
+          </w:rPr>
+          <w:delText>(</w:delText>
+        </w:r>
+      </w:del>
+      <w:r>
+        <w:rPr>
+          <w:rFonts w:ascii="Times New Roman" w:hAnsi="Times New Roman" w:cs="Times New Roman"/>
+          <w:sz w:val="24"/>
+          <w:szCs w:val="24"/>
+        </w:rPr>
+        <w:t>with high</w:t>
+      </w:r>
+      <w:ins w:id="95" w:author="Marques Mendonca, Raissa" w:date="2026-09-14T12:11:00Z" w16du:dateUtc="2026-09-14T16:11:00Z">
+        <w:r>
+          <w:rPr>
+            <w:rFonts w:ascii="Times New Roman" w:hAnsi="Times New Roman" w:cs="Times New Roman"/>
+            <w:sz w:val="24"/>
+            <w:szCs w:val="24"/>
+          </w:rPr>
+          <w:t>ly</w:t>
+        </w:r>
+      </w:ins>
+      <w:r>
+        <w:rPr>
+          <w:rFonts w:ascii="Times New Roman" w:hAnsi="Times New Roman" w:cs="Times New Roman"/>
+          <w:sz w:val="24"/>
+          <w:szCs w:val="24"/>
+        </w:rPr>
+        <w:t xml:space="preserve"> </w:t>
+      </w:r>
+      <w:del w:id="96" w:author="Marques Mendonca, Raissa" w:date="2026-09-14T12:11:00Z" w16du:dateUtc="2026-09-14T16:11:00Z">
+        <w:r>
+          <w:rPr>
+            <w:rFonts w:ascii="Times New Roman" w:hAnsi="Times New Roman" w:cs="Times New Roman"/>
+            <w:sz w:val="24"/>
+            <w:szCs w:val="24"/>
+          </w:rPr>
+          <w:delText xml:space="preserve">variability </w:delText>
+        </w:r>
+      </w:del>
+      <w:ins w:id="97" w:author="Marques Mendonca, Raissa" w:date="2026-09-14T12:11:00Z" w16du:dateUtc="2026-09-14T16:11:00Z">
+        <w:r>
+          <w:rPr>
+            <w:rFonts w:ascii="Times New Roman" w:hAnsi="Times New Roman" w:cs="Times New Roman"/>
+            <w:sz w:val="24"/>
+            <w:szCs w:val="24"/>
+          </w:rPr>
+          <w:t>variab</w:t>
+        </w:r>
+        <w:r>
+          <w:rPr>
+            <w:rFonts w:ascii="Times New Roman" w:hAnsi="Times New Roman" w:cs="Times New Roman"/>
+            <w:sz w:val="24"/>
+            <w:szCs w:val="24"/>
+          </w:rPr>
+          <w:t>le</w:t>
+        </w:r>
+        <w:r>
+          <w:rPr>
+            <w:rFonts w:ascii="Times New Roman" w:hAnsi="Times New Roman" w:cs="Times New Roman"/>
+            <w:sz w:val="24"/>
+            <w:szCs w:val="24"/>
+          </w:rPr>
+          <w:t xml:space="preserve"> </w:t>
+        </w:r>
+      </w:ins>
+      <w:del w:id="98" w:author="Marques Mendonca, Raissa" w:date="2026-09-14T12:11:00Z" w16du:dateUtc="2026-09-14T16:11:00Z">
+        <w:r>
+          <w:rPr>
+            <w:rFonts w:ascii="Times New Roman" w:hAnsi="Times New Roman" w:cs="Times New Roman"/>
+            <w:sz w:val="24"/>
+            <w:szCs w:val="24"/>
+          </w:rPr>
+          <w:delText xml:space="preserve">in </w:delText>
+        </w:r>
+      </w:del>
+      <w:r>
+        <w:rPr>
+          <w:rFonts w:ascii="Times New Roman" w:hAnsi="Times New Roman" w:cs="Times New Roman"/>
+          <w:sz w:val="24"/>
+          <w:szCs w:val="24"/>
+        </w:rPr>
+        <w:t>rates of nutrient retention</w:t>
+      </w:r>
+      <w:ins w:id="99" w:author="Marques Mendonca, Raissa" w:date="2026-09-14T12:11:00Z" w16du:dateUtc="2026-09-14T16:11:00Z">
+        <w:r>
+          <w:rPr>
+            <w:rFonts w:ascii="Times New Roman" w:hAnsi="Times New Roman" w:cs="Times New Roman"/>
+            <w:sz w:val="24"/>
+            <w:szCs w:val="24"/>
+          </w:rPr>
+          <w:t xml:space="preserve"> observed</w:t>
+        </w:r>
+      </w:ins>
+      <w:r>
+        <w:rPr>
+          <w:rFonts w:ascii="Times New Roman" w:hAnsi="Times New Roman" w:cs="Times New Roman"/>
+          <w:sz w:val="24"/>
+          <w:szCs w:val="24"/>
+        </w:rPr>
+        <w:t xml:space="preserve"> across a variety of </w:t>
+      </w:r>
+      <w:commentRangeStart w:id="100"/>
+      <w:r>
+        <w:rPr>
+          <w:rFonts w:ascii="Times New Roman" w:hAnsi="Times New Roman" w:cs="Times New Roman"/>
+          <w:sz w:val="24"/>
+          <w:szCs w:val="24"/>
+        </w:rPr>
+        <w:t>studied</w:t>
+      </w:r>
+      <w:commentRangeEnd w:id="100"/>
+      <w:r>
+        <w:rPr>
+          <w:rStyle w:val="CommentReference"/>
+          <w:rFonts w:ascii="Times New Roman" w:hAnsi="Times New Roman" w:cs="Times New Roman"/>
+          <w:sz w:val="24"/>
+          <w:szCs w:val="24"/>
+        </w:rPr>
+        <w:commentReference w:id="100"/>
+      </w:r>
+      <w:r>
+        <w:rPr>
+          <w:rFonts w:ascii="Times New Roman" w:hAnsi="Times New Roman" w:cs="Times New Roman"/>
+          <w:sz w:val="24"/>
+          <w:szCs w:val="24"/>
+        </w:rPr>
+        <w:t xml:space="preserve"> wetlands</w:t>
+      </w:r>
+      <w:ins w:id="101" w:author="Marques Mendonca, Raissa" w:date="2026-09-14T12:11:00Z" w16du:dateUtc="2026-09-14T16:11:00Z">
+        <w:r>
+          <w:rPr>
+            <w:rFonts w:ascii="Times New Roman" w:hAnsi="Times New Roman" w:cs="Times New Roman"/>
+            <w:sz w:val="24"/>
+            <w:szCs w:val="24"/>
+          </w:rPr>
+          <w:t>.</w:t>
+        </w:r>
+      </w:ins>
+      <w:del w:id="102" w:author="Marques Mendonca, Raissa" w:date="2026-09-14T12:11:00Z" w16du:dateUtc="2026-09-14T16:11:00Z">
+        <w:r>
+          <w:rPr>
+            <w:rFonts w:ascii="Times New Roman" w:hAnsi="Times New Roman" w:cs="Times New Roman"/>
+            <w:sz w:val="24"/>
+            <w:szCs w:val="24"/>
+          </w:rPr>
+          <w:delText>)</w:delText>
+        </w:r>
+        <w:r>
+          <w:rPr>
+            <w:rFonts w:ascii="Times New Roman" w:hAnsi="Times New Roman" w:cs="Times New Roman"/>
+            <w:sz w:val="24"/>
+            <w:szCs w:val="24"/>
+          </w:rPr>
+          <w:delText>,</w:delText>
+        </w:r>
+      </w:del>
+      <w:r>
+        <w:rPr>
+          <w:rFonts w:ascii="Times New Roman" w:hAnsi="Times New Roman" w:cs="Times New Roman"/>
+          <w:sz w:val="24"/>
+          <w:szCs w:val="24"/>
+        </w:rPr>
+        <w:t xml:space="preserve"> </w:t>
+      </w:r>
+      <w:del w:id="103" w:author="Marques Mendonca, Raissa" w:date="2026-09-14T12:11:00Z" w16du:dateUtc="2026-09-14T16:11:00Z">
+        <w:r>
+          <w:rPr>
+            <w:rFonts w:ascii="Times New Roman" w:hAnsi="Times New Roman" w:cs="Times New Roman"/>
+            <w:sz w:val="24"/>
+            <w:szCs w:val="24"/>
+          </w:rPr>
+          <w:delText>but</w:delText>
+        </w:r>
+        <w:r>
+          <w:rPr>
+            <w:rFonts w:ascii="Times New Roman" w:hAnsi="Times New Roman" w:cs="Times New Roman"/>
+            <w:sz w:val="24"/>
+            <w:szCs w:val="24"/>
+          </w:rPr>
+          <w:delText xml:space="preserve"> </w:delText>
+        </w:r>
+      </w:del>
+      <w:ins w:id="104" w:author="Marques Mendonca, Raissa" w:date="2026-09-14T12:11:00Z" w16du:dateUtc="2026-09-14T16:11:00Z">
+        <w:r>
+          <w:rPr>
+            <w:rFonts w:ascii="Times New Roman" w:hAnsi="Times New Roman" w:cs="Times New Roman"/>
+            <w:sz w:val="24"/>
+            <w:szCs w:val="24"/>
+          </w:rPr>
+          <w:t>However,</w:t>
+        </w:r>
+        <w:r>
+          <w:rPr>
+            <w:rFonts w:ascii="Times New Roman" w:hAnsi="Times New Roman" w:cs="Times New Roman"/>
+            <w:sz w:val="24"/>
+            <w:szCs w:val="24"/>
+          </w:rPr>
+          <w:t xml:space="preserve"> </w:t>
+        </w:r>
+      </w:ins>
+      <w:r>
+        <w:rPr>
+          <w:rFonts w:ascii="Times New Roman" w:hAnsi="Times New Roman" w:cs="Times New Roman"/>
+          <w:sz w:val="24"/>
+          <w:szCs w:val="24"/>
+        </w:rPr>
+        <w:t>through nutrient budgeting methods</w:t>
       </w:r>
       <w:r>
         <w:rPr>
@@ -4185,13 +4685,32 @@
         </w:rPr>
         <w:t xml:space="preserve"> </w:t>
       </w:r>
-      <w:r>
-        <w:rPr>
-          <w:rFonts w:ascii="Times New Roman" w:hAnsi="Times New Roman" w:cs="Times New Roman"/>
-          <w:sz w:val="24"/>
-          <w:szCs w:val="24"/>
-        </w:rPr>
-        <w:t xml:space="preserve">consistently retain more phosphorus </w:t>
+      <w:commentRangeStart w:id="105"/>
+      <w:r>
+        <w:rPr>
+          <w:rFonts w:ascii="Times New Roman" w:hAnsi="Times New Roman" w:cs="Times New Roman"/>
+          <w:sz w:val="24"/>
+          <w:szCs w:val="24"/>
+        </w:rPr>
+        <w:t>consistently</w:t>
+      </w:r>
+      <w:commentRangeEnd w:id="105"/>
+      <w:r>
+        <w:rPr>
+          <w:rStyle w:val="CommentReference"/>
+          <w:rFonts w:ascii="Times New Roman" w:hAnsi="Times New Roman" w:cs="Times New Roman"/>
+          <w:sz w:val="24"/>
+          <w:szCs w:val="24"/>
+        </w:rPr>
+        <w:commentReference w:id="105"/>
+      </w:r>
+      <w:r>
+        <w:rPr>
+          <w:rFonts w:ascii="Times New Roman" w:hAnsi="Times New Roman" w:cs="Times New Roman"/>
+          <w:sz w:val="24"/>
+          <w:szCs w:val="24"/>
+        </w:rPr>
+        <w:t xml:space="preserve"> retain more phosphorus </w:t>
       </w:r>
       <w:r>
         <w:rPr>
@@ -4287,7 +4806,25 @@
           <w:sz w:val="24"/>
           <w:szCs w:val="24"/>
         </w:rPr>
-        <w:t xml:space="preserve"> through both connectivity to water and nutrients</w:t>
+        <w:t xml:space="preserve"> through both connectivity to </w:t>
+      </w:r>
+      <w:ins w:id="106" w:author="Marques Mendonca, Raissa" w:date="2026-09-14T12:22:00Z" w16du:dateUtc="2026-09-14T16:22:00Z">
+        <w:r>
+          <w:rPr>
+            <w:rFonts w:ascii="Times New Roman" w:hAnsi="Times New Roman" w:cs="Times New Roman"/>
+            <w:sz w:val="24"/>
+            <w:szCs w:val="24"/>
+          </w:rPr>
+          <w:t xml:space="preserve">source </w:t>
+        </w:r>
+      </w:ins>
+      <w:r>
+        <w:rPr>
+          <w:rFonts w:ascii="Times New Roman" w:hAnsi="Times New Roman" w:cs="Times New Roman"/>
+          <w:sz w:val="24"/>
+          <w:szCs w:val="24"/>
+        </w:rPr>
+        <w:t>water and nutrients</w:t>
       </w:r>
       <w:r>
         <w:rPr>
@@ -4297,14 +4834,26 @@
         </w:rPr>
         <w:t xml:space="preserve"> will enable practitioners to create wetlands that maximize their nutrient</w:t>
       </w:r>
-      <w:r>
-        <w:rPr>
-          <w:rFonts w:ascii="Times New Roman" w:hAnsi="Times New Roman" w:cs="Times New Roman"/>
-          <w:sz w:val="24"/>
-          <w:szCs w:val="24"/>
-        </w:rPr>
-        <w:t>-</w:t>
-      </w:r>
+      <w:ins w:id="107" w:author="Marques Mendonca, Raissa" w:date="2026-09-14T12:22:00Z" w16du:dateUtc="2026-09-14T16:22:00Z">
+        <w:r>
+          <w:rPr>
+            <w:rFonts w:ascii="Times New Roman" w:hAnsi="Times New Roman" w:cs="Times New Roman"/>
+            <w:sz w:val="24"/>
+            <w:szCs w:val="24"/>
+          </w:rPr>
+          <w:t xml:space="preserve"> </w:t>
+        </w:r>
+      </w:ins>
+      <w:del w:id="108" w:author="Marques Mendonca, Raissa" w:date="2026-09-14T12:22:00Z" w16du:dateUtc="2026-09-14T16:22:00Z">
+        <w:r>
+          <w:rPr>
+            <w:rFonts w:ascii="Times New Roman" w:hAnsi="Times New Roman" w:cs="Times New Roman"/>
+            <w:sz w:val="24"/>
+            <w:szCs w:val="24"/>
+          </w:rPr>
+          <w:delText>-</w:delText>
+        </w:r>
+      </w:del>
       <w:r>
         <w:rPr>
           <w:rFonts w:ascii="Times New Roman" w:hAnsi="Times New Roman" w:cs="Times New Roman"/>
@@ -4335,8 +4884,28 @@
           <w:sz w:val="24"/>
           <w:szCs w:val="24"/>
         </w:rPr>
-        <w:t>nutrient-</w:t>
-      </w:r>
+        <w:t>nutrient</w:t>
+      </w:r>
+      <w:ins w:id="109" w:author="Marques Mendonca, Raissa" w:date="2026-09-14T12:22:00Z" w16du:dateUtc="2026-09-14T16:22:00Z">
+        <w:r>
+          <w:rPr>
+            <w:rFonts w:ascii="Times New Roman" w:hAnsi="Times New Roman" w:cs="Times New Roman"/>
+            <w:sz w:val="24"/>
+            <w:szCs w:val="24"/>
+          </w:rPr>
+          <w:t xml:space="preserve"> </w:t>
+        </w:r>
+      </w:ins>
+      <w:del w:id="110" w:author="Marques Mendonca, Raissa" w:date="2026-09-14T12:22:00Z" w16du:dateUtc="2026-09-14T16:22:00Z">
+        <w:r>
+          <w:rPr>
+            <w:rFonts w:ascii="Times New Roman" w:hAnsi="Times New Roman" w:cs="Times New Roman"/>
+            <w:sz w:val="24"/>
+            <w:szCs w:val="24"/>
+          </w:rPr>
+          <w:delText>-</w:delText>
+        </w:r>
+      </w:del>
       <w:r>
         <w:rPr>
           <w:rFonts w:ascii="Times New Roman" w:hAnsi="Times New Roman" w:cs="Times New Roman"/>
@@ -4377,7 +4946,7 @@
         </w:rPr>
         <w:t xml:space="preserve"> goals such as </w:t>
       </w:r>
-      <w:del w:id="69" w:author="Jacquemin, Stephen James" w:date="2026-09-11T12:09:00Z" w16du:dateUtc="2026-09-11T12:09:49Z">
+      <w:del w:id="111" w:author="Jacquemin, Stephen James" w:date="2026-09-11T12:09:00Z" w16du:dateUtc="2026-09-11T12:09:49Z">
         <w:r>
           <w:rPr>
             <w:rFonts w:ascii="Times New Roman" w:hAnsi="Times New Roman" w:cs="Times New Roman"/>
@@ -4387,7 +4956,7 @@
           <w:delText xml:space="preserve">waterfowl </w:delText>
         </w:r>
       </w:del>
-      <w:ins w:id="70" w:author="Jacquemin, Stephen James" w:date="2026-09-11T12:09:00Z" w16du:dateUtc="2026-09-11T12:09:52Z">
+      <w:ins w:id="112" w:author="Jacquemin, Stephen James" w:date="2026-09-11T12:09:00Z" w16du:dateUtc="2026-09-11T12:09:52Z">
         <w:r>
           <w:rPr>
             <w:rFonts w:ascii="Times New Roman" w:hAnsi="Times New Roman" w:cs="Times New Roman"/>
@@ -4816,7 +5385,7 @@
         </w:rPr>
         <w:t>-</w:t>
       </w:r>
-      <w:del w:id="71" w:author="Anderson, Kenneth" w:date="2026-09-02T15:35:00Z" w16du:dateUtc="2026-09-02T19:35:00Z">
+      <w:del w:id="113" w:author="Anderson, Kenneth" w:date="2026-09-02T15:35:00Z" w16du:dateUtc="2026-09-02T19:35:00Z">
         <w:r>
           <w:rPr>
             <w:rFonts w:ascii="Times New Roman" w:hAnsi="Times New Roman" w:cs="Times New Roman"/>
@@ -5460,7 +6029,7 @@
         </w:rPr>
         <w:t xml:space="preserve"> in the </w:t>
       </w:r>
-      <w:del w:id="72" w:author="Jacquemin, Stephen James" w:date="2026-09-11T12:11:00Z" w16du:dateUtc="2026-09-11T12:11:03Z">
+      <w:del w:id="114" w:author="Jacquemin, Stephen James" w:date="2026-09-11T12:11:00Z" w16du:dateUtc="2026-09-11T12:11:03Z">
         <w:r>
           <w:rPr>
             <w:rFonts w:ascii="Times New Roman" w:hAnsi="Times New Roman" w:cs="Times New Roman"/>
@@ -5470,7 +6039,7 @@
           <w:delText xml:space="preserve">region </w:delText>
         </w:r>
       </w:del>
-      <w:ins w:id="73" w:author="Jacquemin, Stephen James" w:date="2026-09-11T12:11:00Z" w16du:dateUtc="2026-09-11T12:11:05Z">
+      <w:ins w:id="115" w:author="Jacquemin, Stephen James" w:date="2026-09-11T12:11:00Z" w16du:dateUtc="2026-09-11T12:11:05Z">
         <w:r>
           <w:rPr>
             <w:rFonts w:ascii="Times New Roman" w:hAnsi="Times New Roman" w:cs="Times New Roman"/>
@@ -5544,7 +6113,7 @@
         </w:rPr>
         <w:t xml:space="preserve"> the Toledo Water Crisis spurred </w:t>
       </w:r>
-      <w:commentRangeStart w:id="74"/>
+      <w:commentRangeStart w:id="116"/>
       <w:r>
         <w:rPr>
           <w:rFonts w:ascii="Times New Roman" w:hAnsi="Times New Roman" w:cs="Times New Roman"/>
@@ -5553,7 +6122,7 @@
         </w:rPr>
         <w:t>interest</w:t>
       </w:r>
-      <w:del w:id="75" w:author="Jacquemin, Stephen James" w:date="2026-09-11T12:11:00Z" w16du:dateUtc="2026-09-11T12:11:11Z">
+      <w:del w:id="117" w:author="Jacquemin, Stephen James" w:date="2026-09-11T12:11:00Z" w16du:dateUtc="2026-09-11T12:11:11Z">
         <w:r>
           <w:rPr>
             <w:rFonts w:ascii="Times New Roman" w:hAnsi="Times New Roman" w:cs="Times New Roman"/>
@@ -5563,7 +6132,7 @@
           <w:delText>ed</w:delText>
         </w:r>
       </w:del>
-      <w:commentRangeEnd w:id="74"/>
+      <w:commentRangeEnd w:id="116"/>
       <w:r>
         <w:rPr>
           <w:rStyle w:val="CommentReference"/>
@@ -5571,7 +6140,7 @@
           <w:sz w:val="24"/>
           <w:szCs w:val="24"/>
         </w:rPr>
-        <w:commentReference w:id="74"/>
+        <w:commentReference w:id="116"/>
       </w:r>
       <w:r>
         <w:rPr>
@@ -5648,7 +6217,7 @@
         </w:rPr>
         <w:t xml:space="preserve">The H2Ohio Wetland Monitoring program </w:t>
       </w:r>
-      <w:commentRangeStart w:id="76"/>
+      <w:commentRangeStart w:id="118"/>
       <w:r>
         <w:rPr>
           <w:rFonts w:ascii="Times New Roman" w:hAnsi="Times New Roman" w:cs="Times New Roman"/>
@@ -5657,7 +6226,7 @@
         </w:rPr>
         <w:t xml:space="preserve">collects </w:t>
       </w:r>
-      <w:commentRangeEnd w:id="76"/>
+      <w:commentRangeEnd w:id="118"/>
       <w:r>
         <w:rPr>
           <w:rStyle w:val="CommentReference"/>
@@ -5665,7 +6234,7 @@
           <w:sz w:val="24"/>
           <w:szCs w:val="24"/>
         </w:rPr>
-        <w:commentReference w:id="76"/>
+        <w:commentReference w:id="118"/>
       </w:r>
       <w:r>
         <w:rPr>
@@ -6170,8 +6739,8 @@
           <w:szCs w:val="24"/>
         </w:rPr>
       </w:pPr>
-      <w:commentRangeStart w:id="77"/>
-      <w:commentRangeEnd w:id="77"/>
+      <w:commentRangeStart w:id="119"/>
+      <w:commentRangeEnd w:id="119"/>
       <w:r>
         <w:rPr>
           <w:rStyle w:val="CommentReference"/>
@@ -6179,7 +6748,7 @@
           <w:sz w:val="24"/>
           <w:szCs w:val="24"/>
         </w:rPr>
-        <w:commentReference w:id="77"/>
+        <w:commentReference w:id="119"/>
       </w:r>
     </w:p>
     <w:p>
@@ -6294,7 +6863,7 @@
         </w:rPr>
         <w:t xml:space="preserve"> of the wetland and logistical</w:t>
       </w:r>
-      <w:commentRangeStart w:id="78"/>
+      <w:commentRangeStart w:id="120"/>
       <w:r>
         <w:rPr>
           <w:rFonts w:ascii="Times New Roman" w:hAnsi="Times New Roman" w:cs="Times New Roman"/>
@@ -6303,7 +6872,7 @@
         </w:rPr>
         <w:t xml:space="preserve"> constraints of the sampling crew</w:t>
       </w:r>
-      <w:commentRangeEnd w:id="78"/>
+      <w:commentRangeEnd w:id="120"/>
       <w:r>
         <w:rPr>
           <w:rStyle w:val="CommentReference"/>
@@ -6311,7 +6880,7 @@
           <w:sz w:val="24"/>
           <w:szCs w:val="24"/>
         </w:rPr>
-        <w:commentReference w:id="78"/>
+        <w:commentReference w:id="120"/>
       </w:r>
       <w:r>
         <w:rPr>
@@ -7179,7 +7748,7 @@
           <w:iCs/>
           <w:sz w:val="24"/>
           <w:szCs w:val="24"/>
-          <w:rPrChange w:id="79" w:author="Ganming Liu" w:date="2026-09-09T23:38:00Z" w16du:dateUtc="2026-09-09T23:38:51Z">
+          <w:rPrChange w:id="121" w:author="Ganming Liu" w:date="2026-09-09T23:38:00Z" w16du:dateUtc="2026-09-09T23:38:51Z">
             <w:rPr>
               <w:rFonts w:ascii="Times New Roman" w:hAnsi="Times New Roman" w:cs="Times New Roman"/>
               <w:sz w:val="24"/>
@@ -7264,7 +7833,7 @@
           <w:szCs w:val="24"/>
         </w:rPr>
       </w:pPr>
-      <w:del w:id="80" w:author="Ganming Liu" w:date="2026-09-09T23:39:00Z" w16du:dateUtc="2026-09-09T23:39:56Z">
+      <w:del w:id="122" w:author="Ganming Liu" w:date="2026-09-09T23:39:00Z" w16du:dateUtc="2026-09-09T23:39:56Z">
         <w:r>
           <w:rPr>
             <w:rFonts w:ascii="Times New Roman" w:hAnsi="Times New Roman" w:cs="Times New Roman"/>
@@ -7291,7 +7860,7 @@
           <w:delText xml:space="preserve"> was computed following the</w:delText>
         </w:r>
       </w:del>
-      <w:ins w:id="81" w:author="Ganming Liu" w:date="2026-09-09T23:39:00Z" w16du:dateUtc="2026-09-09T23:39:58Z">
+      <w:ins w:id="123" w:author="Ganming Liu" w:date="2026-09-09T23:39:00Z" w16du:dateUtc="2026-09-09T23:39:58Z">
         <w:r>
           <w:rPr>
             <w:rFonts w:ascii="Times New Roman" w:hAnsi="Times New Roman" w:cs="Times New Roman"/>
@@ -7309,7 +7878,7 @@
         </w:rPr>
         <w:t xml:space="preserve"> Penman-Monteith FAO-56 equation</w:t>
       </w:r>
-      <w:del w:id="82" w:author="Ganming Liu" w:date="2026-09-09T23:40:00Z" w16du:dateUtc="2026-09-09T23:40:03Z">
+      <w:del w:id="124" w:author="Ganming Liu" w:date="2026-09-09T23:40:00Z" w16du:dateUtc="2026-09-09T23:40:03Z">
         <w:r>
           <w:rPr>
             <w:rFonts w:ascii="Times New Roman" w:hAnsi="Times New Roman" w:cs="Times New Roman"/>
@@ -7403,7 +7972,7 @@
         </w:rPr>
         <w:t xml:space="preserve">) was assumed </w:t>
       </w:r>
-      <w:del w:id="83" w:author="Ganming Liu" w:date="2026-09-09T23:42:00Z" w16du:dateUtc="2026-09-09T23:42:13Z">
+      <w:del w:id="125" w:author="Ganming Liu" w:date="2026-09-09T23:42:00Z" w16du:dateUtc="2026-09-09T23:42:13Z">
         <w:r>
           <w:rPr>
             <w:rFonts w:ascii="Times New Roman" w:hAnsi="Times New Roman" w:cs="Times New Roman"/>
@@ -7413,7 +7982,7 @@
           <w:delText>negligible</w:delText>
         </w:r>
       </w:del>
-      <w:ins w:id="84" w:author="Ganming Liu" w:date="2026-09-09T23:42:00Z" w16du:dateUtc="2026-09-09T23:42:13Z">
+      <w:ins w:id="126" w:author="Ganming Liu" w:date="2026-09-09T23:42:00Z" w16du:dateUtc="2026-09-09T23:42:13Z">
         <w:r>
           <w:rPr>
             <w:rFonts w:ascii="Times New Roman" w:hAnsi="Times New Roman" w:cs="Times New Roman"/>
@@ -7724,7 +8293,7 @@
         </w:rPr>
         <w:t xml:space="preserve"> project</w:t>
       </w:r>
-      <w:del w:id="85" w:author="Ganming Liu" w:date="2026-09-09T23:42:00Z" w16du:dateUtc="2026-09-09T23:42:58Z">
+      <w:del w:id="127" w:author="Ganming Liu" w:date="2026-09-09T23:42:00Z" w16du:dateUtc="2026-09-09T23:42:58Z">
         <w:r>
           <w:rPr>
             <w:rFonts w:ascii="Times New Roman" w:hAnsi="Times New Roman" w:cs="Times New Roman"/>
@@ -8024,7 +8593,23 @@
           <w:sz w:val="24"/>
           <w:szCs w:val="24"/>
         </w:rPr>
-        <w:t xml:space="preserve">To compare nutrient retention rates to regional goals we used the Maumee River Total Maximum Daily Load (TMDL) guidelines </w:t>
+        <w:t xml:space="preserve">To compare </w:t>
+      </w:r>
+      <w:r>
+        <w:rPr>
+          <w:rFonts w:ascii="Times New Roman" w:hAnsi="Times New Roman" w:cs="Times New Roman"/>
+          <w:sz w:val="24"/>
+          <w:szCs w:val="24"/>
+        </w:rPr>
+        <w:t>phosphorus</w:t>
+      </w:r>
+      <w:r>
+        <w:rPr>
+          <w:rFonts w:ascii="Times New Roman" w:hAnsi="Times New Roman" w:cs="Times New Roman"/>
+          <w:sz w:val="24"/>
+          <w:szCs w:val="24"/>
+        </w:rPr>
+        <w:t xml:space="preserve"> retention rates to regional goals we used the Maumee River Total Maximum Daily Load (TMDL) guidelines </w:t>
       </w:r>
       <w:r>
         <w:rPr>
@@ -8200,55 +8785,378 @@
     <w:p>
       <w:pPr>
         <w:spacing w:line="480" w:lineRule="auto"/>
-        <w:rPr>
-          <w:rFonts w:ascii="Times New Roman" w:hAnsi="Times New Roman" w:cs="Times New Roman"/>
-          <w:b/>
-          <w:sz w:val="24"/>
-          <w:szCs w:val="24"/>
-          <w:u w:val="single"/>
+        <w:ind w:firstLine="720"/>
+        <w:rPr>
+          <w:rFonts w:ascii="Times New Roman" w:hAnsi="Times New Roman" w:cs="Times New Roman"/>
+          <w:sz w:val="24"/>
+          <w:szCs w:val="24"/>
         </w:rPr>
       </w:pPr>
       <w:r>
         <w:rPr>
           <w:rFonts w:ascii="Times New Roman" w:hAnsi="Times New Roman" w:cs="Times New Roman"/>
-          <w:b/>
-          <w:sz w:val="24"/>
-          <w:szCs w:val="24"/>
-          <w:u w:val="single"/>
-        </w:rPr>
-        <w:t>2.</w:t>
-      </w:r>
-      <w:r>
-        <w:rPr>
-          <w:rFonts w:ascii="Times New Roman" w:hAnsi="Times New Roman" w:cs="Times New Roman"/>
-          <w:b/>
-          <w:bCs/>
-          <w:sz w:val="24"/>
-          <w:szCs w:val="24"/>
-          <w:u w:val="single"/>
-        </w:rPr>
-        <w:t>3</w:t>
-      </w:r>
-      <w:r>
-        <w:rPr>
-          <w:rFonts w:ascii="Times New Roman" w:hAnsi="Times New Roman" w:cs="Times New Roman"/>
-          <w:b/>
-          <w:sz w:val="24"/>
-          <w:szCs w:val="24"/>
-          <w:u w:val="single"/>
-        </w:rPr>
-        <w:t xml:space="preserve"> Statistical Analysis</w:t>
+          <w:sz w:val="24"/>
+          <w:szCs w:val="24"/>
+        </w:rPr>
+        <w:t xml:space="preserve">To compare nitrogen retention rates to regional goals we used the </w:t>
+      </w:r>
+      <w:r>
+        <w:rPr>
+          <w:rFonts w:ascii="Times New Roman" w:hAnsi="Times New Roman" w:cs="Times New Roman"/>
+          <w:sz w:val="24"/>
+          <w:szCs w:val="24"/>
+        </w:rPr>
+        <w:t xml:space="preserve">proposed nitrogen goals from </w:t>
+      </w:r>
+      <w:r>
+        <w:rPr>
+          <w:rFonts w:ascii="Times New Roman" w:hAnsi="Times New Roman" w:cs="Times New Roman"/>
+          <w:sz w:val="24"/>
+          <w:szCs w:val="24"/>
+        </w:rPr>
+        <w:fldChar w:fldCharType="begin"/>
+      </w:r>
+      <w:r>
+        <w:rPr>
+          <w:rFonts w:ascii="Times New Roman" w:hAnsi="Times New Roman" w:cs="Times New Roman"/>
+          <w:sz w:val="24"/>
+          <w:szCs w:val="24"/>
+        </w:rPr>
+        <w:instrText xml:space="preserve"> ADDIN ZOTERO_ITEM CSL_CITATION {"citationID":"oR0Lpnnl","properties":{"unsorted":false,"formattedCitation":"(Paerl et al. 2024)","plainCitation":"(Paerl et al. 2024)","noteIndex":0},"citationItems":[{"id":6271,"uris":["http://zotero.org/users/5222684/items/AEASSEHL"],"itemData":{"id":6271,"type":"article-journal","abstract":"Lake Erie, USA–Canada, plays an important ecological and socioeconomic role but has suffered from chronic eutrophication. In particular, western Lake Erie (WLE) is the site of harmful algal blooms (HABs) which are suspected of being driven by excessive nutrient (phosphorus (P) and nitrogen (N)) inputs. During 2022 and 2023, in situ nutrient dilution and addition bioassays were conducted at a WLE bloom-impacted location to investigate whether a nutrient reduction regime would be effective in limiting phytoplankton growth during the June diatom-dominated spring blooms and August cyanobacteria-dominated summer blooms. The primary objectives of this experiment were to (1) Determine if a proposed 40% P-alone reduction would effectively reduce phytoplankton growth and mitigate blooms and (2) assess whether reductions in both P and N are more effective in controlling phytoplankton biomass than exclusive reductions in either N or P. Samples were analyzed for nutrient concentrations and growth rate responses for specific algal groups, utilizing diagnostic (for major algal groups) photopigments. Results indicated that although both 20% and 40% dilutions led to lower phytoplankton biomass and growth rates, 40% reductions were more effective. Our results support the USA–Canada Great Lakes Water Quality Agreement recommendation of a 40% P reduction, but also indicate that a parallel reduction of N input by 40% would be most effective in controlling bloom magnitudes. Overall, our findings underscore the recommendation that a year-round dual N and P 40% reduction is needed for long-term control of eutrophication and algal blooms, including cyanobacteria and diatoms, in Lake Erie.","container-title":"Limnology and Oceanography","DOI":"10.1002/lno.12719","ISSN":"1939-5590","issue":"12","language":"en","license":"© 2024 Association for the Sciences of Limnology and Oceanography.","page":"2913-2928","source":"Wiley Online Library","title":"Dual phosphorus and nitrogen nutrient reduction will be more effective than a phosphorus-only reduction in mitigating diatom and cyanobacterial blooms in Lake Erie, USA–Canada","volume":"69","author":[{"family":"Paerl","given":"Hans W."},{"family":"Chaffin","given":"Justin D."},{"family":"Cheshire","given":"Jack H."},{"family":"Plaas","given":"Haley E."},{"family":"Barnard","given":"Malcolm A."},{"family":"Goerlitz","given":"Lillian B."},{"family":"Braddy","given":"Jeremy S."},{"family":"Sabo","given":"Alexandrea"},{"family":"Nelson","given":"Leah M."},{"family":"Yue","given":"Lindsay"}],"issued":{"date-parts":[["2024"]]}}}],"schema":"https://github.com/citation-style-language/schema/raw/master/csl-citation.json"} </w:instrText>
+      </w:r>
+      <w:r>
+        <w:rPr>
+          <w:rFonts w:ascii="Times New Roman" w:hAnsi="Times New Roman" w:cs="Times New Roman"/>
+          <w:sz w:val="24"/>
+          <w:szCs w:val="24"/>
+        </w:rPr>
+        <w:fldChar w:fldCharType="separate"/>
+      </w:r>
+      <w:r>
+        <w:rPr>
+          <w:rFonts w:ascii="Times New Roman" w:hAnsi="Times New Roman" w:cs="Times New Roman"/>
+          <w:sz w:val="24"/>
+        </w:rPr>
+        <w:t xml:space="preserve">Paerl et al. </w:t>
+      </w:r>
+      <w:r>
+        <w:rPr>
+          <w:rFonts w:ascii="Times New Roman" w:hAnsi="Times New Roman" w:cs="Times New Roman"/>
+          <w:sz w:val="24"/>
+        </w:rPr>
+        <w:t>(</w:t>
+      </w:r>
+      <w:r>
+        <w:rPr>
+          <w:rFonts w:ascii="Times New Roman" w:hAnsi="Times New Roman" w:cs="Times New Roman"/>
+          <w:sz w:val="24"/>
+        </w:rPr>
+        <w:t>2024)</w:t>
+      </w:r>
+      <w:r>
+        <w:rPr>
+          <w:rFonts w:ascii="Times New Roman" w:hAnsi="Times New Roman" w:cs="Times New Roman"/>
+          <w:sz w:val="24"/>
+          <w:szCs w:val="24"/>
+        </w:rPr>
+        <w:fldChar w:fldCharType="end"/>
+      </w:r>
+      <w:r>
+        <w:rPr>
+          <w:rFonts w:ascii="Times New Roman" w:hAnsi="Times New Roman" w:cs="Times New Roman"/>
+          <w:sz w:val="24"/>
+          <w:szCs w:val="24"/>
+        </w:rPr>
+        <w:t>.</w:t>
+      </w:r>
+      <w:r>
+        <w:rPr>
+          <w:rFonts w:ascii="Times New Roman" w:hAnsi="Times New Roman" w:cs="Times New Roman"/>
+          <w:sz w:val="24"/>
+          <w:szCs w:val="24"/>
+        </w:rPr>
+        <w:t xml:space="preserve"> They propose a 40% reduction of Nitrogen compared to the 2008 baseline </w:t>
+      </w:r>
+      <w:r>
+        <w:rPr>
+          <w:rFonts w:ascii="Times New Roman" w:hAnsi="Times New Roman" w:cs="Times New Roman"/>
+          <w:sz w:val="24"/>
+          <w:szCs w:val="24"/>
+        </w:rPr>
+        <w:t>(</w:t>
+      </w:r>
+      <w:r>
+        <w:rPr>
+          <w:rFonts w:ascii="Times New Roman" w:hAnsi="Times New Roman" w:cs="Times New Roman"/>
+          <w:sz w:val="24"/>
+          <w:szCs w:val="24"/>
+        </w:rPr>
+        <w:t>~</w:t>
+      </w:r>
+      <w:r>
+        <w:rPr>
+          <w:rFonts w:ascii="Times New Roman" w:hAnsi="Times New Roman" w:cs="Times New Roman"/>
+          <w:sz w:val="24"/>
+          <w:szCs w:val="24"/>
+        </w:rPr>
+        <w:t>1</w:t>
+      </w:r>
+      <w:r>
+        <w:rPr>
+          <w:rFonts w:ascii="Times New Roman" w:hAnsi="Times New Roman" w:cs="Times New Roman"/>
+          <w:sz w:val="24"/>
+          <w:szCs w:val="24"/>
+        </w:rPr>
+        <w:t xml:space="preserve">8 million lbs). </w:t>
+      </w:r>
+      <w:r>
+        <w:rPr>
+          <w:rFonts w:ascii="Times New Roman" w:hAnsi="Times New Roman" w:cs="Times New Roman"/>
+          <w:sz w:val="24"/>
+          <w:szCs w:val="24"/>
+        </w:rPr>
+        <w:t xml:space="preserve">To create a </w:t>
+      </w:r>
+      <w:r>
+        <w:rPr>
+          <w:rFonts w:ascii="Times New Roman" w:hAnsi="Times New Roman" w:cs="Times New Roman"/>
+          <w:sz w:val="24"/>
+          <w:szCs w:val="24"/>
+        </w:rPr>
+        <w:t xml:space="preserve">nitrogen goal for non-point source sinks we </w:t>
+      </w:r>
+      <w:r>
+        <w:rPr>
+          <w:rFonts w:ascii="Times New Roman" w:hAnsi="Times New Roman" w:cs="Times New Roman"/>
+          <w:sz w:val="24"/>
+          <w:szCs w:val="24"/>
+        </w:rPr>
+        <w:t xml:space="preserve">used </w:t>
+      </w:r>
+      <w:r>
+        <w:rPr>
+          <w:rFonts w:ascii="Times New Roman" w:hAnsi="Times New Roman" w:cs="Times New Roman"/>
+          <w:sz w:val="24"/>
+          <w:szCs w:val="24"/>
+        </w:rPr>
+        <w:t>20% of the total to match</w:t>
+      </w:r>
+      <w:r>
+        <w:rPr>
+          <w:rFonts w:ascii="Times New Roman" w:hAnsi="Times New Roman" w:cs="Times New Roman"/>
+          <w:sz w:val="24"/>
+          <w:szCs w:val="24"/>
+        </w:rPr>
+        <w:t xml:space="preserve"> the same percentage </w:t>
+      </w:r>
+      <w:r>
+        <w:rPr>
+          <w:rFonts w:ascii="Times New Roman" w:hAnsi="Times New Roman" w:cs="Times New Roman"/>
+          <w:sz w:val="24"/>
+          <w:szCs w:val="24"/>
+        </w:rPr>
+        <w:t xml:space="preserve">as the TMDL used </w:t>
+      </w:r>
+      <w:r>
+        <w:rPr>
+          <w:rFonts w:ascii="Times New Roman" w:hAnsi="Times New Roman" w:cs="Times New Roman"/>
+          <w:sz w:val="24"/>
+          <w:szCs w:val="24"/>
+        </w:rPr>
+        <w:t>for phosphorus (</w:t>
+      </w:r>
+      <w:r>
+        <w:rPr>
+          <w:rFonts w:ascii="Times New Roman" w:hAnsi="Times New Roman" w:cs="Times New Roman"/>
+          <w:sz w:val="24"/>
+          <w:szCs w:val="24"/>
+        </w:rPr>
+        <w:t>92 metric tons / 442 metric tons)</w:t>
+      </w:r>
+      <w:r>
+        <w:rPr>
+          <w:rFonts w:ascii="Times New Roman" w:hAnsi="Times New Roman" w:cs="Times New Roman"/>
+          <w:sz w:val="24"/>
+          <w:szCs w:val="24"/>
+        </w:rPr>
+        <w:t>; for a total red</w:t>
+      </w:r>
+      <w:r>
+        <w:rPr>
+          <w:rFonts w:ascii="Times New Roman" w:hAnsi="Times New Roman" w:cs="Times New Roman"/>
+          <w:sz w:val="24"/>
+          <w:szCs w:val="24"/>
+        </w:rPr>
+        <w:t xml:space="preserve">uction goal of 3.7 million lbs N. </w:t>
+      </w:r>
+      <w:r>
+        <w:rPr>
+          <w:rFonts w:ascii="Times New Roman" w:hAnsi="Times New Roman" w:cs="Times New Roman"/>
+          <w:sz w:val="24"/>
+          <w:szCs w:val="24"/>
+        </w:rPr>
+        <w:t xml:space="preserve">To calculate the total wetland acreage needed to meet the </w:t>
+      </w:r>
+      <w:r>
+        <w:rPr>
+          <w:rFonts w:ascii="Times New Roman" w:hAnsi="Times New Roman" w:cs="Times New Roman"/>
+          <w:sz w:val="24"/>
+          <w:szCs w:val="24"/>
+        </w:rPr>
+        <w:t>proposed 40% reduction</w:t>
+      </w:r>
+      <w:r>
+        <w:rPr>
+          <w:rFonts w:ascii="Times New Roman" w:hAnsi="Times New Roman" w:cs="Times New Roman"/>
+          <w:sz w:val="24"/>
+          <w:szCs w:val="24"/>
+        </w:rPr>
+        <w:t xml:space="preserve"> we divided the goal of </w:t>
+      </w:r>
+      <w:r>
+        <w:rPr>
+          <w:rFonts w:ascii="Times New Roman" w:hAnsi="Times New Roman" w:cs="Times New Roman"/>
+          <w:sz w:val="24"/>
+          <w:szCs w:val="24"/>
+        </w:rPr>
+        <w:t>3.7 million</w:t>
+      </w:r>
+      <w:r>
+        <w:rPr>
+          <w:rFonts w:ascii="Times New Roman" w:hAnsi="Times New Roman" w:cs="Times New Roman"/>
+          <w:sz w:val="24"/>
+          <w:szCs w:val="24"/>
+        </w:rPr>
+        <w:t xml:space="preserve"> lbs </w:t>
+      </w:r>
+      <w:r>
+        <w:rPr>
+          <w:rFonts w:ascii="Times New Roman" w:hAnsi="Times New Roman" w:cs="Times New Roman"/>
+          <w:sz w:val="24"/>
+          <w:szCs w:val="24"/>
+        </w:rPr>
+        <w:t>N</w:t>
+      </w:r>
+      <w:r>
+        <w:rPr>
+          <w:rFonts w:ascii="Times New Roman" w:hAnsi="Times New Roman" w:cs="Times New Roman"/>
+          <w:sz w:val="24"/>
+          <w:szCs w:val="24"/>
+        </w:rPr>
+        <w:t xml:space="preserve"> by the </w:t>
+      </w:r>
+      <w:r>
+        <w:rPr>
+          <w:rFonts w:ascii="Times New Roman" w:hAnsi="Times New Roman" w:cs="Times New Roman"/>
+          <w:sz w:val="24"/>
+          <w:szCs w:val="24"/>
+        </w:rPr>
+        <w:t>N</w:t>
+      </w:r>
+      <w:r>
+        <w:rPr>
+          <w:rFonts w:ascii="Times New Roman" w:hAnsi="Times New Roman" w:cs="Times New Roman"/>
+          <w:sz w:val="24"/>
+          <w:szCs w:val="24"/>
+        </w:rPr>
+        <w:t xml:space="preserve"> retention across the </w:t>
+      </w:r>
+      <w:r>
+        <w:rPr>
+          <w:rFonts w:ascii="Times New Roman" w:hAnsi="Times New Roman" w:cs="Times New Roman"/>
+          <w:sz w:val="24"/>
+          <w:szCs w:val="24"/>
+        </w:rPr>
+        <w:t xml:space="preserve">same </w:t>
+      </w:r>
+      <w:r>
+        <w:rPr>
+          <w:rFonts w:ascii="Times New Roman" w:hAnsi="Times New Roman" w:cs="Times New Roman"/>
+          <w:sz w:val="24"/>
+          <w:szCs w:val="24"/>
+        </w:rPr>
+        <w:t>three scenarios</w:t>
+      </w:r>
+      <w:r>
+        <w:rPr>
+          <w:rFonts w:ascii="Times New Roman" w:hAnsi="Times New Roman" w:cs="Times New Roman"/>
+          <w:sz w:val="24"/>
+          <w:szCs w:val="24"/>
+        </w:rPr>
+        <w:t xml:space="preserve"> we used for phosphorus</w:t>
+      </w:r>
+      <w:r>
+        <w:rPr>
+          <w:rFonts w:ascii="Times New Roman" w:hAnsi="Times New Roman" w:cs="Times New Roman"/>
+          <w:sz w:val="24"/>
+          <w:szCs w:val="24"/>
+        </w:rPr>
+        <w:t xml:space="preserve">. </w:t>
       </w:r>
     </w:p>
     <w:p>
       <w:pPr>
         <w:spacing w:line="480" w:lineRule="auto"/>
+        <w:ind w:firstLine="720"/>
         <w:rPr>
           <w:rFonts w:ascii="Times New Roman" w:hAnsi="Times New Roman" w:cs="Times New Roman"/>
           <w:sz w:val="24"/>
           <w:szCs w:val="24"/>
         </w:rPr>
       </w:pPr>
+    </w:p>
+    <w:p>
+      <w:pPr>
+        <w:spacing w:line="480" w:lineRule="auto"/>
+        <w:rPr>
+          <w:rFonts w:ascii="Times New Roman" w:hAnsi="Times New Roman" w:cs="Times New Roman"/>
+          <w:b/>
+          <w:sz w:val="24"/>
+          <w:szCs w:val="24"/>
+          <w:u w:val="single"/>
+        </w:rPr>
+      </w:pPr>
+      <w:r>
+        <w:rPr>
+          <w:rFonts w:ascii="Times New Roman" w:hAnsi="Times New Roman" w:cs="Times New Roman"/>
+          <w:b/>
+          <w:sz w:val="24"/>
+          <w:szCs w:val="24"/>
+          <w:u w:val="single"/>
+        </w:rPr>
+        <w:t>2.</w:t>
+      </w:r>
+      <w:r>
+        <w:rPr>
+          <w:rFonts w:ascii="Times New Roman" w:hAnsi="Times New Roman" w:cs="Times New Roman"/>
+          <w:b/>
+          <w:bCs/>
+          <w:sz w:val="24"/>
+          <w:szCs w:val="24"/>
+          <w:u w:val="single"/>
+        </w:rPr>
+        <w:t>3</w:t>
+      </w:r>
+      <w:r>
+        <w:rPr>
+          <w:rFonts w:ascii="Times New Roman" w:hAnsi="Times New Roman" w:cs="Times New Roman"/>
+          <w:b/>
+          <w:sz w:val="24"/>
+          <w:szCs w:val="24"/>
+          <w:u w:val="single"/>
+        </w:rPr>
+        <w:t xml:space="preserve"> Statistical Analysis</w:t>
+      </w:r>
+    </w:p>
+    <w:p>
+      <w:pPr>
+        <w:spacing w:line="480" w:lineRule="auto"/>
+        <w:rPr>
+          <w:rFonts w:ascii="Times New Roman" w:hAnsi="Times New Roman" w:cs="Times New Roman"/>
+          <w:sz w:val="24"/>
+          <w:szCs w:val="24"/>
+        </w:rPr>
+      </w:pPr>
       <w:r>
         <w:rPr>
           <w:rFonts w:ascii="Times New Roman" w:hAnsi="Times New Roman" w:cs="Times New Roman"/>
@@ -8257,7 +9165,7 @@
         </w:rPr>
         <w:t>To investigate relationships between nutrient retention, water volume, and nutrient concentration</w:t>
       </w:r>
-      <w:ins w:id="86" w:author="Ganming Liu" w:date="2026-09-09T23:41:00Z" w16du:dateUtc="2026-09-09T23:41:11Z">
+      <w:ins w:id="128" w:author="Ganming Liu" w:date="2026-09-09T23:41:00Z" w16du:dateUtc="2026-09-09T23:41:11Z">
         <w:r>
           <w:rPr>
             <w:rFonts w:ascii="Times New Roman" w:hAnsi="Times New Roman" w:cs="Times New Roman"/>
@@ -9203,7 +10111,7 @@
         </w:rPr>
         <w:t xml:space="preserve"> 34% of DRP is processed in the spring and 39% in the summer, 44% of nitrite+nitrate is processed in the spring and 38% in the summer, and 18% of total ammonium nitrogen (NH</w:t>
       </w:r>
-      <w:commentRangeStart w:id="87"/>
+      <w:commentRangeStart w:id="129"/>
       <w:r>
         <w:rPr>
           <w:rFonts w:ascii="Times New Roman" w:hAnsi="Times New Roman" w:cs="Times New Roman"/>
@@ -9212,7 +10120,7 @@
         </w:rPr>
         <w:t>4</w:t>
       </w:r>
-      <w:commentRangeEnd w:id="87"/>
+      <w:commentRangeEnd w:id="129"/>
       <w:r>
         <w:rPr>
           <w:rStyle w:val="CommentReference"/>
@@ -9220,7 +10128,7 @@
           <w:sz w:val="24"/>
           <w:szCs w:val="24"/>
         </w:rPr>
-        <w:commentReference w:id="87"/>
+        <w:commentReference w:id="129"/>
       </w:r>
       <w:r>
         <w:rPr>
@@ -10059,9 +10967,9 @@
           <w:szCs w:val="24"/>
         </w:rPr>
       </w:pPr>
-      <w:commentRangeStart w:id="88"/>
-      <w:commentRangeStart w:id="89"/>
-      <w:commentRangeStart w:id="90"/>
+      <w:commentRangeStart w:id="130"/>
+      <w:commentRangeStart w:id="131"/>
+      <w:commentRangeStart w:id="132"/>
       <w:r>
         <w:rPr>
           <w:rFonts w:ascii="Times New Roman" w:hAnsi="Times New Roman" w:cs="Times New Roman"/>
@@ -10070,7 +10978,7 @@
         </w:rPr>
         <w:t>It is notable</w:t>
       </w:r>
-      <w:commentRangeEnd w:id="90"/>
+      <w:commentRangeEnd w:id="132"/>
       <w:r>
         <w:rPr>
           <w:rStyle w:val="CommentReference"/>
@@ -10078,7 +10986,7 @@
           <w:sz w:val="24"/>
           <w:szCs w:val="24"/>
         </w:rPr>
-        <w:commentReference w:id="90"/>
+        <w:commentReference w:id="132"/>
       </w:r>
       <w:r>
         <w:rPr>
@@ -10184,7 +11092,7 @@
         </w:rPr>
         <w:t>is a critical factor for nutrient retention in wetlands</w:t>
       </w:r>
-      <w:commentRangeEnd w:id="88"/>
+      <w:commentRangeEnd w:id="130"/>
       <w:r>
         <w:rPr>
           <w:rStyle w:val="CommentReference"/>
@@ -10192,9 +11100,9 @@
           <w:sz w:val="24"/>
           <w:szCs w:val="24"/>
         </w:rPr>
-        <w:commentReference w:id="88"/>
-      </w:r>
-      <w:commentRangeEnd w:id="89"/>
+        <w:commentReference w:id="130"/>
+      </w:r>
+      <w:commentRangeEnd w:id="131"/>
       <w:r>
         <w:rPr>
           <w:rStyle w:val="CommentReference"/>
@@ -10202,7 +11110,7 @@
           <w:sz w:val="24"/>
           <w:szCs w:val="24"/>
         </w:rPr>
-        <w:commentReference w:id="89"/>
+        <w:commentReference w:id="131"/>
       </w:r>
       <w:r>
         <w:rPr>
@@ -10580,7 +11488,7 @@
         </w:rPr>
         <w:t>).</w:t>
       </w:r>
-      <w:ins w:id="91" w:author="Jacquemin, Stephen James" w:date="2026-09-11T13:46:00Z" w16du:dateUtc="2026-09-11T13:46:07Z">
+      <w:ins w:id="133" w:author="Jacquemin, Stephen James" w:date="2026-09-11T13:46:00Z" w16du:dateUtc="2026-09-11T13:46:07Z">
         <w:r>
           <w:rPr>
             <w:rFonts w:ascii="Times New Roman" w:hAnsi="Times New Roman" w:cs="Times New Roman"/>
@@ -11008,14 +11916,14 @@
         </w:rPr>
         <w:t xml:space="preserve">was a more significant predictor than inflowing volume at </w:t>
       </w:r>
-      <w:commentRangeStart w:id="92"/>
+      <w:commentRangeStart w:id="134"/>
       <w:r>
         <w:rPr>
           <w:rFonts w:ascii="Times New Roman" w:hAnsi="Times New Roman" w:cs="Times New Roman"/>
           <w:sz w:val="24"/>
           <w:szCs w:val="24"/>
           <w:highlight w:val="yellow"/>
-          <w:rPrChange w:id="93" w:author="Ganming Liu" w:date="2026-09-09T23:47:00Z" w16du:dateUtc="2026-09-09T23:47:44Z">
+          <w:rPrChange w:id="135" w:author="Ganming Liu" w:date="2026-09-09T23:47:00Z" w16du:dateUtc="2026-09-09T23:47:44Z">
             <w:rPr>
               <w:rFonts w:ascii="Times New Roman" w:hAnsi="Times New Roman" w:cs="Times New Roman"/>
               <w:sz w:val="24"/>
@@ -11025,7 +11933,7 @@
         </w:rPr>
         <w:t>2</w:t>
       </w:r>
-      <w:commentRangeEnd w:id="92"/>
+      <w:commentRangeEnd w:id="134"/>
       <w:r>
         <w:rPr>
           <w:rStyle w:val="CommentReference"/>
@@ -11033,7 +11941,7 @@
           <w:sz w:val="24"/>
           <w:szCs w:val="24"/>
         </w:rPr>
-        <w:commentReference w:id="92"/>
+        <w:commentReference w:id="134"/>
       </w:r>
       <w:r>
         <w:rPr>
@@ -11137,7 +12045,7 @@
           <w:sz w:val="24"/>
           <w:szCs w:val="24"/>
           <w:highlight w:val="yellow"/>
-          <w:rPrChange w:id="94" w:author="Ganming Liu" w:date="2026-09-09T23:47:00Z" w16du:dateUtc="2026-09-09T23:47:49Z">
+          <w:rPrChange w:id="136" w:author="Ganming Liu" w:date="2026-09-09T23:47:00Z" w16du:dateUtc="2026-09-09T23:47:49Z">
             <w:rPr>
               <w:rFonts w:ascii="Times New Roman" w:hAnsi="Times New Roman" w:cs="Times New Roman"/>
               <w:sz w:val="24"/>
@@ -11161,7 +12069,7 @@
           <w:sz w:val="24"/>
           <w:szCs w:val="24"/>
           <w:highlight w:val="yellow"/>
-          <w:rPrChange w:id="95" w:author="Ganming Liu" w:date="2026-09-09T23:47:00Z" w16du:dateUtc="2026-09-09T23:47:54Z">
+          <w:rPrChange w:id="137" w:author="Ganming Liu" w:date="2026-09-09T23:47:00Z" w16du:dateUtc="2026-09-09T23:47:54Z">
             <w:rPr>
               <w:rFonts w:ascii="Times New Roman" w:hAnsi="Times New Roman" w:cs="Times New Roman"/>
               <w:sz w:val="24"/>
@@ -11209,7 +12117,7 @@
           <w:sz w:val="24"/>
           <w:szCs w:val="24"/>
           <w:highlight w:val="yellow"/>
-          <w:rPrChange w:id="96" w:author="Ganming Liu" w:date="2026-09-09T23:47:00Z" w16du:dateUtc="2026-09-09T23:47:58Z">
+          <w:rPrChange w:id="138" w:author="Ganming Liu" w:date="2026-09-09T23:47:00Z" w16du:dateUtc="2026-09-09T23:47:58Z">
             <w:rPr>
               <w:rFonts w:ascii="Times New Roman" w:hAnsi="Times New Roman" w:cs="Times New Roman"/>
               <w:sz w:val="24"/>
@@ -11233,7 +12141,7 @@
           <w:sz w:val="24"/>
           <w:szCs w:val="24"/>
           <w:highlight w:val="yellow"/>
-          <w:rPrChange w:id="97" w:author="Ganming Liu" w:date="2026-09-09T23:48:00Z" w16du:dateUtc="2026-09-09T23:48:03Z">
+          <w:rPrChange w:id="139" w:author="Ganming Liu" w:date="2026-09-09T23:48:00Z" w16du:dateUtc="2026-09-09T23:48:03Z">
             <w:rPr>
               <w:rFonts w:ascii="Times New Roman" w:hAnsi="Times New Roman" w:cs="Times New Roman"/>
               <w:sz w:val="24"/>
@@ -12632,7 +13540,7 @@
         </w:rPr>
         <w:t xml:space="preserve">We calculated that </w:t>
       </w:r>
-      <w:commentRangeStart w:id="98"/>
+      <w:commentRangeStart w:id="140"/>
       <w:r>
         <w:rPr>
           <w:rFonts w:ascii="Times New Roman" w:hAnsi="Times New Roman" w:cs="Times New Roman"/>
@@ -12641,7 +13549,7 @@
         </w:rPr>
         <w:t xml:space="preserve">the </w:t>
       </w:r>
-      <w:commentRangeEnd w:id="98"/>
+      <w:commentRangeEnd w:id="140"/>
       <w:r>
         <w:rPr>
           <w:rStyle w:val="CommentReference"/>
@@ -12649,7 +13557,7 @@
           <w:sz w:val="24"/>
           <w:szCs w:val="24"/>
         </w:rPr>
-        <w:commentReference w:id="98"/>
+        <w:commentReference w:id="140"/>
       </w:r>
       <w:r>
         <w:rPr>
@@ -13206,7 +14114,131 @@
           <w:sz w:val="24"/>
           <w:szCs w:val="24"/>
         </w:rPr>
-        <w:t>In total the conversion of 1%</w:t>
+        <w:t xml:space="preserve">In total the conversion of 1% of current agricultural land </w:t>
+      </w:r>
+      <w:r>
+        <w:rPr>
+          <w:rFonts w:ascii="Times New Roman" w:hAnsi="Times New Roman" w:cs="Times New Roman"/>
+          <w:sz w:val="24"/>
+          <w:szCs w:val="24"/>
+        </w:rPr>
+        <w:t>(</w:t>
+      </w:r>
+      <w:r>
+        <w:rPr>
+          <w:rFonts w:ascii="Times New Roman" w:hAnsi="Times New Roman" w:cs="Times New Roman"/>
+          <w:sz w:val="24"/>
+          <w:szCs w:val="24"/>
+        </w:rPr>
+        <w:t>2</w:t>
+      </w:r>
+      <w:r>
+        <w:rPr>
+          <w:rFonts w:ascii="Times New Roman" w:hAnsi="Times New Roman" w:cs="Times New Roman"/>
+          <w:sz w:val="24"/>
+          <w:szCs w:val="24"/>
+        </w:rPr>
+        <w:t>.</w:t>
+      </w:r>
+      <w:r>
+        <w:rPr>
+          <w:rFonts w:ascii="Times New Roman" w:hAnsi="Times New Roman" w:cs="Times New Roman"/>
+          <w:sz w:val="24"/>
+          <w:szCs w:val="24"/>
+        </w:rPr>
+        <w:t>6</w:t>
+      </w:r>
+      <w:r>
+        <w:rPr>
+          <w:rFonts w:ascii="Times New Roman" w:hAnsi="Times New Roman" w:cs="Times New Roman"/>
+          <w:sz w:val="24"/>
+          <w:szCs w:val="24"/>
+        </w:rPr>
+        <w:t xml:space="preserve"> million acres)</w:t>
+      </w:r>
+      <w:r>
+        <w:rPr>
+          <w:rFonts w:ascii="Times New Roman" w:hAnsi="Times New Roman" w:cs="Times New Roman"/>
+          <w:sz w:val="24"/>
+          <w:szCs w:val="24"/>
+        </w:rPr>
+        <w:t xml:space="preserve"> in the </w:t>
+      </w:r>
+      <w:commentRangeStart w:id="141"/>
+      <w:r>
+        <w:rPr>
+          <w:rFonts w:ascii="Times New Roman" w:hAnsi="Times New Roman" w:cs="Times New Roman"/>
+          <w:sz w:val="24"/>
+          <w:szCs w:val="24"/>
+        </w:rPr>
+        <w:t xml:space="preserve">Maumee </w:t>
+      </w:r>
+      <w:commentRangeEnd w:id="141"/>
+      <w:r>
+        <w:rPr>
+          <w:rStyle w:val="CommentReference"/>
+          <w:rFonts w:ascii="Times New Roman" w:hAnsi="Times New Roman" w:cs="Times New Roman"/>
+          <w:sz w:val="24"/>
+          <w:szCs w:val="24"/>
+        </w:rPr>
+        <w:commentReference w:id="141"/>
+      </w:r>
+      <w:r>
+        <w:rPr>
+          <w:rFonts w:ascii="Times New Roman" w:hAnsi="Times New Roman" w:cs="Times New Roman"/>
+          <w:sz w:val="24"/>
+          <w:szCs w:val="24"/>
+        </w:rPr>
+        <w:t xml:space="preserve">River watershed to </w:t>
+      </w:r>
+      <w:r>
+        <w:rPr>
+          <w:rFonts w:ascii="Times New Roman" w:hAnsi="Times New Roman" w:cs="Times New Roman"/>
+          <w:b/>
+          <w:sz w:val="24"/>
+          <w:szCs w:val="24"/>
+        </w:rPr>
+        <w:t>hydrologically connected wetlands</w:t>
+      </w:r>
+      <w:r>
+        <w:rPr>
+          <w:rFonts w:ascii="Times New Roman" w:hAnsi="Times New Roman" w:cs="Times New Roman"/>
+          <w:sz w:val="24"/>
+          <w:szCs w:val="24"/>
+        </w:rPr>
+        <w:t xml:space="preserve"> would </w:t>
+      </w:r>
+      <w:r>
+        <w:rPr>
+          <w:rFonts w:ascii="Times New Roman" w:hAnsi="Times New Roman" w:cs="Times New Roman"/>
+          <w:sz w:val="24"/>
+          <w:szCs w:val="24"/>
+        </w:rPr>
+        <w:t xml:space="preserve">meet TMDL goals for wetland contribution to </w:t>
+      </w:r>
+      <w:r>
+        <w:rPr>
+          <w:rFonts w:ascii="Times New Roman" w:hAnsi="Times New Roman" w:cs="Times New Roman"/>
+          <w:sz w:val="24"/>
+          <w:szCs w:val="24"/>
+        </w:rPr>
+        <w:t>phosphorus</w:t>
+      </w:r>
+      <w:r>
+        <w:rPr>
+          <w:rFonts w:ascii="Times New Roman" w:hAnsi="Times New Roman" w:cs="Times New Roman"/>
+          <w:sz w:val="24"/>
+          <w:szCs w:val="24"/>
+        </w:rPr>
+        <w:t xml:space="preserve"> retention</w:t>
+      </w:r>
+      <w:r>
+        <w:rPr>
+          <w:rFonts w:ascii="Times New Roman" w:hAnsi="Times New Roman" w:cs="Times New Roman"/>
+          <w:sz w:val="24"/>
+          <w:szCs w:val="24"/>
+        </w:rPr>
+        <w:t xml:space="preserve"> and would</w:t>
       </w:r>
       <w:r>
         <w:rPr>
@@ -13215,155 +14247,6 @@
           <w:szCs w:val="24"/>
         </w:rPr>
         <w:t xml:space="preserve"> </w:t>
-      </w:r>
-      <w:r>
-        <w:rPr>
-          <w:rFonts w:ascii="Times New Roman" w:hAnsi="Times New Roman" w:cs="Times New Roman"/>
-          <w:sz w:val="24"/>
-          <w:szCs w:val="24"/>
-        </w:rPr>
-        <w:t>of current agricultural land</w:t>
-      </w:r>
-      <w:r>
-        <w:rPr>
-          <w:rFonts w:ascii="Times New Roman" w:hAnsi="Times New Roman" w:cs="Times New Roman"/>
-          <w:sz w:val="24"/>
-          <w:szCs w:val="24"/>
-        </w:rPr>
-        <w:t xml:space="preserve"> (</w:t>
-      </w:r>
-      <w:r>
-        <w:rPr>
-          <w:rFonts w:ascii="Times New Roman" w:hAnsi="Times New Roman" w:cs="Times New Roman"/>
-          <w:sz w:val="24"/>
-          <w:szCs w:val="24"/>
-        </w:rPr>
-        <w:t>2</w:t>
-      </w:r>
-      <w:r>
-        <w:rPr>
-          <w:rFonts w:ascii="Times New Roman" w:hAnsi="Times New Roman" w:cs="Times New Roman"/>
-          <w:sz w:val="24"/>
-          <w:szCs w:val="24"/>
-        </w:rPr>
-        <w:t>.</w:t>
-      </w:r>
-      <w:r>
-        <w:rPr>
-          <w:rFonts w:ascii="Times New Roman" w:hAnsi="Times New Roman" w:cs="Times New Roman"/>
-          <w:sz w:val="24"/>
-          <w:szCs w:val="24"/>
-        </w:rPr>
-        <w:t>6</w:t>
-      </w:r>
-      <w:r>
-        <w:rPr>
-          <w:rFonts w:ascii="Times New Roman" w:hAnsi="Times New Roman" w:cs="Times New Roman"/>
-          <w:sz w:val="24"/>
-          <w:szCs w:val="24"/>
-        </w:rPr>
-        <w:t xml:space="preserve"> million acres)</w:t>
-      </w:r>
-      <w:r>
-        <w:rPr>
-          <w:rFonts w:ascii="Times New Roman" w:hAnsi="Times New Roman" w:cs="Times New Roman"/>
-          <w:sz w:val="24"/>
-          <w:szCs w:val="24"/>
-        </w:rPr>
-        <w:t xml:space="preserve"> in the </w:t>
-      </w:r>
-      <w:commentRangeStart w:id="99"/>
-      <w:r>
-        <w:rPr>
-          <w:rFonts w:ascii="Times New Roman" w:hAnsi="Times New Roman" w:cs="Times New Roman"/>
-          <w:sz w:val="24"/>
-          <w:szCs w:val="24"/>
-        </w:rPr>
-        <w:t xml:space="preserve">Maumee </w:t>
-      </w:r>
-      <w:commentRangeEnd w:id="99"/>
-      <w:r>
-        <w:rPr>
-          <w:rStyle w:val="CommentReference"/>
-          <w:rFonts w:ascii="Times New Roman" w:hAnsi="Times New Roman" w:cs="Times New Roman"/>
-          <w:sz w:val="24"/>
-          <w:szCs w:val="24"/>
-        </w:rPr>
-        <w:commentReference w:id="99"/>
-      </w:r>
-      <w:r>
-        <w:rPr>
-          <w:rFonts w:ascii="Times New Roman" w:hAnsi="Times New Roman" w:cs="Times New Roman"/>
-          <w:sz w:val="24"/>
-          <w:szCs w:val="24"/>
-        </w:rPr>
-        <w:t xml:space="preserve">River watershed to </w:t>
-      </w:r>
-      <w:r>
-        <w:rPr>
-          <w:rFonts w:ascii="Times New Roman" w:hAnsi="Times New Roman" w:cs="Times New Roman"/>
-          <w:b/>
-          <w:bCs/>
-          <w:sz w:val="24"/>
-          <w:szCs w:val="24"/>
-        </w:rPr>
-        <w:t>hydrologically connected wetlands</w:t>
-      </w:r>
-      <w:r>
-        <w:rPr>
-          <w:rFonts w:ascii="Times New Roman" w:hAnsi="Times New Roman" w:cs="Times New Roman"/>
-          <w:sz w:val="24"/>
-          <w:szCs w:val="24"/>
-        </w:rPr>
-        <w:t xml:space="preserve"> would </w:t>
-      </w:r>
-      <w:r>
-        <w:rPr>
-          <w:rFonts w:ascii="Times New Roman" w:hAnsi="Times New Roman" w:cs="Times New Roman"/>
-          <w:sz w:val="24"/>
-          <w:szCs w:val="24"/>
-        </w:rPr>
-        <w:t xml:space="preserve">meet TMDL goals for wetland contribution to </w:t>
-      </w:r>
-      <w:r>
-        <w:rPr>
-          <w:rFonts w:ascii="Times New Roman" w:hAnsi="Times New Roman" w:cs="Times New Roman"/>
-          <w:sz w:val="24"/>
-          <w:szCs w:val="24"/>
-        </w:rPr>
-        <w:t>phosphorus</w:t>
-      </w:r>
-      <w:r>
-        <w:rPr>
-          <w:rFonts w:ascii="Times New Roman" w:hAnsi="Times New Roman" w:cs="Times New Roman"/>
-          <w:sz w:val="24"/>
-          <w:szCs w:val="24"/>
-        </w:rPr>
-        <w:t xml:space="preserve"> </w:t>
-      </w:r>
-      <w:r>
-        <w:rPr>
-          <w:rFonts w:ascii="Times New Roman" w:hAnsi="Times New Roman" w:cs="Times New Roman"/>
-          <w:sz w:val="24"/>
-          <w:szCs w:val="24"/>
-        </w:rPr>
-        <w:t>retention</w:t>
-      </w:r>
-      <w:r>
-        <w:rPr>
-          <w:rFonts w:ascii="Times New Roman" w:hAnsi="Times New Roman" w:cs="Times New Roman"/>
-          <w:sz w:val="24"/>
-          <w:szCs w:val="24"/>
-        </w:rPr>
-        <w:t xml:space="preserve"> and</w:t>
-      </w:r>
-      <w:r>
-        <w:rPr>
-          <w:rFonts w:ascii="Times New Roman" w:hAnsi="Times New Roman" w:cs="Times New Roman"/>
-          <w:sz w:val="24"/>
-          <w:szCs w:val="24"/>
-        </w:rPr>
-        <w:t xml:space="preserve"> would </w:t>
       </w:r>
       <w:r>
         <w:rPr>
@@ -13446,7 +14329,7 @@
         </w:rPr>
         <w:t xml:space="preserve">. </w:t>
       </w:r>
-      <w:commentRangeStart w:id="100"/>
+      <w:commentRangeStart w:id="142"/>
       <w:r>
         <w:rPr>
           <w:rFonts w:ascii="Times New Roman" w:hAnsi="Times New Roman" w:cs="Times New Roman"/>
@@ -13458,7 +14341,7 @@
         </w:rPr>
         <w:t xml:space="preserve">Connectivity </w:t>
       </w:r>
-      <w:commentRangeEnd w:id="100"/>
+      <w:commentRangeEnd w:id="142"/>
       <w:r>
         <w:rPr>
           <w:rStyle w:val="CommentReference"/>
@@ -13469,7 +14352,7 @@
           <w:szCs w:val="24"/>
           <w:u w:val="single"/>
         </w:rPr>
-        <w:commentReference w:id="100"/>
+        <w:commentReference w:id="142"/>
       </w:r>
       <w:r>
         <w:rPr>
@@ -13580,7 +14463,7 @@
         </w:rPr>
         <w:t xml:space="preserve"> H2Ohio wetlands </w:t>
       </w:r>
-      <w:commentRangeStart w:id="101"/>
+      <w:commentRangeStart w:id="143"/>
       <w:r>
         <w:rPr>
           <w:rFonts w:ascii="Times New Roman" w:hAnsi="Times New Roman" w:cs="Times New Roman"/>
@@ -13589,7 +14472,7 @@
         </w:rPr>
         <w:t xml:space="preserve">overwhelmingly </w:t>
       </w:r>
-      <w:commentRangeEnd w:id="101"/>
+      <w:commentRangeEnd w:id="143"/>
       <w:r>
         <w:rPr>
           <w:rStyle w:val="CommentReference"/>
@@ -13597,7 +14480,7 @@
           <w:sz w:val="24"/>
           <w:szCs w:val="24"/>
         </w:rPr>
-        <w:commentReference w:id="101"/>
+        <w:commentReference w:id="143"/>
       </w:r>
       <w:r>
         <w:rPr>
@@ -14106,7 +14989,7 @@
         </w:rPr>
         <w:t>the efficiency of wetlands at nutrient retention</w:t>
       </w:r>
-      <w:commentRangeStart w:id="102"/>
+      <w:commentRangeStart w:id="144"/>
       <w:r>
         <w:rPr>
           <w:rFonts w:ascii="Times New Roman" w:hAnsi="Times New Roman" w:cs="Times New Roman"/>
@@ -14115,7 +14998,7 @@
         </w:rPr>
         <w:t>,</w:t>
       </w:r>
-      <w:commentRangeEnd w:id="102"/>
+      <w:commentRangeEnd w:id="144"/>
       <w:r>
         <w:rPr>
           <w:rStyle w:val="CommentReference"/>
@@ -14123,7 +15006,7 @@
           <w:sz w:val="24"/>
           <w:szCs w:val="24"/>
         </w:rPr>
-        <w:commentReference w:id="102"/>
+        <w:commentReference w:id="144"/>
       </w:r>
       <w:r>
         <w:rPr>
@@ -14133,7 +15016,7 @@
         </w:rPr>
         <w:t xml:space="preserve"> </w:t>
       </w:r>
-      <w:commentRangeStart w:id="103"/>
+      <w:commentRangeStart w:id="145"/>
       <w:r>
         <w:rPr>
           <w:rFonts w:ascii="Times New Roman" w:hAnsi="Times New Roman" w:cs="Times New Roman"/>
@@ -14174,7 +15057,7 @@
         </w:rPr>
         <w:t xml:space="preserve"> as water isn’t slowed down to allow settling, and there isn’t time for sorption of phosphorus or microbial denitrification</w:t>
       </w:r>
-      <w:commentRangeEnd w:id="103"/>
+      <w:commentRangeEnd w:id="145"/>
       <w:r>
         <w:rPr>
           <w:rStyle w:val="CommentReference"/>
@@ -14182,7 +15065,7 @@
           <w:sz w:val="24"/>
           <w:szCs w:val="24"/>
         </w:rPr>
-        <w:commentReference w:id="103"/>
+        <w:commentReference w:id="145"/>
       </w:r>
       <w:r>
         <w:rPr>
@@ -14273,7 +15156,7 @@
         </w:rPr>
         <w:t>context, because differences in volume</w:t>
       </w:r>
-      <w:ins w:id="104" w:author="Klukow, Mary Ellen" w:date="2026-09-08T15:31:00Z" w16du:dateUtc="2026-09-08T15:31:55Z">
+      <w:ins w:id="146" w:author="Klukow, Mary Ellen" w:date="2026-09-08T15:31:00Z" w16du:dateUtc="2026-09-08T15:31:55Z">
         <w:r>
           <w:rPr>
             <w:rFonts w:ascii="Times New Roman" w:hAnsi="Times New Roman" w:cs="Times New Roman"/>
@@ -14398,7 +15281,7 @@
         </w:rPr>
         <w:t xml:space="preserve">, </w:t>
       </w:r>
-      <w:del w:id="105" w:author="Klukow, Mary Ellen" w:date="2026-09-08T15:32:00Z" w16du:dateUtc="2026-09-08T15:32:10Z">
+      <w:del w:id="147" w:author="Klukow, Mary Ellen" w:date="2026-09-08T15:32:00Z" w16du:dateUtc="2026-09-08T15:32:10Z">
         <w:r>
           <w:rPr>
             <w:rFonts w:ascii="Times New Roman" w:hAnsi="Times New Roman" w:cs="Times New Roman"/>
@@ -14408,7 +15291,7 @@
           <w:delText xml:space="preserve">where </w:delText>
         </w:r>
       </w:del>
-      <w:ins w:id="106" w:author="Klukow, Mary Ellen" w:date="2026-09-08T15:32:00Z" w16du:dateUtc="2026-09-08T15:32:13Z">
+      <w:ins w:id="148" w:author="Klukow, Mary Ellen" w:date="2026-09-08T15:32:00Z" w16du:dateUtc="2026-09-08T15:32:13Z">
         <w:r>
           <w:rPr>
             <w:rFonts w:ascii="Times New Roman" w:hAnsi="Times New Roman" w:cs="Times New Roman"/>
@@ -14482,7 +15365,7 @@
         </w:rPr>
         <w:t>. We understand</w:t>
       </w:r>
-      <w:ins w:id="107" w:author="Klukow, Mary Ellen" w:date="2026-09-08T15:34:00Z" w16du:dateUtc="2026-09-08T15:34:50Z">
+      <w:ins w:id="149" w:author="Klukow, Mary Ellen" w:date="2026-09-08T15:34:00Z" w16du:dateUtc="2026-09-08T15:34:50Z">
         <w:r>
           <w:rPr>
             <w:rFonts w:ascii="Times New Roman" w:hAnsi="Times New Roman" w:cs="Times New Roman"/>
@@ -14500,7 +15383,7 @@
         </w:rPr>
         <w:t xml:space="preserve"> are when the majority of both water and nutrients move across the landscape in agricultural drainages </w:t>
       </w:r>
-      <w:commentRangeStart w:id="108"/>
+      <w:commentRangeStart w:id="150"/>
       <w:r>
         <w:rPr>
           <w:rFonts w:ascii="Times New Roman" w:hAnsi="Times New Roman" w:cs="Times New Roman"/>
@@ -14509,7 +15392,7 @@
         </w:rPr>
         <w:t xml:space="preserve">and </w:t>
       </w:r>
-      <w:ins w:id="109" w:author="Klukow, Mary Ellen" w:date="2026-09-08T15:35:00Z" w16du:dateUtc="2026-09-08T15:35:08Z">
+      <w:ins w:id="151" w:author="Klukow, Mary Ellen" w:date="2026-09-08T15:35:00Z" w16du:dateUtc="2026-09-08T15:35:08Z">
         <w:r>
           <w:rPr>
             <w:rFonts w:ascii="Times New Roman" w:hAnsi="Times New Roman" w:cs="Times New Roman"/>
@@ -14527,7 +15410,7 @@
         </w:rPr>
         <w:t>can deliver high concentrations of nutrients for wetlands to retain</w:t>
       </w:r>
-      <w:commentRangeEnd w:id="108"/>
+      <w:commentRangeEnd w:id="150"/>
       <w:r>
         <w:rPr>
           <w:rStyle w:val="CommentReference"/>
@@ -14535,7 +15418,7 @@
           <w:sz w:val="24"/>
           <w:szCs w:val="24"/>
         </w:rPr>
-        <w:commentReference w:id="108"/>
+        <w:commentReference w:id="150"/>
       </w:r>
       <w:r>
         <w:rPr>
@@ -14593,7 +15476,7 @@
         </w:rPr>
         <w:t xml:space="preserve">. While wetlands that are designed </w:t>
       </w:r>
-      <w:ins w:id="110" w:author="Klukow, Mary Ellen" w:date="2026-09-08T15:34:00Z" w16du:dateUtc="2026-09-08T15:34:00Z">
+      <w:ins w:id="152" w:author="Klukow, Mary Ellen" w:date="2026-09-08T15:34:00Z" w16du:dateUtc="2026-09-08T15:34:00Z">
         <w:r>
           <w:rPr>
             <w:rFonts w:ascii="Times New Roman" w:hAnsi="Times New Roman" w:cs="Times New Roman"/>
@@ -14659,7 +15542,7 @@
         </w:rPr>
         <w:t xml:space="preserve">, many constructed wetlands only receive water during storm events, </w:t>
       </w:r>
-      <w:commentRangeStart w:id="111"/>
+      <w:commentRangeStart w:id="153"/>
       <w:r>
         <w:rPr>
           <w:rFonts w:ascii="Times New Roman" w:hAnsi="Times New Roman" w:cs="Times New Roman"/>
@@ -14668,7 +15551,7 @@
         </w:rPr>
         <w:t>making the ability to capture high volumes of water in a short period of time even more important</w:t>
       </w:r>
-      <w:commentRangeEnd w:id="111"/>
+      <w:commentRangeEnd w:id="153"/>
       <w:r>
         <w:rPr>
           <w:rStyle w:val="CommentReference"/>
@@ -14676,7 +15559,7 @@
           <w:sz w:val="24"/>
           <w:szCs w:val="24"/>
         </w:rPr>
-        <w:commentReference w:id="111"/>
+        <w:commentReference w:id="153"/>
       </w:r>
       <w:r>
         <w:rPr>
@@ -14686,7 +15569,7 @@
         </w:rPr>
         <w:t>. Our analysis supports the importance of</w:t>
       </w:r>
-      <w:commentRangeStart w:id="112"/>
+      <w:commentRangeStart w:id="154"/>
       <w:r>
         <w:rPr>
           <w:rFonts w:ascii="Times New Roman" w:hAnsi="Times New Roman" w:cs="Times New Roman"/>
@@ -14695,7 +15578,7 @@
         </w:rPr>
         <w:t xml:space="preserve"> capturing data during storm events,</w:t>
       </w:r>
-      <w:commentRangeEnd w:id="112"/>
+      <w:commentRangeEnd w:id="154"/>
       <w:r>
         <w:rPr>
           <w:rStyle w:val="CommentReference"/>
@@ -14703,7 +15586,7 @@
           <w:sz w:val="24"/>
           <w:szCs w:val="24"/>
         </w:rPr>
-        <w:commentReference w:id="112"/>
+        <w:commentReference w:id="154"/>
       </w:r>
       <w:r>
         <w:rPr>
@@ -14713,7 +15596,7 @@
         </w:rPr>
         <w:t xml:space="preserve"> </w:t>
       </w:r>
-      <w:commentRangeStart w:id="113"/>
+      <w:commentRangeStart w:id="155"/>
       <w:r>
         <w:rPr>
           <w:rFonts w:ascii="Times New Roman" w:hAnsi="Times New Roman" w:cs="Times New Roman"/>
@@ -14722,7 +15605,7 @@
         </w:rPr>
         <w:t>but this</w:t>
       </w:r>
-      <w:commentRangeEnd w:id="113"/>
+      <w:commentRangeEnd w:id="155"/>
       <w:r>
         <w:rPr>
           <w:rStyle w:val="CommentReference"/>
@@ -14730,7 +15613,7 @@
           <w:sz w:val="24"/>
           <w:szCs w:val="24"/>
         </w:rPr>
-        <w:commentReference w:id="113"/>
+        <w:commentReference w:id="155"/>
       </w:r>
       <w:r>
         <w:rPr>
@@ -14804,7 +15687,7 @@
         </w:rPr>
         <w:t xml:space="preserve">hree of the four years of H2Ohio monitoring have taken place during droughts, limiting our understanding of how these wetlands may work better or worse during </w:t>
       </w:r>
-      <w:commentRangeStart w:id="114"/>
+      <w:commentRangeStart w:id="156"/>
       <w:r>
         <w:rPr>
           <w:rFonts w:ascii="Times New Roman" w:hAnsi="Times New Roman" w:cs="Times New Roman"/>
@@ -14813,7 +15696,7 @@
         </w:rPr>
         <w:t>wetter conditions.</w:t>
       </w:r>
-      <w:commentRangeEnd w:id="114"/>
+      <w:commentRangeEnd w:id="156"/>
       <w:r>
         <w:rPr>
           <w:rStyle w:val="CommentReference"/>
@@ -14821,7 +15704,7 @@
           <w:sz w:val="24"/>
           <w:szCs w:val="24"/>
         </w:rPr>
-        <w:commentReference w:id="114"/>
+        <w:commentReference w:id="156"/>
       </w:r>
       <w:r>
         <w:rPr>
@@ -14887,7 +15770,7 @@
         </w:rPr>
         <w:fldChar w:fldCharType="end"/>
       </w:r>
-      <w:del w:id="115" w:author="Klukow, Mary Ellen" w:date="2026-09-08T15:42:00Z" w16du:dateUtc="2026-09-08T15:42:00Z">
+      <w:del w:id="157" w:author="Klukow, Mary Ellen" w:date="2026-09-08T15:42:00Z" w16du:dateUtc="2026-09-08T15:42:00Z">
         <w:r>
           <w:rPr>
             <w:rFonts w:ascii="Times New Roman" w:hAnsi="Times New Roman" w:cs="Times New Roman"/>
@@ -14905,7 +15788,7 @@
         </w:rPr>
         <w:t xml:space="preserve"> and </w:t>
       </w:r>
-      <w:del w:id="116" w:author="Klukow, Mary Ellen" w:date="2026-09-08T15:42:00Z" w16du:dateUtc="2026-09-08T15:42:13Z">
+      <w:del w:id="158" w:author="Klukow, Mary Ellen" w:date="2026-09-08T15:42:00Z" w16du:dateUtc="2026-09-08T15:42:13Z">
         <w:r>
           <w:rPr>
             <w:rFonts w:ascii="Times New Roman" w:hAnsi="Times New Roman" w:cs="Times New Roman"/>
@@ -14923,7 +15806,7 @@
         </w:rPr>
         <w:t xml:space="preserve"> building up stores of phosphorus with the potential to be </w:t>
       </w:r>
-      <w:commentRangeStart w:id="117"/>
+      <w:commentRangeStart w:id="159"/>
       <w:r>
         <w:rPr>
           <w:rFonts w:ascii="Times New Roman" w:hAnsi="Times New Roman" w:cs="Times New Roman"/>
@@ -14932,7 +15815,7 @@
         </w:rPr>
         <w:t>released</w:t>
       </w:r>
-      <w:del w:id="118" w:author="Klukow, Mary Ellen" w:date="2026-09-08T15:41:00Z" w16du:dateUtc="2026-09-08T15:41:43Z">
+      <w:del w:id="160" w:author="Klukow, Mary Ellen" w:date="2026-09-08T15:41:00Z" w16du:dateUtc="2026-09-08T15:41:43Z">
         <w:r>
           <w:rPr>
             <w:rFonts w:ascii="Times New Roman" w:hAnsi="Times New Roman" w:cs="Times New Roman"/>
@@ -14942,7 +15825,7 @@
           <w:delText xml:space="preserve"> </w:delText>
         </w:r>
       </w:del>
-      <w:commentRangeEnd w:id="117"/>
+      <w:commentRangeEnd w:id="159"/>
       <w:r>
         <w:rPr>
           <w:rStyle w:val="CommentReference"/>
@@ -14950,7 +15833,7 @@
           <w:sz w:val="24"/>
           <w:szCs w:val="24"/>
         </w:rPr>
-        <w:commentReference w:id="117"/>
+        <w:commentReference w:id="159"/>
       </w:r>
       <w:r>
         <w:rPr>
@@ -14973,7 +15856,7 @@
           <w:u w:val="single"/>
         </w:rPr>
       </w:pPr>
-      <w:commentRangeStart w:id="119"/>
+      <w:commentRangeStart w:id="161"/>
       <w:r>
         <w:rPr>
           <w:rFonts w:ascii="Times New Roman" w:hAnsi="Times New Roman" w:cs="Times New Roman"/>
@@ -15029,7 +15912,7 @@
         </w:rPr>
         <w:t>elease</w:t>
       </w:r>
-      <w:commentRangeEnd w:id="119"/>
+      <w:commentRangeEnd w:id="161"/>
       <w:r>
         <w:rPr>
           <w:rStyle w:val="CommentReference"/>
@@ -15040,7 +15923,7 @@
           <w:szCs w:val="24"/>
           <w:u w:val="single"/>
         </w:rPr>
-        <w:commentReference w:id="119"/>
+        <w:commentReference w:id="161"/>
       </w:r>
     </w:p>
     <w:p>
@@ -15085,7 +15968,7 @@
         </w:rPr>
         <w:t xml:space="preserve"> or vegetation</w:t>
       </w:r>
-      <w:del w:id="120" w:author="Klukow, Mary Ellen" w:date="2026-09-08T15:45:00Z" w16du:dateUtc="2026-09-08T15:45:02Z">
+      <w:del w:id="162" w:author="Klukow, Mary Ellen" w:date="2026-09-08T15:45:00Z" w16du:dateUtc="2026-09-08T15:45:02Z">
         <w:r>
           <w:rPr>
             <w:rFonts w:ascii="Times New Roman" w:hAnsi="Times New Roman" w:cs="Times New Roman"/>
@@ -15103,7 +15986,7 @@
           <w:delText xml:space="preserve"> </w:delText>
         </w:r>
       </w:del>
-      <w:ins w:id="121" w:author="Klukow, Mary Ellen" w:date="2026-09-08T15:45:00Z" w16du:dateUtc="2026-09-08T15:45:03Z">
+      <w:ins w:id="163" w:author="Klukow, Mary Ellen" w:date="2026-09-08T15:45:00Z" w16du:dateUtc="2026-09-08T15:45:03Z">
         <w:r>
           <w:rPr>
             <w:rFonts w:ascii="Times New Roman" w:hAnsi="Times New Roman" w:cs="Times New Roman"/>
@@ -15289,7 +16172,7 @@
         </w:rPr>
         <w:t xml:space="preserve">. </w:t>
       </w:r>
-      <w:commentRangeStart w:id="122"/>
+      <w:commentRangeStart w:id="164"/>
       <w:r>
         <w:rPr>
           <w:rFonts w:ascii="Times New Roman" w:hAnsi="Times New Roman" w:cs="Times New Roman"/>
@@ -15338,7 +16221,7 @@
         </w:rPr>
         <w:t>,</w:t>
       </w:r>
-      <w:commentRangeEnd w:id="122"/>
+      <w:commentRangeEnd w:id="164"/>
       <w:r>
         <w:rPr>
           <w:rStyle w:val="CommentReference"/>
@@ -15346,7 +16229,7 @@
           <w:sz w:val="24"/>
           <w:szCs w:val="24"/>
         </w:rPr>
-        <w:commentReference w:id="122"/>
+        <w:commentReference w:id="164"/>
       </w:r>
       <w:r>
         <w:rPr>
@@ -15747,9 +16630,9 @@
           <w:szCs w:val="24"/>
         </w:rPr>
       </w:pPr>
-      <w:commentRangeStart w:id="123"/>
-      <w:commentRangeStart w:id="124"/>
-      <w:commentRangeStart w:id="125"/>
+      <w:commentRangeStart w:id="165"/>
+      <w:commentRangeStart w:id="166"/>
+      <w:commentRangeStart w:id="167"/>
       <w:r>
         <w:rPr>
           <w:rFonts w:ascii="Times New Roman" w:hAnsi="Times New Roman" w:cs="Times New Roman"/>
@@ -15798,7 +16681,7 @@
         </w:rPr>
         <w:t xml:space="preserve"> in both new and existing wetlands.</w:t>
       </w:r>
-      <w:commentRangeEnd w:id="123"/>
+      <w:commentRangeEnd w:id="165"/>
       <w:r>
         <w:rPr>
           <w:rStyle w:val="CommentReference"/>
@@ -15806,9 +16689,9 @@
           <w:sz w:val="24"/>
           <w:szCs w:val="24"/>
         </w:rPr>
-        <w:commentReference w:id="123"/>
-      </w:r>
-      <w:commentRangeEnd w:id="124"/>
+        <w:commentReference w:id="165"/>
+      </w:r>
+      <w:commentRangeEnd w:id="166"/>
       <w:r>
         <w:rPr>
           <w:rStyle w:val="CommentReference"/>
@@ -15816,9 +16699,9 @@
           <w:sz w:val="24"/>
           <w:szCs w:val="24"/>
         </w:rPr>
-        <w:commentReference w:id="124"/>
-      </w:r>
-      <w:commentRangeEnd w:id="125"/>
+        <w:commentReference w:id="166"/>
+      </w:r>
+      <w:commentRangeEnd w:id="167"/>
       <w:r>
         <w:rPr>
           <w:rStyle w:val="CommentReference"/>
@@ -15826,7 +16709,7 @@
           <w:sz w:val="24"/>
           <w:szCs w:val="24"/>
         </w:rPr>
-        <w:commentReference w:id="125"/>
+        <w:commentReference w:id="167"/>
       </w:r>
       <w:r>
         <w:rPr>
@@ -15858,7 +16741,15 @@
           <w:sz w:val="24"/>
           <w:szCs w:val="24"/>
         </w:rPr>
-        <w:t xml:space="preserve">and associated habitat </w:t>
+        <w:t>and associated habitat</w:t>
+      </w:r>
+      <w:r>
+        <w:rPr>
+          <w:rFonts w:ascii="Times New Roman" w:hAnsi="Times New Roman" w:cs="Times New Roman"/>
+          <w:sz w:val="24"/>
+          <w:szCs w:val="24"/>
+        </w:rPr>
+        <w:t xml:space="preserve"> </w:t>
       </w:r>
       <w:r>
         <w:rPr>
@@ -15930,15 +16821,15 @@
           <w:sz w:val="24"/>
           <w:szCs w:val="24"/>
         </w:rPr>
-        <w:t xml:space="preserve">for wetlands </w:t>
-      </w:r>
-      <w:r>
-        <w:rPr>
-          <w:rFonts w:ascii="Times New Roman" w:hAnsi="Times New Roman" w:cs="Times New Roman"/>
-          <w:sz w:val="24"/>
-          <w:szCs w:val="24"/>
-        </w:rPr>
-        <w:t>with</w:t>
+        <w:t>for wetlands</w:t>
+      </w:r>
+      <w:r>
+        <w:rPr>
+          <w:rFonts w:ascii="Times New Roman" w:hAnsi="Times New Roman" w:cs="Times New Roman"/>
+          <w:sz w:val="24"/>
+          <w:szCs w:val="24"/>
+        </w:rPr>
+        <w:t xml:space="preserve"> with</w:t>
       </w:r>
       <w:r>
         <w:rPr>
@@ -15994,7 +16885,23 @@
           <w:sz w:val="24"/>
           <w:szCs w:val="24"/>
         </w:rPr>
-        <w:t xml:space="preserve">, and reaching proposed nitrogen reduction goals </w:t>
+        <w:t>,</w:t>
+      </w:r>
+      <w:r>
+        <w:rPr>
+          <w:rFonts w:ascii="Times New Roman" w:hAnsi="Times New Roman" w:cs="Times New Roman"/>
+          <w:sz w:val="24"/>
+          <w:szCs w:val="24"/>
+        </w:rPr>
+        <w:t xml:space="preserve"> and reaching proposed nitrogen reduction goals</w:t>
+      </w:r>
+      <w:r>
+        <w:rPr>
+          <w:rFonts w:ascii="Times New Roman" w:hAnsi="Times New Roman" w:cs="Times New Roman"/>
+          <w:sz w:val="24"/>
+          <w:szCs w:val="24"/>
+        </w:rPr>
+        <w:t xml:space="preserve"> </w:t>
       </w:r>
       <w:r>
         <w:rPr>
@@ -16065,9 +16972,9 @@
           <w:sz w:val="24"/>
           <w:szCs w:val="24"/>
         </w:rPr>
-        <w:t xml:space="preserve"> those </w:t>
-      </w:r>
-      <w:commentRangeStart w:id="127"/>
+        <w:t xml:space="preserve"> </w:t>
+      </w:r>
+      <w:commentRangeStart w:id="169"/>
       <w:r>
         <w:rPr>
           <w:rFonts w:ascii="Times New Roman" w:hAnsi="Times New Roman" w:cs="Times New Roman"/>
@@ -16082,7 +16989,23 @@
           <w:sz w:val="24"/>
           <w:szCs w:val="24"/>
         </w:rPr>
-        <w:t xml:space="preserve">either half of the 40,000 acres of connected wetlands needed to meet TMDL goals or only a fifth of the 120,000 acres of </w:t>
+        <w:t xml:space="preserve">either half of the 40,000 acres of connected wetlands needed to meet TMDL </w:t>
+      </w:r>
+      <w:r>
+        <w:rPr>
+          <w:rFonts w:ascii="Times New Roman" w:hAnsi="Times New Roman" w:cs="Times New Roman"/>
+          <w:sz w:val="24"/>
+          <w:szCs w:val="24"/>
+        </w:rPr>
+        <w:t xml:space="preserve">phosphorus </w:t>
+      </w:r>
+      <w:r>
+        <w:rPr>
+          <w:rFonts w:ascii="Times New Roman" w:hAnsi="Times New Roman" w:cs="Times New Roman"/>
+          <w:sz w:val="24"/>
+          <w:szCs w:val="24"/>
+        </w:rPr>
+        <w:t xml:space="preserve">goals or only a fifth of the 120,000 acres of </w:t>
       </w:r>
       <w:r>
         <w:rPr>
@@ -16124,7 +17047,7 @@
         </w:rPr>
         <w:t xml:space="preserve">. </w:t>
       </w:r>
-      <w:commentRangeEnd w:id="127"/>
+      <w:commentRangeEnd w:id="169"/>
       <w:r>
         <w:rPr>
           <w:rStyle w:val="CommentReference"/>
@@ -16132,7 +17055,63 @@
           <w:sz w:val="24"/>
           <w:szCs w:val="24"/>
         </w:rPr>
-        <w:commentReference w:id="127"/>
+        <w:commentReference w:id="169"/>
+      </w:r>
+      <w:r>
+        <w:rPr>
+          <w:rFonts w:ascii="Times New Roman" w:hAnsi="Times New Roman" w:cs="Times New Roman"/>
+          <w:sz w:val="24"/>
+          <w:szCs w:val="24"/>
+        </w:rPr>
+        <w:t xml:space="preserve">Both typical and hydrologically connected wetlands are </w:t>
+      </w:r>
+      <w:r>
+        <w:rPr>
+          <w:rFonts w:ascii="Times New Roman" w:hAnsi="Times New Roman" w:cs="Times New Roman"/>
+          <w:sz w:val="24"/>
+          <w:szCs w:val="24"/>
+        </w:rPr>
+        <w:t xml:space="preserve">more effective at meeting nitrogen goals than phosphorus goals, with </w:t>
+      </w:r>
+      <w:r>
+        <w:rPr>
+          <w:rFonts w:ascii="Times New Roman" w:hAnsi="Times New Roman" w:cs="Times New Roman"/>
+          <w:sz w:val="24"/>
+          <w:szCs w:val="24"/>
+        </w:rPr>
+        <w:t xml:space="preserve">30% less acreage </w:t>
+      </w:r>
+      <w:r>
+        <w:rPr>
+          <w:rFonts w:ascii="Times New Roman" w:hAnsi="Times New Roman" w:cs="Times New Roman"/>
+          <w:sz w:val="24"/>
+          <w:szCs w:val="24"/>
+        </w:rPr>
+        <w:t xml:space="preserve">of typical wetlands, and 50% less acreage of connected wetlands needed to meet </w:t>
+      </w:r>
+      <w:r>
+        <w:rPr>
+          <w:rFonts w:ascii="Times New Roman" w:hAnsi="Times New Roman" w:cs="Times New Roman"/>
+          <w:sz w:val="24"/>
+          <w:szCs w:val="24"/>
+        </w:rPr>
+        <w:t xml:space="preserve">water quality goals. However, </w:t>
+      </w:r>
+      <w:r>
+        <w:rPr>
+          <w:rFonts w:ascii="Times New Roman" w:hAnsi="Times New Roman" w:cs="Times New Roman"/>
+          <w:sz w:val="24"/>
+          <w:szCs w:val="24"/>
+        </w:rPr>
+        <w:t xml:space="preserve">we found that our wetlands have a higher max on phosphorus retention than nitrogen leading to </w:t>
+      </w:r>
+      <w:r>
+        <w:rPr>
+          <w:rFonts w:ascii="Times New Roman" w:hAnsi="Times New Roman" w:cs="Times New Roman"/>
+          <w:sz w:val="24"/>
+          <w:szCs w:val="24"/>
+        </w:rPr>
+        <w:t>less acreage of the best possible wetlands needed to treat phosphorus than nitrogen.</w:t>
       </w:r>
     </w:p>
     <w:p>
@@ -16169,8 +17148,8 @@
         </w:rPr>
         <w:t xml:space="preserve"> </w:t>
       </w:r>
-      <w:commentRangeStart w:id="128"/>
-      <w:commentRangeStart w:id="129"/>
+      <w:commentRangeStart w:id="170"/>
+      <w:commentRangeStart w:id="171"/>
       <w:r>
         <w:rPr>
           <w:rFonts w:ascii="Times New Roman" w:hAnsi="Times New Roman" w:cs="Times New Roman"/>
@@ -16179,7 +17158,7 @@
         </w:rPr>
         <w:t>through adaptive monitoring</w:t>
       </w:r>
-      <w:commentRangeEnd w:id="128"/>
+      <w:commentRangeEnd w:id="170"/>
       <w:r>
         <w:rPr>
           <w:rStyle w:val="CommentReference"/>
@@ -16187,9 +17166,9 @@
           <w:sz w:val="24"/>
           <w:szCs w:val="24"/>
         </w:rPr>
-        <w:commentReference w:id="128"/>
-      </w:r>
-      <w:commentRangeEnd w:id="129"/>
+        <w:commentReference w:id="170"/>
+      </w:r>
+      <w:commentRangeEnd w:id="171"/>
       <w:r>
         <w:rPr>
           <w:rStyle w:val="CommentReference"/>
@@ -16197,7 +17176,7 @@
           <w:sz w:val="24"/>
           <w:szCs w:val="24"/>
         </w:rPr>
-        <w:commentReference w:id="129"/>
+        <w:commentReference w:id="171"/>
       </w:r>
       <w:r>
         <w:rPr>
@@ -16363,7 +17342,7 @@
           <w:szCs w:val="24"/>
         </w:rPr>
       </w:pPr>
-      <w:commentRangeStart w:id="131"/>
+      <w:commentRangeStart w:id="173"/>
       <w:r>
         <w:rPr>
           <w:rFonts w:ascii="Times New Roman" w:hAnsi="Times New Roman" w:cs="Times New Roman"/>
@@ -16374,7 +17353,7 @@
         </w:rPr>
         <w:t>5. Conclusion</w:t>
       </w:r>
-      <w:commentRangeEnd w:id="131"/>
+      <w:commentRangeEnd w:id="173"/>
       <w:r>
         <w:rPr>
           <w:rStyle w:val="CommentReference"/>
@@ -16384,7 +17363,7 @@
           <w:sz w:val="24"/>
           <w:szCs w:val="24"/>
         </w:rPr>
-        <w:commentReference w:id="131"/>
+        <w:commentReference w:id="173"/>
       </w:r>
     </w:p>
     <w:p>
@@ -16405,7 +17384,7 @@
         </w:rPr>
         <w:t>Our data</w:t>
       </w:r>
-      <w:ins w:id="132" w:author="Klukow, Mary Ellen" w:date="2026-09-08T15:52:00Z" w16du:dateUtc="2026-09-08T15:52:43Z">
+      <w:ins w:id="174" w:author="Klukow, Mary Ellen" w:date="2026-09-08T15:52:00Z" w16du:dateUtc="2026-09-08T15:52:43Z">
         <w:r>
           <w:rPr>
             <w:rFonts w:ascii="Times New Roman" w:hAnsi="Times New Roman" w:cs="Times New Roman"/>
@@ -16431,7 +17410,7 @@
         </w:rPr>
         <w:t>as part of the H2Ohio Wetland Monitoring Program</w:t>
       </w:r>
-      <w:ins w:id="133" w:author="Klukow, Mary Ellen" w:date="2026-09-08T15:52:00Z" w16du:dateUtc="2026-09-08T15:52:47Z">
+      <w:ins w:id="175" w:author="Klukow, Mary Ellen" w:date="2026-09-08T15:52:00Z" w16du:dateUtc="2026-09-08T15:52:47Z">
         <w:r>
           <w:rPr>
             <w:rFonts w:ascii="Times New Roman" w:hAnsi="Times New Roman" w:cs="Times New Roman"/>
@@ -16545,7 +17524,7 @@
         </w:rPr>
         <w:t xml:space="preserve">Our database shows that wetlands can be an effective </w:t>
       </w:r>
-      <w:commentRangeStart w:id="134"/>
+      <w:commentRangeStart w:id="176"/>
       <w:r>
         <w:rPr>
           <w:rFonts w:ascii="Times New Roman" w:hAnsi="Times New Roman" w:cs="Times New Roman"/>
@@ -16554,7 +17533,7 @@
         </w:rPr>
         <w:t xml:space="preserve">method </w:t>
       </w:r>
-      <w:commentRangeEnd w:id="134"/>
+      <w:commentRangeEnd w:id="176"/>
       <w:r>
         <w:rPr>
           <w:rStyle w:val="CommentReference"/>
@@ -16562,7 +17541,7 @@
           <w:sz w:val="24"/>
           <w:szCs w:val="24"/>
         </w:rPr>
-        <w:commentReference w:id="134"/>
+        <w:commentReference w:id="176"/>
       </w:r>
       <w:r>
         <w:rPr>
@@ -16725,7 +17704,7 @@
         </w:rPr>
         <w:t xml:space="preserve">Figures: </w:t>
       </w:r>
-      <w:bookmarkStart w:id="135" w:name="_Ref237347007"/>
+      <w:bookmarkStart w:id="177" w:name="_Ref237347007"/>
     </w:p>
     <w:p>
       <w:pPr>
@@ -16739,7 +17718,7 @@
           <w:szCs w:val="22"/>
         </w:rPr>
       </w:pPr>
-      <w:bookmarkStart w:id="136" w:name="_Ref237351546"/>
+      <w:bookmarkStart w:id="178" w:name="_Ref237351546"/>
       <w:r>
         <w:rPr>
           <w:rFonts w:ascii="Times New Roman" w:hAnsi="Times New Roman" w:cs="Times New Roman"/>
@@ -16807,7 +17786,7 @@
         </w:rPr>
         <w:fldChar w:fldCharType="end"/>
       </w:r>
-      <w:bookmarkEnd w:id="136"/>
+      <w:bookmarkEnd w:id="178"/>
       <w:r>
         <w:rPr>
           <w:rFonts w:ascii="Times New Roman" w:hAnsi="Times New Roman" w:cs="Times New Roman"/>
@@ -16874,7 +17853,7 @@
         </w:rPr>
         <w:t>Map of 24 wetland restoration projects where inflowing and outflowing volumes and nutrient concentrations were monitored to build nutrient budgets</w:t>
       </w:r>
-      <w:bookmarkEnd w:id="135"/>
+      <w:bookmarkEnd w:id="177"/>
     </w:p>
     <w:p>
       <w:pPr>
@@ -16950,8 +17929,8 @@
           <w:u w:val="single"/>
         </w:rPr>
       </w:pPr>
-      <w:bookmarkStart w:id="137" w:name="_Toc237348176"/>
-      <w:bookmarkStart w:id="138" w:name="_Ref237351592"/>
+      <w:bookmarkStart w:id="179" w:name="_Toc237348176"/>
+      <w:bookmarkStart w:id="180" w:name="_Ref237351592"/>
       <w:r>
         <w:rPr>
           <w:rFonts w:ascii="Times New Roman" w:hAnsi="Times New Roman" w:cs="Times New Roman"/>
@@ -17019,8 +17998,8 @@
         </w:rPr>
         <w:fldChar w:fldCharType="end"/>
       </w:r>
-      <w:bookmarkEnd w:id="137"/>
-      <w:bookmarkEnd w:id="138"/>
+      <w:bookmarkEnd w:id="179"/>
+      <w:bookmarkEnd w:id="180"/>
       <w:r>
         <w:rPr>
           <w:rFonts w:ascii="Times New Roman" w:hAnsi="Times New Roman" w:cs="Times New Roman"/>
@@ -17211,7 +18190,7 @@
           <w:u w:val="single"/>
         </w:rPr>
       </w:pPr>
-      <w:bookmarkStart w:id="139" w:name="_Ref237351576"/>
+      <w:bookmarkStart w:id="181" w:name="_Ref237351576"/>
       <w:r>
         <w:rPr>
           <w:rFonts w:ascii="Times New Roman" w:hAnsi="Times New Roman" w:cs="Times New Roman"/>
@@ -17349,7 +18328,7 @@
         </w:rPr>
         <w:fldChar w:fldCharType="end"/>
       </w:r>
-      <w:bookmarkEnd w:id="139"/>
+      <w:bookmarkEnd w:id="181"/>
       <w:r>
         <w:rPr>
           <w:rFonts w:ascii="Times New Roman" w:hAnsi="Times New Roman" w:cs="Times New Roman"/>
@@ -17541,7 +18520,7 @@
           <w:szCs w:val="22"/>
         </w:rPr>
       </w:pPr>
-      <w:bookmarkStart w:id="140" w:name="_Ref237355469"/>
+      <w:bookmarkStart w:id="182" w:name="_Ref237355469"/>
       <w:r>
         <w:rPr>
           <w:rFonts w:ascii="Times New Roman" w:hAnsi="Times New Roman" w:cs="Times New Roman"/>
@@ -17609,7 +18588,7 @@
         </w:rPr>
         <w:fldChar w:fldCharType="end"/>
       </w:r>
-      <w:bookmarkEnd w:id="140"/>
+      <w:bookmarkEnd w:id="182"/>
       <w:r>
         <w:rPr>
           <w:rFonts w:ascii="Times New Roman" w:hAnsi="Times New Roman" w:cs="Times New Roman"/>
@@ -17774,7 +18753,7 @@
           <w:u w:val="single"/>
         </w:rPr>
       </w:pPr>
-      <w:bookmarkStart w:id="141" w:name="_Ref237355488"/>
+      <w:bookmarkStart w:id="183" w:name="_Ref237355488"/>
       <w:r>
         <w:rPr>
           <w:rFonts w:ascii="Times New Roman" w:hAnsi="Times New Roman" w:cs="Times New Roman"/>
@@ -17842,7 +18821,7 @@
         </w:rPr>
         <w:fldChar w:fldCharType="end"/>
       </w:r>
-      <w:bookmarkEnd w:id="141"/>
+      <w:bookmarkEnd w:id="183"/>
       <w:r>
         <w:rPr>
           <w:rFonts w:ascii="Times New Roman" w:hAnsi="Times New Roman" w:cs="Times New Roman"/>
@@ -17953,7 +18932,7 @@
           <w:u w:val="single"/>
         </w:rPr>
       </w:pPr>
-      <w:bookmarkStart w:id="142" w:name="_Ref237355502"/>
+      <w:bookmarkStart w:id="184" w:name="_Ref237355502"/>
       <w:r>
         <w:rPr>
           <w:rFonts w:ascii="Times New Roman" w:hAnsi="Times New Roman" w:cs="Times New Roman"/>
@@ -18021,7 +19000,7 @@
         </w:rPr>
         <w:fldChar w:fldCharType="end"/>
       </w:r>
-      <w:bookmarkEnd w:id="142"/>
+      <w:bookmarkEnd w:id="184"/>
       <w:r>
         <w:rPr>
           <w:rFonts w:ascii="Times New Roman" w:hAnsi="Times New Roman" w:cs="Times New Roman"/>
@@ -18088,8 +19067,8 @@
           <w:u w:val="single"/>
         </w:rPr>
       </w:pPr>
-      <w:bookmarkStart w:id="143" w:name="_Ref238469583"/>
-      <w:bookmarkStart w:id="144" w:name="_Ref238469568"/>
+      <w:bookmarkStart w:id="185" w:name="_Ref238469583"/>
+      <w:bookmarkStart w:id="186" w:name="_Ref238469568"/>
       <w:r>
         <w:rPr>
           <w:rFonts w:ascii="Times New Roman" w:hAnsi="Times New Roman" w:cs="Times New Roman"/>
@@ -18168,7 +19147,7 @@
         </w:rPr>
         <w:fldChar w:fldCharType="end"/>
       </w:r>
-      <w:bookmarkEnd w:id="143"/>
+      <w:bookmarkEnd w:id="185"/>
       <w:r>
         <w:rPr>
           <w:rFonts w:ascii="Times New Roman" w:hAnsi="Times New Roman" w:cs="Times New Roman"/>
@@ -18180,7 +19159,7 @@
         </w:rPr>
         <w:t>.</w:t>
       </w:r>
-      <w:bookmarkEnd w:id="144"/>
+      <w:bookmarkEnd w:id="186"/>
       <w:r>
         <w:rPr>
           <w:rFonts w:ascii="Times New Roman" w:hAnsi="Times New Roman" w:cs="Times New Roman"/>
@@ -19560,7 +20539,7 @@
           <w:szCs w:val="22"/>
         </w:rPr>
       </w:pPr>
-      <w:bookmarkStart w:id="145" w:name="_Ref238473448"/>
+      <w:bookmarkStart w:id="187" w:name="_Ref238473448"/>
       <w:r>
         <w:rPr>
           <w:rFonts w:ascii="Times New Roman" w:hAnsi="Times New Roman" w:cs="Times New Roman"/>
@@ -19628,7 +20607,7 @@
         </w:rPr>
         <w:fldChar w:fldCharType="end"/>
       </w:r>
-      <w:bookmarkEnd w:id="145"/>
+      <w:bookmarkEnd w:id="187"/>
       <w:r>
         <w:rPr>
           <w:rFonts w:ascii="Times New Roman" w:hAnsi="Times New Roman" w:cs="Times New Roman"/>
@@ -19649,7 +20628,51 @@
           <w:sz w:val="22"/>
           <w:szCs w:val="22"/>
         </w:rPr>
-        <w:t>Wetland acres needed to meet the TMDL “enhance nonpoint source sinks” goal for three different scenarios: Typical wetlands (using 50</w:t>
+        <w:t xml:space="preserve">Wetland acres needed to meet the TMDL “enhance nonpoint source sinks” </w:t>
+      </w:r>
+      <w:r>
+        <w:rPr>
+          <w:rFonts w:ascii="Times New Roman" w:hAnsi="Times New Roman" w:cs="Times New Roman"/>
+          <w:i w:val="0"/>
+          <w:iCs w:val="0"/>
+          <w:color w:val="auto"/>
+          <w:sz w:val="22"/>
+          <w:szCs w:val="22"/>
+        </w:rPr>
+        <w:t xml:space="preserve">phosphorus reduction </w:t>
+      </w:r>
+      <w:r>
+        <w:rPr>
+          <w:rFonts w:ascii="Times New Roman" w:hAnsi="Times New Roman" w:cs="Times New Roman"/>
+          <w:i w:val="0"/>
+          <w:iCs w:val="0"/>
+          <w:color w:val="auto"/>
+          <w:sz w:val="22"/>
+          <w:szCs w:val="22"/>
+        </w:rPr>
+        <w:t xml:space="preserve">goal </w:t>
+      </w:r>
+      <w:r>
+        <w:rPr>
+          <w:rFonts w:ascii="Times New Roman" w:hAnsi="Times New Roman" w:cs="Times New Roman"/>
+          <w:i w:val="0"/>
+          <w:iCs w:val="0"/>
+          <w:color w:val="auto"/>
+          <w:sz w:val="22"/>
+          <w:szCs w:val="22"/>
+        </w:rPr>
+        <w:t>and proposed co-reduction goals for nitrogen</w:t>
+      </w:r>
+      <w:r>
+        <w:rPr>
+          <w:rFonts w:ascii="Times New Roman" w:hAnsi="Times New Roman" w:cs="Times New Roman"/>
+          <w:i w:val="0"/>
+          <w:iCs w:val="0"/>
+          <w:color w:val="auto"/>
+          <w:sz w:val="22"/>
+          <w:szCs w:val="22"/>
+        </w:rPr>
+        <w:t xml:space="preserve"> for three different scenarios: Typical wetlands (using 50</w:t>
       </w:r>
       <w:r>
         <w:rPr>
@@ -19717,7 +20740,7 @@
           <w:sz w:val="22"/>
           <w:szCs w:val="22"/>
         </w:rPr>
-        <w:t>. Median P retention during the HAB season was 65% of annual retention, so here 65% of total</w:t>
+        <w:t>. Median P retention during the HAB season was 65% of annual retention</w:t>
       </w:r>
       <w:r>
         <w:rPr>
@@ -19728,7 +20751,73 @@
           <w:sz w:val="22"/>
           <w:szCs w:val="22"/>
         </w:rPr>
-        <w:t xml:space="preserve"> P retention is used. </w:t>
+        <w:t xml:space="preserve"> and median N retention was 7</w:t>
+      </w:r>
+      <w:r>
+        <w:rPr>
+          <w:rFonts w:ascii="Times New Roman" w:hAnsi="Times New Roman" w:cs="Times New Roman"/>
+          <w:i w:val="0"/>
+          <w:iCs w:val="0"/>
+          <w:color w:val="auto"/>
+          <w:sz w:val="22"/>
+          <w:szCs w:val="22"/>
+        </w:rPr>
+        <w:t>2</w:t>
+      </w:r>
+      <w:r>
+        <w:rPr>
+          <w:rFonts w:ascii="Times New Roman" w:hAnsi="Times New Roman" w:cs="Times New Roman"/>
+          <w:i w:val="0"/>
+          <w:iCs w:val="0"/>
+          <w:color w:val="auto"/>
+          <w:sz w:val="22"/>
+          <w:szCs w:val="22"/>
+        </w:rPr>
+        <w:t>%</w:t>
+      </w:r>
+      <w:r>
+        <w:rPr>
+          <w:rFonts w:ascii="Times New Roman" w:hAnsi="Times New Roman" w:cs="Times New Roman"/>
+          <w:i w:val="0"/>
+          <w:iCs w:val="0"/>
+          <w:color w:val="auto"/>
+          <w:sz w:val="22"/>
+          <w:szCs w:val="22"/>
+        </w:rPr>
+        <w:t>, so here 65% of total</w:t>
+      </w:r>
+      <w:r>
+        <w:rPr>
+          <w:rFonts w:ascii="Times New Roman" w:hAnsi="Times New Roman" w:cs="Times New Roman"/>
+          <w:i w:val="0"/>
+          <w:iCs w:val="0"/>
+          <w:color w:val="auto"/>
+          <w:sz w:val="22"/>
+          <w:szCs w:val="22"/>
+        </w:rPr>
+        <w:t xml:space="preserve"> P retention</w:t>
+      </w:r>
+      <w:r>
+        <w:rPr>
+          <w:rFonts w:ascii="Times New Roman" w:hAnsi="Times New Roman" w:cs="Times New Roman"/>
+          <w:i w:val="0"/>
+          <w:iCs w:val="0"/>
+          <w:color w:val="auto"/>
+          <w:sz w:val="22"/>
+          <w:szCs w:val="22"/>
+        </w:rPr>
+        <w:t>, and 72% of total N retention are</w:t>
+      </w:r>
+      <w:r>
+        <w:rPr>
+          <w:rFonts w:ascii="Times New Roman" w:hAnsi="Times New Roman" w:cs="Times New Roman"/>
+          <w:i w:val="0"/>
+          <w:iCs w:val="0"/>
+          <w:color w:val="auto"/>
+          <w:sz w:val="22"/>
+          <w:szCs w:val="22"/>
+        </w:rPr>
+        <w:t xml:space="preserve"> used. </w:t>
       </w:r>
     </w:p>
     <w:tbl>
@@ -19739,6 +20828,16 @@
           <w:right w:w="0" w:type="dxa"/>
         </w:tblCellMar>
         <w:tblLook w:val="0420" w:firstRow="1" w:lastRow="0" w:firstColumn="0" w:lastColumn="0" w:noHBand="0" w:noVBand="1"/>
+        <w:tblPrChange w:id="188" w:author="Anderson, Kenneth" w:date="2026-09-14T11:26:00Z" w16du:dateUtc="2026-09-14T15:26:00Z">
+          <w:tblPr>
+            <w:tblW w:w="9360" w:type="dxa"/>
+            <w:tblCellMar>
+              <w:left w:w="0" w:type="dxa"/>
+              <w:right w:w="0" w:type="dxa"/>
+            </w:tblCellMar>
+            <w:tblLook w:val="0420" w:firstRow="1" w:lastRow="0" w:firstColumn="0" w:lastColumn="0" w:noHBand="0" w:noVBand="1"/>
+          </w:tblPr>
+        </w:tblPrChange>
       </w:tblPr>
       <w:tblGrid>
         <w:gridCol w:w="2043"/>
@@ -19746,7 +20845,7 @@
         <w:gridCol w:w="1650"/>
         <w:gridCol w:w="2002"/>
         <w:gridCol w:w="1736"/>
-        <w:tblGridChange w:id="146">
+        <w:tblGridChange w:id="189">
           <w:tblGrid>
             <w:gridCol w:w="2043"/>
             <w:gridCol w:w="1929"/>
@@ -19759,6 +20858,11 @@
       <w:tr>
         <w:trPr>
           <w:trHeight w:val="743"/>
+          <w:trPrChange w:id="190" w:author="Anderson, Kenneth" w:date="2026-09-14T11:26:00Z" w16du:dateUtc="2026-09-14T15:26:00Z">
+            <w:trPr>
+              <w:trHeight w:val="743"/>
+            </w:trPr>
+          </w:trPrChange>
         </w:trPr>
         <w:tc>
           <w:tcPr>
@@ -19775,6 +20879,23 @@
               <w:right w:w="133" w:type="dxa"/>
             </w:tcMar>
             <w:hideMark/>
+            <w:tcPrChange w:id="191" w:author="Anderson, Kenneth" w:date="2026-09-14T11:26:00Z" w16du:dateUtc="2026-09-14T15:26:00Z">
+              <w:tcPr>
+                <w:tcW w:w="2043" w:type="dxa"/>
+                <w:tcBorders>
+                  <w:top w:val="single" w:sz="4" w:space="0" w:color="auto"/>
+                  <w:bottom w:val="single" w:sz="4" w:space="0" w:color="auto"/>
+                </w:tcBorders>
+                <w:shd w:val="clear" w:color="auto" w:fill="ADADAD" w:themeFill="background2" w:themeFillShade="BF"/>
+                <w:tcMar>
+                  <w:top w:w="67" w:type="dxa"/>
+                  <w:left w:w="133" w:type="dxa"/>
+                  <w:bottom w:w="67" w:type="dxa"/>
+                  <w:right w:w="133" w:type="dxa"/>
+                </w:tcMar>
+                <w:hideMark/>
+              </w:tcPr>
+            </w:tcPrChange>
           </w:tcPr>
           <w:p>
             <w:pPr>
@@ -19808,6 +20929,23 @@
               <w:right w:w="133" w:type="dxa"/>
             </w:tcMar>
             <w:hideMark/>
+            <w:tcPrChange w:id="192" w:author="Anderson, Kenneth" w:date="2026-09-14T11:26:00Z" w16du:dateUtc="2026-09-14T15:26:00Z">
+              <w:tcPr>
+                <w:tcW w:w="1929" w:type="dxa"/>
+                <w:tcBorders>
+                  <w:top w:val="single" w:sz="4" w:space="0" w:color="auto"/>
+                  <w:bottom w:val="single" w:sz="4" w:space="0" w:color="auto"/>
+                </w:tcBorders>
+                <w:shd w:val="clear" w:color="auto" w:fill="ADADAD" w:themeFill="background2" w:themeFillShade="BF"/>
+                <w:tcMar>
+                  <w:top w:w="67" w:type="dxa"/>
+                  <w:left w:w="133" w:type="dxa"/>
+                  <w:bottom w:w="67" w:type="dxa"/>
+                  <w:right w:w="133" w:type="dxa"/>
+                </w:tcMar>
+                <w:hideMark/>
+              </w:tcPr>
+            </w:tcPrChange>
           </w:tcPr>
           <w:p>
             <w:pPr>
@@ -19822,7 +20960,15 @@
                 <w:b/>
                 <w:bCs/>
               </w:rPr>
-              <w:t>Total P retention (lbs. P / acre during HAB season)</w:t>
+              <w:t xml:space="preserve">Total </w:t>
+            </w:r>
+            <w:r>
+              <w:rPr>
+                <w:rFonts w:ascii="Times New Roman" w:hAnsi="Times New Roman" w:cs="Times New Roman"/>
+                <w:b/>
+                <w:bCs/>
+              </w:rPr>
+              <w:t>P retention (lbs. P / acre during HAB season)</w:t>
             </w:r>
           </w:p>
         </w:tc>
@@ -19834,6 +20980,16 @@
               <w:bottom w:val="single" w:sz="4" w:space="0" w:color="auto"/>
             </w:tcBorders>
             <w:shd w:val="clear" w:color="auto" w:fill="ADADAD" w:themeFill="background2" w:themeFillShade="BF"/>
+            <w:tcPrChange w:id="193" w:author="Anderson, Kenneth" w:date="2026-09-14T11:26:00Z" w16du:dateUtc="2026-09-14T15:26:00Z">
+              <w:tcPr>
+                <w:tcW w:w="1650" w:type="dxa"/>
+                <w:tcBorders>
+                  <w:top w:val="single" w:sz="4" w:space="0" w:color="auto"/>
+                  <w:bottom w:val="single" w:sz="4" w:space="0" w:color="auto"/>
+                </w:tcBorders>
+                <w:shd w:val="clear" w:color="auto" w:fill="ADADAD" w:themeFill="background2" w:themeFillShade="BF"/>
+              </w:tcPr>
+            </w:tcPrChange>
           </w:tcPr>
           <w:p>
             <w:pPr>
@@ -19901,6 +21057,23 @@
               <w:right w:w="133" w:type="dxa"/>
             </w:tcMar>
             <w:hideMark/>
+            <w:tcPrChange w:id="194" w:author="Anderson, Kenneth" w:date="2026-09-14T11:26:00Z" w16du:dateUtc="2026-09-14T15:26:00Z">
+              <w:tcPr>
+                <w:tcW w:w="2002" w:type="dxa"/>
+                <w:tcBorders>
+                  <w:top w:val="single" w:sz="4" w:space="0" w:color="auto"/>
+                  <w:bottom w:val="single" w:sz="4" w:space="0" w:color="auto"/>
+                </w:tcBorders>
+                <w:shd w:val="clear" w:color="auto" w:fill="ADADAD" w:themeFill="background2" w:themeFillShade="BF"/>
+                <w:tcMar>
+                  <w:top w:w="67" w:type="dxa"/>
+                  <w:left w:w="133" w:type="dxa"/>
+                  <w:bottom w:w="67" w:type="dxa"/>
+                  <w:right w:w="133" w:type="dxa"/>
+                </w:tcMar>
+                <w:hideMark/>
+              </w:tcPr>
+            </w:tcPrChange>
           </w:tcPr>
           <w:p>
             <w:pPr>
@@ -19917,7 +21090,7 @@
               </w:rPr>
               <w:t xml:space="preserve">Wetland acres needed to meet TMDL wetland goal </w:t>
             </w:r>
-            <w:ins w:id="147" w:author="Anderson, Kenneth" w:date="2026-09-14T11:09:00Z" w16du:dateUtc="2026-09-14T15:09:00Z">
+            <w:ins w:id="195" w:author="Anderson, Kenneth" w:date="2026-09-14T11:09:00Z" w16du:dateUtc="2026-09-14T15:09:00Z">
               <w:r>
                 <w:rPr>
                   <w:rFonts w:ascii="Times New Roman" w:hAnsi="Times New Roman" w:cs="Times New Roman"/>
@@ -19937,6 +21110,16 @@
               <w:bottom w:val="single" w:sz="4" w:space="0" w:color="auto"/>
             </w:tcBorders>
             <w:shd w:val="clear" w:color="auto" w:fill="ADADAD" w:themeFill="background2" w:themeFillShade="BF"/>
+            <w:tcPrChange w:id="196" w:author="Anderson, Kenneth" w:date="2026-09-14T11:26:00Z" w16du:dateUtc="2026-09-14T15:26:00Z">
+              <w:tcPr>
+                <w:tcW w:w="1736" w:type="dxa"/>
+                <w:tcBorders>
+                  <w:top w:val="single" w:sz="4" w:space="0" w:color="auto"/>
+                  <w:bottom w:val="single" w:sz="4" w:space="0" w:color="auto"/>
+                </w:tcBorders>
+                <w:shd w:val="clear" w:color="auto" w:fill="ADADAD" w:themeFill="background2" w:themeFillShade="BF"/>
+              </w:tcPr>
+            </w:tcPrChange>
           </w:tcPr>
           <w:p>
             <w:pPr>
@@ -19947,7 +21130,7 @@
                 <w:bCs/>
               </w:rPr>
             </w:pPr>
-            <w:ins w:id="148" w:author="Anderson, Kenneth" w:date="2026-09-14T11:09:00Z" w16du:dateUtc="2026-09-14T15:09:00Z">
+            <w:ins w:id="197" w:author="Anderson, Kenneth" w:date="2026-09-14T11:09:00Z" w16du:dateUtc="2026-09-14T15:09:00Z">
               <w:r>
                 <w:rPr>
                   <w:rFonts w:ascii="Times New Roman" w:hAnsi="Times New Roman" w:cs="Times New Roman"/>
@@ -19957,7 +21140,7 @@
                 <w:t>Wetland acres needed to meet co-</w:t>
               </w:r>
             </w:ins>
-            <w:ins w:id="149" w:author="Anderson, Kenneth" w:date="2026-09-14T11:10:00Z" w16du:dateUtc="2026-09-14T15:10:00Z">
+            <w:ins w:id="198" w:author="Anderson, Kenneth" w:date="2026-09-14T11:10:00Z" w16du:dateUtc="2026-09-14T15:10:00Z">
               <w:r>
                 <w:rPr>
                   <w:rFonts w:ascii="Times New Roman" w:hAnsi="Times New Roman" w:cs="Times New Roman"/>
@@ -19973,6 +21156,11 @@
       <w:tr>
         <w:trPr>
           <w:trHeight w:val="479"/>
+          <w:trPrChange w:id="199" w:author="Anderson, Kenneth" w:date="2026-09-14T11:26:00Z" w16du:dateUtc="2026-09-14T15:26:00Z">
+            <w:trPr>
+              <w:trHeight w:val="479"/>
+            </w:trPr>
+          </w:trPrChange>
         </w:trPr>
         <w:tc>
           <w:tcPr>
@@ -19988,6 +21176,22 @@
               <w:right w:w="133" w:type="dxa"/>
             </w:tcMar>
             <w:hideMark/>
+            <w:tcPrChange w:id="200" w:author="Anderson, Kenneth" w:date="2026-09-14T11:26:00Z" w16du:dateUtc="2026-09-14T15:26:00Z">
+              <w:tcPr>
+                <w:tcW w:w="2043" w:type="dxa"/>
+                <w:tcBorders>
+                  <w:top w:val="single" w:sz="4" w:space="0" w:color="auto"/>
+                </w:tcBorders>
+                <w:shd w:val="clear" w:color="auto" w:fill="FFFFFF" w:themeFill="background1"/>
+                <w:tcMar>
+                  <w:top w:w="67" w:type="dxa"/>
+                  <w:left w:w="133" w:type="dxa"/>
+                  <w:bottom w:w="67" w:type="dxa"/>
+                  <w:right w:w="133" w:type="dxa"/>
+                </w:tcMar>
+                <w:hideMark/>
+              </w:tcPr>
+            </w:tcPrChange>
           </w:tcPr>
           <w:p>
             <w:pPr>
@@ -20005,14 +21209,14 @@
               </w:rPr>
               <w:t xml:space="preserve">1. </w:t>
             </w:r>
-            <w:commentRangeStart w:id="150"/>
+            <w:commentRangeStart w:id="201"/>
             <w:r>
               <w:rPr>
                 <w:rFonts w:ascii="Times New Roman" w:hAnsi="Times New Roman" w:cs="Times New Roman"/>
               </w:rPr>
               <w:t>Typical</w:t>
             </w:r>
-            <w:commentRangeEnd w:id="150"/>
+            <w:commentRangeEnd w:id="201"/>
             <w:r>
               <w:rPr>
                 <w:rStyle w:val="CommentReference"/>
@@ -20020,7 +21224,7 @@
                 <w:sz w:val="22"/>
                 <w:szCs w:val="22"/>
               </w:rPr>
-              <w:commentReference w:id="150"/>
+              <w:commentReference w:id="201"/>
             </w:r>
             <w:r>
               <w:rPr>
@@ -20057,6 +21261,22 @@
               <w:right w:w="133" w:type="dxa"/>
             </w:tcMar>
             <w:hideMark/>
+            <w:tcPrChange w:id="202" w:author="Anderson, Kenneth" w:date="2026-09-14T11:26:00Z" w16du:dateUtc="2026-09-14T15:26:00Z">
+              <w:tcPr>
+                <w:tcW w:w="1929" w:type="dxa"/>
+                <w:tcBorders>
+                  <w:top w:val="single" w:sz="4" w:space="0" w:color="auto"/>
+                </w:tcBorders>
+                <w:shd w:val="clear" w:color="auto" w:fill="FFFFFF" w:themeFill="background1"/>
+                <w:tcMar>
+                  <w:top w:w="67" w:type="dxa"/>
+                  <w:left w:w="133" w:type="dxa"/>
+                  <w:bottom w:w="67" w:type="dxa"/>
+                  <w:right w:w="133" w:type="dxa"/>
+                </w:tcMar>
+                <w:hideMark/>
+              </w:tcPr>
+            </w:tcPrChange>
           </w:tcPr>
           <w:p>
             <w:pPr>
@@ -20065,7 +21285,7 @@
               <w:rPr>
                 <w:rFonts w:ascii="Times New Roman" w:hAnsi="Times New Roman" w:cs="Times New Roman"/>
               </w:rPr>
-              <w:pPrChange w:id="151" w:author="Anderson, Kenneth" w:date="2026-09-14T11:10:00Z" w16du:dateUtc="2026-09-14T15:10:00Z">
+              <w:pPrChange w:id="203" w:author="Anderson, Kenneth" w:date="2026-09-14T11:10:00Z" w16du:dateUtc="2026-09-14T15:10:00Z">
                 <w:pPr>
                   <w:spacing w:line="240" w:lineRule="auto"/>
                 </w:pPr>
@@ -20077,7 +21297,23 @@
                 <w:b/>
                 <w:bCs/>
               </w:rPr>
-              <w:t>1.65</w:t>
+              <w:t>1.</w:t>
+            </w:r>
+            <w:r>
+              <w:rPr>
+                <w:rFonts w:ascii="Times New Roman" w:hAnsi="Times New Roman" w:cs="Times New Roman"/>
+                <w:b/>
+                <w:bCs/>
+              </w:rPr>
+              <w:t>6</w:t>
+            </w:r>
+            <w:r>
+              <w:rPr>
+                <w:rFonts w:ascii="Times New Roman" w:hAnsi="Times New Roman" w:cs="Times New Roman"/>
+                <w:b/>
+                <w:bCs/>
+              </w:rPr>
+              <w:t>5</w:t>
             </w:r>
           </w:p>
         </w:tc>
@@ -20088,6 +21324,15 @@
               <w:top w:val="single" w:sz="4" w:space="0" w:color="auto"/>
             </w:tcBorders>
             <w:shd w:val="clear" w:color="auto" w:fill="FFFFFF" w:themeFill="background1"/>
+            <w:tcPrChange w:id="204" w:author="Anderson, Kenneth" w:date="2026-09-14T11:26:00Z" w16du:dateUtc="2026-09-14T15:26:00Z">
+              <w:tcPr>
+                <w:tcW w:w="1650" w:type="dxa"/>
+                <w:tcBorders>
+                  <w:top w:val="single" w:sz="4" w:space="0" w:color="auto"/>
+                </w:tcBorders>
+                <w:shd w:val="clear" w:color="auto" w:fill="FFFFFF" w:themeFill="background1"/>
+              </w:tcPr>
+            </w:tcPrChange>
           </w:tcPr>
           <w:p>
             <w:pPr>
@@ -20123,6 +21368,22 @@
               <w:right w:w="133" w:type="dxa"/>
             </w:tcMar>
             <w:hideMark/>
+            <w:tcPrChange w:id="205" w:author="Anderson, Kenneth" w:date="2026-09-14T11:26:00Z" w16du:dateUtc="2026-09-14T15:26:00Z">
+              <w:tcPr>
+                <w:tcW w:w="2002" w:type="dxa"/>
+                <w:tcBorders>
+                  <w:top w:val="single" w:sz="4" w:space="0" w:color="auto"/>
+                </w:tcBorders>
+                <w:shd w:val="clear" w:color="auto" w:fill="FFFFFF" w:themeFill="background1"/>
+                <w:tcMar>
+                  <w:top w:w="67" w:type="dxa"/>
+                  <w:left w:w="133" w:type="dxa"/>
+                  <w:bottom w:w="67" w:type="dxa"/>
+                  <w:right w:w="133" w:type="dxa"/>
+                </w:tcMar>
+                <w:hideMark/>
+              </w:tcPr>
+            </w:tcPrChange>
           </w:tcPr>
           <w:p>
             <w:pPr>
@@ -20131,7 +21392,7 @@
               <w:rPr>
                 <w:rFonts w:ascii="Times New Roman" w:hAnsi="Times New Roman" w:cs="Times New Roman"/>
               </w:rPr>
-              <w:pPrChange w:id="152" w:author="Anderson, Kenneth" w:date="2026-09-14T11:10:00Z" w16du:dateUtc="2026-09-14T15:10:00Z">
+              <w:pPrChange w:id="206" w:author="Anderson, Kenneth" w:date="2026-09-14T11:10:00Z" w16du:dateUtc="2026-09-14T15:10:00Z">
                 <w:pPr>
                   <w:spacing w:line="240" w:lineRule="auto"/>
                 </w:pPr>
@@ -20143,7 +21404,23 @@
                 <w:b/>
                 <w:bCs/>
               </w:rPr>
-              <w:t>120,000</w:t>
+              <w:t>1</w:t>
+            </w:r>
+            <w:r>
+              <w:rPr>
+                <w:rFonts w:ascii="Times New Roman" w:hAnsi="Times New Roman" w:cs="Times New Roman"/>
+                <w:b/>
+                <w:bCs/>
+              </w:rPr>
+              <w:t>20</w:t>
+            </w:r>
+            <w:r>
+              <w:rPr>
+                <w:rFonts w:ascii="Times New Roman" w:hAnsi="Times New Roman" w:cs="Times New Roman"/>
+                <w:b/>
+                <w:bCs/>
+              </w:rPr>
+              <w:t>,000</w:t>
             </w:r>
           </w:p>
         </w:tc>
@@ -20154,6 +21431,15 @@
               <w:top w:val="single" w:sz="4" w:space="0" w:color="auto"/>
             </w:tcBorders>
             <w:shd w:val="clear" w:color="auto" w:fill="FFFFFF" w:themeFill="background1"/>
+            <w:tcPrChange w:id="207" w:author="Anderson, Kenneth" w:date="2026-09-14T11:26:00Z" w16du:dateUtc="2026-09-14T15:26:00Z">
+              <w:tcPr>
+                <w:tcW w:w="1736" w:type="dxa"/>
+                <w:tcBorders>
+                  <w:top w:val="single" w:sz="4" w:space="0" w:color="auto"/>
+                </w:tcBorders>
+                <w:shd w:val="clear" w:color="auto" w:fill="FFFFFF" w:themeFill="background1"/>
+              </w:tcPr>
+            </w:tcPrChange>
           </w:tcPr>
           <w:p>
             <w:pPr>
@@ -20165,7 +21451,7 @@
                 <w:bCs/>
               </w:rPr>
             </w:pPr>
-            <w:ins w:id="153" w:author="Anderson, Kenneth" w:date="2026-09-14T11:10:00Z" w16du:dateUtc="2026-09-14T15:10:00Z">
+            <w:ins w:id="208" w:author="Anderson, Kenneth" w:date="2026-09-14T11:10:00Z" w16du:dateUtc="2026-09-14T15:10:00Z">
               <w:r>
                 <w:rPr>
                   <w:rFonts w:ascii="Times New Roman" w:hAnsi="Times New Roman" w:cs="Times New Roman"/>
@@ -20181,6 +21467,11 @@
       <w:tr>
         <w:trPr>
           <w:trHeight w:val="654"/>
+          <w:trPrChange w:id="209" w:author="Anderson, Kenneth" w:date="2026-09-14T11:26:00Z" w16du:dateUtc="2026-09-14T15:26:00Z">
+            <w:trPr>
+              <w:trHeight w:val="654"/>
+            </w:trPr>
+          </w:trPrChange>
         </w:trPr>
         <w:tc>
           <w:tcPr>
@@ -20193,6 +21484,19 @@
               <w:right w:w="133" w:type="dxa"/>
             </w:tcMar>
             <w:hideMark/>
+            <w:tcPrChange w:id="210" w:author="Anderson, Kenneth" w:date="2026-09-14T11:26:00Z" w16du:dateUtc="2026-09-14T15:26:00Z">
+              <w:tcPr>
+                <w:tcW w:w="2043" w:type="dxa"/>
+                <w:shd w:val="clear" w:color="auto" w:fill="FFFFFF" w:themeFill="background1"/>
+                <w:tcMar>
+                  <w:top w:w="67" w:type="dxa"/>
+                  <w:left w:w="133" w:type="dxa"/>
+                  <w:bottom w:w="67" w:type="dxa"/>
+                  <w:right w:w="133" w:type="dxa"/>
+                </w:tcMar>
+                <w:hideMark/>
+              </w:tcPr>
+            </w:tcPrChange>
           </w:tcPr>
           <w:p>
             <w:pPr>
@@ -20242,6 +21546,19 @@
               <w:right w:w="133" w:type="dxa"/>
             </w:tcMar>
             <w:hideMark/>
+            <w:tcPrChange w:id="211" w:author="Anderson, Kenneth" w:date="2026-09-14T11:26:00Z" w16du:dateUtc="2026-09-14T15:26:00Z">
+              <w:tcPr>
+                <w:tcW w:w="1929" w:type="dxa"/>
+                <w:shd w:val="clear" w:color="auto" w:fill="FFFFFF" w:themeFill="background1"/>
+                <w:tcMar>
+                  <w:top w:w="67" w:type="dxa"/>
+                  <w:left w:w="133" w:type="dxa"/>
+                  <w:bottom w:w="67" w:type="dxa"/>
+                  <w:right w:w="133" w:type="dxa"/>
+                </w:tcMar>
+                <w:hideMark/>
+              </w:tcPr>
+            </w:tcPrChange>
           </w:tcPr>
           <w:p>
             <w:pPr>
@@ -20252,7 +21569,7 @@
                 <w:b/>
                 <w:bCs/>
               </w:rPr>
-              <w:pPrChange w:id="154" w:author="Anderson, Kenneth" w:date="2026-09-14T11:10:00Z" w16du:dateUtc="2026-09-14T15:10:00Z">
+              <w:pPrChange w:id="212" w:author="Anderson, Kenneth" w:date="2026-09-14T11:10:00Z" w16du:dateUtc="2026-09-14T15:10:00Z">
                 <w:pPr>
                   <w:spacing w:line="240" w:lineRule="auto"/>
                 </w:pPr>
@@ -20272,6 +21589,12 @@
           <w:tcPr>
             <w:tcW w:w="1650" w:type="dxa"/>
             <w:shd w:val="clear" w:color="auto" w:fill="FFFFFF" w:themeFill="background1"/>
+            <w:tcPrChange w:id="213" w:author="Anderson, Kenneth" w:date="2026-09-14T11:26:00Z" w16du:dateUtc="2026-09-14T15:26:00Z">
+              <w:tcPr>
+                <w:tcW w:w="1650" w:type="dxa"/>
+                <w:shd w:val="clear" w:color="auto" w:fill="FFFFFF" w:themeFill="background1"/>
+              </w:tcPr>
+            </w:tcPrChange>
           </w:tcPr>
           <w:p>
             <w:pPr>
@@ -20304,6 +21627,19 @@
               <w:right w:w="133" w:type="dxa"/>
             </w:tcMar>
             <w:hideMark/>
+            <w:tcPrChange w:id="214" w:author="Anderson, Kenneth" w:date="2026-09-14T11:26:00Z" w16du:dateUtc="2026-09-14T15:26:00Z">
+              <w:tcPr>
+                <w:tcW w:w="2002" w:type="dxa"/>
+                <w:shd w:val="clear" w:color="auto" w:fill="FFFFFF" w:themeFill="background1"/>
+                <w:tcMar>
+                  <w:top w:w="67" w:type="dxa"/>
+                  <w:left w:w="133" w:type="dxa"/>
+                  <w:bottom w:w="67" w:type="dxa"/>
+                  <w:right w:w="133" w:type="dxa"/>
+                </w:tcMar>
+                <w:hideMark/>
+              </w:tcPr>
+            </w:tcPrChange>
           </w:tcPr>
           <w:p>
             <w:pPr>
@@ -20312,7 +21648,7 @@
               <w:rPr>
                 <w:rFonts w:ascii="Times New Roman" w:hAnsi="Times New Roman" w:cs="Times New Roman"/>
               </w:rPr>
-              <w:pPrChange w:id="155" w:author="Anderson, Kenneth" w:date="2026-09-14T11:10:00Z" w16du:dateUtc="2026-09-14T15:10:00Z">
+              <w:pPrChange w:id="215" w:author="Anderson, Kenneth" w:date="2026-09-14T11:10:00Z" w16du:dateUtc="2026-09-14T15:10:00Z">
                 <w:pPr>
                   <w:spacing w:line="240" w:lineRule="auto"/>
                 </w:pPr>
@@ -20324,7 +21660,23 @@
                 <w:b/>
                 <w:bCs/>
               </w:rPr>
-              <w:t>40,000</w:t>
+              <w:t>4</w:t>
+            </w:r>
+            <w:r>
+              <w:rPr>
+                <w:rFonts w:ascii="Times New Roman" w:hAnsi="Times New Roman" w:cs="Times New Roman"/>
+                <w:b/>
+                <w:bCs/>
+              </w:rPr>
+              <w:t>0</w:t>
+            </w:r>
+            <w:r>
+              <w:rPr>
+                <w:rFonts w:ascii="Times New Roman" w:hAnsi="Times New Roman" w:cs="Times New Roman"/>
+                <w:b/>
+                <w:bCs/>
+              </w:rPr>
+              <w:t>,000</w:t>
             </w:r>
           </w:p>
         </w:tc>
@@ -20332,6 +21684,12 @@
           <w:tcPr>
             <w:tcW w:w="1736" w:type="dxa"/>
             <w:shd w:val="clear" w:color="auto" w:fill="FFFFFF" w:themeFill="background1"/>
+            <w:tcPrChange w:id="216" w:author="Anderson, Kenneth" w:date="2026-09-14T11:26:00Z" w16du:dateUtc="2026-09-14T15:26:00Z">
+              <w:tcPr>
+                <w:tcW w:w="1736" w:type="dxa"/>
+                <w:shd w:val="clear" w:color="auto" w:fill="FFFFFF" w:themeFill="background1"/>
+              </w:tcPr>
+            </w:tcPrChange>
           </w:tcPr>
           <w:p>
             <w:pPr>
@@ -20343,7 +21701,7 @@
                 <w:bCs/>
               </w:rPr>
             </w:pPr>
-            <w:ins w:id="156" w:author="Anderson, Kenneth" w:date="2026-09-14T11:10:00Z" w16du:dateUtc="2026-09-14T15:10:00Z">
+            <w:ins w:id="217" w:author="Anderson, Kenneth" w:date="2026-09-14T11:10:00Z" w16du:dateUtc="2026-09-14T15:10:00Z">
               <w:r>
                 <w:rPr>
                   <w:rFonts w:ascii="Times New Roman" w:hAnsi="Times New Roman" w:cs="Times New Roman"/>
@@ -20359,6 +21717,11 @@
       <w:tr>
         <w:trPr>
           <w:trHeight w:val="533"/>
+          <w:trPrChange w:id="218" w:author="Anderson, Kenneth" w:date="2026-09-14T11:26:00Z" w16du:dateUtc="2026-09-14T15:26:00Z">
+            <w:trPr>
+              <w:trHeight w:val="533"/>
+            </w:trPr>
+          </w:trPrChange>
         </w:trPr>
         <w:tc>
           <w:tcPr>
@@ -20374,6 +21737,22 @@
               <w:right w:w="133" w:type="dxa"/>
             </w:tcMar>
             <w:hideMark/>
+            <w:tcPrChange w:id="219" w:author="Anderson, Kenneth" w:date="2026-09-14T11:26:00Z" w16du:dateUtc="2026-09-14T15:26:00Z">
+              <w:tcPr>
+                <w:tcW w:w="2043" w:type="dxa"/>
+                <w:tcBorders>
+                  <w:bottom w:val="single" w:sz="4" w:space="0" w:color="auto"/>
+                </w:tcBorders>
+                <w:shd w:val="clear" w:color="auto" w:fill="FFFFFF" w:themeFill="background1"/>
+                <w:tcMar>
+                  <w:top w:w="67" w:type="dxa"/>
+                  <w:left w:w="133" w:type="dxa"/>
+                  <w:bottom w:w="67" w:type="dxa"/>
+                  <w:right w:w="133" w:type="dxa"/>
+                </w:tcMar>
+                <w:hideMark/>
+              </w:tcPr>
+            </w:tcPrChange>
           </w:tcPr>
           <w:p>
             <w:pPr>
@@ -20413,6 +21792,22 @@
               <w:right w:w="133" w:type="dxa"/>
             </w:tcMar>
             <w:hideMark/>
+            <w:tcPrChange w:id="220" w:author="Anderson, Kenneth" w:date="2026-09-14T11:26:00Z" w16du:dateUtc="2026-09-14T15:26:00Z">
+              <w:tcPr>
+                <w:tcW w:w="1929" w:type="dxa"/>
+                <w:tcBorders>
+                  <w:bottom w:val="single" w:sz="4" w:space="0" w:color="auto"/>
+                </w:tcBorders>
+                <w:shd w:val="clear" w:color="auto" w:fill="FFFFFF" w:themeFill="background1"/>
+                <w:tcMar>
+                  <w:top w:w="67" w:type="dxa"/>
+                  <w:left w:w="133" w:type="dxa"/>
+                  <w:bottom w:w="67" w:type="dxa"/>
+                  <w:right w:w="133" w:type="dxa"/>
+                </w:tcMar>
+                <w:hideMark/>
+              </w:tcPr>
+            </w:tcPrChange>
           </w:tcPr>
           <w:p>
             <w:pPr>
@@ -20421,13 +21816,13 @@
               <w:rPr>
                 <w:rFonts w:ascii="Times New Roman" w:hAnsi="Times New Roman" w:cs="Times New Roman"/>
               </w:rPr>
-              <w:pPrChange w:id="157" w:author="Anderson, Kenneth" w:date="2026-09-14T11:10:00Z" w16du:dateUtc="2026-09-14T15:10:00Z">
+              <w:pPrChange w:id="221" w:author="Anderson, Kenneth" w:date="2026-09-14T11:10:00Z" w16du:dateUtc="2026-09-14T15:10:00Z">
                 <w:pPr>
                   <w:spacing w:line="240" w:lineRule="auto"/>
                 </w:pPr>
               </w:pPrChange>
             </w:pPr>
-            <w:commentRangeStart w:id="158"/>
+            <w:commentRangeStart w:id="222"/>
             <w:r>
               <w:rPr>
                 <w:rFonts w:ascii="Times New Roman" w:hAnsi="Times New Roman" w:cs="Times New Roman"/>
@@ -20436,7 +21831,7 @@
               </w:rPr>
               <w:t>113.75</w:t>
             </w:r>
-            <w:commentRangeEnd w:id="158"/>
+            <w:commentRangeEnd w:id="222"/>
             <w:r>
               <w:rPr>
                 <w:rStyle w:val="CommentReference"/>
@@ -20444,7 +21839,7 @@
                 <w:sz w:val="22"/>
                 <w:szCs w:val="22"/>
               </w:rPr>
-              <w:commentReference w:id="158"/>
+              <w:commentReference w:id="222"/>
             </w:r>
           </w:p>
         </w:tc>
@@ -20455,6 +21850,15 @@
               <w:bottom w:val="single" w:sz="4" w:space="0" w:color="auto"/>
             </w:tcBorders>
             <w:shd w:val="clear" w:color="auto" w:fill="FFFFFF" w:themeFill="background1"/>
+            <w:tcPrChange w:id="223" w:author="Anderson, Kenneth" w:date="2026-09-14T11:26:00Z" w16du:dateUtc="2026-09-14T15:26:00Z">
+              <w:tcPr>
+                <w:tcW w:w="1650" w:type="dxa"/>
+                <w:tcBorders>
+                  <w:bottom w:val="single" w:sz="4" w:space="0" w:color="auto"/>
+                </w:tcBorders>
+                <w:shd w:val="clear" w:color="auto" w:fill="FFFFFF" w:themeFill="background1"/>
+              </w:tcPr>
+            </w:tcPrChange>
           </w:tcPr>
           <w:p>
             <w:pPr>
@@ -20490,6 +21894,22 @@
               <w:right w:w="133" w:type="dxa"/>
             </w:tcMar>
             <w:hideMark/>
+            <w:tcPrChange w:id="224" w:author="Anderson, Kenneth" w:date="2026-09-14T11:26:00Z" w16du:dateUtc="2026-09-14T15:26:00Z">
+              <w:tcPr>
+                <w:tcW w:w="2002" w:type="dxa"/>
+                <w:tcBorders>
+                  <w:bottom w:val="single" w:sz="4" w:space="0" w:color="auto"/>
+                </w:tcBorders>
+                <w:shd w:val="clear" w:color="auto" w:fill="FFFFFF" w:themeFill="background1"/>
+                <w:tcMar>
+                  <w:top w:w="67" w:type="dxa"/>
+                  <w:left w:w="133" w:type="dxa"/>
+                  <w:bottom w:w="67" w:type="dxa"/>
+                  <w:right w:w="133" w:type="dxa"/>
+                </w:tcMar>
+                <w:hideMark/>
+              </w:tcPr>
+            </w:tcPrChange>
           </w:tcPr>
           <w:p>
             <w:pPr>
@@ -20498,7 +21918,7 @@
               <w:rPr>
                 <w:rFonts w:ascii="Times New Roman" w:hAnsi="Times New Roman" w:cs="Times New Roman"/>
               </w:rPr>
-              <w:pPrChange w:id="159" w:author="Anderson, Kenneth" w:date="2026-09-14T11:10:00Z" w16du:dateUtc="2026-09-14T15:10:00Z">
+              <w:pPrChange w:id="225" w:author="Anderson, Kenneth" w:date="2026-09-14T11:10:00Z" w16du:dateUtc="2026-09-14T15:10:00Z">
                 <w:pPr>
                   <w:spacing w:line="240" w:lineRule="auto"/>
                 </w:pPr>
@@ -20510,7 +21930,15 @@
                 <w:b/>
                 <w:bCs/>
               </w:rPr>
-              <w:t>2,000</w:t>
+              <w:t>2,0</w:t>
+            </w:r>
+            <w:r>
+              <w:rPr>
+                <w:rFonts w:ascii="Times New Roman" w:hAnsi="Times New Roman" w:cs="Times New Roman"/>
+                <w:b/>
+                <w:bCs/>
+              </w:rPr>
+              <w:t>00</w:t>
             </w:r>
           </w:p>
         </w:tc>
@@ -20521,6 +21949,15 @@
               <w:bottom w:val="single" w:sz="4" w:space="0" w:color="auto"/>
             </w:tcBorders>
             <w:shd w:val="clear" w:color="auto" w:fill="FFFFFF" w:themeFill="background1"/>
+            <w:tcPrChange w:id="226" w:author="Anderson, Kenneth" w:date="2026-09-14T11:26:00Z" w16du:dateUtc="2026-09-14T15:26:00Z">
+              <w:tcPr>
+                <w:tcW w:w="1736" w:type="dxa"/>
+                <w:tcBorders>
+                  <w:bottom w:val="single" w:sz="4" w:space="0" w:color="auto"/>
+                </w:tcBorders>
+                <w:shd w:val="clear" w:color="auto" w:fill="FFFFFF" w:themeFill="background1"/>
+              </w:tcPr>
+            </w:tcPrChange>
           </w:tcPr>
           <w:p>
             <w:pPr>
@@ -20532,7 +21969,7 @@
                 <w:bCs/>
               </w:rPr>
             </w:pPr>
-            <w:ins w:id="160" w:author="Anderson, Kenneth" w:date="2026-09-14T11:10:00Z" w16du:dateUtc="2026-09-14T15:10:00Z">
+            <w:ins w:id="227" w:author="Anderson, Kenneth" w:date="2026-09-14T11:10:00Z" w16du:dateUtc="2026-09-14T15:10:00Z">
               <w:r>
                 <w:rPr>
                   <w:rFonts w:ascii="Times New Roman" w:hAnsi="Times New Roman" w:cs="Times New Roman"/>
@@ -20680,8 +22117,8 @@
           <w:szCs w:val="22"/>
         </w:rPr>
       </w:pPr>
-      <w:bookmarkStart w:id="161" w:name="_Ref237352403"/>
-      <w:bookmarkStart w:id="162" w:name="_Ref237352386"/>
+      <w:bookmarkStart w:id="228" w:name="_Ref237352403"/>
+      <w:bookmarkStart w:id="229" w:name="_Ref237352386"/>
       <w:r>
         <w:rPr>
           <w:rFonts w:ascii="Times New Roman" w:hAnsi="Times New Roman" w:cs="Times New Roman"/>
@@ -20749,7 +22186,7 @@
         </w:rPr>
         <w:fldChar w:fldCharType="end"/>
       </w:r>
-      <w:bookmarkEnd w:id="161"/>
+      <w:bookmarkEnd w:id="228"/>
       <w:r>
         <w:rPr>
           <w:rFonts w:ascii="Times New Roman" w:hAnsi="Times New Roman" w:cs="Times New Roman"/>
@@ -20761,7 +22198,7 @@
         </w:rPr>
         <w:t xml:space="preserve">. </w:t>
       </w:r>
-      <w:bookmarkEnd w:id="162"/>
+      <w:bookmarkEnd w:id="229"/>
       <w:r>
         <w:rPr>
           <w:rFonts w:ascii="Times New Roman" w:hAnsi="Times New Roman" w:cs="Times New Roman"/>
@@ -20808,7 +22245,7 @@
           <w:szCs w:val="22"/>
         </w:rPr>
       </w:pPr>
-      <w:bookmarkStart w:id="163" w:name="_Ref238453741"/>
+      <w:bookmarkStart w:id="230" w:name="_Ref238453741"/>
     </w:p>
     <w:p>
       <w:pPr>
@@ -20905,7 +22342,7 @@
         </w:rPr>
         <w:fldChar w:fldCharType="end"/>
       </w:r>
-      <w:bookmarkEnd w:id="163"/>
+      <w:bookmarkEnd w:id="230"/>
       <w:r>
         <w:rPr>
           <w:rFonts w:ascii="Times New Roman" w:hAnsi="Times New Roman" w:cs="Times New Roman"/>
@@ -31774,8 +33211,8 @@
         </w:rPr>
         <w:t>.</w:t>
       </w:r>
-      <w:commentRangeStart w:id="164"/>
-      <w:commentRangeEnd w:id="164"/>
+      <w:commentRangeStart w:id="231"/>
+      <w:commentRangeEnd w:id="231"/>
       <w:r>
         <w:rPr>
           <w:rStyle w:val="CommentReference"/>
@@ -31786,7 +33223,7 @@
           <w:sz w:val="22"/>
           <w:szCs w:val="22"/>
         </w:rPr>
-        <w:commentReference w:id="164"/>
+        <w:commentReference w:id="231"/>
       </w:r>
     </w:p>
     <w:tbl>
@@ -35703,7 +37140,7 @@
           <w:bCs/>
         </w:rPr>
       </w:pPr>
-      <w:commentRangeStart w:id="165"/>
+      <w:commentRangeStart w:id="232"/>
       <w:r>
         <w:rPr>
           <w:rFonts w:ascii="Times New Roman" w:hAnsi="Times New Roman" w:cs="Times New Roman"/>
@@ -35721,7 +37158,7 @@
         </w:rPr>
         <w:t xml:space="preserve"> </w:t>
       </w:r>
-      <w:commentRangeEnd w:id="165"/>
+      <w:commentRangeEnd w:id="232"/>
       <w:r>
         <w:rPr>
           <w:rStyle w:val="CommentReference"/>
@@ -35731,7 +37168,7 @@
           <w:sz w:val="22"/>
           <w:szCs w:val="22"/>
         </w:rPr>
-        <w:commentReference w:id="165"/>
+        <w:commentReference w:id="232"/>
       </w:r>
     </w:p>
     <w:p>
@@ -35771,7 +37208,7 @@
           <w:rFonts w:ascii="Times New Roman" w:hAnsi="Times New Roman" w:cs="Times New Roman"/>
         </w:rPr>
       </w:pPr>
-      <w:commentRangeStart w:id="166"/>
+      <w:commentRangeStart w:id="233"/>
       <w:r>
         <w:rPr>
           <w:rFonts w:ascii="Times New Roman" w:hAnsi="Times New Roman" w:cs="Times New Roman"/>
@@ -35887,7 +37324,7 @@
         </w:rPr>
         <w:t xml:space="preserve">Group for advice and feedback during the development of this manuscript: Nandita Basu, Whitney Beck, Jacob Berkowitz, Paul Gledhill, Heather Golden, Matt Pawlowski, Katie Quesnell, Craig Stow, Santina Wortman. </w:t>
       </w:r>
-      <w:commentRangeEnd w:id="166"/>
+      <w:commentRangeEnd w:id="233"/>
       <w:r>
         <w:rPr>
           <w:rStyle w:val="CommentReference"/>
@@ -35895,7 +37332,7 @@
           <w:sz w:val="22"/>
           <w:szCs w:val="22"/>
         </w:rPr>
-        <w:commentReference w:id="166"/>
+        <w:commentReference w:id="233"/>
       </w:r>
       <w:r>
         <w:rPr>
@@ -36403,7 +37840,7 @@
         <w:rPr>
           <w:rFonts w:ascii="Times New Roman" w:hAnsi="Times New Roman" w:cs="Times New Roman"/>
         </w:rPr>
-        <w:pPrChange w:id="167" w:author="Anderson, Kenneth" w:date="2026-09-02T16:06:00Z" w16du:dateUtc="2026-09-02T20:06:00Z">
+        <w:pPrChange w:id="234" w:author="Anderson, Kenneth" w:date="2026-09-02T16:06:00Z" w16du:dateUtc="2026-09-02T20:06:00Z">
           <w:pPr/>
         </w:pPrChange>
       </w:pPr>
@@ -36629,7 +38066,24 @@
       </w:r>
     </w:p>
   </w:comment>
-  <w:comment w:id="58" w:author="Klukow, Mary Ellen" w:date="2026-08-26T08:45:00Z" w:initials="KM">
+  <w:comment w:id="58" w:author="Marques Mendonca, Raissa" w:date="2026-09-14T11:46:00Z" w:initials="RM">
+    <w:p>
+      <w:r>
+        <w:rPr>
+          <w:rStyle w:val="CommentReference"/>
+        </w:rPr>
+        <w:annotationRef/>
+      </w:r>
+      <w:r>
+        <w:rPr>
+          <w:sz w:val="20"/>
+          <w:szCs w:val="20"/>
+        </w:rPr>
+        <w:t>Success is subjective here. I suggest "[...] the designs of constructed wetlands with highest nutrient processing capacity are rooted in a deep understanding [...]"</w:t>
+      </w:r>
+    </w:p>
+  </w:comment>
+  <w:comment w:id="59" w:author="Klukow, Mary Ellen" w:date="2026-08-26T08:45:00Z" w:initials="KM">
     <w:p>
       <w:pPr>
         <w:pStyle w:val="CommentText"/>
@@ -36662,7 +38116,24 @@
       </w:r>
     </w:p>
   </w:comment>
-  <w:comment w:id="61" w:author="Klukow, Mary Ellen" w:date="2026-08-26T08:46:00Z" w:initials="KM">
+  <w:comment w:id="65" w:author="Marques Mendonca, Raissa" w:date="2026-09-14T11:52:00Z" w:initials="RM">
+    <w:p>
+      <w:r>
+        <w:rPr>
+          <w:rStyle w:val="CommentReference"/>
+        </w:rPr>
+        <w:annotationRef/>
+      </w:r>
+      <w:r>
+        <w:rPr>
+          <w:sz w:val="20"/>
+          <w:szCs w:val="20"/>
+        </w:rPr>
+        <w:t>Mentioning "sediment to settle" again looked a bit redundant with the "sedimentation" part in the prior sentence, so I joined them.</w:t>
+      </w:r>
+    </w:p>
+  </w:comment>
+  <w:comment w:id="67" w:author="Klukow, Mary Ellen" w:date="2026-08-26T08:46:00Z" w:initials="KM">
     <w:p>
       <w:pPr>
         <w:pStyle w:val="CommentText"/>
@@ -36678,7 +38149,24 @@
       </w:r>
     </w:p>
   </w:comment>
-  <w:comment w:id="66" w:author="Klukow, Mary Ellen" w:date="2026-08-26T08:47:00Z" w:initials="KM">
+  <w:comment w:id="70" w:author="Marques Mendonca, Raissa" w:date="2026-09-14T11:58:00Z" w:initials="RM">
+    <w:p>
+      <w:r>
+        <w:rPr>
+          <w:rStyle w:val="CommentReference"/>
+        </w:rPr>
+        <w:annotationRef/>
+      </w:r>
+      <w:r>
+        <w:rPr>
+          <w:sz w:val="20"/>
+          <w:szCs w:val="20"/>
+        </w:rPr>
+        <w:t>[Not a hill] Note that "capture", "process", and "treat" have been used to describe the wetland function so far. No mention of retention per se yet. Might be worth to either stick to the other options or more clearly include this option earlier (and/or describe it).</w:t>
+      </w:r>
+    </w:p>
+  </w:comment>
+  <w:comment w:id="89" w:author="Klukow, Mary Ellen" w:date="2026-08-26T08:47:00Z" w:initials="KM">
     <w:p>
       <w:pPr>
         <w:pStyle w:val="CommentText"/>
@@ -36694,7 +38182,7 @@
       </w:r>
     </w:p>
   </w:comment>
-  <w:comment w:id="67" w:author="Klukow, Mary Ellen" w:date="2026-08-26T08:47:00Z" w:initials="KM">
+  <w:comment w:id="90" w:author="Klukow, Mary Ellen" w:date="2026-08-26T08:47:00Z" w:initials="KM">
     <w:p>
       <w:pPr>
         <w:pStyle w:val="CommentText"/>
@@ -36710,7 +38198,7 @@
       </w:r>
     </w:p>
   </w:comment>
-  <w:comment w:id="68" w:author="Klukow, Mary Ellen" w:date="2026-08-26T08:48:00Z" w:initials="KM">
+  <w:comment w:id="91" w:author="Klukow, Mary Ellen" w:date="2026-08-26T08:48:00Z" w:initials="KM">
     <w:p>
       <w:pPr>
         <w:pStyle w:val="CommentText"/>
@@ -36726,7 +38214,41 @@
       </w:r>
     </w:p>
   </w:comment>
-  <w:comment w:id="74" w:author="Jutte, Morgan Christine" w:date="2026-09-09T15:31:00Z" w:initials="JM">
+  <w:comment w:id="100" w:author="Marques Mendonca, Raissa" w:date="2026-09-14T12:11:00Z" w:initials="RM">
+    <w:p>
+      <w:r>
+        <w:rPr>
+          <w:rStyle w:val="CommentReference"/>
+        </w:rPr>
+        <w:annotationRef/>
+      </w:r>
+      <w:r>
+        <w:rPr>
+          <w:sz w:val="20"/>
+          <w:szCs w:val="20"/>
+        </w:rPr>
+        <w:t>By us or in the literature? Probs need some refs here if in the literature.</w:t>
+      </w:r>
+    </w:p>
+  </w:comment>
+  <w:comment w:id="105" w:author="Marques Mendonca, Raissa" w:date="2026-09-14T12:21:00Z" w:initials="RM">
+    <w:p>
+      <w:r>
+        <w:rPr>
+          <w:rStyle w:val="CommentReference"/>
+        </w:rPr>
+        <w:annotationRef/>
+      </w:r>
+      <w:r>
+        <w:rPr>
+          <w:sz w:val="20"/>
+          <w:szCs w:val="20"/>
+        </w:rPr>
+        <w:t>Consistently receive high loading or consistently retain more nutrients?</w:t>
+      </w:r>
+    </w:p>
+  </w:comment>
+  <w:comment w:id="116" w:author="Jutte, Morgan Christine" w:date="2026-09-09T15:31:00Z" w:initials="JM">
     <w:p>
       <w:pPr>
         <w:pStyle w:val="CommentText"/>
@@ -36742,7 +38264,7 @@
       </w:r>
     </w:p>
   </w:comment>
-  <w:comment w:id="76" w:author="Jacquemin, Stephen James" w:date="2026-09-11T08:11:00Z" w:initials="JS">
+  <w:comment w:id="118" w:author="Jacquemin, Stephen James" w:date="2026-09-11T08:11:00Z" w:initials="JS">
     <w:p>
       <w:pPr>
         <w:pStyle w:val="CommentText"/>
@@ -36758,7 +38280,7 @@
       </w:r>
     </w:p>
   </w:comment>
-  <w:comment w:id="77" w:author="Jacquemin, Stephen James" w:date="2026-09-11T08:12:00Z" w:initials="JS">
+  <w:comment w:id="119" w:author="Jacquemin, Stephen James" w:date="2026-09-11T08:12:00Z" w:initials="JS">
     <w:p>
       <w:pPr>
         <w:pStyle w:val="CommentText"/>
@@ -36774,7 +38296,7 @@
       </w:r>
     </w:p>
   </w:comment>
-  <w:comment w:id="78" w:author="Bahlai, Christie" w:date="2026-09-09T16:07:00Z" w:initials="BC">
+  <w:comment w:id="120" w:author="Bahlai, Christie" w:date="2026-09-09T16:07:00Z" w:initials="BC">
     <w:p>
       <w:pPr>
         <w:pStyle w:val="CommentText"/>
@@ -36790,7 +38312,7 @@
       </w:r>
     </w:p>
   </w:comment>
-  <w:comment w:id="87" w:author="Jutte, Morgan Christine" w:date="2026-09-09T15:31:00Z" w:initials="JM">
+  <w:comment w:id="129" w:author="Jutte, Morgan Christine" w:date="2026-09-09T15:31:00Z" w:initials="JM">
     <w:p>
       <w:pPr>
         <w:pStyle w:val="CommentText"/>
@@ -36806,7 +38328,7 @@
       </w:r>
     </w:p>
   </w:comment>
-  <w:comment w:id="90" w:author="Klukow, Mary Ellen" w:date="2026-09-08T11:09:00Z" w:initials="KM">
+  <w:comment w:id="132" w:author="Klukow, Mary Ellen" w:date="2026-09-08T11:09:00Z" w:initials="KM">
     <w:p>
       <w:pPr>
         <w:pStyle w:val="CommentText"/>
@@ -36822,7 +38344,7 @@
       </w:r>
     </w:p>
   </w:comment>
-  <w:comment w:id="88" w:author="Klukow, Mary Ellen" w:date="2026-08-26T09:22:00Z" w:initials="KM">
+  <w:comment w:id="130" w:author="Klukow, Mary Ellen" w:date="2026-08-26T09:22:00Z" w:initials="KM">
     <w:p>
       <w:pPr>
         <w:pStyle w:val="CommentText"/>
@@ -36838,7 +38360,7 @@
       </w:r>
     </w:p>
   </w:comment>
-  <w:comment w:id="89" w:author="Esber, Hana" w:date="2026-08-28T11:07:00Z" w:initials="HE">
+  <w:comment w:id="131" w:author="Esber, Hana" w:date="2026-08-28T11:07:00Z" w:initials="HE">
     <w:p>
       <w:pPr>
         <w:pStyle w:val="CommentText"/>
@@ -36854,7 +38376,7 @@
       </w:r>
     </w:p>
   </w:comment>
-  <w:comment w:id="92" w:author="Ganming Liu" w:date="2026-09-09T19:50:00Z" w:initials="GL">
+  <w:comment w:id="134" w:author="Ganming Liu" w:date="2026-09-09T19:50:00Z" w:initials="GL">
     <w:p>
       <w:pPr>
         <w:pStyle w:val="CommentText"/>
@@ -36870,7 +38392,7 @@
       </w:r>
     </w:p>
   </w:comment>
-  <w:comment w:id="98" w:author="Jacquemin, Stephen James" w:date="2026-09-11T09:51:00Z" w:initials="JS">
+  <w:comment w:id="140" w:author="Jacquemin, Stephen James" w:date="2026-09-11T09:51:00Z" w:initials="JS">
     <w:p>
       <w:pPr>
         <w:pStyle w:val="CommentText"/>
@@ -36886,7 +38408,7 @@
       </w:r>
     </w:p>
   </w:comment>
-  <w:comment w:id="99" w:author="Jacquemin, Stephen James" w:date="2026-09-11T09:50:00Z" w:initials="JS">
+  <w:comment w:id="141" w:author="Jacquemin, Stephen James" w:date="2026-09-11T09:50:00Z" w:initials="JS">
     <w:p>
       <w:pPr>
         <w:pStyle w:val="CommentText"/>
@@ -36902,7 +38424,7 @@
       </w:r>
     </w:p>
   </w:comment>
-  <w:comment w:id="100" w:author="Klukow, Mary Ellen" w:date="2026-09-08T11:44:00Z" w:initials="KM">
+  <w:comment w:id="142" w:author="Klukow, Mary Ellen" w:date="2026-09-08T11:44:00Z" w:initials="KM">
     <w:p>
       <w:pPr>
         <w:pStyle w:val="CommentText"/>
@@ -36918,7 +38440,7 @@
       </w:r>
     </w:p>
   </w:comment>
-  <w:comment w:id="101" w:author="Klukow, Mary Ellen" w:date="2026-09-08T11:24:00Z" w:initials="KM">
+  <w:comment w:id="143" w:author="Klukow, Mary Ellen" w:date="2026-09-08T11:24:00Z" w:initials="KM">
     <w:p>
       <w:pPr>
         <w:pStyle w:val="CommentText"/>
@@ -36934,7 +38456,7 @@
       </w:r>
     </w:p>
   </w:comment>
-  <w:comment w:id="102" w:author="Klukow, Mary Ellen" w:date="2026-09-08T11:27:00Z" w:initials="KM">
+  <w:comment w:id="144" w:author="Klukow, Mary Ellen" w:date="2026-09-08T11:27:00Z" w:initials="KM">
     <w:p>
       <w:pPr>
         <w:pStyle w:val="CommentText"/>
@@ -36950,7 +38472,7 @@
       </w:r>
     </w:p>
   </w:comment>
-  <w:comment w:id="103" w:author="Klukow, Mary Ellen" w:date="2026-09-08T11:30:00Z" w:initials="KM">
+  <w:comment w:id="145" w:author="Klukow, Mary Ellen" w:date="2026-09-08T11:30:00Z" w:initials="KM">
     <w:p>
       <w:pPr>
         <w:pStyle w:val="CommentText"/>
@@ -36966,7 +38488,7 @@
       </w:r>
     </w:p>
   </w:comment>
-  <w:comment w:id="108" w:author="Klukow, Mary Ellen" w:date="2026-09-08T11:35:00Z" w:initials="KM">
+  <w:comment w:id="150" w:author="Klukow, Mary Ellen" w:date="2026-09-08T11:35:00Z" w:initials="KM">
     <w:p>
       <w:pPr>
         <w:pStyle w:val="CommentText"/>
@@ -36982,7 +38504,7 @@
       </w:r>
     </w:p>
   </w:comment>
-  <w:comment w:id="111" w:author="Klukow, Mary Ellen" w:date="2026-09-08T11:37:00Z" w:initials="KM">
+  <w:comment w:id="153" w:author="Klukow, Mary Ellen" w:date="2026-09-08T11:37:00Z" w:initials="KM">
     <w:p>
       <w:pPr>
         <w:pStyle w:val="CommentText"/>
@@ -36998,7 +38520,7 @@
       </w:r>
     </w:p>
   </w:comment>
-  <w:comment w:id="112" w:author="Klukow, Mary Ellen" w:date="2026-09-08T11:40:00Z" w:initials="KM">
+  <w:comment w:id="154" w:author="Klukow, Mary Ellen" w:date="2026-09-08T11:40:00Z" w:initials="KM">
     <w:p>
       <w:pPr>
         <w:pStyle w:val="CommentText"/>
@@ -37014,7 +38536,7 @@
       </w:r>
     </w:p>
   </w:comment>
-  <w:comment w:id="113" w:author="Klukow, Mary Ellen" w:date="2026-09-08T11:39:00Z" w:initials="KM">
+  <w:comment w:id="155" w:author="Klukow, Mary Ellen" w:date="2026-09-08T11:39:00Z" w:initials="KM">
     <w:p>
       <w:pPr>
         <w:pStyle w:val="CommentText"/>
@@ -37030,7 +38552,7 @@
       </w:r>
     </w:p>
   </w:comment>
-  <w:comment w:id="114" w:author="Klukow, Mary Ellen" w:date="2026-09-08T11:41:00Z" w:initials="KM">
+  <w:comment w:id="156" w:author="Klukow, Mary Ellen" w:date="2026-09-08T11:41:00Z" w:initials="KM">
     <w:p>
       <w:pPr>
         <w:pStyle w:val="CommentText"/>
@@ -37046,7 +38568,7 @@
       </w:r>
     </w:p>
   </w:comment>
-  <w:comment w:id="117" w:author="Klukow, Mary Ellen" w:date="2026-09-08T11:43:00Z" w:initials="KM">
+  <w:comment w:id="159" w:author="Klukow, Mary Ellen" w:date="2026-09-08T11:43:00Z" w:initials="KM">
     <w:p>
       <w:pPr>
         <w:pStyle w:val="CommentText"/>
@@ -37075,7 +38597,7 @@
       </w:r>
     </w:p>
   </w:comment>
-  <w:comment w:id="119" w:author="Klukow, Mary Ellen" w:date="2026-09-08T11:47:00Z" w:initials="KM">
+  <w:comment w:id="161" w:author="Klukow, Mary Ellen" w:date="2026-09-08T11:47:00Z" w:initials="KM">
     <w:p>
       <w:pPr>
         <w:pStyle w:val="CommentText"/>
@@ -37091,7 +38613,7 @@
       </w:r>
     </w:p>
   </w:comment>
-  <w:comment w:id="122" w:author="Klukow, Mary Ellen" w:date="2026-09-08T11:47:00Z" w:initials="KM">
+  <w:comment w:id="164" w:author="Klukow, Mary Ellen" w:date="2026-09-08T11:47:00Z" w:initials="KM">
     <w:p>
       <w:pPr>
         <w:pStyle w:val="CommentText"/>
@@ -37107,7 +38629,7 @@
       </w:r>
     </w:p>
   </w:comment>
-  <w:comment w:id="123" w:author="Klukow, Mary Ellen" w:date="2026-09-08T11:49:00Z" w:initials="KM">
+  <w:comment w:id="165" w:author="Klukow, Mary Ellen" w:date="2026-09-08T11:49:00Z" w:initials="KM">
     <w:p>
       <w:pPr>
         <w:pStyle w:val="CommentText"/>
@@ -37123,7 +38645,7 @@
       </w:r>
     </w:p>
   </w:comment>
-  <w:comment w:id="124" w:author="Anderson, Kenneth" w:date="2026-09-14T11:42:00Z" w:initials="KA">
+  <w:comment w:id="166" w:author="Anderson, Kenneth" w:date="2026-09-14T11:42:00Z" w:initials="KA">
     <w:p>
       <w:pPr>
         <w:pStyle w:val="CommentText"/>
@@ -37140,11 +38662,11 @@
       <w:r>
         <w:instrText>HYPERLINK "mailto:mklukow@kent.edu"</w:instrText>
       </w:r>
-      <w:bookmarkStart w:id="126" w:name="_@_4EE9DCC5D64A4EEBA1010277C1DA689FZ"/>
+      <w:bookmarkStart w:id="168" w:name="_@_4EE9DCC5D64A4EEBA1010277C1DA689FZ"/>
       <w:r>
         <w:fldChar w:fldCharType="separate"/>
       </w:r>
-      <w:bookmarkEnd w:id="126"/>
+      <w:bookmarkEnd w:id="168"/>
       <w:r>
         <w:rPr>
           <w:rStyle w:val="Mention"/>
@@ -37160,7 +38682,7 @@
       </w:r>
     </w:p>
   </w:comment>
-  <w:comment w:id="125" w:author="Anderson, Kenneth" w:date="2026-09-14T11:43:00Z" w:initials="KA">
+  <w:comment w:id="167" w:author="Anderson, Kenneth" w:date="2026-09-14T11:43:00Z" w:initials="KA">
     <w:p>
       <w:pPr>
         <w:pStyle w:val="CommentText"/>
@@ -37176,7 +38698,7 @@
       </w:r>
     </w:p>
   </w:comment>
-  <w:comment w:id="127" w:author="Klukow, Mary Ellen" w:date="2026-09-08T11:50:00Z" w:initials="KM">
+  <w:comment w:id="169" w:author="Klukow, Mary Ellen" w:date="2026-09-08T11:50:00Z" w:initials="KM">
     <w:p>
       <w:pPr>
         <w:pStyle w:val="CommentText"/>
@@ -37192,7 +38714,7 @@
       </w:r>
     </w:p>
   </w:comment>
-  <w:comment w:id="128" w:author="Klukow, Mary Ellen" w:date="2026-09-08T11:52:00Z" w:initials="KM">
+  <w:comment w:id="170" w:author="Klukow, Mary Ellen" w:date="2026-09-08T11:52:00Z" w:initials="KM">
     <w:p>
       <w:pPr>
         <w:pStyle w:val="CommentText"/>
@@ -37208,7 +38730,7 @@
       </w:r>
     </w:p>
   </w:comment>
-  <w:comment w:id="129" w:author="Anderson, Kenneth" w:date="2026-09-14T11:42:00Z" w:initials="KA">
+  <w:comment w:id="171" w:author="Anderson, Kenneth" w:date="2026-09-14T11:42:00Z" w:initials="KA">
     <w:p>
       <w:pPr>
         <w:pStyle w:val="CommentText"/>
@@ -37228,11 +38750,11 @@
       <w:r>
         <w:instrText>HYPERLINK "mailto:mklukow@kent.edu"</w:instrText>
       </w:r>
-      <w:bookmarkStart w:id="130" w:name="_@_E5BB69611B1B48C591CAAEBE26B5D990Z"/>
+      <w:bookmarkStart w:id="172" w:name="_@_E5BB69611B1B48C591CAAEBE26B5D990Z"/>
       <w:r>
         <w:fldChar w:fldCharType="separate"/>
       </w:r>
-      <w:bookmarkEnd w:id="130"/>
+      <w:bookmarkEnd w:id="172"/>
       <w:r>
         <w:rPr>
           <w:rStyle w:val="Mention"/>
@@ -37255,7 +38777,7 @@
       </w:r>
     </w:p>
   </w:comment>
-  <w:comment w:id="131" w:author="Klukow, Mary Ellen" w:date="2026-09-08T11:53:00Z" w:initials="KM">
+  <w:comment w:id="173" w:author="Klukow, Mary Ellen" w:date="2026-09-08T11:53:00Z" w:initials="KM">
     <w:p>
       <w:pPr>
         <w:pStyle w:val="CommentText"/>
@@ -37271,7 +38793,7 @@
       </w:r>
     </w:p>
   </w:comment>
-  <w:comment w:id="134" w:author="Klukow, Mary Ellen" w:date="2026-09-08T11:53:00Z" w:initials="KM">
+  <w:comment w:id="176" w:author="Klukow, Mary Ellen" w:date="2026-09-08T11:53:00Z" w:initials="KM">
     <w:p>
       <w:pPr>
         <w:pStyle w:val="CommentText"/>
@@ -37287,7 +38809,7 @@
       </w:r>
     </w:p>
   </w:comment>
-  <w:comment w:id="150" w:author="Kinsman-Costello, Lauren" w:date="2026-07-16T13:58:00Z" w:initials="LK">
+  <w:comment w:id="201" w:author="Kinsman-Costello, Lauren" w:date="2026-07-16T13:58:00Z" w:initials="LK">
     <w:p>
       <w:r>
         <w:rPr>
@@ -37304,7 +38826,7 @@
       </w:r>
     </w:p>
   </w:comment>
-  <w:comment w:id="158" w:author="Kinsman-Costello, Lauren" w:date="2026-06-18T14:36:00Z" w:initials="LK">
+  <w:comment w:id="222" w:author="Kinsman-Costello, Lauren" w:date="2026-06-18T14:36:00Z" w:initials="LK">
     <w:p>
       <w:r>
         <w:rPr>
@@ -37321,7 +38843,7 @@
       </w:r>
     </w:p>
   </w:comment>
-  <w:comment w:id="164" w:author="Dean, Dave" w:date="2026-09-09T09:45:00Z" w:initials="DD">
+  <w:comment w:id="231" w:author="Dean, Dave" w:date="2026-09-09T09:45:00Z" w:initials="DD">
     <w:p>
       <w:pPr>
         <w:pStyle w:val="CommentText"/>
@@ -37337,7 +38859,7 @@
       </w:r>
     </w:p>
   </w:comment>
-  <w:comment w:id="165" w:author="Anderson, Kenneth" w:date="2026-09-01T15:37:00Z" w:initials="KA">
+  <w:comment w:id="232" w:author="Anderson, Kenneth" w:date="2026-09-01T15:37:00Z" w:initials="KA">
     <w:p>
       <w:pPr>
         <w:pStyle w:val="CommentText"/>
@@ -37353,7 +38875,7 @@
       </w:r>
     </w:p>
   </w:comment>
-  <w:comment w:id="166" w:author="Anderson, Kenneth" w:date="2026-09-01T15:45:00Z" w:initials="KA">
+  <w:comment w:id="233" w:author="Anderson, Kenneth" w:date="2026-09-01T15:45:00Z" w:initials="KA">
     <w:p>
       <w:pPr>
         <w:pStyle w:val="CommentText"/>
@@ -37385,12 +38907,17 @@
   <w15:commentEx w15:paraId="760C35F3" w15:done="0"/>
   <w15:commentEx w15:paraId="17417929" w15:done="0"/>
   <w15:commentEx w15:paraId="7E33381F" w15:done="1"/>
+  <w15:commentEx w15:paraId="70A190BE" w15:done="0"/>
   <w15:commentEx w15:paraId="0DFCE6C4" w15:done="1"/>
   <w15:commentEx w15:paraId="6B545F5B" w15:done="0"/>
+  <w15:commentEx w15:paraId="6FA71CE3" w15:done="0"/>
   <w15:commentEx w15:paraId="07E738FA" w15:done="1"/>
+  <w15:commentEx w15:paraId="10EA21EB" w15:done="0"/>
   <w15:commentEx w15:paraId="2F473D81" w15:done="1"/>
   <w15:commentEx w15:paraId="00BFF4E7" w15:done="1"/>
   <w15:commentEx w15:paraId="1B18C8C1" w15:done="1"/>
+  <w15:commentEx w15:paraId="1577C23D" w15:done="0"/>
+  <w15:commentEx w15:paraId="696E5161" w15:done="0"/>
   <w15:commentEx w15:paraId="247E9CF4" w15:done="0"/>
   <w15:commentEx w15:paraId="4B29EEEE" w15:done="0"/>
   <w15:commentEx w15:paraId="7384A1E5" w15:done="0"/>
@@ -37455,12 +38982,17 @@
   <w16cex:commentExtensible w16cex:durableId="76F9CC37" w16cex:dateUtc="2026-09-14T15:13:00Z"/>
   <w16cex:commentExtensible w16cex:durableId="01D1C36E" w16cex:dateUtc="2026-09-14T15:32:00Z"/>
   <w16cex:commentExtensible w16cex:durableId="44A76127" w16cex:dateUtc="2026-08-26T12:39:00Z"/>
+  <w16cex:commentExtensible w16cex:durableId="48976E91" w16cex:dateUtc="2026-09-14T15:46:00Z"/>
   <w16cex:commentExtensible w16cex:durableId="04051381" w16cex:dateUtc="2026-08-26T12:45:00Z"/>
   <w16cex:commentExtensible w16cex:durableId="77B7F876" w16cex:dateUtc="2026-09-14T15:42:00Z"/>
+  <w16cex:commentExtensible w16cex:durableId="53B2F3E7" w16cex:dateUtc="2026-09-14T15:52:00Z"/>
   <w16cex:commentExtensible w16cex:durableId="2E67CFFB" w16cex:dateUtc="2026-08-26T12:46:00Z"/>
+  <w16cex:commentExtensible w16cex:durableId="0A6F490E" w16cex:dateUtc="2026-09-14T15:58:00Z"/>
   <w16cex:commentExtensible w16cex:durableId="02D681C2" w16cex:dateUtc="2026-08-26T12:47:00Z"/>
   <w16cex:commentExtensible w16cex:durableId="2B80D3FF" w16cex:dateUtc="2026-08-26T12:47:00Z"/>
   <w16cex:commentExtensible w16cex:durableId="5D5960BF" w16cex:dateUtc="2026-08-26T12:48:00Z"/>
+  <w16cex:commentExtensible w16cex:durableId="6621ABFA" w16cex:dateUtc="2026-09-14T16:11:00Z"/>
+  <w16cex:commentExtensible w16cex:durableId="4F9B5B4F" w16cex:dateUtc="2026-09-14T16:21:00Z"/>
   <w16cex:commentExtensible w16cex:durableId="78F1DAA9" w16cex:dateUtc="2026-09-09T19:31:00Z"/>
   <w16cex:commentExtensible w16cex:durableId="53CBE0C0" w16cex:dateUtc="2026-09-11T12:11:00Z"/>
   <w16cex:commentExtensible w16cex:durableId="62DCB1D9" w16cex:dateUtc="2026-09-11T12:12:00Z"/>
@@ -37513,12 +39045,17 @@
   <w16cid:commentId w16cid:paraId="760C35F3" w16cid:durableId="76F9CC37"/>
   <w16cid:commentId w16cid:paraId="17417929" w16cid:durableId="01D1C36E"/>
   <w16cid:commentId w16cid:paraId="7E33381F" w16cid:durableId="44A76127"/>
+  <w16cid:commentId w16cid:paraId="70A190BE" w16cid:durableId="48976E91"/>
   <w16cid:commentId w16cid:paraId="0DFCE6C4" w16cid:durableId="04051381"/>
   <w16cid:commentId w16cid:paraId="6B545F5B" w16cid:durableId="77B7F876"/>
+  <w16cid:commentId w16cid:paraId="6FA71CE3" w16cid:durableId="53B2F3E7"/>
   <w16cid:commentId w16cid:paraId="07E738FA" w16cid:durableId="2E67CFFB"/>
+  <w16cid:commentId w16cid:paraId="10EA21EB" w16cid:durableId="0A6F490E"/>
   <w16cid:commentId w16cid:paraId="2F473D81" w16cid:durableId="02D681C2"/>
   <w16cid:commentId w16cid:paraId="00BFF4E7" w16cid:durableId="2B80D3FF"/>
   <w16cid:commentId w16cid:paraId="1B18C8C1" w16cid:durableId="5D5960BF"/>
+  <w16cid:commentId w16cid:paraId="1577C23D" w16cid:durableId="6621ABFA"/>
+  <w16cid:commentId w16cid:paraId="696E5161" w16cid:durableId="4F9B5B4F"/>
   <w16cid:commentId w16cid:paraId="247E9CF4" w16cid:durableId="78F1DAA9"/>
   <w16cid:commentId w16cid:paraId="4B29EEEE" w16cid:durableId="53CBE0C0"/>
   <w16cid:commentId w16cid:paraId="7384A1E5" w16cid:durableId="62DCB1D9"/>
@@ -39363,12 +40900,6 @@
   <w15:person w15:author="Ganming Liu">
     <w15:presenceInfo w15:providerId="AD" w15:userId="S::gliu_bgsu.edu#ext#@ksuprod.onmicrosoft.com::d416d290-2afd-4095-9275-cb5862ad9582"/>
   </w15:person>
-  <w15:person w15:author="Hoehn, Haley">
-    <w15:presenceInfo w15:providerId="AD" w15:userId="S::haley.hoehn_wright.edu#ext#@ksuprod.onmicrosoft.com::cbcba63f-ed98-4116-b3a3-05aa2718ff62"/>
-  </w15:person>
-  <w15:person w15:author="Nainiger, Austin J">
-    <w15:presenceInfo w15:providerId="AD" w15:userId="S::anainig_rockets.utoledo.edu#ext#@ksuprod.onmicrosoft.com::27c2bbd8-7bab-4e7d-8f54-b960dfd22a6a"/>
-  </w15:person>
   <w15:person w15:author="Anderson, Kenneth">
     <w15:presenceInfo w15:providerId="AD" w15:userId="S::kande120@kent.edu::71d0f1ec-66db-465c-9160-81dd6a36e785"/>
   </w15:person>
@@ -39380,9 +40911,6 @@
   </w15:person>
   <w15:person w15:author="Klukow, Mary Ellen">
     <w15:presenceInfo w15:providerId="AD" w15:userId="S::mklukow@kent.edu::c0826514-8d03-4712-84bd-aefb72c35407"/>
-  </w15:person>
-  <w15:person w15:author="Lauren N Brown">
-    <w15:presenceInfo w15:providerId="AD" w15:userId="S::lnbrown_bgsu.edu#ext#@ksuprod.onmicrosoft.com::fad72f19-fe10-4df2-82e5-7f1f0c84e9c8"/>
   </w15:person>
   <w15:person w15:author="Jutte, Morgan Christine">
     <w15:presenceInfo w15:providerId="AD" w15:userId="S::morgan.grunden_wright.edu#ext#@ksuprod.onmicrosoft.com::cd0d7be7-3058-4e90-a11b-f4ee356ff2f9"/>
@@ -40640,7 +42168,7 @@
     <w:uiPriority w:val="99"/>
     <w:semiHidden/>
     <w:unhideWhenUsed/>
-    <w:rsid w:val="009C2B5F"/>
+    <w:rsid w:val="0066412D"/>
     <w:pPr>
       <w:spacing w:after="0" w:line="240" w:lineRule="auto"/>
     </w:pPr>
@@ -40656,7 +42184,7 @@
     <w:link w:val="HTMLPreformatted"/>
     <w:uiPriority w:val="99"/>
     <w:semiHidden/>
-    <w:rsid w:val="009C2B5F"/>
+    <w:rsid w:val="0066412D"/>
     <w:rPr>
       <w:rFonts w:ascii="Consolas" w:hAnsi="Consolas"/>
       <w:sz w:val="20"/>

</xml_diff>